<commit_message>
docs:se realizan cambios de formato ajustándolo a las normas APA y se mejora el planteamiento del problema del informe
</commit_message>
<xml_diff>
--- a/informe de requisitos.docx
+++ b/informe de requisitos.docx
@@ -1,6 +1,6 @@
 
 <file path=word/document.xml><?xml version="1.0" encoding="utf-8"?>
-<w:document xmlns:wpc="http://schemas.microsoft.com/office/word/2010/wordprocessingCanvas" xmlns:cx="http://schemas.microsoft.com/office/drawing/2014/chartex" xmlns:cx1="http://schemas.microsoft.com/office/drawing/2015/9/8/chartex" xmlns:cx2="http://schemas.microsoft.com/office/drawing/2015/10/21/chartex" xmlns:cx3="http://schemas.microsoft.com/office/drawing/2016/5/9/chartex" xmlns:cx4="http://schemas.microsoft.com/office/drawing/2016/5/10/chartex" xmlns:cx5="http://schemas.microsoft.com/office/drawing/2016/5/11/chartex" xmlns:cx6="http://schemas.microsoft.com/office/drawing/2016/5/12/chartex" xmlns:cx7="http://schemas.microsoft.com/office/drawing/2016/5/13/chartex" xmlns:cx8="http://schemas.microsoft.com/office/drawing/2016/5/14/chartex" xmlns:mc="http://schemas.openxmlformats.org/markup-compatibility/2006" xmlns:aink="http://schemas.microsoft.com/office/drawing/2016/ink" xmlns:am3d="http://schemas.microsoft.com/office/drawing/2017/model3d" xmlns:o="urn:schemas-microsoft-com:office:office" xmlns:r="http://schemas.openxmlformats.org/officeDocument/2006/relationships" xmlns:m="http://schemas.openxmlformats.org/officeDocument/2006/math" xmlns:v="urn:schemas-microsoft-com:vml" xmlns:wp14="http://schemas.microsoft.com/office/word/2010/wordprocessingDrawing" xmlns:wp="http://schemas.openxmlformats.org/drawingml/2006/wordprocessingDrawing" xmlns:w10="urn:schemas-microsoft-com:office:word" xmlns:w="http://schemas.openxmlformats.org/wordprocessingml/2006/main" xmlns:w14="http://schemas.microsoft.com/office/word/2010/wordml" xmlns:w15="http://schemas.microsoft.com/office/word/2012/wordml" xmlns:w16cex="http://schemas.microsoft.com/office/word/2018/wordml/cex" xmlns:w16cid="http://schemas.microsoft.com/office/word/2016/wordml/cid" xmlns:w16="http://schemas.microsoft.com/office/word/2018/wordml" xmlns:w16sdtdh="http://schemas.microsoft.com/office/word/2020/wordml/sdtdatahash" xmlns:w16se="http://schemas.microsoft.com/office/word/2015/wordml/symex" xmlns:wpg="http://schemas.microsoft.com/office/word/2010/wordprocessingGroup" xmlns:wpi="http://schemas.microsoft.com/office/word/2010/wordprocessingInk" xmlns:wne="http://schemas.microsoft.com/office/word/2006/wordml" xmlns:wps="http://schemas.microsoft.com/office/word/2010/wordprocessingShape" mc:Ignorable="w14 w15 w16se w16cid w16 w16cex w16sdtdh wp14">
+<w:document xmlns:wpc="http://schemas.microsoft.com/office/word/2010/wordprocessingCanvas" xmlns:cx="http://schemas.microsoft.com/office/drawing/2014/chartex" xmlns:cx1="http://schemas.microsoft.com/office/drawing/2015/9/8/chartex" xmlns:cx2="http://schemas.microsoft.com/office/drawing/2015/10/21/chartex" xmlns:cx3="http://schemas.microsoft.com/office/drawing/2016/5/9/chartex" xmlns:cx4="http://schemas.microsoft.com/office/drawing/2016/5/10/chartex" xmlns:cx5="http://schemas.microsoft.com/office/drawing/2016/5/11/chartex" xmlns:cx6="http://schemas.microsoft.com/office/drawing/2016/5/12/chartex" xmlns:cx7="http://schemas.microsoft.com/office/drawing/2016/5/13/chartex" xmlns:cx8="http://schemas.microsoft.com/office/drawing/2016/5/14/chartex" xmlns:mc="http://schemas.openxmlformats.org/markup-compatibility/2006" xmlns:aink="http://schemas.microsoft.com/office/drawing/2016/ink" xmlns:am3d="http://schemas.microsoft.com/office/drawing/2017/model3d" xmlns:o="urn:schemas-microsoft-com:office:office" xmlns:oel="http://schemas.microsoft.com/office/2019/extlst" xmlns:r="http://schemas.openxmlformats.org/officeDocument/2006/relationships" xmlns:m="http://schemas.openxmlformats.org/officeDocument/2006/math" xmlns:v="urn:schemas-microsoft-com:vml" xmlns:wp14="http://schemas.microsoft.com/office/word/2010/wordprocessingDrawing" xmlns:wp="http://schemas.openxmlformats.org/drawingml/2006/wordprocessingDrawing" xmlns:w10="urn:schemas-microsoft-com:office:word" xmlns:w="http://schemas.openxmlformats.org/wordprocessingml/2006/main" xmlns:w14="http://schemas.microsoft.com/office/word/2010/wordml" xmlns:w15="http://schemas.microsoft.com/office/word/2012/wordml" xmlns:w16cex="http://schemas.microsoft.com/office/word/2018/wordml/cex" xmlns:w16cid="http://schemas.microsoft.com/office/word/2016/wordml/cid" xmlns:w16="http://schemas.microsoft.com/office/word/2018/wordml" xmlns:w16du="http://schemas.microsoft.com/office/word/2023/wordml/word16du" xmlns:w16sdtdh="http://schemas.microsoft.com/office/word/2020/wordml/sdtdatahash" xmlns:w16se="http://schemas.microsoft.com/office/word/2015/wordml/symex" xmlns:wpg="http://schemas.microsoft.com/office/word/2010/wordprocessingGroup" xmlns:wpi="http://schemas.microsoft.com/office/word/2010/wordprocessingInk" xmlns:wne="http://schemas.microsoft.com/office/word/2006/wordml" xmlns:wps="http://schemas.microsoft.com/office/word/2010/wordprocessingShape" mc:Ignorable="w14 w15 w16se w16cid w16 w16cex w16sdtdh w16du wp14">
   <w:body>
     <w:p>
       <w:pPr>
@@ -121,13 +121,6 @@
     </w:p>
     <w:p>
       <w:pPr>
-        <w:rPr>
-          <w:rFonts w:cs="Times New Roman"/>
-        </w:rPr>
-      </w:pPr>
-    </w:p>
-    <w:p>
-      <w:pPr>
         <w:jc w:val="center"/>
         <w:rPr>
           <w:rFonts w:cs="Times New Roman"/>
@@ -158,13 +151,6 @@
     </w:p>
     <w:p>
       <w:pPr>
-        <w:rPr>
-          <w:rFonts w:cs="Times New Roman"/>
-        </w:rPr>
-      </w:pPr>
-    </w:p>
-    <w:p>
-      <w:pPr>
         <w:jc w:val="center"/>
         <w:rPr>
           <w:rFonts w:cs="Times New Roman"/>
@@ -203,67 +189,46 @@
     </w:p>
     <w:p>
       <w:pPr>
-        <w:rPr>
-          <w:rFonts w:cs="Times New Roman"/>
-        </w:rPr>
-      </w:pPr>
-    </w:p>
-    <w:p>
-      <w:pPr>
-        <w:jc w:val="center"/>
-        <w:rPr>
-          <w:rFonts w:cs="Times New Roman"/>
-        </w:rPr>
-      </w:pPr>
-    </w:p>
-    <w:p>
-      <w:pPr>
-        <w:jc w:val="center"/>
-        <w:rPr>
-          <w:rFonts w:cs="Times New Roman"/>
-        </w:rPr>
-      </w:pPr>
-    </w:p>
-    <w:p>
-      <w:pPr>
-        <w:jc w:val="center"/>
-        <w:rPr>
-          <w:rFonts w:cs="Times New Roman"/>
-        </w:rPr>
-      </w:pPr>
-    </w:p>
-    <w:p>
-      <w:pPr>
-        <w:jc w:val="center"/>
-        <w:rPr>
-          <w:rFonts w:cs="Times New Roman"/>
-        </w:rPr>
-      </w:pPr>
-    </w:p>
-    <w:p>
-      <w:pPr>
-        <w:jc w:val="center"/>
-        <w:rPr>
-          <w:rFonts w:cs="Times New Roman"/>
-        </w:rPr>
-      </w:pPr>
-    </w:p>
-    <w:p>
-      <w:pPr>
-        <w:jc w:val="center"/>
-        <w:rPr>
-          <w:rFonts w:cs="Times New Roman"/>
-        </w:rPr>
-      </w:pPr>
-      <w:r>
-        <w:rPr>
-          <w:rFonts w:cs="Times New Roman"/>
-        </w:rPr>
-        <w:t>SENA</w:t>
-      </w:r>
-    </w:p>
-    <w:p>
-      <w:pPr>
+        <w:jc w:val="center"/>
+        <w:rPr>
+          <w:rFonts w:cs="Times New Roman"/>
+        </w:rPr>
+      </w:pPr>
+    </w:p>
+    <w:p>
+      <w:pPr>
+        <w:jc w:val="center"/>
+        <w:rPr>
+          <w:rFonts w:cs="Times New Roman"/>
+        </w:rPr>
+      </w:pPr>
+    </w:p>
+    <w:p>
+      <w:pPr>
+        <w:jc w:val="center"/>
+        <w:rPr>
+          <w:rFonts w:cs="Times New Roman"/>
+        </w:rPr>
+      </w:pPr>
+    </w:p>
+    <w:p>
+      <w:pPr>
+        <w:ind w:firstLine="0"/>
+        <w:jc w:val="center"/>
+        <w:rPr>
+          <w:rFonts w:cs="Times New Roman"/>
+        </w:rPr>
+      </w:pPr>
+      <w:r>
+        <w:rPr>
+          <w:rFonts w:cs="Times New Roman"/>
+        </w:rPr>
+        <w:t>CESDE</w:t>
+      </w:r>
+    </w:p>
+    <w:p>
+      <w:pPr>
+        <w:ind w:firstLine="0"/>
         <w:jc w:val="center"/>
         <w:rPr>
           <w:rFonts w:cs="Times New Roman"/>
@@ -366,8 +331,9 @@
               <w:tab w:val="right" w:leader="dot" w:pos="8828"/>
             </w:tabs>
             <w:rPr>
-              <w:rFonts w:eastAsiaTheme="minorEastAsia"/>
+              <w:rFonts w:asciiTheme="minorHAnsi" w:eastAsiaTheme="minorEastAsia" w:hAnsiTheme="minorHAnsi"/>
               <w:noProof/>
+              <w:color w:val="auto"/>
               <w:sz w:val="22"/>
               <w:szCs w:val="22"/>
               <w:lang w:val="es-MX" w:eastAsia="es-MX"/>
@@ -392,7 +358,7 @@
             </w:rPr>
             <w:fldChar w:fldCharType="separate"/>
           </w:r>
-          <w:hyperlink w:anchor="_Toc241702554" w:history="1">
+          <w:hyperlink w:anchor="_Toc242124618" w:history="1">
             <w:r>
               <w:rPr>
                 <w:rStyle w:val="Hipervnculo"/>
@@ -421,7 +387,7 @@
                 <w:noProof/>
                 <w:webHidden/>
               </w:rPr>
-              <w:instrText xml:space="preserve"> PAGEREF _Toc241702554 \h </w:instrText>
+              <w:instrText xml:space="preserve"> PAGEREF _Toc242124618 \h </w:instrText>
             </w:r>
             <w:r>
               <w:rPr>
@@ -441,7 +407,7 @@
                 <w:noProof/>
                 <w:webHidden/>
               </w:rPr>
-              <w:t>3</w:t>
+              <w:t>4</w:t>
             </w:r>
             <w:r>
               <w:rPr>
@@ -459,14 +425,15 @@
               <w:tab w:val="right" w:leader="dot" w:pos="8828"/>
             </w:tabs>
             <w:rPr>
-              <w:rFonts w:eastAsiaTheme="minorEastAsia"/>
+              <w:rFonts w:asciiTheme="minorHAnsi" w:eastAsiaTheme="minorEastAsia" w:hAnsiTheme="minorHAnsi"/>
               <w:noProof/>
+              <w:color w:val="auto"/>
               <w:sz w:val="22"/>
               <w:szCs w:val="22"/>
               <w:lang w:val="es-MX" w:eastAsia="es-MX"/>
             </w:rPr>
           </w:pPr>
-          <w:hyperlink w:anchor="_Toc241702555" w:history="1">
+          <w:hyperlink w:anchor="_Toc242124619" w:history="1">
             <w:r>
               <w:rPr>
                 <w:rStyle w:val="Hipervnculo"/>
@@ -494,7 +461,7 @@
                 <w:noProof/>
                 <w:webHidden/>
               </w:rPr>
-              <w:instrText xml:space="preserve"> PAGEREF _Toc241702555 \h </w:instrText>
+              <w:instrText xml:space="preserve"> PAGEREF _Toc242124619 \h </w:instrText>
             </w:r>
             <w:r>
               <w:rPr>
@@ -514,7 +481,7 @@
                 <w:noProof/>
                 <w:webHidden/>
               </w:rPr>
-              <w:t>4</w:t>
+              <w:t>5</w:t>
             </w:r>
             <w:r>
               <w:rPr>
@@ -532,14 +499,15 @@
               <w:tab w:val="right" w:leader="dot" w:pos="8828"/>
             </w:tabs>
             <w:rPr>
-              <w:rFonts w:eastAsiaTheme="minorEastAsia"/>
+              <w:rFonts w:asciiTheme="minorHAnsi" w:eastAsiaTheme="minorEastAsia" w:hAnsiTheme="minorHAnsi"/>
               <w:noProof/>
+              <w:color w:val="auto"/>
               <w:sz w:val="22"/>
               <w:szCs w:val="22"/>
               <w:lang w:val="es-MX" w:eastAsia="es-MX"/>
             </w:rPr>
           </w:pPr>
-          <w:hyperlink w:anchor="_Toc241702556" w:history="1">
+          <w:hyperlink w:anchor="_Toc242124620" w:history="1">
             <w:r>
               <w:rPr>
                 <w:rStyle w:val="Hipervnculo"/>
@@ -567,7 +535,7 @@
                 <w:noProof/>
                 <w:webHidden/>
               </w:rPr>
-              <w:instrText xml:space="preserve"> PAGEREF _Toc241702556 \h </w:instrText>
+              <w:instrText xml:space="preserve"> PAGEREF _Toc242124620 \h </w:instrText>
             </w:r>
             <w:r>
               <w:rPr>
@@ -587,7 +555,7 @@
                 <w:noProof/>
                 <w:webHidden/>
               </w:rPr>
-              <w:t>5</w:t>
+              <w:t>6</w:t>
             </w:r>
             <w:r>
               <w:rPr>
@@ -605,18 +573,18 @@
               <w:tab w:val="right" w:leader="dot" w:pos="8828"/>
             </w:tabs>
             <w:rPr>
-              <w:rFonts w:eastAsiaTheme="minorEastAsia"/>
+              <w:rFonts w:asciiTheme="minorHAnsi" w:eastAsiaTheme="minorEastAsia" w:hAnsiTheme="minorHAnsi"/>
               <w:noProof/>
+              <w:color w:val="auto"/>
               <w:sz w:val="22"/>
               <w:szCs w:val="22"/>
               <w:lang w:val="es-MX" w:eastAsia="es-MX"/>
             </w:rPr>
           </w:pPr>
-          <w:hyperlink w:anchor="_Toc241702557" w:history="1">
+          <w:hyperlink w:anchor="_Toc242124621" w:history="1">
             <w:r>
               <w:rPr>
                 <w:rStyle w:val="Hipervnculo"/>
-                <w:rFonts w:cs="Times New Roman"/>
                 <w:noProof/>
               </w:rPr>
               <w:t>Objetivos</w:t>
@@ -640,7 +608,7 @@
                 <w:noProof/>
                 <w:webHidden/>
               </w:rPr>
-              <w:instrText xml:space="preserve"> PAGEREF _Toc241702557 \h </w:instrText>
+              <w:instrText xml:space="preserve"> PAGEREF _Toc242124621 \h </w:instrText>
             </w:r>
             <w:r>
               <w:rPr>
@@ -660,7 +628,7 @@
                 <w:noProof/>
                 <w:webHidden/>
               </w:rPr>
-              <w:t>7</w:t>
+              <w:t>8</w:t>
             </w:r>
             <w:r>
               <w:rPr>
@@ -678,21 +646,21 @@
               <w:tab w:val="right" w:leader="dot" w:pos="8828"/>
             </w:tabs>
             <w:rPr>
-              <w:rFonts w:eastAsiaTheme="minorEastAsia"/>
+              <w:rFonts w:asciiTheme="minorHAnsi" w:eastAsiaTheme="minorEastAsia" w:hAnsiTheme="minorHAnsi"/>
               <w:noProof/>
+              <w:color w:val="auto"/>
               <w:sz w:val="22"/>
               <w:szCs w:val="22"/>
               <w:lang w:val="es-MX" w:eastAsia="es-MX"/>
             </w:rPr>
           </w:pPr>
-          <w:hyperlink w:anchor="_Toc241702558" w:history="1">
+          <w:hyperlink w:anchor="_Toc242124622" w:history="1">
             <w:r>
               <w:rPr>
                 <w:rStyle w:val="Hipervnculo"/>
-                <w:rFonts w:cs="Times New Roman"/>
-                <w:noProof/>
-              </w:rPr>
-              <w:t>Objetivo General</w:t>
+                <w:noProof/>
+              </w:rPr>
+              <w:t>Objetivo general</w:t>
             </w:r>
             <w:r>
               <w:rPr>
@@ -713,7 +681,7 @@
                 <w:noProof/>
                 <w:webHidden/>
               </w:rPr>
-              <w:instrText xml:space="preserve"> PAGEREF _Toc241702558 \h </w:instrText>
+              <w:instrText xml:space="preserve"> PAGEREF _Toc242124622 \h </w:instrText>
             </w:r>
             <w:r>
               <w:rPr>
@@ -733,7 +701,7 @@
                 <w:noProof/>
                 <w:webHidden/>
               </w:rPr>
-              <w:t>7</w:t>
+              <w:t>8</w:t>
             </w:r>
             <w:r>
               <w:rPr>
@@ -751,18 +719,18 @@
               <w:tab w:val="right" w:leader="dot" w:pos="8828"/>
             </w:tabs>
             <w:rPr>
-              <w:rFonts w:eastAsiaTheme="minorEastAsia"/>
+              <w:rFonts w:asciiTheme="minorHAnsi" w:eastAsiaTheme="minorEastAsia" w:hAnsiTheme="minorHAnsi"/>
               <w:noProof/>
+              <w:color w:val="auto"/>
               <w:sz w:val="22"/>
               <w:szCs w:val="22"/>
               <w:lang w:val="es-MX" w:eastAsia="es-MX"/>
             </w:rPr>
           </w:pPr>
-          <w:hyperlink w:anchor="_Toc241702559" w:history="1">
+          <w:hyperlink w:anchor="_Toc242124623" w:history="1">
             <w:r>
               <w:rPr>
                 <w:rStyle w:val="Hipervnculo"/>
-                <w:rFonts w:cs="Times New Roman"/>
                 <w:noProof/>
               </w:rPr>
               <w:t>Objetivos específicos</w:t>
@@ -786,7 +754,7 @@
                 <w:noProof/>
                 <w:webHidden/>
               </w:rPr>
-              <w:instrText xml:space="preserve"> PAGEREF _Toc241702559 \h </w:instrText>
+              <w:instrText xml:space="preserve"> PAGEREF _Toc242124623 \h </w:instrText>
             </w:r>
             <w:r>
               <w:rPr>
@@ -806,7 +774,7 @@
                 <w:noProof/>
                 <w:webHidden/>
               </w:rPr>
-              <w:t>7</w:t>
+              <w:t>8</w:t>
             </w:r>
             <w:r>
               <w:rPr>
@@ -824,14 +792,15 @@
               <w:tab w:val="right" w:leader="dot" w:pos="8828"/>
             </w:tabs>
             <w:rPr>
-              <w:rFonts w:eastAsiaTheme="minorEastAsia"/>
+              <w:rFonts w:asciiTheme="minorHAnsi" w:eastAsiaTheme="minorEastAsia" w:hAnsiTheme="minorHAnsi"/>
               <w:noProof/>
+              <w:color w:val="auto"/>
               <w:sz w:val="22"/>
               <w:szCs w:val="22"/>
               <w:lang w:val="es-MX" w:eastAsia="es-MX"/>
             </w:rPr>
           </w:pPr>
-          <w:hyperlink w:anchor="_Toc241702560" w:history="1">
+          <w:hyperlink w:anchor="_Toc242124624" w:history="1">
             <w:r>
               <w:rPr>
                 <w:rStyle w:val="Hipervnculo"/>
@@ -859,7 +828,7 @@
                 <w:noProof/>
                 <w:webHidden/>
               </w:rPr>
-              <w:instrText xml:space="preserve"> PAGEREF _Toc241702560 \h </w:instrText>
+              <w:instrText xml:space="preserve"> PAGEREF _Toc242124624 \h </w:instrText>
             </w:r>
             <w:r>
               <w:rPr>
@@ -879,7 +848,230 @@
                 <w:noProof/>
                 <w:webHidden/>
               </w:rPr>
-              <w:t>8</w:t>
+              <w:t>9</w:t>
+            </w:r>
+            <w:r>
+              <w:rPr>
+                <w:noProof/>
+                <w:webHidden/>
+              </w:rPr>
+              <w:fldChar w:fldCharType="end"/>
+            </w:r>
+          </w:hyperlink>
+        </w:p>
+        <w:p>
+          <w:pPr>
+            <w:pStyle w:val="TDC2"/>
+            <w:tabs>
+              <w:tab w:val="right" w:leader="dot" w:pos="8828"/>
+            </w:tabs>
+            <w:rPr>
+              <w:rFonts w:asciiTheme="minorHAnsi" w:eastAsiaTheme="minorEastAsia" w:hAnsiTheme="minorHAnsi"/>
+              <w:noProof/>
+              <w:color w:val="auto"/>
+              <w:sz w:val="22"/>
+              <w:szCs w:val="22"/>
+              <w:lang w:val="es-MX" w:eastAsia="es-MX"/>
+            </w:rPr>
+          </w:pPr>
+          <w:hyperlink w:anchor="_Toc242124625" w:history="1">
+            <w:r>
+              <w:rPr>
+                <w:rStyle w:val="Hipervnculo"/>
+                <w:noProof/>
+              </w:rPr>
+              <w:t>Necesidad</w:t>
+            </w:r>
+            <w:r>
+              <w:rPr>
+                <w:noProof/>
+                <w:webHidden/>
+              </w:rPr>
+              <w:tab/>
+            </w:r>
+            <w:r>
+              <w:rPr>
+                <w:noProof/>
+                <w:webHidden/>
+              </w:rPr>
+              <w:fldChar w:fldCharType="begin"/>
+            </w:r>
+            <w:r>
+              <w:rPr>
+                <w:noProof/>
+                <w:webHidden/>
+              </w:rPr>
+              <w:instrText xml:space="preserve"> PAGEREF _Toc242124625 \h </w:instrText>
+            </w:r>
+            <w:r>
+              <w:rPr>
+                <w:noProof/>
+                <w:webHidden/>
+              </w:rPr>
+            </w:r>
+            <w:r>
+              <w:rPr>
+                <w:noProof/>
+                <w:webHidden/>
+              </w:rPr>
+              <w:fldChar w:fldCharType="separate"/>
+            </w:r>
+            <w:r>
+              <w:rPr>
+                <w:noProof/>
+                <w:webHidden/>
+              </w:rPr>
+              <w:t>9</w:t>
+            </w:r>
+            <w:r>
+              <w:rPr>
+                <w:noProof/>
+                <w:webHidden/>
+              </w:rPr>
+              <w:fldChar w:fldCharType="end"/>
+            </w:r>
+          </w:hyperlink>
+        </w:p>
+        <w:p>
+          <w:pPr>
+            <w:pStyle w:val="TDC2"/>
+            <w:tabs>
+              <w:tab w:val="right" w:leader="dot" w:pos="8828"/>
+            </w:tabs>
+            <w:rPr>
+              <w:rFonts w:asciiTheme="minorHAnsi" w:eastAsiaTheme="minorEastAsia" w:hAnsiTheme="minorHAnsi"/>
+              <w:noProof/>
+              <w:color w:val="auto"/>
+              <w:sz w:val="22"/>
+              <w:szCs w:val="22"/>
+              <w:lang w:val="es-MX" w:eastAsia="es-MX"/>
+            </w:rPr>
+          </w:pPr>
+          <w:hyperlink w:anchor="_Toc242124626" w:history="1">
+            <w:r>
+              <w:rPr>
+                <w:rStyle w:val="Hipervnculo"/>
+                <w:rFonts w:eastAsia="Times New Roman"/>
+                <w:noProof/>
+                <w:lang w:val="es-MX" w:eastAsia="es-MX"/>
+              </w:rPr>
+              <w:t>Manejo Actual</w:t>
+            </w:r>
+            <w:r>
+              <w:rPr>
+                <w:noProof/>
+                <w:webHidden/>
+              </w:rPr>
+              <w:tab/>
+            </w:r>
+            <w:r>
+              <w:rPr>
+                <w:noProof/>
+                <w:webHidden/>
+              </w:rPr>
+              <w:fldChar w:fldCharType="begin"/>
+            </w:r>
+            <w:r>
+              <w:rPr>
+                <w:noProof/>
+                <w:webHidden/>
+              </w:rPr>
+              <w:instrText xml:space="preserve"> PAGEREF _Toc242124626 \h </w:instrText>
+            </w:r>
+            <w:r>
+              <w:rPr>
+                <w:noProof/>
+                <w:webHidden/>
+              </w:rPr>
+            </w:r>
+            <w:r>
+              <w:rPr>
+                <w:noProof/>
+                <w:webHidden/>
+              </w:rPr>
+              <w:fldChar w:fldCharType="separate"/>
+            </w:r>
+            <w:r>
+              <w:rPr>
+                <w:noProof/>
+                <w:webHidden/>
+              </w:rPr>
+              <w:t>9</w:t>
+            </w:r>
+            <w:r>
+              <w:rPr>
+                <w:noProof/>
+                <w:webHidden/>
+              </w:rPr>
+              <w:fldChar w:fldCharType="end"/>
+            </w:r>
+          </w:hyperlink>
+        </w:p>
+        <w:p>
+          <w:pPr>
+            <w:pStyle w:val="TDC2"/>
+            <w:tabs>
+              <w:tab w:val="right" w:leader="dot" w:pos="8828"/>
+            </w:tabs>
+            <w:rPr>
+              <w:rFonts w:asciiTheme="minorHAnsi" w:eastAsiaTheme="minorEastAsia" w:hAnsiTheme="minorHAnsi"/>
+              <w:noProof/>
+              <w:color w:val="auto"/>
+              <w:sz w:val="22"/>
+              <w:szCs w:val="22"/>
+              <w:lang w:val="es-MX" w:eastAsia="es-MX"/>
+            </w:rPr>
+          </w:pPr>
+          <w:hyperlink w:anchor="_Toc242124627" w:history="1">
+            <w:r>
+              <w:rPr>
+                <w:rStyle w:val="Hipervnculo"/>
+                <w:rFonts w:eastAsia="Times New Roman"/>
+                <w:noProof/>
+                <w:lang w:val="es-MX" w:eastAsia="es-MX"/>
+              </w:rPr>
+              <w:t>Solución Propuesta (Célula 6)</w:t>
+            </w:r>
+            <w:r>
+              <w:rPr>
+                <w:noProof/>
+                <w:webHidden/>
+              </w:rPr>
+              <w:tab/>
+            </w:r>
+            <w:r>
+              <w:rPr>
+                <w:noProof/>
+                <w:webHidden/>
+              </w:rPr>
+              <w:fldChar w:fldCharType="begin"/>
+            </w:r>
+            <w:r>
+              <w:rPr>
+                <w:noProof/>
+                <w:webHidden/>
+              </w:rPr>
+              <w:instrText xml:space="preserve"> PAGEREF _Toc242124627 \h </w:instrText>
+            </w:r>
+            <w:r>
+              <w:rPr>
+                <w:noProof/>
+                <w:webHidden/>
+              </w:rPr>
+            </w:r>
+            <w:r>
+              <w:rPr>
+                <w:noProof/>
+                <w:webHidden/>
+              </w:rPr>
+              <w:fldChar w:fldCharType="separate"/>
+            </w:r>
+            <w:r>
+              <w:rPr>
+                <w:noProof/>
+                <w:webHidden/>
+              </w:rPr>
+              <w:t>9</w:t>
             </w:r>
             <w:r>
               <w:rPr>
@@ -897,14 +1089,15 @@
               <w:tab w:val="right" w:leader="dot" w:pos="8828"/>
             </w:tabs>
             <w:rPr>
-              <w:rFonts w:eastAsiaTheme="minorEastAsia"/>
+              <w:rFonts w:asciiTheme="minorHAnsi" w:eastAsiaTheme="minorEastAsia" w:hAnsiTheme="minorHAnsi"/>
               <w:noProof/>
+              <w:color w:val="auto"/>
               <w:sz w:val="22"/>
               <w:szCs w:val="22"/>
               <w:lang w:val="es-MX" w:eastAsia="es-MX"/>
             </w:rPr>
           </w:pPr>
-          <w:hyperlink w:anchor="_Toc241702561" w:history="1">
+          <w:hyperlink w:anchor="_Toc242124628" w:history="1">
             <w:r>
               <w:rPr>
                 <w:rStyle w:val="Hipervnculo"/>
@@ -932,7 +1125,7 @@
                 <w:noProof/>
                 <w:webHidden/>
               </w:rPr>
-              <w:instrText xml:space="preserve"> PAGEREF _Toc241702561 \h </w:instrText>
+              <w:instrText xml:space="preserve"> PAGEREF _Toc242124628 \h </w:instrText>
             </w:r>
             <w:r>
               <w:rPr>
@@ -952,7 +1145,7 @@
                 <w:noProof/>
                 <w:webHidden/>
               </w:rPr>
-              <w:t>9</w:t>
+              <w:t>11</w:t>
             </w:r>
             <w:r>
               <w:rPr>
@@ -970,21 +1163,22 @@
               <w:tab w:val="right" w:leader="dot" w:pos="8828"/>
             </w:tabs>
             <w:rPr>
-              <w:rFonts w:eastAsiaTheme="minorEastAsia"/>
+              <w:rFonts w:asciiTheme="minorHAnsi" w:eastAsiaTheme="minorEastAsia" w:hAnsiTheme="minorHAnsi"/>
               <w:noProof/>
+              <w:color w:val="auto"/>
               <w:sz w:val="22"/>
               <w:szCs w:val="22"/>
               <w:lang w:val="es-MX" w:eastAsia="es-MX"/>
             </w:rPr>
           </w:pPr>
-          <w:hyperlink w:anchor="_Toc241702562" w:history="1">
+          <w:hyperlink w:anchor="_Toc242124629" w:history="1">
             <w:r>
               <w:rPr>
                 <w:rStyle w:val="Hipervnculo"/>
                 <w:rFonts w:cs="Times New Roman"/>
                 <w:noProof/>
               </w:rPr>
-              <w:t>Alcance</w:t>
+              <w:t>2. Alcance</w:t>
             </w:r>
             <w:r>
               <w:rPr>
@@ -1005,7 +1199,7 @@
                 <w:noProof/>
                 <w:webHidden/>
               </w:rPr>
-              <w:instrText xml:space="preserve"> PAGEREF _Toc241702562 \h </w:instrText>
+              <w:instrText xml:space="preserve"> PAGEREF _Toc242124629 \h </w:instrText>
             </w:r>
             <w:r>
               <w:rPr>
@@ -1025,7 +1219,7 @@
                 <w:noProof/>
                 <w:webHidden/>
               </w:rPr>
-              <w:t>12</w:t>
+              <w:t>13</w:t>
             </w:r>
             <w:r>
               <w:rPr>
@@ -1043,21 +1237,22 @@
               <w:tab w:val="right" w:leader="dot" w:pos="8828"/>
             </w:tabs>
             <w:rPr>
-              <w:rFonts w:eastAsiaTheme="minorEastAsia"/>
+              <w:rFonts w:asciiTheme="minorHAnsi" w:eastAsiaTheme="minorEastAsia" w:hAnsiTheme="minorHAnsi"/>
               <w:noProof/>
+              <w:color w:val="auto"/>
               <w:sz w:val="22"/>
               <w:szCs w:val="22"/>
               <w:lang w:val="es-MX" w:eastAsia="es-MX"/>
             </w:rPr>
           </w:pPr>
-          <w:hyperlink w:anchor="_Toc241702563" w:history="1">
+          <w:hyperlink w:anchor="_Toc242124630" w:history="1">
             <w:r>
               <w:rPr>
                 <w:rStyle w:val="Hipervnculo"/>
                 <w:rFonts w:cs="Times New Roman"/>
                 <w:noProof/>
               </w:rPr>
-              <w:t>Inclusiones</w:t>
+              <w:t>2.1 Inclusiones</w:t>
             </w:r>
             <w:r>
               <w:rPr>
@@ -1078,7 +1273,7 @@
                 <w:noProof/>
                 <w:webHidden/>
               </w:rPr>
-              <w:instrText xml:space="preserve"> PAGEREF _Toc241702563 \h </w:instrText>
+              <w:instrText xml:space="preserve"> PAGEREF _Toc242124630 \h </w:instrText>
             </w:r>
             <w:r>
               <w:rPr>
@@ -1098,7 +1293,7 @@
                 <w:noProof/>
                 <w:webHidden/>
               </w:rPr>
-              <w:t>12</w:t>
+              <w:t>13</w:t>
             </w:r>
             <w:r>
               <w:rPr>
@@ -1116,21 +1311,22 @@
               <w:tab w:val="right" w:leader="dot" w:pos="8828"/>
             </w:tabs>
             <w:rPr>
-              <w:rFonts w:eastAsiaTheme="minorEastAsia"/>
+              <w:rFonts w:asciiTheme="minorHAnsi" w:eastAsiaTheme="minorEastAsia" w:hAnsiTheme="minorHAnsi"/>
               <w:noProof/>
+              <w:color w:val="auto"/>
               <w:sz w:val="22"/>
               <w:szCs w:val="22"/>
               <w:lang w:val="es-MX" w:eastAsia="es-MX"/>
             </w:rPr>
           </w:pPr>
-          <w:hyperlink w:anchor="_Toc241702564" w:history="1">
+          <w:hyperlink w:anchor="_Toc242124631" w:history="1">
             <w:r>
               <w:rPr>
                 <w:rStyle w:val="Hipervnculo"/>
                 <w:rFonts w:cs="Times New Roman"/>
                 <w:noProof/>
               </w:rPr>
-              <w:t>Exclusiones</w:t>
+              <w:t>2.2 Exclusiones</w:t>
             </w:r>
             <w:r>
               <w:rPr>
@@ -1151,7 +1347,7 @@
                 <w:noProof/>
                 <w:webHidden/>
               </w:rPr>
-              <w:instrText xml:space="preserve"> PAGEREF _Toc241702564 \h </w:instrText>
+              <w:instrText xml:space="preserve"> PAGEREF _Toc242124631 \h </w:instrText>
             </w:r>
             <w:r>
               <w:rPr>
@@ -1257,7 +1453,7 @@
           <w:lang w:val="en-US"/>
         </w:rPr>
       </w:pPr>
-      <w:bookmarkStart w:id="0" w:name="_Toc241702554"/>
+      <w:bookmarkStart w:id="0" w:name="_Toc242124618"/>
       <w:proofErr w:type="spellStart"/>
       <w:r>
         <w:rPr>
@@ -1628,7 +1824,7 @@
         <w:jc w:val="both"/>
         <w:rPr>
           <w:rFonts w:cs="Times New Roman"/>
-          <w:lang w:val="en-US"/>
+          <w:lang w:val="es-MX"/>
         </w:rPr>
       </w:pPr>
       <w:r>
@@ -1642,13 +1838,13 @@
       <w:pPr>
         <w:rPr>
           <w:rFonts w:cs="Times New Roman"/>
-          <w:lang w:val="en-US"/>
-        </w:rPr>
-      </w:pPr>
-      <w:r>
-        <w:rPr>
-          <w:rFonts w:cs="Times New Roman"/>
-          <w:lang w:val="en-US"/>
+          <w:lang w:val="es-MX"/>
+        </w:rPr>
+      </w:pPr>
+      <w:r>
+        <w:rPr>
+          <w:rFonts w:cs="Times New Roman"/>
+          <w:lang w:val="es-MX"/>
         </w:rPr>
         <w:br w:type="page"/>
       </w:r>
@@ -1661,7 +1857,7 @@
           <w:szCs w:val="24"/>
         </w:rPr>
       </w:pPr>
-      <w:bookmarkStart w:id="1" w:name="_Toc241702555"/>
+      <w:bookmarkStart w:id="1" w:name="_Toc242124619"/>
       <w:r>
         <w:rPr>
           <w:rFonts w:cs="Times New Roman"/>
@@ -1823,7 +2019,7 @@
           <w:szCs w:val="24"/>
         </w:rPr>
       </w:pPr>
-      <w:bookmarkStart w:id="2" w:name="_Toc241702556"/>
+      <w:bookmarkStart w:id="2" w:name="_Toc242124620"/>
       <w:r>
         <w:rPr>
           <w:rFonts w:cs="Times New Roman"/>
@@ -1898,19 +2094,28 @@
       <w:pPr>
         <w:pStyle w:val="Ttulo1"/>
       </w:pPr>
-      <w:bookmarkStart w:id="3" w:name="_Toc241702560"/>
       <w:r>
         <w:lastRenderedPageBreak/>
-        <w:t>1. Objetivos</w:t>
-      </w:r>
+        <w:t xml:space="preserve"> </w:t>
+      </w:r>
+      <w:bookmarkStart w:id="3" w:name="_Toc242124621"/>
+      <w:r>
+        <w:t>Objetivos</w:t>
+      </w:r>
+      <w:bookmarkEnd w:id="3"/>
     </w:p>
     <w:p>
       <w:pPr>
         <w:pStyle w:val="Ttulo2"/>
       </w:pPr>
       <w:r>
-        <w:t>1.1 Objetivo general</w:t>
-      </w:r>
+        <w:t xml:space="preserve"> </w:t>
+      </w:r>
+      <w:bookmarkStart w:id="4" w:name="_Toc242124622"/>
+      <w:r>
+        <w:t>Objetivo general</w:t>
+      </w:r>
+      <w:bookmarkEnd w:id="4"/>
     </w:p>
     <w:p>
       <w:r>
@@ -1922,750 +2127,300 @@
         <w:pStyle w:val="Ttulo2"/>
       </w:pPr>
       <w:r>
-        <w:t>1.2 Objetivos específicos</w:t>
+        <w:t xml:space="preserve"> </w:t>
+      </w:r>
+      <w:bookmarkStart w:id="5" w:name="_Toc242124623"/>
+      <w:r>
+        <w:t>Objetivos específicos</w:t>
+      </w:r>
+      <w:bookmarkEnd w:id="5"/>
+    </w:p>
+    <w:p>
+      <w:pPr>
+        <w:rPr>
+          <w:lang w:val="es-MX"/>
+        </w:rPr>
+      </w:pPr>
+      <w:r>
+        <w:rPr>
+          <w:lang w:val="es-MX"/>
+        </w:rPr>
+        <w:t>Identificar las principales interacciones que los usuarios pueden realizar sobre las recetas dentro de la comunidad de Sazón.</w:t>
+      </w:r>
+    </w:p>
+    <w:p>
+      <w:pPr>
+        <w:rPr>
+          <w:lang w:val="es-MX"/>
+        </w:rPr>
+      </w:pPr>
+      <w:r>
+        <w:rPr>
+          <w:lang w:val="es-MX"/>
+        </w:rPr>
+        <w:t>Diseñar la estructura de datos necesaria para registrar calificaciones, comentarios, favoritos, colecciones y reportes realizados por los usuarios.</w:t>
+      </w:r>
+    </w:p>
+    <w:p>
+      <w:pPr>
+        <w:rPr>
+          <w:lang w:val="es-MX"/>
+        </w:rPr>
+      </w:pPr>
+      <w:r>
+        <w:rPr>
+          <w:lang w:val="es-MX"/>
+        </w:rPr>
+        <w:t>Implementar las relaciones entre las entidades que conforman el módulo de comunidad, permitiendo almacenar y consultar la información generada por las interacciones de los usuarios.</w:t>
+      </w:r>
+    </w:p>
+    <w:p>
+      <w:pPr>
+        <w:rPr>
+          <w:lang w:val="es-MX"/>
+        </w:rPr>
+      </w:pPr>
+      <w:r>
+        <w:rPr>
+          <w:lang w:val="es-MX"/>
+        </w:rPr>
+        <w:t>Gestionar las calificaciones realizadas sobre las recetas para registrar la valoración de los usuarios y contribuir a la organización de la información del recetario.</w:t>
+      </w:r>
+    </w:p>
+    <w:p>
+      <w:pPr>
+        <w:rPr>
+          <w:lang w:val="es-MX"/>
+        </w:rPr>
+      </w:pPr>
+      <w:r>
+        <w:rPr>
+          <w:lang w:val="es-MX"/>
+        </w:rPr>
+        <w:t>Registrar los comentarios realizados por los usuarios sobre las recetas, conservando información relacionada con su autor, fecha y contenido.</w:t>
+      </w:r>
+    </w:p>
+    <w:p>
+      <w:pPr>
+        <w:rPr>
+          <w:lang w:val="es-MX"/>
+        </w:rPr>
+      </w:pPr>
+      <w:r>
+        <w:rPr>
+          <w:lang w:val="es-MX"/>
+        </w:rPr>
+        <w:t>Organizar las recetas favoritas de los usuarios mediante colecciones que permitan agrupar y administrar diferentes recetas.</w:t>
+      </w:r>
+    </w:p>
+    <w:p>
+      <w:pPr>
+        <w:rPr>
+          <w:lang w:val="es-MX"/>
+        </w:rPr>
+      </w:pPr>
+      <w:r>
+        <w:rPr>
+          <w:lang w:val="es-MX"/>
+        </w:rPr>
+        <w:t>Gestionar los reportes realizados por los usuarios sobre contenido que pueda afectar la calidad o convivencia de la comunidad.</w:t>
+      </w:r>
+    </w:p>
+    <w:p>
+      <w:pPr>
+        <w:spacing w:after="160" w:line="278" w:lineRule="auto"/>
+        <w:ind w:firstLine="0"/>
+        <w:rPr>
+          <w:rFonts w:ascii="Arial" w:eastAsiaTheme="minorEastAsia" w:hAnsi="Arial"/>
+          <w:color w:val="auto"/>
+          <w:kern w:val="0"/>
+          <w:sz w:val="22"/>
+          <w:szCs w:val="22"/>
+          <w:lang w:val="es-MX"/>
+          <w14:ligatures w14:val="none"/>
+        </w:rPr>
+      </w:pPr>
+      <w:r>
+        <w:rPr>
+          <w:lang w:val="es-MX"/>
+        </w:rPr>
+        <w:br w:type="page"/>
       </w:r>
     </w:p>
     <w:p>
       <w:pPr>
         <w:pStyle w:val="Listaconvietas"/>
+        <w:numPr>
+          <w:ilvl w:val="0"/>
+          <w:numId w:val="0"/>
+        </w:numPr>
         <w:spacing w:line="480" w:lineRule="auto"/>
-      </w:pPr>
-      <w:proofErr w:type="spellStart"/>
-      <w:r>
-        <w:t>Identificar</w:t>
-      </w:r>
-      <w:proofErr w:type="spellEnd"/>
-      <w:r>
-        <w:t xml:space="preserve"> las </w:t>
-      </w:r>
-      <w:proofErr w:type="spellStart"/>
-      <w:r>
-        <w:t>principales</w:t>
-      </w:r>
-      <w:proofErr w:type="spellEnd"/>
+        <w:ind w:left="360"/>
+        <w:rPr>
+          <w:lang w:val="es-MX"/>
+        </w:rPr>
+      </w:pPr>
+    </w:p>
+    <w:p>
+      <w:pPr>
+        <w:pStyle w:val="Ttulo1"/>
+        <w:rPr>
+          <w:rFonts w:cs="Times New Roman"/>
+          <w:szCs w:val="24"/>
+        </w:rPr>
+      </w:pPr>
+      <w:bookmarkStart w:id="6" w:name="_Toc242124624"/>
+      <w:r>
+        <w:rPr>
+          <w:rFonts w:cs="Times New Roman"/>
+          <w:szCs w:val="24"/>
+        </w:rPr>
+        <w:t>Planteamiento del problema</w:t>
+      </w:r>
+      <w:bookmarkEnd w:id="6"/>
+    </w:p>
+    <w:p>
+      <w:pPr>
+        <w:rPr>
+          <w:rFonts w:cs="Times New Roman"/>
+        </w:rPr>
+      </w:pPr>
+    </w:p>
+    <w:p>
+      <w:pPr>
+        <w:rPr>
+          <w:rFonts w:cs="Times New Roman"/>
+        </w:rPr>
+      </w:pPr>
+    </w:p>
+    <w:p>
+      <w:pPr>
+        <w:rPr>
+          <w:rFonts w:cs="Times New Roman"/>
+        </w:rPr>
+      </w:pPr>
+    </w:p>
+    <w:p>
+      <w:pPr>
+        <w:pStyle w:val="Ttulo2"/>
+      </w:pPr>
       <w:r>
         <w:t xml:space="preserve"> </w:t>
       </w:r>
-      <w:proofErr w:type="spellStart"/>
-      <w:r>
-        <w:t>interacciones</w:t>
-      </w:r>
-      <w:proofErr w:type="spellEnd"/>
-      <w:r>
-        <w:t xml:space="preserve"> que los </w:t>
-      </w:r>
-      <w:proofErr w:type="spellStart"/>
-      <w:r>
-        <w:t>usuarios</w:t>
-      </w:r>
-      <w:proofErr w:type="spellEnd"/>
-      <w:r>
+      <w:bookmarkStart w:id="7" w:name="_Toc242124625"/>
+      <w:r>
+        <w:t>Necesidad</w:t>
+      </w:r>
+      <w:bookmarkEnd w:id="7"/>
+    </w:p>
+    <w:p>
+      <w:pPr>
+        <w:rPr>
+          <w:lang w:val="es-MX" w:eastAsia="es-MX"/>
+        </w:rPr>
+      </w:pPr>
+      <w:r>
+        <w:rPr>
+          <w:lang w:val="es-MX" w:eastAsia="es-MX"/>
+        </w:rPr>
+        <w:t>Dentro de una plataforma gastronómica moderna, la simple consulta de ingredientes y pasos resulta insuficiente para generar fidelización. Los usuarios requieren conocer la experiencia real de otras personas al preparar un platillo (tiempo real empleado, posibles sustituciones de ingredientes y nivel de dificultad percibido). Sin un módulo de comunidad y valoraciones, la plataforma carece de "prueba social", lo que disminuye la confianza del usuario al momento de seleccionar una receta.</w:t>
+      </w:r>
+    </w:p>
+    <w:p>
+      <w:pPr>
+        <w:pStyle w:val="Ttulo2"/>
+        <w:rPr>
+          <w:rFonts w:eastAsia="Times New Roman"/>
+          <w:lang w:val="es-MX" w:eastAsia="es-MX"/>
+        </w:rPr>
+      </w:pPr>
+      <w:r>
+        <w:rPr>
+          <w:rFonts w:eastAsia="Times New Roman"/>
+          <w:lang w:val="es-MX" w:eastAsia="es-MX"/>
+        </w:rPr>
         <w:t xml:space="preserve"> </w:t>
       </w:r>
-      <w:proofErr w:type="spellStart"/>
-      <w:r>
-        <w:t>pueden</w:t>
-      </w:r>
-      <w:proofErr w:type="spellEnd"/>
-      <w:r>
-        <w:t xml:space="preserve"> </w:t>
-      </w:r>
-      <w:proofErr w:type="spellStart"/>
-      <w:r>
-        <w:t>realizar</w:t>
-      </w:r>
-      <w:proofErr w:type="spellEnd"/>
-      <w:r>
-        <w:t xml:space="preserve"> </w:t>
-      </w:r>
-      <w:proofErr w:type="spellStart"/>
-      <w:r>
-        <w:t>sobre</w:t>
-      </w:r>
-      <w:proofErr w:type="spellEnd"/>
-      <w:r>
-        <w:t xml:space="preserve"> las </w:t>
-      </w:r>
-      <w:proofErr w:type="spellStart"/>
-      <w:r>
-        <w:t>recetas</w:t>
-      </w:r>
-      <w:proofErr w:type="spellEnd"/>
-      <w:r>
-        <w:t xml:space="preserve"> dentro de la </w:t>
-      </w:r>
-      <w:proofErr w:type="spellStart"/>
-      <w:r>
-        <w:t>comunidad</w:t>
-      </w:r>
-      <w:proofErr w:type="spellEnd"/>
-      <w:r>
-        <w:t xml:space="preserve"> de </w:t>
-      </w:r>
-      <w:proofErr w:type="spellStart"/>
-      <w:r>
-        <w:t>Sazón</w:t>
-      </w:r>
-      <w:proofErr w:type="spellEnd"/>
-      <w:r>
-        <w:t>.</w:t>
-      </w:r>
-    </w:p>
-    <w:p>
-      <w:pPr>
-        <w:pStyle w:val="Listaconvietas"/>
-        <w:spacing w:line="480" w:lineRule="auto"/>
-      </w:pPr>
-      <w:proofErr w:type="spellStart"/>
-      <w:r>
-        <w:t>Diseñar</w:t>
-      </w:r>
-      <w:proofErr w:type="spellEnd"/>
-      <w:r>
-        <w:t xml:space="preserve"> la </w:t>
-      </w:r>
-      <w:proofErr w:type="spellStart"/>
-      <w:r>
-        <w:t>estructura</w:t>
-      </w:r>
-      <w:proofErr w:type="spellEnd"/>
-      <w:r>
-        <w:t xml:space="preserve"> de </w:t>
-      </w:r>
-      <w:proofErr w:type="spellStart"/>
-      <w:r>
-        <w:t>datos</w:t>
-      </w:r>
-      <w:proofErr w:type="spellEnd"/>
-      <w:r>
-        <w:t xml:space="preserve"> </w:t>
-      </w:r>
-      <w:proofErr w:type="spellStart"/>
-      <w:r>
-        <w:t>necesaria</w:t>
-      </w:r>
-      <w:proofErr w:type="spellEnd"/>
-      <w:r>
-        <w:t xml:space="preserve"> para registrar </w:t>
-      </w:r>
-      <w:proofErr w:type="spellStart"/>
-      <w:r>
-        <w:t>calificaciones</w:t>
-      </w:r>
-      <w:proofErr w:type="spellEnd"/>
-      <w:r>
-        <w:t xml:space="preserve">, </w:t>
-      </w:r>
-      <w:proofErr w:type="spellStart"/>
-      <w:r>
-        <w:t>comentarios</w:t>
-      </w:r>
-      <w:proofErr w:type="spellEnd"/>
-      <w:r>
-        <w:t xml:space="preserve">, </w:t>
-      </w:r>
-      <w:proofErr w:type="spellStart"/>
-      <w:r>
-        <w:t>favoritos</w:t>
-      </w:r>
-      <w:proofErr w:type="spellEnd"/>
-      <w:r>
-        <w:t xml:space="preserve">, </w:t>
-      </w:r>
-      <w:proofErr w:type="spellStart"/>
-      <w:r>
-        <w:t>colecciones</w:t>
-      </w:r>
-      <w:proofErr w:type="spellEnd"/>
-      <w:r>
-        <w:t xml:space="preserve"> y </w:t>
-      </w:r>
-      <w:proofErr w:type="spellStart"/>
-      <w:r>
-        <w:t>reportes</w:t>
-      </w:r>
-      <w:proofErr w:type="spellEnd"/>
-      <w:r>
-        <w:t xml:space="preserve"> </w:t>
-      </w:r>
-      <w:proofErr w:type="spellStart"/>
-      <w:r>
-        <w:t>realizados</w:t>
-      </w:r>
-      <w:proofErr w:type="spellEnd"/>
-      <w:r>
-        <w:t xml:space="preserve"> por los </w:t>
-      </w:r>
-      <w:proofErr w:type="spellStart"/>
-      <w:r>
-        <w:t>usuarios</w:t>
-      </w:r>
-      <w:proofErr w:type="spellEnd"/>
-      <w:r>
-        <w:t>.</w:t>
-      </w:r>
-    </w:p>
-    <w:p>
-      <w:pPr>
-        <w:pStyle w:val="Listaconvietas"/>
-        <w:spacing w:line="480" w:lineRule="auto"/>
-      </w:pPr>
-      <w:proofErr w:type="spellStart"/>
-      <w:r>
-        <w:t>Implementar</w:t>
-      </w:r>
-      <w:proofErr w:type="spellEnd"/>
-      <w:r>
-        <w:t xml:space="preserve"> las </w:t>
-      </w:r>
-      <w:proofErr w:type="spellStart"/>
-      <w:r>
-        <w:t>relaciones</w:t>
-      </w:r>
-      <w:proofErr w:type="spellEnd"/>
-      <w:r>
-        <w:t xml:space="preserve"> entre las </w:t>
-      </w:r>
-      <w:proofErr w:type="spellStart"/>
-      <w:r>
-        <w:t>entidades</w:t>
-      </w:r>
-      <w:proofErr w:type="spellEnd"/>
-      <w:r>
-        <w:t xml:space="preserve"> que </w:t>
-      </w:r>
-      <w:proofErr w:type="spellStart"/>
-      <w:r>
-        <w:t>conforman</w:t>
-      </w:r>
-      <w:proofErr w:type="spellEnd"/>
-      <w:r>
-        <w:t xml:space="preserve"> </w:t>
-      </w:r>
-      <w:proofErr w:type="spellStart"/>
-      <w:r>
-        <w:t>el</w:t>
-      </w:r>
-      <w:proofErr w:type="spellEnd"/>
-      <w:r>
-        <w:t xml:space="preserve"> </w:t>
-      </w:r>
-      <w:proofErr w:type="spellStart"/>
-      <w:r>
-        <w:t>módulo</w:t>
-      </w:r>
-      <w:proofErr w:type="spellEnd"/>
-      <w:r>
-        <w:t xml:space="preserve"> de </w:t>
-      </w:r>
-      <w:proofErr w:type="spellStart"/>
-      <w:r>
-        <w:t>comunidad</w:t>
-      </w:r>
-      <w:proofErr w:type="spellEnd"/>
-      <w:r>
-        <w:t xml:space="preserve">, </w:t>
-      </w:r>
-      <w:proofErr w:type="spellStart"/>
-      <w:r>
-        <w:t>permitiendo</w:t>
-      </w:r>
-      <w:proofErr w:type="spellEnd"/>
-      <w:r>
-        <w:t xml:space="preserve"> </w:t>
-      </w:r>
-      <w:proofErr w:type="spellStart"/>
-      <w:r>
-        <w:t>almacenar</w:t>
-      </w:r>
-      <w:proofErr w:type="spellEnd"/>
-      <w:r>
-        <w:t xml:space="preserve"> y </w:t>
-      </w:r>
-      <w:proofErr w:type="spellStart"/>
-      <w:r>
-        <w:t>consultar</w:t>
-      </w:r>
-      <w:proofErr w:type="spellEnd"/>
-      <w:r>
-        <w:t xml:space="preserve"> la </w:t>
-      </w:r>
-      <w:proofErr w:type="spellStart"/>
-      <w:r>
-        <w:t>información</w:t>
-      </w:r>
-      <w:proofErr w:type="spellEnd"/>
-      <w:r>
-        <w:t xml:space="preserve"> </w:t>
-      </w:r>
-      <w:proofErr w:type="spellStart"/>
-      <w:r>
-        <w:t>generada</w:t>
-      </w:r>
-      <w:proofErr w:type="spellEnd"/>
-      <w:r>
-        <w:t xml:space="preserve"> por las </w:t>
-      </w:r>
-      <w:proofErr w:type="spellStart"/>
-      <w:r>
-        <w:t>interacciones</w:t>
-      </w:r>
-      <w:proofErr w:type="spellEnd"/>
-      <w:r>
-        <w:t xml:space="preserve"> de los </w:t>
-      </w:r>
-      <w:proofErr w:type="spellStart"/>
-      <w:r>
-        <w:t>usuarios</w:t>
-      </w:r>
-      <w:proofErr w:type="spellEnd"/>
-      <w:r>
-        <w:t>.</w:t>
-      </w:r>
-    </w:p>
-    <w:p>
-      <w:pPr>
-        <w:pStyle w:val="Listaconvietas"/>
-        <w:spacing w:line="480" w:lineRule="auto"/>
-      </w:pPr>
-      <w:proofErr w:type="spellStart"/>
-      <w:r>
-        <w:t>Gestionar</w:t>
-      </w:r>
-      <w:proofErr w:type="spellEnd"/>
-      <w:r>
-        <w:t xml:space="preserve"> las </w:t>
-      </w:r>
-      <w:proofErr w:type="spellStart"/>
-      <w:r>
-        <w:t>calificaciones</w:t>
-      </w:r>
-      <w:proofErr w:type="spellEnd"/>
-      <w:r>
-        <w:t xml:space="preserve"> </w:t>
-      </w:r>
-      <w:proofErr w:type="spellStart"/>
-      <w:r>
-        <w:t>realizadas</w:t>
-      </w:r>
-      <w:proofErr w:type="spellEnd"/>
-      <w:r>
-        <w:t xml:space="preserve"> </w:t>
-      </w:r>
-      <w:proofErr w:type="spellStart"/>
-      <w:r>
-        <w:t>sobre</w:t>
-      </w:r>
-      <w:proofErr w:type="spellEnd"/>
-      <w:r>
-        <w:t xml:space="preserve"> las </w:t>
-      </w:r>
-      <w:proofErr w:type="spellStart"/>
-      <w:r>
-        <w:t>recetas</w:t>
-      </w:r>
-      <w:proofErr w:type="spellEnd"/>
-      <w:r>
-        <w:t xml:space="preserve"> para registrar la </w:t>
-      </w:r>
-      <w:proofErr w:type="spellStart"/>
-      <w:r>
-        <w:t>valoración</w:t>
-      </w:r>
-      <w:proofErr w:type="spellEnd"/>
-      <w:r>
-        <w:t xml:space="preserve"> de los </w:t>
-      </w:r>
-      <w:proofErr w:type="spellStart"/>
-      <w:r>
-        <w:t>usuarios</w:t>
-      </w:r>
-      <w:proofErr w:type="spellEnd"/>
-      <w:r>
-        <w:t xml:space="preserve"> y </w:t>
-      </w:r>
-      <w:proofErr w:type="spellStart"/>
-      <w:r>
-        <w:t>contribuir</w:t>
-      </w:r>
-      <w:proofErr w:type="spellEnd"/>
-      <w:r>
-        <w:t xml:space="preserve"> a la </w:t>
-      </w:r>
-      <w:proofErr w:type="spellStart"/>
-      <w:r>
-        <w:t>organización</w:t>
-      </w:r>
-      <w:proofErr w:type="spellEnd"/>
-      <w:r>
-        <w:t xml:space="preserve"> de la </w:t>
-      </w:r>
-      <w:proofErr w:type="spellStart"/>
-      <w:r>
-        <w:t>información</w:t>
-      </w:r>
-      <w:proofErr w:type="spellEnd"/>
-      <w:r>
-        <w:t xml:space="preserve"> del </w:t>
-      </w:r>
-      <w:proofErr w:type="spellStart"/>
-      <w:r>
-        <w:t>recetario</w:t>
-      </w:r>
-      <w:proofErr w:type="spellEnd"/>
-      <w:r>
-        <w:t>.</w:t>
-      </w:r>
-    </w:p>
-    <w:p>
-      <w:pPr>
-        <w:pStyle w:val="Listaconvietas"/>
-        <w:spacing w:line="480" w:lineRule="auto"/>
-      </w:pPr>
-      <w:r>
-        <w:t xml:space="preserve">Registrar los </w:t>
-      </w:r>
-      <w:proofErr w:type="spellStart"/>
-      <w:r>
-        <w:t>comentarios</w:t>
-      </w:r>
-      <w:proofErr w:type="spellEnd"/>
-      <w:r>
-        <w:t xml:space="preserve"> </w:t>
-      </w:r>
-      <w:proofErr w:type="spellStart"/>
-      <w:r>
-        <w:t>realizados</w:t>
-      </w:r>
-      <w:proofErr w:type="spellEnd"/>
-      <w:r>
-        <w:t xml:space="preserve"> por los </w:t>
-      </w:r>
-      <w:proofErr w:type="spellStart"/>
-      <w:r>
-        <w:t>usuarios</w:t>
-      </w:r>
-      <w:proofErr w:type="spellEnd"/>
-      <w:r>
-        <w:t xml:space="preserve"> </w:t>
-      </w:r>
-      <w:proofErr w:type="spellStart"/>
-      <w:r>
-        <w:t>sobre</w:t>
-      </w:r>
-      <w:proofErr w:type="spellEnd"/>
-      <w:r>
-        <w:t xml:space="preserve"> las </w:t>
-      </w:r>
-      <w:proofErr w:type="spellStart"/>
-      <w:r>
-        <w:t>recetas</w:t>
-      </w:r>
-      <w:proofErr w:type="spellEnd"/>
-      <w:r>
-        <w:t xml:space="preserve">, </w:t>
-      </w:r>
-      <w:proofErr w:type="spellStart"/>
-      <w:r>
-        <w:t>conservando</w:t>
-      </w:r>
-      <w:proofErr w:type="spellEnd"/>
-      <w:r>
-        <w:t xml:space="preserve"> </w:t>
-      </w:r>
-      <w:proofErr w:type="spellStart"/>
-      <w:r>
-        <w:t>información</w:t>
-      </w:r>
-      <w:proofErr w:type="spellEnd"/>
-      <w:r>
-        <w:t xml:space="preserve"> </w:t>
-      </w:r>
-      <w:proofErr w:type="spellStart"/>
-      <w:r>
-        <w:t>relacionada</w:t>
-      </w:r>
-      <w:proofErr w:type="spellEnd"/>
-      <w:r>
-        <w:t xml:space="preserve"> con </w:t>
-      </w:r>
-      <w:proofErr w:type="spellStart"/>
-      <w:r>
-        <w:t>su</w:t>
-      </w:r>
-      <w:proofErr w:type="spellEnd"/>
-      <w:r>
-        <w:t xml:space="preserve"> </w:t>
-      </w:r>
-      <w:proofErr w:type="spellStart"/>
-      <w:r>
-        <w:t>autor</w:t>
-      </w:r>
-      <w:proofErr w:type="spellEnd"/>
-      <w:r>
-        <w:t xml:space="preserve">, </w:t>
-      </w:r>
-      <w:proofErr w:type="spellStart"/>
-      <w:r>
-        <w:t>fecha</w:t>
-      </w:r>
-      <w:proofErr w:type="spellEnd"/>
-      <w:r>
-        <w:t xml:space="preserve"> y </w:t>
-      </w:r>
-      <w:proofErr w:type="spellStart"/>
-      <w:r>
-        <w:t>contenido</w:t>
-      </w:r>
-      <w:proofErr w:type="spellEnd"/>
-      <w:r>
-        <w:t>.</w:t>
-      </w:r>
-    </w:p>
-    <w:p>
-      <w:pPr>
-        <w:pStyle w:val="Listaconvietas"/>
-        <w:spacing w:line="480" w:lineRule="auto"/>
-      </w:pPr>
-      <w:proofErr w:type="spellStart"/>
-      <w:r>
-        <w:t>Organizar</w:t>
-      </w:r>
-      <w:proofErr w:type="spellEnd"/>
-      <w:r>
-        <w:t xml:space="preserve"> las </w:t>
-      </w:r>
-      <w:proofErr w:type="spellStart"/>
-      <w:r>
-        <w:t>recetas</w:t>
-      </w:r>
-      <w:proofErr w:type="spellEnd"/>
-      <w:r>
-        <w:t xml:space="preserve"> </w:t>
-      </w:r>
-      <w:proofErr w:type="spellStart"/>
-      <w:r>
-        <w:t>favoritas</w:t>
-      </w:r>
-      <w:proofErr w:type="spellEnd"/>
-      <w:r>
-        <w:t xml:space="preserve"> de los </w:t>
-      </w:r>
-      <w:proofErr w:type="spellStart"/>
-      <w:r>
-        <w:t>usuarios</w:t>
-      </w:r>
-      <w:proofErr w:type="spellEnd"/>
-      <w:r>
-        <w:t xml:space="preserve"> </w:t>
-      </w:r>
-      <w:proofErr w:type="spellStart"/>
-      <w:r>
-        <w:t>mediante</w:t>
-      </w:r>
-      <w:proofErr w:type="spellEnd"/>
-      <w:r>
-        <w:t xml:space="preserve"> </w:t>
-      </w:r>
-      <w:proofErr w:type="spellStart"/>
-      <w:r>
-        <w:t>colecciones</w:t>
-      </w:r>
-      <w:proofErr w:type="spellEnd"/>
-      <w:r>
-        <w:t xml:space="preserve"> que </w:t>
-      </w:r>
-      <w:proofErr w:type="spellStart"/>
-      <w:r>
-        <w:t>permitan</w:t>
-      </w:r>
-      <w:proofErr w:type="spellEnd"/>
-      <w:r>
-        <w:t xml:space="preserve"> </w:t>
-      </w:r>
-      <w:proofErr w:type="spellStart"/>
-      <w:r>
-        <w:t>agrupar</w:t>
-      </w:r>
-      <w:proofErr w:type="spellEnd"/>
-      <w:r>
-        <w:t xml:space="preserve"> y </w:t>
-      </w:r>
-      <w:proofErr w:type="spellStart"/>
-      <w:r>
-        <w:t>administrar</w:t>
-      </w:r>
-      <w:proofErr w:type="spellEnd"/>
-      <w:r>
-        <w:t xml:space="preserve"> </w:t>
-      </w:r>
-      <w:proofErr w:type="spellStart"/>
-      <w:r>
-        <w:t>diferentes</w:t>
-      </w:r>
-      <w:proofErr w:type="spellEnd"/>
-      <w:r>
-        <w:t xml:space="preserve"> </w:t>
-      </w:r>
-      <w:proofErr w:type="spellStart"/>
-      <w:r>
-        <w:t>recetas</w:t>
-      </w:r>
-      <w:proofErr w:type="spellEnd"/>
-      <w:r>
-        <w:t>.</w:t>
-      </w:r>
-    </w:p>
-    <w:p>
-      <w:pPr>
-        <w:pStyle w:val="Listaconvietas"/>
-        <w:spacing w:line="480" w:lineRule="auto"/>
-      </w:pPr>
-      <w:proofErr w:type="spellStart"/>
-      <w:r>
-        <w:t>Gestionar</w:t>
-      </w:r>
-      <w:proofErr w:type="spellEnd"/>
-      <w:r>
-        <w:t xml:space="preserve"> los </w:t>
-      </w:r>
-      <w:proofErr w:type="spellStart"/>
-      <w:r>
-        <w:t>reportes</w:t>
-      </w:r>
-      <w:proofErr w:type="spellEnd"/>
-      <w:r>
-        <w:t xml:space="preserve"> </w:t>
-      </w:r>
-      <w:proofErr w:type="spellStart"/>
-      <w:r>
-        <w:t>realizados</w:t>
-      </w:r>
-      <w:proofErr w:type="spellEnd"/>
-      <w:r>
-        <w:t xml:space="preserve"> por los </w:t>
-      </w:r>
-      <w:proofErr w:type="spellStart"/>
-      <w:r>
-        <w:t>usuarios</w:t>
-      </w:r>
-      <w:proofErr w:type="spellEnd"/>
-      <w:r>
-        <w:t xml:space="preserve"> </w:t>
-      </w:r>
-      <w:proofErr w:type="spellStart"/>
-      <w:r>
-        <w:t>sobre</w:t>
-      </w:r>
-      <w:proofErr w:type="spellEnd"/>
-      <w:r>
-        <w:t xml:space="preserve"> </w:t>
-      </w:r>
-      <w:proofErr w:type="spellStart"/>
-      <w:r>
-        <w:t>contenido</w:t>
-      </w:r>
-      <w:proofErr w:type="spellEnd"/>
-      <w:r>
-        <w:t xml:space="preserve"> que </w:t>
-      </w:r>
-      <w:proofErr w:type="spellStart"/>
-      <w:r>
-        <w:t>pueda</w:t>
-      </w:r>
-      <w:proofErr w:type="spellEnd"/>
-      <w:r>
-        <w:t xml:space="preserve"> </w:t>
-      </w:r>
-      <w:proofErr w:type="spellStart"/>
-      <w:r>
-        <w:t>afectar</w:t>
-      </w:r>
-      <w:proofErr w:type="spellEnd"/>
-      <w:r>
-        <w:t xml:space="preserve"> la </w:t>
-      </w:r>
-      <w:proofErr w:type="spellStart"/>
-      <w:r>
-        <w:t>calidad</w:t>
-      </w:r>
-      <w:proofErr w:type="spellEnd"/>
-      <w:r>
-        <w:t xml:space="preserve"> o </w:t>
-      </w:r>
-      <w:proofErr w:type="spellStart"/>
-      <w:r>
-        <w:t>convivencia</w:t>
-      </w:r>
-      <w:proofErr w:type="spellEnd"/>
-      <w:r>
-        <w:t xml:space="preserve"> de la </w:t>
-      </w:r>
-      <w:proofErr w:type="spellStart"/>
-      <w:r>
-        <w:t>comunidad</w:t>
-      </w:r>
-      <w:proofErr w:type="spellEnd"/>
-      <w:r>
-        <w:t>.</w:t>
-      </w:r>
-    </w:p>
-    <w:p>
-      <w:pPr>
-        <w:pStyle w:val="Ttulo1"/>
-        <w:rPr>
-          <w:rFonts w:cs="Times New Roman"/>
-          <w:szCs w:val="24"/>
-        </w:rPr>
-      </w:pPr>
-      <w:r>
-        <w:rPr>
-          <w:rFonts w:cs="Times New Roman"/>
-          <w:szCs w:val="24"/>
+      <w:bookmarkStart w:id="8" w:name="_Toc242124626"/>
+      <w:r>
+        <w:rPr>
+          <w:rFonts w:eastAsia="Times New Roman"/>
+          <w:lang w:val="es-MX" w:eastAsia="es-MX"/>
+        </w:rPr>
+        <w:t>Manejo Actual</w:t>
+      </w:r>
+      <w:bookmarkEnd w:id="8"/>
+    </w:p>
+    <w:p>
+      <w:pPr>
+        <w:rPr>
+          <w:lang w:val="es-MX" w:eastAsia="es-MX"/>
+        </w:rPr>
+      </w:pPr>
+      <w:r>
+        <w:rPr>
+          <w:lang w:val="es-MX" w:eastAsia="es-MX"/>
+        </w:rPr>
+        <w:t xml:space="preserve">En la versión base de Sazón (y en blogs culinarios estáticos), el contenido fluye en una sola dirección: de la plataforma hacia el lector. Los usuarios consumen la </w:t>
+      </w:r>
+      <w:proofErr w:type="gramStart"/>
+      <w:r>
+        <w:rPr>
+          <w:lang w:val="es-MX" w:eastAsia="es-MX"/>
+        </w:rPr>
+        <w:t>receta</w:t>
+      </w:r>
+      <w:proofErr w:type="gramEnd"/>
+      <w:r>
+        <w:rPr>
+          <w:lang w:val="es-MX" w:eastAsia="es-MX"/>
+        </w:rPr>
+        <w:t xml:space="preserve"> pero no tienen un canal para calificar su precisión, sugerir mejoras, subir evidencias fotográficas o consultar opiniones de otros cocineros antes de preparar el alimento.</w:t>
+      </w:r>
+    </w:p>
+    <w:p>
+      <w:pPr>
+        <w:pStyle w:val="Ttulo2"/>
+        <w:rPr>
+          <w:rFonts w:eastAsia="Times New Roman"/>
+          <w:lang w:val="es-MX" w:eastAsia="es-MX"/>
+        </w:rPr>
+      </w:pPr>
+      <w:bookmarkStart w:id="9" w:name="_Toc242124627"/>
+      <w:r>
+        <w:rPr>
+          <w:rFonts w:eastAsia="Times New Roman"/>
+          <w:lang w:val="es-MX" w:eastAsia="es-MX"/>
+        </w:rPr>
+        <w:t>Solución Propuesta (Célula 6)</w:t>
+      </w:r>
+      <w:bookmarkEnd w:id="9"/>
+    </w:p>
+    <w:p>
+      <w:pPr>
+        <w:rPr>
+          <w:lang w:val="es-MX" w:eastAsia="es-MX"/>
+        </w:rPr>
+      </w:pPr>
+      <w:r>
+        <w:rPr>
+          <w:lang w:val="es-MX" w:eastAsia="es-MX"/>
+        </w:rPr>
+        <w:t xml:space="preserve">La Célula 6 implementará un Módulo de Comunidad y Valoraciones integrado de forma transparente en la plataforma. Esta solución permitirá a los usuarios registrados calificar las recetas mediante una escala de 1 a 5 estrellas, redactar reseñas con comentarios constructivos, responder a las opiniones de otros miembros y visualizar estadísticas </w:t>
+      </w:r>
+      <w:r>
+        <w:rPr>
+          <w:lang w:val="es-MX" w:eastAsia="es-MX"/>
         </w:rPr>
         <w:lastRenderedPageBreak/>
-        <w:t>Planteamiento del problema</w:t>
-      </w:r>
-      <w:bookmarkEnd w:id="3"/>
-    </w:p>
-    <w:p>
-      <w:pPr>
-        <w:rPr>
-          <w:rFonts w:cs="Times New Roman"/>
-        </w:rPr>
-      </w:pPr>
-    </w:p>
-    <w:p>
-      <w:pPr>
-        <w:rPr>
-          <w:rFonts w:cs="Times New Roman"/>
-        </w:rPr>
-      </w:pPr>
-    </w:p>
-    <w:p>
-      <w:pPr>
-        <w:rPr>
-          <w:rFonts w:cs="Times New Roman"/>
-        </w:rPr>
-      </w:pPr>
-    </w:p>
-    <w:p>
-      <w:pPr>
-        <w:rPr>
-          <w:rFonts w:cs="Times New Roman"/>
-        </w:rPr>
-      </w:pPr>
-      <w:r>
-        <w:rPr>
-          <w:rFonts w:cs="Times New Roman"/>
-        </w:rPr>
-        <w:t>Actualmente, la barbería gestiona sus citas de manera manual mediante mensajes y llamadas, lo que genera cruces de horarios, interrupciones constantes durante el servicio y un alto índice de inasistencias al no tener un seguimiento adecuado. Al analizar este flujo de trabajo diario, identificamos que la dependencia de la comunicación manual para agendar es el principal cuello de botella operativo y quita tiempo valioso. Para solucionar esto, desarrollaremos una aplicación de gestión centralizada que traslade esta carga a un sistema automatizado, permitiendo a los clientes reservar su propio espacio según la disponibilidad en tiempo real y recibir recordatorios automáticos, mientras los barberos cuentan con un panel administrativo que organiza sus horarios y el historial de cada cliente, eliminando por completo el uso de agendas físicas y chats desorganizados.</w:t>
-      </w:r>
-    </w:p>
-    <w:p>
-      <w:pPr>
-        <w:rPr>
-          <w:rFonts w:cs="Times New Roman"/>
+        <w:t>agregadas (promedios de valoración y número de reseñas) en cada ficha de receta, fomentando un ecosistema culinario participativo.</w:t>
+      </w:r>
+    </w:p>
+    <w:p>
+      <w:pPr>
+        <w:rPr>
+          <w:rFonts w:cs="Times New Roman"/>
+          <w:lang w:val="es-MX"/>
         </w:rPr>
       </w:pPr>
     </w:p>
@@ -2679,7 +2434,7 @@
           <w:szCs w:val="24"/>
         </w:rPr>
       </w:pPr>
-      <w:bookmarkStart w:id="4" w:name="_Toc241140091"/>
+      <w:bookmarkStart w:id="10" w:name="_Toc241140091"/>
       <w:r>
         <w:rPr>
           <w:rFonts w:cs="Times New Roman"/>
@@ -2737,7 +2492,7 @@
         </w:rPr>
         <w:t xml:space="preserve"> - Comparativa</w:t>
       </w:r>
-      <w:bookmarkEnd w:id="4"/>
+      <w:bookmarkEnd w:id="10"/>
     </w:p>
     <w:tbl>
       <w:tblPr>
@@ -2892,7 +2647,6 @@
         <w:rPr>
           <w:rFonts w:cs="Times New Roman"/>
         </w:rPr>
-        <w:lastRenderedPageBreak/>
         <w:br w:type="page"/>
       </w:r>
     </w:p>
@@ -2904,7 +2658,7 @@
           <w:szCs w:val="24"/>
         </w:rPr>
       </w:pPr>
-      <w:bookmarkStart w:id="5" w:name="_Toc241702561"/>
+      <w:bookmarkStart w:id="11" w:name="_Toc242124628"/>
       <w:r>
         <w:rPr>
           <w:rFonts w:cs="Times New Roman"/>
@@ -2913,7 +2667,7 @@
         <w:lastRenderedPageBreak/>
         <w:t>Stack tecnológico</w:t>
       </w:r>
-      <w:bookmarkEnd w:id="5"/>
+      <w:bookmarkEnd w:id="11"/>
     </w:p>
     <w:p>
       <w:pPr>
@@ -3023,7 +2777,7 @@
           <w:szCs w:val="24"/>
         </w:rPr>
       </w:pPr>
-      <w:bookmarkStart w:id="6" w:name="_Toc241140366"/>
+      <w:bookmarkStart w:id="12" w:name="_Toc241140366"/>
       <w:r>
         <w:rPr>
           <w:rFonts w:cs="Times New Roman"/>
@@ -3089,7 +2843,7 @@
         </w:rPr>
         <w:t>tecnológico</w:t>
       </w:r>
-      <w:bookmarkEnd w:id="6"/>
+      <w:bookmarkEnd w:id="12"/>
       <w:r>
         <w:rPr>
           <w:rFonts w:cs="Times New Roman"/>
@@ -3107,6 +2861,7 @@
           <w:szCs w:val="24"/>
         </w:rPr>
       </w:pPr>
+      <w:bookmarkStart w:id="13" w:name="_Toc242124629"/>
       <w:r>
         <w:rPr>
           <w:rFonts w:cs="Times New Roman"/>
@@ -3115,6 +2870,7 @@
         <w:lastRenderedPageBreak/>
         <w:t>2. Alcance</w:t>
       </w:r>
+      <w:bookmarkEnd w:id="13"/>
     </w:p>
     <w:p>
       <w:pPr>
@@ -3137,6 +2893,7 @@
           <w:szCs w:val="24"/>
         </w:rPr>
       </w:pPr>
+      <w:bookmarkStart w:id="14" w:name="_Toc242124630"/>
       <w:r>
         <w:rPr>
           <w:rFonts w:cs="Times New Roman"/>
@@ -3144,6 +2901,7 @@
         </w:rPr>
         <w:t>2.1 Inclusiones</w:t>
       </w:r>
+      <w:bookmarkEnd w:id="14"/>
     </w:p>
     <w:p>
       <w:pPr>
@@ -3153,133 +2911,163 @@
           <w:rFonts w:ascii="Times New Roman" w:hAnsi="Times New Roman" w:cs="Times New Roman"/>
           <w:sz w:val="24"/>
           <w:szCs w:val="24"/>
-        </w:rPr>
-      </w:pPr>
-      <w:proofErr w:type="spellStart"/>
+          <w:lang w:val="es-MX"/>
+        </w:rPr>
+      </w:pPr>
       <w:r>
         <w:rPr>
           <w:rFonts w:ascii="Times New Roman" w:hAnsi="Times New Roman" w:cs="Times New Roman"/>
           <w:sz w:val="24"/>
           <w:szCs w:val="24"/>
-        </w:rPr>
-        <w:t>Registro</w:t>
-      </w:r>
-      <w:proofErr w:type="spellEnd"/>
-      <w:r>
+          <w:lang w:val="es-MX"/>
+        </w:rPr>
+        <w:t>Registro y gestión de las calificaciones realizadas por los usuarios sobre las recetas.</w:t>
+      </w:r>
+    </w:p>
+    <w:p>
+      <w:pPr>
+        <w:pStyle w:val="Listaconvietas"/>
+        <w:spacing w:line="480" w:lineRule="auto"/>
         <w:rPr>
           <w:rFonts w:ascii="Times New Roman" w:hAnsi="Times New Roman" w:cs="Times New Roman"/>
           <w:sz w:val="24"/>
           <w:szCs w:val="24"/>
-        </w:rPr>
-        <w:t xml:space="preserve"> y </w:t>
-      </w:r>
-      <w:proofErr w:type="spellStart"/>
+          <w:lang w:val="es-MX"/>
+        </w:rPr>
+      </w:pPr>
       <w:r>
         <w:rPr>
           <w:rFonts w:ascii="Times New Roman" w:hAnsi="Times New Roman" w:cs="Times New Roman"/>
           <w:sz w:val="24"/>
           <w:szCs w:val="24"/>
-        </w:rPr>
-        <w:t>gestión</w:t>
-      </w:r>
-      <w:proofErr w:type="spellEnd"/>
-      <w:r>
+          <w:lang w:val="es-MX"/>
+        </w:rPr>
+        <w:t>Registro de comentarios asociados a las recetas.</w:t>
+      </w:r>
+    </w:p>
+    <w:p>
+      <w:pPr>
+        <w:pStyle w:val="Listaconvietas"/>
+        <w:spacing w:line="480" w:lineRule="auto"/>
         <w:rPr>
           <w:rFonts w:ascii="Times New Roman" w:hAnsi="Times New Roman" w:cs="Times New Roman"/>
           <w:sz w:val="24"/>
           <w:szCs w:val="24"/>
-        </w:rPr>
-        <w:t xml:space="preserve"> de las </w:t>
-      </w:r>
-      <w:proofErr w:type="spellStart"/>
+          <w:lang w:val="es-MX"/>
+        </w:rPr>
+      </w:pPr>
       <w:r>
         <w:rPr>
           <w:rFonts w:ascii="Times New Roman" w:hAnsi="Times New Roman" w:cs="Times New Roman"/>
           <w:sz w:val="24"/>
           <w:szCs w:val="24"/>
-        </w:rPr>
-        <w:t>calificaciones</w:t>
-      </w:r>
-      <w:proofErr w:type="spellEnd"/>
-      <w:r>
+          <w:lang w:val="es-MX"/>
+        </w:rPr>
+        <w:t>Gestión de las recetas favoritas de cada usuario.</w:t>
+      </w:r>
+    </w:p>
+    <w:p>
+      <w:pPr>
+        <w:pStyle w:val="Listaconvietas"/>
+        <w:spacing w:line="480" w:lineRule="auto"/>
         <w:rPr>
           <w:rFonts w:ascii="Times New Roman" w:hAnsi="Times New Roman" w:cs="Times New Roman"/>
           <w:sz w:val="24"/>
           <w:szCs w:val="24"/>
-        </w:rPr>
-        <w:t xml:space="preserve"> </w:t>
-      </w:r>
-      <w:proofErr w:type="spellStart"/>
+          <w:lang w:val="es-MX"/>
+        </w:rPr>
+      </w:pPr>
       <w:r>
         <w:rPr>
           <w:rFonts w:ascii="Times New Roman" w:hAnsi="Times New Roman" w:cs="Times New Roman"/>
           <w:sz w:val="24"/>
           <w:szCs w:val="24"/>
-        </w:rPr>
-        <w:t>realizadas</w:t>
-      </w:r>
-      <w:proofErr w:type="spellEnd"/>
-      <w:r>
+          <w:lang w:val="es-MX"/>
+        </w:rPr>
+        <w:t>Creación y organización de colecciones de recetas.</w:t>
+      </w:r>
+    </w:p>
+    <w:p>
+      <w:pPr>
+        <w:pStyle w:val="Listaconvietas"/>
+        <w:spacing w:line="480" w:lineRule="auto"/>
         <w:rPr>
           <w:rFonts w:ascii="Times New Roman" w:hAnsi="Times New Roman" w:cs="Times New Roman"/>
           <w:sz w:val="24"/>
           <w:szCs w:val="24"/>
-        </w:rPr>
-        <w:t xml:space="preserve"> por los </w:t>
-      </w:r>
-      <w:proofErr w:type="spellStart"/>
+          <w:lang w:val="es-MX"/>
+        </w:rPr>
+      </w:pPr>
       <w:r>
         <w:rPr>
           <w:rFonts w:ascii="Times New Roman" w:hAnsi="Times New Roman" w:cs="Times New Roman"/>
           <w:sz w:val="24"/>
           <w:szCs w:val="24"/>
-        </w:rPr>
-        <w:t>usuarios</w:t>
-      </w:r>
-      <w:proofErr w:type="spellEnd"/>
+          <w:lang w:val="es-MX"/>
+        </w:rPr>
+        <w:t xml:space="preserve">Relación entre favoritos y colecciones mediante la entidad </w:t>
+      </w:r>
+      <w:proofErr w:type="spellStart"/>
       <w:r>
         <w:rPr>
           <w:rFonts w:ascii="Times New Roman" w:hAnsi="Times New Roman" w:cs="Times New Roman"/>
           <w:sz w:val="24"/>
           <w:szCs w:val="24"/>
-        </w:rPr>
-        <w:t xml:space="preserve"> </w:t>
-      </w:r>
-      <w:proofErr w:type="spellStart"/>
+          <w:lang w:val="es-MX"/>
+        </w:rPr>
+        <w:t>Favoritos_colecciones</w:t>
+      </w:r>
+      <w:proofErr w:type="spellEnd"/>
       <w:r>
         <w:rPr>
           <w:rFonts w:ascii="Times New Roman" w:hAnsi="Times New Roman" w:cs="Times New Roman"/>
           <w:sz w:val="24"/>
           <w:szCs w:val="24"/>
-        </w:rPr>
-        <w:t>sobre</w:t>
-      </w:r>
-      <w:proofErr w:type="spellEnd"/>
-      <w:r>
+          <w:lang w:val="es-MX"/>
+        </w:rPr>
+        <w:t>.</w:t>
+      </w:r>
+    </w:p>
+    <w:p>
+      <w:pPr>
+        <w:pStyle w:val="Listaconvietas"/>
+        <w:spacing w:line="480" w:lineRule="auto"/>
         <w:rPr>
           <w:rFonts w:ascii="Times New Roman" w:hAnsi="Times New Roman" w:cs="Times New Roman"/>
           <w:sz w:val="24"/>
           <w:szCs w:val="24"/>
-        </w:rPr>
-        <w:t xml:space="preserve"> las </w:t>
-      </w:r>
-      <w:proofErr w:type="spellStart"/>
+          <w:lang w:val="es-MX"/>
+        </w:rPr>
+      </w:pPr>
       <w:r>
         <w:rPr>
           <w:rFonts w:ascii="Times New Roman" w:hAnsi="Times New Roman" w:cs="Times New Roman"/>
           <w:sz w:val="24"/>
           <w:szCs w:val="24"/>
-        </w:rPr>
-        <w:t>recetas</w:t>
-      </w:r>
-      <w:proofErr w:type="spellEnd"/>
-      <w:r>
+          <w:lang w:val="es-MX"/>
+        </w:rPr>
+        <w:t>Registro y gestión de reportes realizados por los usuarios.</w:t>
+      </w:r>
+    </w:p>
+    <w:p>
+      <w:pPr>
+        <w:pStyle w:val="Listaconvietas"/>
+        <w:spacing w:line="480" w:lineRule="auto"/>
         <w:rPr>
           <w:rFonts w:ascii="Times New Roman" w:hAnsi="Times New Roman" w:cs="Times New Roman"/>
           <w:sz w:val="24"/>
           <w:szCs w:val="24"/>
-        </w:rPr>
-        <w:t>.</w:t>
+          <w:lang w:val="es-MX"/>
+        </w:rPr>
+      </w:pPr>
+      <w:r>
+        <w:rPr>
+          <w:rFonts w:ascii="Times New Roman" w:hAnsi="Times New Roman" w:cs="Times New Roman"/>
+          <w:sz w:val="24"/>
+          <w:szCs w:val="24"/>
+          <w:lang w:val="es-MX"/>
+        </w:rPr>
+        <w:t>Almacenamiento de la información necesaria para relacionar las acciones de los usuarios con las recetas.</w:t>
       </w:r>
     </w:p>
     <w:p>
@@ -3290,79 +3078,119 @@
           <w:rFonts w:ascii="Times New Roman" w:hAnsi="Times New Roman" w:cs="Times New Roman"/>
           <w:sz w:val="24"/>
           <w:szCs w:val="24"/>
-        </w:rPr>
-      </w:pPr>
-      <w:proofErr w:type="spellStart"/>
+          <w:lang w:val="es-MX"/>
+        </w:rPr>
+      </w:pPr>
       <w:r>
         <w:rPr>
           <w:rFonts w:ascii="Times New Roman" w:hAnsi="Times New Roman" w:cs="Times New Roman"/>
           <w:sz w:val="24"/>
           <w:szCs w:val="24"/>
-        </w:rPr>
-        <w:t>Registro</w:t>
-      </w:r>
-      <w:proofErr w:type="spellEnd"/>
-      <w:r>
+          <w:lang w:val="es-MX"/>
+        </w:rPr>
+        <w:t>Organización de la información mediante las entidades y relaciones definidas para el módulo de comunidad.</w:t>
+      </w:r>
+    </w:p>
+    <w:p>
+      <w:pPr>
+        <w:pStyle w:val="Listaconvietas"/>
+        <w:spacing w:line="480" w:lineRule="auto"/>
         <w:rPr>
           <w:rFonts w:ascii="Times New Roman" w:hAnsi="Times New Roman" w:cs="Times New Roman"/>
           <w:sz w:val="24"/>
           <w:szCs w:val="24"/>
-        </w:rPr>
-        <w:t xml:space="preserve"> de </w:t>
-      </w:r>
-      <w:proofErr w:type="spellStart"/>
+          <w:lang w:val="es-MX"/>
+        </w:rPr>
+      </w:pPr>
       <w:r>
         <w:rPr>
           <w:rFonts w:ascii="Times New Roman" w:hAnsi="Times New Roman" w:cs="Times New Roman"/>
           <w:sz w:val="24"/>
           <w:szCs w:val="24"/>
-        </w:rPr>
-        <w:t>comentarios</w:t>
-      </w:r>
-      <w:proofErr w:type="spellEnd"/>
-      <w:r>
+          <w:lang w:val="es-MX"/>
+        </w:rPr>
+        <w:t>Consulta de la información generada por las diferentes acciones sociales realizadas dentro del sistema.</w:t>
+      </w:r>
+    </w:p>
+    <w:p>
+      <w:pPr>
+        <w:pStyle w:val="Ttulo2"/>
+        <w:rPr>
+          <w:rFonts w:cs="Times New Roman"/>
+          <w:szCs w:val="24"/>
+        </w:rPr>
+      </w:pPr>
+      <w:bookmarkStart w:id="15" w:name="_Toc242124631"/>
+      <w:r>
+        <w:rPr>
+          <w:rFonts w:cs="Times New Roman"/>
+          <w:szCs w:val="24"/>
+        </w:rPr>
+        <w:t>2.2 Exclusiones</w:t>
+      </w:r>
+      <w:bookmarkEnd w:id="15"/>
+    </w:p>
+    <w:p>
+      <w:pPr>
+        <w:pStyle w:val="Listaconvietas"/>
+        <w:spacing w:line="480" w:lineRule="auto"/>
         <w:rPr>
           <w:rFonts w:ascii="Times New Roman" w:hAnsi="Times New Roman" w:cs="Times New Roman"/>
           <w:sz w:val="24"/>
           <w:szCs w:val="24"/>
-        </w:rPr>
-        <w:t xml:space="preserve"> </w:t>
-      </w:r>
-      <w:proofErr w:type="spellStart"/>
+          <w:lang w:val="es-MX"/>
+        </w:rPr>
+      </w:pPr>
       <w:r>
         <w:rPr>
           <w:rFonts w:ascii="Times New Roman" w:hAnsi="Times New Roman" w:cs="Times New Roman"/>
           <w:sz w:val="24"/>
           <w:szCs w:val="24"/>
-        </w:rPr>
-        <w:t>asociados</w:t>
-      </w:r>
-      <w:proofErr w:type="spellEnd"/>
-      <w:r>
+          <w:lang w:val="es-MX"/>
+        </w:rPr>
+        <w:t>Desarrollo de funcionalidades relacionadas con nutrición y perfiles alimentarios.</w:t>
+      </w:r>
+    </w:p>
+    <w:p>
+      <w:pPr>
+        <w:pStyle w:val="Listaconvietas"/>
+        <w:spacing w:line="480" w:lineRule="auto"/>
         <w:rPr>
           <w:rFonts w:ascii="Times New Roman" w:hAnsi="Times New Roman" w:cs="Times New Roman"/>
           <w:sz w:val="24"/>
           <w:szCs w:val="24"/>
-        </w:rPr>
-        <w:t xml:space="preserve"> a las </w:t>
-      </w:r>
-      <w:proofErr w:type="spellStart"/>
+          <w:lang w:val="es-MX"/>
+        </w:rPr>
+      </w:pPr>
       <w:r>
         <w:rPr>
           <w:rFonts w:ascii="Times New Roman" w:hAnsi="Times New Roman" w:cs="Times New Roman"/>
           <w:sz w:val="24"/>
           <w:szCs w:val="24"/>
-        </w:rPr>
-        <w:t>recetas</w:t>
-      </w:r>
-      <w:proofErr w:type="spellEnd"/>
-      <w:r>
+          <w:lang w:val="es-MX"/>
+        </w:rPr>
+        <w:t>Desarrollo de funcionalidades relacionadas con transporte, pedidos o entrega de productos.</w:t>
+      </w:r>
+    </w:p>
+    <w:p>
+      <w:pPr>
+        <w:pStyle w:val="Listaconvietas"/>
+        <w:spacing w:line="480" w:lineRule="auto"/>
         <w:rPr>
           <w:rFonts w:ascii="Times New Roman" w:hAnsi="Times New Roman" w:cs="Times New Roman"/>
           <w:sz w:val="24"/>
           <w:szCs w:val="24"/>
-        </w:rPr>
-        <w:t>.</w:t>
+          <w:lang w:val="es-MX"/>
+        </w:rPr>
+      </w:pPr>
+      <w:r>
+        <w:rPr>
+          <w:rFonts w:ascii="Times New Roman" w:hAnsi="Times New Roman" w:cs="Times New Roman"/>
+          <w:sz w:val="24"/>
+          <w:szCs w:val="24"/>
+          <w:lang w:val="es-MX"/>
+        </w:rPr>
+        <w:t>Gestión de información correspondiente a módulos diferentes al componente de comunidad.</w:t>
       </w:r>
     </w:p>
     <w:p>
@@ -3373,1537 +3201,39 @@
           <w:rFonts w:ascii="Times New Roman" w:hAnsi="Times New Roman" w:cs="Times New Roman"/>
           <w:sz w:val="24"/>
           <w:szCs w:val="24"/>
-        </w:rPr>
-      </w:pPr>
-      <w:proofErr w:type="spellStart"/>
+          <w:lang w:val="es-MX"/>
+        </w:rPr>
+      </w:pPr>
       <w:r>
         <w:rPr>
           <w:rFonts w:ascii="Times New Roman" w:hAnsi="Times New Roman" w:cs="Times New Roman"/>
           <w:sz w:val="24"/>
           <w:szCs w:val="24"/>
-        </w:rPr>
-        <w:t>Gestión</w:t>
-      </w:r>
-      <w:proofErr w:type="spellEnd"/>
-      <w:r>
+          <w:lang w:val="es-MX"/>
+        </w:rPr>
+        <w:lastRenderedPageBreak/>
+        <w:t>Administración de contenidos que no estén relacionados con las interacciones sociales definidas para las recetas.</w:t>
+      </w:r>
+    </w:p>
+    <w:p>
+      <w:pPr>
+        <w:pStyle w:val="Listaconvietas"/>
+        <w:spacing w:line="480" w:lineRule="auto"/>
         <w:rPr>
           <w:rFonts w:ascii="Times New Roman" w:hAnsi="Times New Roman" w:cs="Times New Roman"/>
           <w:sz w:val="24"/>
           <w:szCs w:val="24"/>
-        </w:rPr>
-        <w:t xml:space="preserve"> de las </w:t>
-      </w:r>
-      <w:proofErr w:type="spellStart"/>
+          <w:lang w:val="es-MX"/>
+        </w:rPr>
+      </w:pPr>
       <w:r>
         <w:rPr>
           <w:rFonts w:ascii="Times New Roman" w:hAnsi="Times New Roman" w:cs="Times New Roman"/>
           <w:sz w:val="24"/>
           <w:szCs w:val="24"/>
-        </w:rPr>
-        <w:t>recetas</w:t>
-      </w:r>
-      <w:proofErr w:type="spellEnd"/>
-      <w:r>
-        <w:rPr>
-          <w:rFonts w:ascii="Times New Roman" w:hAnsi="Times New Roman" w:cs="Times New Roman"/>
-          <w:sz w:val="24"/>
-          <w:szCs w:val="24"/>
-        </w:rPr>
-        <w:t xml:space="preserve"> </w:t>
-      </w:r>
-      <w:proofErr w:type="spellStart"/>
-      <w:r>
-        <w:rPr>
-          <w:rFonts w:ascii="Times New Roman" w:hAnsi="Times New Roman" w:cs="Times New Roman"/>
-          <w:sz w:val="24"/>
-          <w:szCs w:val="24"/>
-        </w:rPr>
-        <w:t>favoritas</w:t>
-      </w:r>
-      <w:proofErr w:type="spellEnd"/>
-      <w:r>
-        <w:rPr>
-          <w:rFonts w:ascii="Times New Roman" w:hAnsi="Times New Roman" w:cs="Times New Roman"/>
-          <w:sz w:val="24"/>
-          <w:szCs w:val="24"/>
-        </w:rPr>
-        <w:t xml:space="preserve"> de cada </w:t>
-      </w:r>
-      <w:proofErr w:type="spellStart"/>
-      <w:r>
-        <w:rPr>
-          <w:rFonts w:ascii="Times New Roman" w:hAnsi="Times New Roman" w:cs="Times New Roman"/>
-          <w:sz w:val="24"/>
-          <w:szCs w:val="24"/>
-        </w:rPr>
-        <w:t>usuario</w:t>
-      </w:r>
-      <w:proofErr w:type="spellEnd"/>
-      <w:r>
-        <w:rPr>
-          <w:rFonts w:ascii="Times New Roman" w:hAnsi="Times New Roman" w:cs="Times New Roman"/>
-          <w:sz w:val="24"/>
-          <w:szCs w:val="24"/>
-        </w:rPr>
-        <w:t>.</w:t>
-      </w:r>
-    </w:p>
-    <w:p>
-      <w:pPr>
-        <w:pStyle w:val="Listaconvietas"/>
-        <w:spacing w:line="480" w:lineRule="auto"/>
-        <w:rPr>
-          <w:rFonts w:ascii="Times New Roman" w:hAnsi="Times New Roman" w:cs="Times New Roman"/>
-          <w:sz w:val="24"/>
-          <w:szCs w:val="24"/>
-        </w:rPr>
-      </w:pPr>
-      <w:proofErr w:type="spellStart"/>
-      <w:r>
-        <w:rPr>
-          <w:rFonts w:ascii="Times New Roman" w:hAnsi="Times New Roman" w:cs="Times New Roman"/>
-          <w:sz w:val="24"/>
-          <w:szCs w:val="24"/>
-        </w:rPr>
-        <w:t>Creación</w:t>
-      </w:r>
-      <w:proofErr w:type="spellEnd"/>
-      <w:r>
-        <w:rPr>
-          <w:rFonts w:ascii="Times New Roman" w:hAnsi="Times New Roman" w:cs="Times New Roman"/>
-          <w:sz w:val="24"/>
-          <w:szCs w:val="24"/>
-        </w:rPr>
-        <w:t xml:space="preserve"> y </w:t>
-      </w:r>
-      <w:proofErr w:type="spellStart"/>
-      <w:r>
-        <w:rPr>
-          <w:rFonts w:ascii="Times New Roman" w:hAnsi="Times New Roman" w:cs="Times New Roman"/>
-          <w:sz w:val="24"/>
-          <w:szCs w:val="24"/>
-        </w:rPr>
-        <w:t>organización</w:t>
-      </w:r>
-      <w:proofErr w:type="spellEnd"/>
-      <w:r>
-        <w:rPr>
-          <w:rFonts w:ascii="Times New Roman" w:hAnsi="Times New Roman" w:cs="Times New Roman"/>
-          <w:sz w:val="24"/>
-          <w:szCs w:val="24"/>
-        </w:rPr>
-        <w:t xml:space="preserve"> de </w:t>
-      </w:r>
-      <w:proofErr w:type="spellStart"/>
-      <w:r>
-        <w:rPr>
-          <w:rFonts w:ascii="Times New Roman" w:hAnsi="Times New Roman" w:cs="Times New Roman"/>
-          <w:sz w:val="24"/>
-          <w:szCs w:val="24"/>
-        </w:rPr>
-        <w:t>colecciones</w:t>
-      </w:r>
-      <w:proofErr w:type="spellEnd"/>
-      <w:r>
-        <w:rPr>
-          <w:rFonts w:ascii="Times New Roman" w:hAnsi="Times New Roman" w:cs="Times New Roman"/>
-          <w:sz w:val="24"/>
-          <w:szCs w:val="24"/>
-        </w:rPr>
-        <w:t xml:space="preserve"> de </w:t>
-      </w:r>
-      <w:proofErr w:type="spellStart"/>
-      <w:r>
-        <w:rPr>
-          <w:rFonts w:ascii="Times New Roman" w:hAnsi="Times New Roman" w:cs="Times New Roman"/>
-          <w:sz w:val="24"/>
-          <w:szCs w:val="24"/>
-        </w:rPr>
-        <w:t>recetas</w:t>
-      </w:r>
-      <w:proofErr w:type="spellEnd"/>
-      <w:r>
-        <w:rPr>
-          <w:rFonts w:ascii="Times New Roman" w:hAnsi="Times New Roman" w:cs="Times New Roman"/>
-          <w:sz w:val="24"/>
-          <w:szCs w:val="24"/>
-        </w:rPr>
-        <w:t>.</w:t>
-      </w:r>
-    </w:p>
-    <w:p>
-      <w:pPr>
-        <w:pStyle w:val="Listaconvietas"/>
-        <w:spacing w:line="480" w:lineRule="auto"/>
-        <w:rPr>
-          <w:rFonts w:ascii="Times New Roman" w:hAnsi="Times New Roman" w:cs="Times New Roman"/>
-          <w:sz w:val="24"/>
-          <w:szCs w:val="24"/>
-        </w:rPr>
-      </w:pPr>
-      <w:proofErr w:type="spellStart"/>
-      <w:r>
-        <w:rPr>
-          <w:rFonts w:ascii="Times New Roman" w:hAnsi="Times New Roman" w:cs="Times New Roman"/>
-          <w:sz w:val="24"/>
-          <w:szCs w:val="24"/>
-        </w:rPr>
-        <w:t>Relación</w:t>
-      </w:r>
-      <w:proofErr w:type="spellEnd"/>
-      <w:r>
-        <w:rPr>
-          <w:rFonts w:ascii="Times New Roman" w:hAnsi="Times New Roman" w:cs="Times New Roman"/>
-          <w:sz w:val="24"/>
-          <w:szCs w:val="24"/>
-        </w:rPr>
-        <w:t xml:space="preserve"> entre </w:t>
-      </w:r>
-      <w:proofErr w:type="spellStart"/>
-      <w:r>
-        <w:rPr>
-          <w:rFonts w:ascii="Times New Roman" w:hAnsi="Times New Roman" w:cs="Times New Roman"/>
-          <w:sz w:val="24"/>
-          <w:szCs w:val="24"/>
-        </w:rPr>
-        <w:t>favoritos</w:t>
-      </w:r>
-      <w:proofErr w:type="spellEnd"/>
-      <w:r>
-        <w:rPr>
-          <w:rFonts w:ascii="Times New Roman" w:hAnsi="Times New Roman" w:cs="Times New Roman"/>
-          <w:sz w:val="24"/>
-          <w:szCs w:val="24"/>
-        </w:rPr>
-        <w:t xml:space="preserve"> y </w:t>
-      </w:r>
-      <w:proofErr w:type="spellStart"/>
-      <w:r>
-        <w:rPr>
-          <w:rFonts w:ascii="Times New Roman" w:hAnsi="Times New Roman" w:cs="Times New Roman"/>
-          <w:sz w:val="24"/>
-          <w:szCs w:val="24"/>
-        </w:rPr>
-        <w:t>colecciones</w:t>
-      </w:r>
-      <w:proofErr w:type="spellEnd"/>
-      <w:r>
-        <w:rPr>
-          <w:rFonts w:ascii="Times New Roman" w:hAnsi="Times New Roman" w:cs="Times New Roman"/>
-          <w:sz w:val="24"/>
-          <w:szCs w:val="24"/>
-        </w:rPr>
-        <w:t xml:space="preserve"> </w:t>
-      </w:r>
-      <w:proofErr w:type="spellStart"/>
-      <w:r>
-        <w:rPr>
-          <w:rFonts w:ascii="Times New Roman" w:hAnsi="Times New Roman" w:cs="Times New Roman"/>
-          <w:sz w:val="24"/>
-          <w:szCs w:val="24"/>
-        </w:rPr>
-        <w:t>mediante</w:t>
-      </w:r>
-      <w:proofErr w:type="spellEnd"/>
-      <w:r>
-        <w:rPr>
-          <w:rFonts w:ascii="Times New Roman" w:hAnsi="Times New Roman" w:cs="Times New Roman"/>
-          <w:sz w:val="24"/>
-          <w:szCs w:val="24"/>
-        </w:rPr>
-        <w:t xml:space="preserve"> la </w:t>
-      </w:r>
-      <w:proofErr w:type="spellStart"/>
-      <w:r>
-        <w:rPr>
-          <w:rFonts w:ascii="Times New Roman" w:hAnsi="Times New Roman" w:cs="Times New Roman"/>
-          <w:sz w:val="24"/>
-          <w:szCs w:val="24"/>
-        </w:rPr>
-        <w:t>entidad</w:t>
-      </w:r>
-      <w:proofErr w:type="spellEnd"/>
-      <w:r>
-        <w:rPr>
-          <w:rFonts w:ascii="Times New Roman" w:hAnsi="Times New Roman" w:cs="Times New Roman"/>
-          <w:sz w:val="24"/>
-          <w:szCs w:val="24"/>
-        </w:rPr>
-        <w:t xml:space="preserve"> </w:t>
-      </w:r>
-      <w:proofErr w:type="spellStart"/>
-      <w:r>
-        <w:rPr>
-          <w:rFonts w:ascii="Times New Roman" w:hAnsi="Times New Roman" w:cs="Times New Roman"/>
-          <w:sz w:val="24"/>
-          <w:szCs w:val="24"/>
-        </w:rPr>
-        <w:t>Favoritos_colecciones</w:t>
-      </w:r>
-      <w:proofErr w:type="spellEnd"/>
-      <w:r>
-        <w:rPr>
-          <w:rFonts w:ascii="Times New Roman" w:hAnsi="Times New Roman" w:cs="Times New Roman"/>
-          <w:sz w:val="24"/>
-          <w:szCs w:val="24"/>
-        </w:rPr>
-        <w:t>.</w:t>
-      </w:r>
-    </w:p>
-    <w:p>
-      <w:pPr>
-        <w:pStyle w:val="Listaconvietas"/>
-        <w:spacing w:line="480" w:lineRule="auto"/>
-        <w:rPr>
-          <w:rFonts w:ascii="Times New Roman" w:hAnsi="Times New Roman" w:cs="Times New Roman"/>
-          <w:sz w:val="24"/>
-          <w:szCs w:val="24"/>
-        </w:rPr>
-      </w:pPr>
-      <w:proofErr w:type="spellStart"/>
-      <w:r>
-        <w:rPr>
-          <w:rFonts w:ascii="Times New Roman" w:hAnsi="Times New Roman" w:cs="Times New Roman"/>
-          <w:sz w:val="24"/>
-          <w:szCs w:val="24"/>
-        </w:rPr>
-        <w:t>Registro</w:t>
-      </w:r>
-      <w:proofErr w:type="spellEnd"/>
-      <w:r>
-        <w:rPr>
-          <w:rFonts w:ascii="Times New Roman" w:hAnsi="Times New Roman" w:cs="Times New Roman"/>
-          <w:sz w:val="24"/>
-          <w:szCs w:val="24"/>
-        </w:rPr>
-        <w:t xml:space="preserve"> y </w:t>
-      </w:r>
-      <w:proofErr w:type="spellStart"/>
-      <w:r>
-        <w:rPr>
-          <w:rFonts w:ascii="Times New Roman" w:hAnsi="Times New Roman" w:cs="Times New Roman"/>
-          <w:sz w:val="24"/>
-          <w:szCs w:val="24"/>
-        </w:rPr>
-        <w:t>gestión</w:t>
-      </w:r>
-      <w:proofErr w:type="spellEnd"/>
-      <w:r>
-        <w:rPr>
-          <w:rFonts w:ascii="Times New Roman" w:hAnsi="Times New Roman" w:cs="Times New Roman"/>
-          <w:sz w:val="24"/>
-          <w:szCs w:val="24"/>
-        </w:rPr>
-        <w:t xml:space="preserve"> de </w:t>
-      </w:r>
-      <w:proofErr w:type="spellStart"/>
-      <w:r>
-        <w:rPr>
-          <w:rFonts w:ascii="Times New Roman" w:hAnsi="Times New Roman" w:cs="Times New Roman"/>
-          <w:sz w:val="24"/>
-          <w:szCs w:val="24"/>
-        </w:rPr>
-        <w:t>reportes</w:t>
-      </w:r>
-      <w:proofErr w:type="spellEnd"/>
-      <w:r>
-        <w:rPr>
-          <w:rFonts w:ascii="Times New Roman" w:hAnsi="Times New Roman" w:cs="Times New Roman"/>
-          <w:sz w:val="24"/>
-          <w:szCs w:val="24"/>
-        </w:rPr>
-        <w:t xml:space="preserve"> </w:t>
-      </w:r>
-      <w:proofErr w:type="spellStart"/>
-      <w:r>
-        <w:rPr>
-          <w:rFonts w:ascii="Times New Roman" w:hAnsi="Times New Roman" w:cs="Times New Roman"/>
-          <w:sz w:val="24"/>
-          <w:szCs w:val="24"/>
-        </w:rPr>
-        <w:t>realizados</w:t>
-      </w:r>
-      <w:proofErr w:type="spellEnd"/>
-      <w:r>
-        <w:rPr>
-          <w:rFonts w:ascii="Times New Roman" w:hAnsi="Times New Roman" w:cs="Times New Roman"/>
-          <w:sz w:val="24"/>
-          <w:szCs w:val="24"/>
-        </w:rPr>
-        <w:t xml:space="preserve"> por los </w:t>
-      </w:r>
-      <w:proofErr w:type="spellStart"/>
-      <w:r>
-        <w:rPr>
-          <w:rFonts w:ascii="Times New Roman" w:hAnsi="Times New Roman" w:cs="Times New Roman"/>
-          <w:sz w:val="24"/>
-          <w:szCs w:val="24"/>
-        </w:rPr>
-        <w:t>usuarios</w:t>
-      </w:r>
-      <w:proofErr w:type="spellEnd"/>
-      <w:r>
-        <w:rPr>
-          <w:rFonts w:ascii="Times New Roman" w:hAnsi="Times New Roman" w:cs="Times New Roman"/>
-          <w:sz w:val="24"/>
-          <w:szCs w:val="24"/>
-        </w:rPr>
-        <w:t>.</w:t>
-      </w:r>
-    </w:p>
-    <w:p>
-      <w:pPr>
-        <w:pStyle w:val="Listaconvietas"/>
-        <w:spacing w:line="480" w:lineRule="auto"/>
-        <w:rPr>
-          <w:rFonts w:ascii="Times New Roman" w:hAnsi="Times New Roman" w:cs="Times New Roman"/>
-          <w:sz w:val="24"/>
-          <w:szCs w:val="24"/>
-        </w:rPr>
-      </w:pPr>
-      <w:proofErr w:type="spellStart"/>
-      <w:r>
-        <w:rPr>
-          <w:rFonts w:ascii="Times New Roman" w:hAnsi="Times New Roman" w:cs="Times New Roman"/>
-          <w:sz w:val="24"/>
-          <w:szCs w:val="24"/>
-        </w:rPr>
-        <w:t>Almacenamiento</w:t>
-      </w:r>
-      <w:proofErr w:type="spellEnd"/>
-      <w:r>
-        <w:rPr>
-          <w:rFonts w:ascii="Times New Roman" w:hAnsi="Times New Roman" w:cs="Times New Roman"/>
-          <w:sz w:val="24"/>
-          <w:szCs w:val="24"/>
-        </w:rPr>
-        <w:t xml:space="preserve"> de la </w:t>
-      </w:r>
-      <w:proofErr w:type="spellStart"/>
-      <w:r>
-        <w:rPr>
-          <w:rFonts w:ascii="Times New Roman" w:hAnsi="Times New Roman" w:cs="Times New Roman"/>
-          <w:sz w:val="24"/>
-          <w:szCs w:val="24"/>
-        </w:rPr>
-        <w:t>información</w:t>
-      </w:r>
-      <w:proofErr w:type="spellEnd"/>
-      <w:r>
-        <w:rPr>
-          <w:rFonts w:ascii="Times New Roman" w:hAnsi="Times New Roman" w:cs="Times New Roman"/>
-          <w:sz w:val="24"/>
-          <w:szCs w:val="24"/>
-        </w:rPr>
-        <w:t xml:space="preserve"> </w:t>
-      </w:r>
-      <w:proofErr w:type="spellStart"/>
-      <w:r>
-        <w:rPr>
-          <w:rFonts w:ascii="Times New Roman" w:hAnsi="Times New Roman" w:cs="Times New Roman"/>
-          <w:sz w:val="24"/>
-          <w:szCs w:val="24"/>
-        </w:rPr>
-        <w:t>necesaria</w:t>
-      </w:r>
-      <w:proofErr w:type="spellEnd"/>
-      <w:r>
-        <w:rPr>
-          <w:rFonts w:ascii="Times New Roman" w:hAnsi="Times New Roman" w:cs="Times New Roman"/>
-          <w:sz w:val="24"/>
-          <w:szCs w:val="24"/>
-        </w:rPr>
-        <w:t xml:space="preserve"> para </w:t>
-      </w:r>
-      <w:proofErr w:type="spellStart"/>
-      <w:r>
-        <w:rPr>
-          <w:rFonts w:ascii="Times New Roman" w:hAnsi="Times New Roman" w:cs="Times New Roman"/>
-          <w:sz w:val="24"/>
-          <w:szCs w:val="24"/>
-        </w:rPr>
-        <w:t>relacionar</w:t>
-      </w:r>
-      <w:proofErr w:type="spellEnd"/>
-      <w:r>
-        <w:rPr>
-          <w:rFonts w:ascii="Times New Roman" w:hAnsi="Times New Roman" w:cs="Times New Roman"/>
-          <w:sz w:val="24"/>
-          <w:szCs w:val="24"/>
-        </w:rPr>
-        <w:t xml:space="preserve"> las </w:t>
-      </w:r>
-      <w:proofErr w:type="spellStart"/>
-      <w:r>
-        <w:rPr>
-          <w:rFonts w:ascii="Times New Roman" w:hAnsi="Times New Roman" w:cs="Times New Roman"/>
-          <w:sz w:val="24"/>
-          <w:szCs w:val="24"/>
-        </w:rPr>
-        <w:t>acciones</w:t>
-      </w:r>
-      <w:proofErr w:type="spellEnd"/>
-      <w:r>
-        <w:rPr>
-          <w:rFonts w:ascii="Times New Roman" w:hAnsi="Times New Roman" w:cs="Times New Roman"/>
-          <w:sz w:val="24"/>
-          <w:szCs w:val="24"/>
-        </w:rPr>
-        <w:t xml:space="preserve"> de los </w:t>
-      </w:r>
-      <w:proofErr w:type="spellStart"/>
-      <w:r>
-        <w:rPr>
-          <w:rFonts w:ascii="Times New Roman" w:hAnsi="Times New Roman" w:cs="Times New Roman"/>
-          <w:sz w:val="24"/>
-          <w:szCs w:val="24"/>
-        </w:rPr>
-        <w:t>usuarios</w:t>
-      </w:r>
-      <w:proofErr w:type="spellEnd"/>
-      <w:r>
-        <w:rPr>
-          <w:rFonts w:ascii="Times New Roman" w:hAnsi="Times New Roman" w:cs="Times New Roman"/>
-          <w:sz w:val="24"/>
-          <w:szCs w:val="24"/>
-        </w:rPr>
-        <w:t xml:space="preserve"> con las </w:t>
-      </w:r>
-      <w:proofErr w:type="spellStart"/>
-      <w:r>
-        <w:rPr>
-          <w:rFonts w:ascii="Times New Roman" w:hAnsi="Times New Roman" w:cs="Times New Roman"/>
-          <w:sz w:val="24"/>
-          <w:szCs w:val="24"/>
-        </w:rPr>
-        <w:t>recetas</w:t>
-      </w:r>
-      <w:proofErr w:type="spellEnd"/>
-      <w:r>
-        <w:rPr>
-          <w:rFonts w:ascii="Times New Roman" w:hAnsi="Times New Roman" w:cs="Times New Roman"/>
-          <w:sz w:val="24"/>
-          <w:szCs w:val="24"/>
-        </w:rPr>
-        <w:t>.</w:t>
-      </w:r>
-    </w:p>
-    <w:p>
-      <w:pPr>
-        <w:pStyle w:val="Listaconvietas"/>
-        <w:spacing w:line="480" w:lineRule="auto"/>
-        <w:rPr>
-          <w:rFonts w:ascii="Times New Roman" w:hAnsi="Times New Roman" w:cs="Times New Roman"/>
-          <w:sz w:val="24"/>
-          <w:szCs w:val="24"/>
-        </w:rPr>
-      </w:pPr>
-      <w:proofErr w:type="spellStart"/>
-      <w:r>
-        <w:rPr>
-          <w:rFonts w:ascii="Times New Roman" w:hAnsi="Times New Roman" w:cs="Times New Roman"/>
-          <w:sz w:val="24"/>
-          <w:szCs w:val="24"/>
-        </w:rPr>
-        <w:t>Organización</w:t>
-      </w:r>
-      <w:proofErr w:type="spellEnd"/>
-      <w:r>
-        <w:rPr>
-          <w:rFonts w:ascii="Times New Roman" w:hAnsi="Times New Roman" w:cs="Times New Roman"/>
-          <w:sz w:val="24"/>
-          <w:szCs w:val="24"/>
-        </w:rPr>
-        <w:t xml:space="preserve"> de la </w:t>
-      </w:r>
-      <w:proofErr w:type="spellStart"/>
-      <w:r>
-        <w:rPr>
-          <w:rFonts w:ascii="Times New Roman" w:hAnsi="Times New Roman" w:cs="Times New Roman"/>
-          <w:sz w:val="24"/>
-          <w:szCs w:val="24"/>
-        </w:rPr>
-        <w:t>información</w:t>
-      </w:r>
-      <w:proofErr w:type="spellEnd"/>
-      <w:r>
-        <w:rPr>
-          <w:rFonts w:ascii="Times New Roman" w:hAnsi="Times New Roman" w:cs="Times New Roman"/>
-          <w:sz w:val="24"/>
-          <w:szCs w:val="24"/>
-        </w:rPr>
-        <w:t xml:space="preserve"> </w:t>
-      </w:r>
-      <w:proofErr w:type="spellStart"/>
-      <w:r>
-        <w:rPr>
-          <w:rFonts w:ascii="Times New Roman" w:hAnsi="Times New Roman" w:cs="Times New Roman"/>
-          <w:sz w:val="24"/>
-          <w:szCs w:val="24"/>
-        </w:rPr>
-        <w:t>mediante</w:t>
-      </w:r>
-      <w:proofErr w:type="spellEnd"/>
-      <w:r>
-        <w:rPr>
-          <w:rFonts w:ascii="Times New Roman" w:hAnsi="Times New Roman" w:cs="Times New Roman"/>
-          <w:sz w:val="24"/>
-          <w:szCs w:val="24"/>
-        </w:rPr>
-        <w:t xml:space="preserve"> las </w:t>
-      </w:r>
-      <w:proofErr w:type="spellStart"/>
-      <w:r>
-        <w:rPr>
-          <w:rFonts w:ascii="Times New Roman" w:hAnsi="Times New Roman" w:cs="Times New Roman"/>
-          <w:sz w:val="24"/>
-          <w:szCs w:val="24"/>
-        </w:rPr>
-        <w:t>entidades</w:t>
-      </w:r>
-      <w:proofErr w:type="spellEnd"/>
-      <w:r>
-        <w:rPr>
-          <w:rFonts w:ascii="Times New Roman" w:hAnsi="Times New Roman" w:cs="Times New Roman"/>
-          <w:sz w:val="24"/>
-          <w:szCs w:val="24"/>
-        </w:rPr>
-        <w:t xml:space="preserve"> y </w:t>
-      </w:r>
-      <w:proofErr w:type="spellStart"/>
-      <w:r>
-        <w:rPr>
-          <w:rFonts w:ascii="Times New Roman" w:hAnsi="Times New Roman" w:cs="Times New Roman"/>
-          <w:sz w:val="24"/>
-          <w:szCs w:val="24"/>
-        </w:rPr>
-        <w:t>relaciones</w:t>
-      </w:r>
-      <w:proofErr w:type="spellEnd"/>
-      <w:r>
-        <w:rPr>
-          <w:rFonts w:ascii="Times New Roman" w:hAnsi="Times New Roman" w:cs="Times New Roman"/>
-          <w:sz w:val="24"/>
-          <w:szCs w:val="24"/>
-        </w:rPr>
-        <w:t xml:space="preserve"> </w:t>
-      </w:r>
-      <w:proofErr w:type="spellStart"/>
-      <w:r>
-        <w:rPr>
-          <w:rFonts w:ascii="Times New Roman" w:hAnsi="Times New Roman" w:cs="Times New Roman"/>
-          <w:sz w:val="24"/>
-          <w:szCs w:val="24"/>
-        </w:rPr>
-        <w:t>definidas</w:t>
-      </w:r>
-      <w:proofErr w:type="spellEnd"/>
-      <w:r>
-        <w:rPr>
-          <w:rFonts w:ascii="Times New Roman" w:hAnsi="Times New Roman" w:cs="Times New Roman"/>
-          <w:sz w:val="24"/>
-          <w:szCs w:val="24"/>
-        </w:rPr>
-        <w:t xml:space="preserve"> para </w:t>
-      </w:r>
-      <w:proofErr w:type="spellStart"/>
-      <w:r>
-        <w:rPr>
-          <w:rFonts w:ascii="Times New Roman" w:hAnsi="Times New Roman" w:cs="Times New Roman"/>
-          <w:sz w:val="24"/>
-          <w:szCs w:val="24"/>
-        </w:rPr>
-        <w:t>el</w:t>
-      </w:r>
-      <w:proofErr w:type="spellEnd"/>
-      <w:r>
-        <w:rPr>
-          <w:rFonts w:ascii="Times New Roman" w:hAnsi="Times New Roman" w:cs="Times New Roman"/>
-          <w:sz w:val="24"/>
-          <w:szCs w:val="24"/>
-        </w:rPr>
-        <w:t xml:space="preserve"> </w:t>
-      </w:r>
-      <w:proofErr w:type="spellStart"/>
-      <w:r>
-        <w:rPr>
-          <w:rFonts w:ascii="Times New Roman" w:hAnsi="Times New Roman" w:cs="Times New Roman"/>
-          <w:sz w:val="24"/>
-          <w:szCs w:val="24"/>
-        </w:rPr>
-        <w:t>módulo</w:t>
-      </w:r>
-      <w:proofErr w:type="spellEnd"/>
-      <w:r>
-        <w:rPr>
-          <w:rFonts w:ascii="Times New Roman" w:hAnsi="Times New Roman" w:cs="Times New Roman"/>
-          <w:sz w:val="24"/>
-          <w:szCs w:val="24"/>
-        </w:rPr>
-        <w:t xml:space="preserve"> de </w:t>
-      </w:r>
-      <w:proofErr w:type="spellStart"/>
-      <w:r>
-        <w:rPr>
-          <w:rFonts w:ascii="Times New Roman" w:hAnsi="Times New Roman" w:cs="Times New Roman"/>
-          <w:sz w:val="24"/>
-          <w:szCs w:val="24"/>
-        </w:rPr>
-        <w:t>comunidad</w:t>
-      </w:r>
-      <w:proofErr w:type="spellEnd"/>
-      <w:r>
-        <w:rPr>
-          <w:rFonts w:ascii="Times New Roman" w:hAnsi="Times New Roman" w:cs="Times New Roman"/>
-          <w:sz w:val="24"/>
-          <w:szCs w:val="24"/>
-        </w:rPr>
-        <w:t>.</w:t>
-      </w:r>
-    </w:p>
-    <w:p>
-      <w:pPr>
-        <w:pStyle w:val="Listaconvietas"/>
-        <w:spacing w:line="480" w:lineRule="auto"/>
-        <w:rPr>
-          <w:rFonts w:ascii="Times New Roman" w:hAnsi="Times New Roman" w:cs="Times New Roman"/>
-          <w:sz w:val="24"/>
-          <w:szCs w:val="24"/>
-        </w:rPr>
-      </w:pPr>
-      <w:r>
-        <w:rPr>
-          <w:rFonts w:ascii="Times New Roman" w:hAnsi="Times New Roman" w:cs="Times New Roman"/>
-          <w:sz w:val="24"/>
-          <w:szCs w:val="24"/>
-        </w:rPr>
-        <w:t xml:space="preserve">Consulta de la </w:t>
-      </w:r>
-      <w:proofErr w:type="spellStart"/>
-      <w:r>
-        <w:rPr>
-          <w:rFonts w:ascii="Times New Roman" w:hAnsi="Times New Roman" w:cs="Times New Roman"/>
-          <w:sz w:val="24"/>
-          <w:szCs w:val="24"/>
-        </w:rPr>
-        <w:t>información</w:t>
-      </w:r>
-      <w:proofErr w:type="spellEnd"/>
-      <w:r>
-        <w:rPr>
-          <w:rFonts w:ascii="Times New Roman" w:hAnsi="Times New Roman" w:cs="Times New Roman"/>
-          <w:sz w:val="24"/>
-          <w:szCs w:val="24"/>
-        </w:rPr>
-        <w:t xml:space="preserve"> </w:t>
-      </w:r>
-      <w:proofErr w:type="spellStart"/>
-      <w:r>
-        <w:rPr>
-          <w:rFonts w:ascii="Times New Roman" w:hAnsi="Times New Roman" w:cs="Times New Roman"/>
-          <w:sz w:val="24"/>
-          <w:szCs w:val="24"/>
-        </w:rPr>
-        <w:t>generada</w:t>
-      </w:r>
-      <w:proofErr w:type="spellEnd"/>
-      <w:r>
-        <w:rPr>
-          <w:rFonts w:ascii="Times New Roman" w:hAnsi="Times New Roman" w:cs="Times New Roman"/>
-          <w:sz w:val="24"/>
-          <w:szCs w:val="24"/>
-        </w:rPr>
-        <w:t xml:space="preserve"> por las </w:t>
-      </w:r>
-      <w:proofErr w:type="spellStart"/>
-      <w:r>
-        <w:rPr>
-          <w:rFonts w:ascii="Times New Roman" w:hAnsi="Times New Roman" w:cs="Times New Roman"/>
-          <w:sz w:val="24"/>
-          <w:szCs w:val="24"/>
-        </w:rPr>
-        <w:t>diferentes</w:t>
-      </w:r>
-      <w:proofErr w:type="spellEnd"/>
-      <w:r>
-        <w:rPr>
-          <w:rFonts w:ascii="Times New Roman" w:hAnsi="Times New Roman" w:cs="Times New Roman"/>
-          <w:sz w:val="24"/>
-          <w:szCs w:val="24"/>
-        </w:rPr>
-        <w:t xml:space="preserve"> </w:t>
-      </w:r>
-      <w:proofErr w:type="spellStart"/>
-      <w:r>
-        <w:rPr>
-          <w:rFonts w:ascii="Times New Roman" w:hAnsi="Times New Roman" w:cs="Times New Roman"/>
-          <w:sz w:val="24"/>
-          <w:szCs w:val="24"/>
-        </w:rPr>
-        <w:t>acciones</w:t>
-      </w:r>
-      <w:proofErr w:type="spellEnd"/>
-      <w:r>
-        <w:rPr>
-          <w:rFonts w:ascii="Times New Roman" w:hAnsi="Times New Roman" w:cs="Times New Roman"/>
-          <w:sz w:val="24"/>
-          <w:szCs w:val="24"/>
-        </w:rPr>
-        <w:t xml:space="preserve"> </w:t>
-      </w:r>
-      <w:proofErr w:type="spellStart"/>
-      <w:r>
-        <w:rPr>
-          <w:rFonts w:ascii="Times New Roman" w:hAnsi="Times New Roman" w:cs="Times New Roman"/>
-          <w:sz w:val="24"/>
-          <w:szCs w:val="24"/>
-        </w:rPr>
-        <w:t>sociales</w:t>
-      </w:r>
-      <w:proofErr w:type="spellEnd"/>
-      <w:r>
-        <w:rPr>
-          <w:rFonts w:ascii="Times New Roman" w:hAnsi="Times New Roman" w:cs="Times New Roman"/>
-          <w:sz w:val="24"/>
-          <w:szCs w:val="24"/>
-        </w:rPr>
-        <w:t xml:space="preserve"> </w:t>
-      </w:r>
-      <w:proofErr w:type="spellStart"/>
-      <w:r>
-        <w:rPr>
-          <w:rFonts w:ascii="Times New Roman" w:hAnsi="Times New Roman" w:cs="Times New Roman"/>
-          <w:sz w:val="24"/>
-          <w:szCs w:val="24"/>
-        </w:rPr>
-        <w:t>realizadas</w:t>
-      </w:r>
-      <w:proofErr w:type="spellEnd"/>
-      <w:r>
-        <w:rPr>
-          <w:rFonts w:ascii="Times New Roman" w:hAnsi="Times New Roman" w:cs="Times New Roman"/>
-          <w:sz w:val="24"/>
-          <w:szCs w:val="24"/>
-        </w:rPr>
-        <w:t xml:space="preserve"> dentro del </w:t>
-      </w:r>
-      <w:proofErr w:type="spellStart"/>
-      <w:r>
-        <w:rPr>
-          <w:rFonts w:ascii="Times New Roman" w:hAnsi="Times New Roman" w:cs="Times New Roman"/>
-          <w:sz w:val="24"/>
-          <w:szCs w:val="24"/>
-        </w:rPr>
-        <w:t>sistema</w:t>
-      </w:r>
-      <w:proofErr w:type="spellEnd"/>
-      <w:r>
-        <w:rPr>
-          <w:rFonts w:ascii="Times New Roman" w:hAnsi="Times New Roman" w:cs="Times New Roman"/>
-          <w:sz w:val="24"/>
-          <w:szCs w:val="24"/>
-        </w:rPr>
-        <w:t>.</w:t>
-      </w:r>
-    </w:p>
-    <w:p>
-      <w:pPr>
-        <w:pStyle w:val="Ttulo2"/>
-        <w:rPr>
-          <w:rFonts w:cs="Times New Roman"/>
-          <w:szCs w:val="24"/>
-        </w:rPr>
-      </w:pPr>
-      <w:r>
-        <w:rPr>
-          <w:rFonts w:cs="Times New Roman"/>
-          <w:szCs w:val="24"/>
-        </w:rPr>
-        <w:t>2.2 Exclusiones</w:t>
-      </w:r>
-    </w:p>
-    <w:p>
-      <w:pPr>
-        <w:pStyle w:val="Listaconvietas"/>
-        <w:spacing w:line="480" w:lineRule="auto"/>
-        <w:rPr>
-          <w:rFonts w:ascii="Times New Roman" w:hAnsi="Times New Roman" w:cs="Times New Roman"/>
-          <w:sz w:val="24"/>
-          <w:szCs w:val="24"/>
-        </w:rPr>
-      </w:pPr>
-      <w:r>
-        <w:rPr>
-          <w:rFonts w:ascii="Times New Roman" w:hAnsi="Times New Roman" w:cs="Times New Roman"/>
-          <w:sz w:val="24"/>
-          <w:szCs w:val="24"/>
-        </w:rPr>
-        <w:t xml:space="preserve">Desarrollo de </w:t>
-      </w:r>
-      <w:proofErr w:type="spellStart"/>
-      <w:r>
-        <w:rPr>
-          <w:rFonts w:ascii="Times New Roman" w:hAnsi="Times New Roman" w:cs="Times New Roman"/>
-          <w:sz w:val="24"/>
-          <w:szCs w:val="24"/>
-        </w:rPr>
-        <w:t>funcionalidades</w:t>
-      </w:r>
-      <w:proofErr w:type="spellEnd"/>
-      <w:r>
-        <w:rPr>
-          <w:rFonts w:ascii="Times New Roman" w:hAnsi="Times New Roman" w:cs="Times New Roman"/>
-          <w:sz w:val="24"/>
-          <w:szCs w:val="24"/>
-        </w:rPr>
-        <w:t xml:space="preserve"> </w:t>
-      </w:r>
-      <w:proofErr w:type="spellStart"/>
-      <w:r>
-        <w:rPr>
-          <w:rFonts w:ascii="Times New Roman" w:hAnsi="Times New Roman" w:cs="Times New Roman"/>
-          <w:sz w:val="24"/>
-          <w:szCs w:val="24"/>
-        </w:rPr>
-        <w:t>relacionadas</w:t>
-      </w:r>
-      <w:proofErr w:type="spellEnd"/>
-      <w:r>
-        <w:rPr>
-          <w:rFonts w:ascii="Times New Roman" w:hAnsi="Times New Roman" w:cs="Times New Roman"/>
-          <w:sz w:val="24"/>
-          <w:szCs w:val="24"/>
-        </w:rPr>
-        <w:t xml:space="preserve"> con </w:t>
-      </w:r>
-      <w:proofErr w:type="spellStart"/>
-      <w:r>
-        <w:rPr>
-          <w:rFonts w:ascii="Times New Roman" w:hAnsi="Times New Roman" w:cs="Times New Roman"/>
-          <w:sz w:val="24"/>
-          <w:szCs w:val="24"/>
-        </w:rPr>
-        <w:t>nutrición</w:t>
-      </w:r>
-      <w:proofErr w:type="spellEnd"/>
-      <w:r>
-        <w:rPr>
-          <w:rFonts w:ascii="Times New Roman" w:hAnsi="Times New Roman" w:cs="Times New Roman"/>
-          <w:sz w:val="24"/>
-          <w:szCs w:val="24"/>
-        </w:rPr>
-        <w:t xml:space="preserve"> y </w:t>
-      </w:r>
-      <w:proofErr w:type="spellStart"/>
-      <w:r>
-        <w:rPr>
-          <w:rFonts w:ascii="Times New Roman" w:hAnsi="Times New Roman" w:cs="Times New Roman"/>
-          <w:sz w:val="24"/>
-          <w:szCs w:val="24"/>
-        </w:rPr>
-        <w:t>perfiles</w:t>
-      </w:r>
-      <w:proofErr w:type="spellEnd"/>
-      <w:r>
-        <w:rPr>
-          <w:rFonts w:ascii="Times New Roman" w:hAnsi="Times New Roman" w:cs="Times New Roman"/>
-          <w:sz w:val="24"/>
-          <w:szCs w:val="24"/>
-        </w:rPr>
-        <w:t xml:space="preserve"> </w:t>
-      </w:r>
-      <w:proofErr w:type="spellStart"/>
-      <w:r>
-        <w:rPr>
-          <w:rFonts w:ascii="Times New Roman" w:hAnsi="Times New Roman" w:cs="Times New Roman"/>
-          <w:sz w:val="24"/>
-          <w:szCs w:val="24"/>
-        </w:rPr>
-        <w:t>alimentarios</w:t>
-      </w:r>
-      <w:proofErr w:type="spellEnd"/>
-      <w:r>
-        <w:rPr>
-          <w:rFonts w:ascii="Times New Roman" w:hAnsi="Times New Roman" w:cs="Times New Roman"/>
-          <w:sz w:val="24"/>
-          <w:szCs w:val="24"/>
-        </w:rPr>
-        <w:t>.</w:t>
-      </w:r>
-    </w:p>
-    <w:p>
-      <w:pPr>
-        <w:pStyle w:val="Listaconvietas"/>
-        <w:spacing w:line="480" w:lineRule="auto"/>
-        <w:rPr>
-          <w:rFonts w:ascii="Times New Roman" w:hAnsi="Times New Roman" w:cs="Times New Roman"/>
-          <w:sz w:val="24"/>
-          <w:szCs w:val="24"/>
-        </w:rPr>
-      </w:pPr>
-      <w:r>
-        <w:rPr>
-          <w:rFonts w:ascii="Times New Roman" w:hAnsi="Times New Roman" w:cs="Times New Roman"/>
-          <w:sz w:val="24"/>
-          <w:szCs w:val="24"/>
-        </w:rPr>
-        <w:t xml:space="preserve">Desarrollo de </w:t>
-      </w:r>
-      <w:proofErr w:type="spellStart"/>
-      <w:r>
-        <w:rPr>
-          <w:rFonts w:ascii="Times New Roman" w:hAnsi="Times New Roman" w:cs="Times New Roman"/>
-          <w:sz w:val="24"/>
-          <w:szCs w:val="24"/>
-        </w:rPr>
-        <w:t>funcionalidades</w:t>
-      </w:r>
-      <w:proofErr w:type="spellEnd"/>
-      <w:r>
-        <w:rPr>
-          <w:rFonts w:ascii="Times New Roman" w:hAnsi="Times New Roman" w:cs="Times New Roman"/>
-          <w:sz w:val="24"/>
-          <w:szCs w:val="24"/>
-        </w:rPr>
-        <w:t xml:space="preserve"> </w:t>
-      </w:r>
-      <w:proofErr w:type="spellStart"/>
-      <w:r>
-        <w:rPr>
-          <w:rFonts w:ascii="Times New Roman" w:hAnsi="Times New Roman" w:cs="Times New Roman"/>
-          <w:sz w:val="24"/>
-          <w:szCs w:val="24"/>
-        </w:rPr>
-        <w:t>relacionadas</w:t>
-      </w:r>
-      <w:proofErr w:type="spellEnd"/>
-      <w:r>
-        <w:rPr>
-          <w:rFonts w:ascii="Times New Roman" w:hAnsi="Times New Roman" w:cs="Times New Roman"/>
-          <w:sz w:val="24"/>
-          <w:szCs w:val="24"/>
-        </w:rPr>
-        <w:t xml:space="preserve"> con </w:t>
-      </w:r>
-      <w:proofErr w:type="spellStart"/>
-      <w:r>
-        <w:rPr>
-          <w:rFonts w:ascii="Times New Roman" w:hAnsi="Times New Roman" w:cs="Times New Roman"/>
-          <w:sz w:val="24"/>
-          <w:szCs w:val="24"/>
-        </w:rPr>
-        <w:t>transporte</w:t>
-      </w:r>
-      <w:proofErr w:type="spellEnd"/>
-      <w:r>
-        <w:rPr>
-          <w:rFonts w:ascii="Times New Roman" w:hAnsi="Times New Roman" w:cs="Times New Roman"/>
-          <w:sz w:val="24"/>
-          <w:szCs w:val="24"/>
-        </w:rPr>
-        <w:t xml:space="preserve">, </w:t>
-      </w:r>
-      <w:proofErr w:type="spellStart"/>
-      <w:r>
-        <w:rPr>
-          <w:rFonts w:ascii="Times New Roman" w:hAnsi="Times New Roman" w:cs="Times New Roman"/>
-          <w:sz w:val="24"/>
-          <w:szCs w:val="24"/>
-        </w:rPr>
-        <w:t>pedidos</w:t>
-      </w:r>
-      <w:proofErr w:type="spellEnd"/>
-      <w:r>
-        <w:rPr>
-          <w:rFonts w:ascii="Times New Roman" w:hAnsi="Times New Roman" w:cs="Times New Roman"/>
-          <w:sz w:val="24"/>
-          <w:szCs w:val="24"/>
-        </w:rPr>
-        <w:t xml:space="preserve"> o </w:t>
-      </w:r>
-      <w:proofErr w:type="spellStart"/>
-      <w:r>
-        <w:rPr>
-          <w:rFonts w:ascii="Times New Roman" w:hAnsi="Times New Roman" w:cs="Times New Roman"/>
-          <w:sz w:val="24"/>
-          <w:szCs w:val="24"/>
-        </w:rPr>
-        <w:t>entrega</w:t>
-      </w:r>
-      <w:proofErr w:type="spellEnd"/>
-      <w:r>
-        <w:rPr>
-          <w:rFonts w:ascii="Times New Roman" w:hAnsi="Times New Roman" w:cs="Times New Roman"/>
-          <w:sz w:val="24"/>
-          <w:szCs w:val="24"/>
-        </w:rPr>
-        <w:t xml:space="preserve"> de </w:t>
-      </w:r>
-      <w:proofErr w:type="spellStart"/>
-      <w:r>
-        <w:rPr>
-          <w:rFonts w:ascii="Times New Roman" w:hAnsi="Times New Roman" w:cs="Times New Roman"/>
-          <w:sz w:val="24"/>
-          <w:szCs w:val="24"/>
-        </w:rPr>
-        <w:t>productos</w:t>
-      </w:r>
-      <w:proofErr w:type="spellEnd"/>
-      <w:r>
-        <w:rPr>
-          <w:rFonts w:ascii="Times New Roman" w:hAnsi="Times New Roman" w:cs="Times New Roman"/>
-          <w:sz w:val="24"/>
-          <w:szCs w:val="24"/>
-        </w:rPr>
-        <w:t>.</w:t>
-      </w:r>
-    </w:p>
-    <w:p>
-      <w:pPr>
-        <w:pStyle w:val="Listaconvietas"/>
-        <w:spacing w:line="480" w:lineRule="auto"/>
-        <w:rPr>
-          <w:rFonts w:ascii="Times New Roman" w:hAnsi="Times New Roman" w:cs="Times New Roman"/>
-          <w:sz w:val="24"/>
-          <w:szCs w:val="24"/>
-        </w:rPr>
-      </w:pPr>
-      <w:proofErr w:type="spellStart"/>
-      <w:r>
-        <w:rPr>
-          <w:rFonts w:ascii="Times New Roman" w:hAnsi="Times New Roman" w:cs="Times New Roman"/>
-          <w:sz w:val="24"/>
-          <w:szCs w:val="24"/>
-        </w:rPr>
-        <w:lastRenderedPageBreak/>
-        <w:t>Gestión</w:t>
-      </w:r>
-      <w:proofErr w:type="spellEnd"/>
-      <w:r>
-        <w:rPr>
-          <w:rFonts w:ascii="Times New Roman" w:hAnsi="Times New Roman" w:cs="Times New Roman"/>
-          <w:sz w:val="24"/>
-          <w:szCs w:val="24"/>
-        </w:rPr>
-        <w:t xml:space="preserve"> de </w:t>
-      </w:r>
-      <w:proofErr w:type="spellStart"/>
-      <w:r>
-        <w:rPr>
-          <w:rFonts w:ascii="Times New Roman" w:hAnsi="Times New Roman" w:cs="Times New Roman"/>
-          <w:sz w:val="24"/>
-          <w:szCs w:val="24"/>
-        </w:rPr>
-        <w:t>información</w:t>
-      </w:r>
-      <w:proofErr w:type="spellEnd"/>
-      <w:r>
-        <w:rPr>
-          <w:rFonts w:ascii="Times New Roman" w:hAnsi="Times New Roman" w:cs="Times New Roman"/>
-          <w:sz w:val="24"/>
-          <w:szCs w:val="24"/>
-        </w:rPr>
-        <w:t xml:space="preserve"> </w:t>
-      </w:r>
-      <w:proofErr w:type="spellStart"/>
-      <w:r>
-        <w:rPr>
-          <w:rFonts w:ascii="Times New Roman" w:hAnsi="Times New Roman" w:cs="Times New Roman"/>
-          <w:sz w:val="24"/>
-          <w:szCs w:val="24"/>
-        </w:rPr>
-        <w:t>correspondiente</w:t>
-      </w:r>
-      <w:proofErr w:type="spellEnd"/>
-      <w:r>
-        <w:rPr>
-          <w:rFonts w:ascii="Times New Roman" w:hAnsi="Times New Roman" w:cs="Times New Roman"/>
-          <w:sz w:val="24"/>
-          <w:szCs w:val="24"/>
-        </w:rPr>
-        <w:t xml:space="preserve"> a </w:t>
-      </w:r>
-      <w:proofErr w:type="spellStart"/>
-      <w:r>
-        <w:rPr>
-          <w:rFonts w:ascii="Times New Roman" w:hAnsi="Times New Roman" w:cs="Times New Roman"/>
-          <w:sz w:val="24"/>
-          <w:szCs w:val="24"/>
-        </w:rPr>
-        <w:t>módulos</w:t>
-      </w:r>
-      <w:proofErr w:type="spellEnd"/>
-      <w:r>
-        <w:rPr>
-          <w:rFonts w:ascii="Times New Roman" w:hAnsi="Times New Roman" w:cs="Times New Roman"/>
-          <w:sz w:val="24"/>
-          <w:szCs w:val="24"/>
-        </w:rPr>
-        <w:t xml:space="preserve"> </w:t>
-      </w:r>
-      <w:proofErr w:type="spellStart"/>
-      <w:r>
-        <w:rPr>
-          <w:rFonts w:ascii="Times New Roman" w:hAnsi="Times New Roman" w:cs="Times New Roman"/>
-          <w:sz w:val="24"/>
-          <w:szCs w:val="24"/>
-        </w:rPr>
-        <w:t>diferentes</w:t>
-      </w:r>
-      <w:proofErr w:type="spellEnd"/>
-      <w:r>
-        <w:rPr>
-          <w:rFonts w:ascii="Times New Roman" w:hAnsi="Times New Roman" w:cs="Times New Roman"/>
-          <w:sz w:val="24"/>
-          <w:szCs w:val="24"/>
-        </w:rPr>
-        <w:t xml:space="preserve"> al </w:t>
-      </w:r>
-      <w:proofErr w:type="spellStart"/>
-      <w:r>
-        <w:rPr>
-          <w:rFonts w:ascii="Times New Roman" w:hAnsi="Times New Roman" w:cs="Times New Roman"/>
-          <w:sz w:val="24"/>
-          <w:szCs w:val="24"/>
-        </w:rPr>
-        <w:t>componente</w:t>
-      </w:r>
-      <w:proofErr w:type="spellEnd"/>
-      <w:r>
-        <w:rPr>
-          <w:rFonts w:ascii="Times New Roman" w:hAnsi="Times New Roman" w:cs="Times New Roman"/>
-          <w:sz w:val="24"/>
-          <w:szCs w:val="24"/>
-        </w:rPr>
-        <w:t xml:space="preserve"> de </w:t>
-      </w:r>
-      <w:proofErr w:type="spellStart"/>
-      <w:r>
-        <w:rPr>
-          <w:rFonts w:ascii="Times New Roman" w:hAnsi="Times New Roman" w:cs="Times New Roman"/>
-          <w:sz w:val="24"/>
-          <w:szCs w:val="24"/>
-        </w:rPr>
-        <w:t>comunidad</w:t>
-      </w:r>
-      <w:proofErr w:type="spellEnd"/>
-      <w:r>
-        <w:rPr>
-          <w:rFonts w:ascii="Times New Roman" w:hAnsi="Times New Roman" w:cs="Times New Roman"/>
-          <w:sz w:val="24"/>
-          <w:szCs w:val="24"/>
-        </w:rPr>
-        <w:t>.</w:t>
-      </w:r>
-    </w:p>
-    <w:p>
-      <w:pPr>
-        <w:pStyle w:val="Listaconvietas"/>
-        <w:spacing w:line="480" w:lineRule="auto"/>
-        <w:rPr>
-          <w:rFonts w:ascii="Times New Roman" w:hAnsi="Times New Roman" w:cs="Times New Roman"/>
-          <w:sz w:val="24"/>
-          <w:szCs w:val="24"/>
-        </w:rPr>
-      </w:pPr>
-      <w:proofErr w:type="spellStart"/>
-      <w:r>
-        <w:rPr>
-          <w:rFonts w:ascii="Times New Roman" w:hAnsi="Times New Roman" w:cs="Times New Roman"/>
-          <w:sz w:val="24"/>
-          <w:szCs w:val="24"/>
-        </w:rPr>
-        <w:t>Administración</w:t>
-      </w:r>
-      <w:proofErr w:type="spellEnd"/>
-      <w:r>
-        <w:rPr>
-          <w:rFonts w:ascii="Times New Roman" w:hAnsi="Times New Roman" w:cs="Times New Roman"/>
-          <w:sz w:val="24"/>
-          <w:szCs w:val="24"/>
-        </w:rPr>
-        <w:t xml:space="preserve"> de </w:t>
-      </w:r>
-      <w:proofErr w:type="spellStart"/>
-      <w:r>
-        <w:rPr>
-          <w:rFonts w:ascii="Times New Roman" w:hAnsi="Times New Roman" w:cs="Times New Roman"/>
-          <w:sz w:val="24"/>
-          <w:szCs w:val="24"/>
-        </w:rPr>
-        <w:t>contenidos</w:t>
-      </w:r>
-      <w:proofErr w:type="spellEnd"/>
-      <w:r>
-        <w:rPr>
-          <w:rFonts w:ascii="Times New Roman" w:hAnsi="Times New Roman" w:cs="Times New Roman"/>
-          <w:sz w:val="24"/>
-          <w:szCs w:val="24"/>
-        </w:rPr>
-        <w:t xml:space="preserve"> que no </w:t>
-      </w:r>
-      <w:proofErr w:type="spellStart"/>
-      <w:r>
-        <w:rPr>
-          <w:rFonts w:ascii="Times New Roman" w:hAnsi="Times New Roman" w:cs="Times New Roman"/>
-          <w:sz w:val="24"/>
-          <w:szCs w:val="24"/>
-        </w:rPr>
-        <w:t>estén</w:t>
-      </w:r>
-      <w:proofErr w:type="spellEnd"/>
-      <w:r>
-        <w:rPr>
-          <w:rFonts w:ascii="Times New Roman" w:hAnsi="Times New Roman" w:cs="Times New Roman"/>
-          <w:sz w:val="24"/>
-          <w:szCs w:val="24"/>
-        </w:rPr>
-        <w:t xml:space="preserve"> </w:t>
-      </w:r>
-      <w:proofErr w:type="spellStart"/>
-      <w:r>
-        <w:rPr>
-          <w:rFonts w:ascii="Times New Roman" w:hAnsi="Times New Roman" w:cs="Times New Roman"/>
-          <w:sz w:val="24"/>
-          <w:szCs w:val="24"/>
-        </w:rPr>
-        <w:t>relacionados</w:t>
-      </w:r>
-      <w:proofErr w:type="spellEnd"/>
-      <w:r>
-        <w:rPr>
-          <w:rFonts w:ascii="Times New Roman" w:hAnsi="Times New Roman" w:cs="Times New Roman"/>
-          <w:sz w:val="24"/>
-          <w:szCs w:val="24"/>
-        </w:rPr>
-        <w:t xml:space="preserve"> con las </w:t>
-      </w:r>
-      <w:proofErr w:type="spellStart"/>
-      <w:r>
-        <w:rPr>
-          <w:rFonts w:ascii="Times New Roman" w:hAnsi="Times New Roman" w:cs="Times New Roman"/>
-          <w:sz w:val="24"/>
-          <w:szCs w:val="24"/>
-        </w:rPr>
-        <w:t>interacciones</w:t>
-      </w:r>
-      <w:proofErr w:type="spellEnd"/>
-      <w:r>
-        <w:rPr>
-          <w:rFonts w:ascii="Times New Roman" w:hAnsi="Times New Roman" w:cs="Times New Roman"/>
-          <w:sz w:val="24"/>
-          <w:szCs w:val="24"/>
-        </w:rPr>
-        <w:t xml:space="preserve"> </w:t>
-      </w:r>
-      <w:proofErr w:type="spellStart"/>
-      <w:r>
-        <w:rPr>
-          <w:rFonts w:ascii="Times New Roman" w:hAnsi="Times New Roman" w:cs="Times New Roman"/>
-          <w:sz w:val="24"/>
-          <w:szCs w:val="24"/>
-        </w:rPr>
-        <w:t>sociales</w:t>
-      </w:r>
-      <w:proofErr w:type="spellEnd"/>
-      <w:r>
-        <w:rPr>
-          <w:rFonts w:ascii="Times New Roman" w:hAnsi="Times New Roman" w:cs="Times New Roman"/>
-          <w:sz w:val="24"/>
-          <w:szCs w:val="24"/>
-        </w:rPr>
-        <w:t xml:space="preserve"> </w:t>
-      </w:r>
-      <w:proofErr w:type="spellStart"/>
-      <w:r>
-        <w:rPr>
-          <w:rFonts w:ascii="Times New Roman" w:hAnsi="Times New Roman" w:cs="Times New Roman"/>
-          <w:sz w:val="24"/>
-          <w:szCs w:val="24"/>
-        </w:rPr>
-        <w:t>definidas</w:t>
-      </w:r>
-      <w:proofErr w:type="spellEnd"/>
-      <w:r>
-        <w:rPr>
-          <w:rFonts w:ascii="Times New Roman" w:hAnsi="Times New Roman" w:cs="Times New Roman"/>
-          <w:sz w:val="24"/>
-          <w:szCs w:val="24"/>
-        </w:rPr>
-        <w:t xml:space="preserve"> para las </w:t>
-      </w:r>
-      <w:proofErr w:type="spellStart"/>
-      <w:r>
-        <w:rPr>
-          <w:rFonts w:ascii="Times New Roman" w:hAnsi="Times New Roman" w:cs="Times New Roman"/>
-          <w:sz w:val="24"/>
-          <w:szCs w:val="24"/>
-        </w:rPr>
-        <w:t>recetas</w:t>
-      </w:r>
-      <w:proofErr w:type="spellEnd"/>
-      <w:r>
-        <w:rPr>
-          <w:rFonts w:ascii="Times New Roman" w:hAnsi="Times New Roman" w:cs="Times New Roman"/>
-          <w:sz w:val="24"/>
-          <w:szCs w:val="24"/>
-        </w:rPr>
-        <w:t>.</w:t>
-      </w:r>
-    </w:p>
-    <w:p>
-      <w:pPr>
-        <w:pStyle w:val="Listaconvietas"/>
-        <w:spacing w:line="480" w:lineRule="auto"/>
-        <w:rPr>
-          <w:rFonts w:ascii="Times New Roman" w:hAnsi="Times New Roman" w:cs="Times New Roman"/>
-          <w:sz w:val="24"/>
-          <w:szCs w:val="24"/>
-        </w:rPr>
-      </w:pPr>
-      <w:proofErr w:type="spellStart"/>
-      <w:r>
-        <w:rPr>
-          <w:rFonts w:ascii="Times New Roman" w:hAnsi="Times New Roman" w:cs="Times New Roman"/>
-          <w:sz w:val="24"/>
-          <w:szCs w:val="24"/>
-        </w:rPr>
-        <w:t>Implementación</w:t>
-      </w:r>
-      <w:proofErr w:type="spellEnd"/>
-      <w:r>
-        <w:rPr>
-          <w:rFonts w:ascii="Times New Roman" w:hAnsi="Times New Roman" w:cs="Times New Roman"/>
-          <w:sz w:val="24"/>
-          <w:szCs w:val="24"/>
-        </w:rPr>
-        <w:t xml:space="preserve"> de </w:t>
-      </w:r>
-      <w:proofErr w:type="spellStart"/>
-      <w:r>
-        <w:rPr>
-          <w:rFonts w:ascii="Times New Roman" w:hAnsi="Times New Roman" w:cs="Times New Roman"/>
-          <w:sz w:val="24"/>
-          <w:szCs w:val="24"/>
-        </w:rPr>
-        <w:t>funcionalidades</w:t>
-      </w:r>
-      <w:proofErr w:type="spellEnd"/>
-      <w:r>
-        <w:rPr>
-          <w:rFonts w:ascii="Times New Roman" w:hAnsi="Times New Roman" w:cs="Times New Roman"/>
-          <w:sz w:val="24"/>
-          <w:szCs w:val="24"/>
-        </w:rPr>
-        <w:t xml:space="preserve"> </w:t>
-      </w:r>
-      <w:proofErr w:type="spellStart"/>
-      <w:r>
-        <w:rPr>
-          <w:rFonts w:ascii="Times New Roman" w:hAnsi="Times New Roman" w:cs="Times New Roman"/>
-          <w:sz w:val="24"/>
-          <w:szCs w:val="24"/>
-        </w:rPr>
-        <w:t>diferentes</w:t>
-      </w:r>
-      <w:proofErr w:type="spellEnd"/>
-      <w:r>
-        <w:rPr>
-          <w:rFonts w:ascii="Times New Roman" w:hAnsi="Times New Roman" w:cs="Times New Roman"/>
-          <w:sz w:val="24"/>
-          <w:szCs w:val="24"/>
-        </w:rPr>
-        <w:t xml:space="preserve"> a las </w:t>
-      </w:r>
-      <w:proofErr w:type="spellStart"/>
-      <w:r>
-        <w:rPr>
-          <w:rFonts w:ascii="Times New Roman" w:hAnsi="Times New Roman" w:cs="Times New Roman"/>
-          <w:sz w:val="24"/>
-          <w:szCs w:val="24"/>
-        </w:rPr>
-        <w:t>establecidas</w:t>
-      </w:r>
-      <w:proofErr w:type="spellEnd"/>
-      <w:r>
-        <w:rPr>
-          <w:rFonts w:ascii="Times New Roman" w:hAnsi="Times New Roman" w:cs="Times New Roman"/>
-          <w:sz w:val="24"/>
-          <w:szCs w:val="24"/>
-        </w:rPr>
-        <w:t xml:space="preserve"> dentro de las </w:t>
-      </w:r>
-      <w:proofErr w:type="spellStart"/>
-      <w:r>
-        <w:rPr>
-          <w:rFonts w:ascii="Times New Roman" w:hAnsi="Times New Roman" w:cs="Times New Roman"/>
-          <w:sz w:val="24"/>
-          <w:szCs w:val="24"/>
-        </w:rPr>
-        <w:t>entidades</w:t>
-      </w:r>
-      <w:proofErr w:type="spellEnd"/>
-      <w:r>
-        <w:rPr>
-          <w:rFonts w:ascii="Times New Roman" w:hAnsi="Times New Roman" w:cs="Times New Roman"/>
-          <w:sz w:val="24"/>
-          <w:szCs w:val="24"/>
-        </w:rPr>
-        <w:t xml:space="preserve"> y </w:t>
-      </w:r>
-      <w:proofErr w:type="spellStart"/>
-      <w:r>
-        <w:rPr>
-          <w:rFonts w:ascii="Times New Roman" w:hAnsi="Times New Roman" w:cs="Times New Roman"/>
-          <w:sz w:val="24"/>
-          <w:szCs w:val="24"/>
-        </w:rPr>
-        <w:t>relaciones</w:t>
-      </w:r>
-      <w:proofErr w:type="spellEnd"/>
-      <w:r>
-        <w:rPr>
-          <w:rFonts w:ascii="Times New Roman" w:hAnsi="Times New Roman" w:cs="Times New Roman"/>
-          <w:sz w:val="24"/>
-          <w:szCs w:val="24"/>
-        </w:rPr>
-        <w:t xml:space="preserve"> </w:t>
-      </w:r>
-      <w:proofErr w:type="spellStart"/>
-      <w:r>
-        <w:rPr>
-          <w:rFonts w:ascii="Times New Roman" w:hAnsi="Times New Roman" w:cs="Times New Roman"/>
-          <w:sz w:val="24"/>
-          <w:szCs w:val="24"/>
-        </w:rPr>
-        <w:t>correspondientes</w:t>
-      </w:r>
-      <w:proofErr w:type="spellEnd"/>
-      <w:r>
-        <w:rPr>
-          <w:rFonts w:ascii="Times New Roman" w:hAnsi="Times New Roman" w:cs="Times New Roman"/>
-          <w:sz w:val="24"/>
-          <w:szCs w:val="24"/>
-        </w:rPr>
-        <w:t xml:space="preserve"> al </w:t>
-      </w:r>
-      <w:proofErr w:type="spellStart"/>
-      <w:r>
-        <w:rPr>
-          <w:rFonts w:ascii="Times New Roman" w:hAnsi="Times New Roman" w:cs="Times New Roman"/>
-          <w:sz w:val="24"/>
-          <w:szCs w:val="24"/>
-        </w:rPr>
-        <w:t>módulo</w:t>
-      </w:r>
-      <w:proofErr w:type="spellEnd"/>
-      <w:r>
-        <w:rPr>
-          <w:rFonts w:ascii="Times New Roman" w:hAnsi="Times New Roman" w:cs="Times New Roman"/>
-          <w:sz w:val="24"/>
-          <w:szCs w:val="24"/>
-        </w:rPr>
-        <w:t>.</w:t>
+          <w:lang w:val="es-MX"/>
+        </w:rPr>
+        <w:t>Implementación de funcionalidades diferentes a las establecidas dentro de las entidades y relaciones correspondientes al módulo.</w:t>
       </w:r>
     </w:p>
     <w:p>
@@ -5535,7 +3865,7 @@
 </file>
 
 <file path=word/numbering.xml><?xml version="1.0" encoding="utf-8"?>
-<w:numbering xmlns:wpc="http://schemas.microsoft.com/office/word/2010/wordprocessingCanvas" xmlns:cx="http://schemas.microsoft.com/office/drawing/2014/chartex" xmlns:cx1="http://schemas.microsoft.com/office/drawing/2015/9/8/chartex" xmlns:cx2="http://schemas.microsoft.com/office/drawing/2015/10/21/chartex" xmlns:cx3="http://schemas.microsoft.com/office/drawing/2016/5/9/chartex" xmlns:cx4="http://schemas.microsoft.com/office/drawing/2016/5/10/chartex" xmlns:cx5="http://schemas.microsoft.com/office/drawing/2016/5/11/chartex" xmlns:cx6="http://schemas.microsoft.com/office/drawing/2016/5/12/chartex" xmlns:cx7="http://schemas.microsoft.com/office/drawing/2016/5/13/chartex" xmlns:cx8="http://schemas.microsoft.com/office/drawing/2016/5/14/chartex" xmlns:mc="http://schemas.openxmlformats.org/markup-compatibility/2006" xmlns:aink="http://schemas.microsoft.com/office/drawing/2016/ink" xmlns:am3d="http://schemas.microsoft.com/office/drawing/2017/model3d" xmlns:o="urn:schemas-microsoft-com:office:office" xmlns:r="http://schemas.openxmlformats.org/officeDocument/2006/relationships" xmlns:m="http://schemas.openxmlformats.org/officeDocument/2006/math" xmlns:v="urn:schemas-microsoft-com:vml" xmlns:wp14="http://schemas.microsoft.com/office/word/2010/wordprocessingDrawing" xmlns:wp="http://schemas.openxmlformats.org/drawingml/2006/wordprocessingDrawing" xmlns:w10="urn:schemas-microsoft-com:office:word" xmlns:w="http://schemas.openxmlformats.org/wordprocessingml/2006/main" xmlns:w14="http://schemas.microsoft.com/office/word/2010/wordml" xmlns:w15="http://schemas.microsoft.com/office/word/2012/wordml" xmlns:w16cex="http://schemas.microsoft.com/office/word/2018/wordml/cex" xmlns:w16cid="http://schemas.microsoft.com/office/word/2016/wordml/cid" xmlns:w16="http://schemas.microsoft.com/office/word/2018/wordml" xmlns:w16sdtdh="http://schemas.microsoft.com/office/word/2020/wordml/sdtdatahash" xmlns:w16se="http://schemas.microsoft.com/office/word/2015/wordml/symex" xmlns:wpg="http://schemas.microsoft.com/office/word/2010/wordprocessingGroup" xmlns:wpi="http://schemas.microsoft.com/office/word/2010/wordprocessingInk" xmlns:wne="http://schemas.microsoft.com/office/word/2006/wordml" xmlns:wps="http://schemas.microsoft.com/office/word/2010/wordprocessingShape" mc:Ignorable="w14 w15 w16se w16cid w16 w16cex w16sdtdh wp14">
+<w:numbering xmlns:wpc="http://schemas.microsoft.com/office/word/2010/wordprocessingCanvas" xmlns:cx="http://schemas.microsoft.com/office/drawing/2014/chartex" xmlns:cx1="http://schemas.microsoft.com/office/drawing/2015/9/8/chartex" xmlns:cx2="http://schemas.microsoft.com/office/drawing/2015/10/21/chartex" xmlns:cx3="http://schemas.microsoft.com/office/drawing/2016/5/9/chartex" xmlns:cx4="http://schemas.microsoft.com/office/drawing/2016/5/10/chartex" xmlns:cx5="http://schemas.microsoft.com/office/drawing/2016/5/11/chartex" xmlns:cx6="http://schemas.microsoft.com/office/drawing/2016/5/12/chartex" xmlns:cx7="http://schemas.microsoft.com/office/drawing/2016/5/13/chartex" xmlns:cx8="http://schemas.microsoft.com/office/drawing/2016/5/14/chartex" xmlns:mc="http://schemas.openxmlformats.org/markup-compatibility/2006" xmlns:aink="http://schemas.microsoft.com/office/drawing/2016/ink" xmlns:am3d="http://schemas.microsoft.com/office/drawing/2017/model3d" xmlns:o="urn:schemas-microsoft-com:office:office" xmlns:oel="http://schemas.microsoft.com/office/2019/extlst" xmlns:r="http://schemas.openxmlformats.org/officeDocument/2006/relationships" xmlns:m="http://schemas.openxmlformats.org/officeDocument/2006/math" xmlns:v="urn:schemas-microsoft-com:vml" xmlns:wp14="http://schemas.microsoft.com/office/word/2010/wordprocessingDrawing" xmlns:wp="http://schemas.openxmlformats.org/drawingml/2006/wordprocessingDrawing" xmlns:w10="urn:schemas-microsoft-com:office:word" xmlns:w="http://schemas.openxmlformats.org/wordprocessingml/2006/main" xmlns:w14="http://schemas.microsoft.com/office/word/2010/wordml" xmlns:w15="http://schemas.microsoft.com/office/word/2012/wordml" xmlns:w16cex="http://schemas.microsoft.com/office/word/2018/wordml/cex" xmlns:w16cid="http://schemas.microsoft.com/office/word/2016/wordml/cid" xmlns:w16="http://schemas.microsoft.com/office/word/2018/wordml" xmlns:w16du="http://schemas.microsoft.com/office/word/2023/wordml/word16du" xmlns:w16sdtdh="http://schemas.microsoft.com/office/word/2020/wordml/sdtdatahash" xmlns:w16se="http://schemas.microsoft.com/office/word/2015/wordml/symex" xmlns:wpg="http://schemas.microsoft.com/office/word/2010/wordprocessingGroup" xmlns:wpi="http://schemas.microsoft.com/office/word/2010/wordprocessingInk" xmlns:wne="http://schemas.microsoft.com/office/word/2006/wordml" xmlns:wps="http://schemas.microsoft.com/office/word/2010/wordprocessingShape" mc:Ignorable="w14 w15 w16se w16cid w16 w16cex w16sdtdh w16du wp14">
   <w:abstractNum w:abstractNumId="0" w15:restartNumberingAfterBreak="0">
     <w:nsid w:val="FFFFFF89"/>
     <w:multiLevelType w:val="singleLevel"/>
@@ -6427,35 +4757,35 @@
       </w:rPr>
     </w:lvl>
   </w:abstractNum>
-  <w:num w:numId="1">
+  <w:num w:numId="1" w16cid:durableId="128135283">
     <w:abstractNumId w:val="4"/>
   </w:num>
-  <w:num w:numId="2">
+  <w:num w:numId="2" w16cid:durableId="21170353">
     <w:abstractNumId w:val="2"/>
   </w:num>
-  <w:num w:numId="3">
+  <w:num w:numId="3" w16cid:durableId="189268394">
     <w:abstractNumId w:val="1"/>
   </w:num>
-  <w:num w:numId="4">
+  <w:num w:numId="4" w16cid:durableId="1103454377">
     <w:abstractNumId w:val="3"/>
   </w:num>
-  <w:num w:numId="5">
+  <w:num w:numId="5" w16cid:durableId="1032073507">
     <w:abstractNumId w:val="5"/>
   </w:num>
-  <w:num w:numId="6">
+  <w:num w:numId="6" w16cid:durableId="1192379375">
     <w:abstractNumId w:val="7"/>
   </w:num>
-  <w:num w:numId="7">
+  <w:num w:numId="7" w16cid:durableId="591742390">
     <w:abstractNumId w:val="6"/>
   </w:num>
-  <w:num w:numId="8">
+  <w:num w:numId="8" w16cid:durableId="1853302657">
     <w:abstractNumId w:val="0"/>
   </w:num>
 </w:numbering>
 </file>
 
 <file path=word/styles.xml><?xml version="1.0" encoding="utf-8"?>
-<w:styles xmlns:mc="http://schemas.openxmlformats.org/markup-compatibility/2006" xmlns:r="http://schemas.openxmlformats.org/officeDocument/2006/relationships" xmlns:w="http://schemas.openxmlformats.org/wordprocessingml/2006/main" xmlns:w14="http://schemas.microsoft.com/office/word/2010/wordml" xmlns:w15="http://schemas.microsoft.com/office/word/2012/wordml" xmlns:w16cex="http://schemas.microsoft.com/office/word/2018/wordml/cex" xmlns:w16cid="http://schemas.microsoft.com/office/word/2016/wordml/cid" xmlns:w16="http://schemas.microsoft.com/office/word/2018/wordml" xmlns:w16sdtdh="http://schemas.microsoft.com/office/word/2020/wordml/sdtdatahash" xmlns:w16se="http://schemas.microsoft.com/office/word/2015/wordml/symex" mc:Ignorable="w14 w15 w16se w16cid w16 w16cex w16sdtdh">
+<w:styles xmlns:mc="http://schemas.openxmlformats.org/markup-compatibility/2006" xmlns:r="http://schemas.openxmlformats.org/officeDocument/2006/relationships" xmlns:w="http://schemas.openxmlformats.org/wordprocessingml/2006/main" xmlns:w14="http://schemas.microsoft.com/office/word/2010/wordml" xmlns:w15="http://schemas.microsoft.com/office/word/2012/wordml" xmlns:w16cex="http://schemas.microsoft.com/office/word/2018/wordml/cex" xmlns:w16cid="http://schemas.microsoft.com/office/word/2016/wordml/cid" xmlns:w16="http://schemas.microsoft.com/office/word/2018/wordml" xmlns:w16du="http://schemas.microsoft.com/office/word/2023/wordml/word16du" xmlns:w16sdtdh="http://schemas.microsoft.com/office/word/2020/wordml/sdtdatahash" xmlns:w16se="http://schemas.microsoft.com/office/word/2015/wordml/symex" mc:Ignorable="w14 w15 w16se w16cid w16 w16cex w16sdtdh w16du">
   <w:docDefaults>
     <w:rPrDefault>
       <w:rPr>
@@ -6893,11 +5223,11 @@
     <w:uiPriority w:val="9"/>
     <w:unhideWhenUsed/>
     <w:qFormat/>
-    <w:rsid w:val="00B47789"/>
+    <w:rsid w:val="00FF3D20"/>
     <w:pPr>
       <w:keepNext/>
       <w:keepLines/>
-      <w:spacing w:before="160" w:after="80"/>
+      <w:ind w:firstLine="0"/>
       <w:outlineLvl w:val="1"/>
     </w:pPr>
     <w:rPr>
@@ -7104,7 +5434,7 @@
     <w:basedOn w:val="Fuentedeprrafopredeter"/>
     <w:link w:val="Ttulo2"/>
     <w:uiPriority w:val="9"/>
-    <w:rsid w:val="00B47789"/>
+    <w:rsid w:val="00FF3D20"/>
     <w:rPr>
       <w:rFonts w:ascii="Times New Roman" w:eastAsiaTheme="majorEastAsia" w:hAnsi="Times New Roman" w:cstheme="majorBidi"/>
       <w:b/>

</xml_diff>

<commit_message>
docs: se hacen algunas mejoras al documento, actualizando la tabla de contenido
</commit_message>
<xml_diff>
--- a/informe de requisitos.docx
+++ b/informe de requisitos.docx
@@ -4,11 +4,14 @@
   <w:body>
     <w:p>
       <w:pPr>
-        <w:jc w:val="center"/>
-        <w:rPr>
-          <w:rFonts w:cs="Times New Roman"/>
-        </w:rPr>
-      </w:pPr>
+        <w:spacing w:after="160" w:line="278" w:lineRule="auto"/>
+        <w:ind w:firstLine="0"/>
+        <w:jc w:val="center"/>
+        <w:rPr>
+          <w:rFonts w:cs="Times New Roman"/>
+        </w:rPr>
+      </w:pPr>
+      <w:bookmarkStart w:id="0" w:name="_Hlk242132836"/>
       <w:r>
         <w:rPr>
           <w:rFonts w:cs="Times New Roman"/>
@@ -18,117 +21,134 @@
     </w:p>
     <w:p>
       <w:pPr>
-        <w:jc w:val="center"/>
-        <w:rPr>
-          <w:rFonts w:cs="Times New Roman"/>
-        </w:rPr>
-      </w:pPr>
-    </w:p>
-    <w:p>
-      <w:pPr>
-        <w:jc w:val="center"/>
-        <w:rPr>
-          <w:rFonts w:cs="Times New Roman"/>
-        </w:rPr>
-      </w:pPr>
-    </w:p>
-    <w:p>
-      <w:pPr>
-        <w:jc w:val="center"/>
-        <w:rPr>
-          <w:rFonts w:cs="Times New Roman"/>
-        </w:rPr>
-      </w:pPr>
+        <w:spacing w:after="160" w:line="278" w:lineRule="auto"/>
+        <w:ind w:firstLine="0"/>
+        <w:jc w:val="center"/>
+        <w:rPr>
+          <w:rFonts w:cs="Times New Roman"/>
+        </w:rPr>
+      </w:pPr>
+    </w:p>
+    <w:p>
+      <w:pPr>
+        <w:spacing w:after="160" w:line="278" w:lineRule="auto"/>
+        <w:ind w:firstLine="0"/>
+        <w:jc w:val="center"/>
+        <w:rPr>
+          <w:rFonts w:cs="Times New Roman"/>
+        </w:rPr>
+      </w:pPr>
+    </w:p>
+    <w:p>
+      <w:pPr>
+        <w:spacing w:after="160" w:line="278" w:lineRule="auto"/>
+        <w:ind w:firstLine="0"/>
+        <w:jc w:val="center"/>
+        <w:rPr>
+          <w:rFonts w:cs="Times New Roman"/>
+        </w:rPr>
+      </w:pPr>
+    </w:p>
+    <w:p>
+      <w:pPr>
+        <w:spacing w:after="160" w:line="278" w:lineRule="auto"/>
+        <w:ind w:firstLine="0"/>
+        <w:jc w:val="center"/>
+        <w:rPr>
+          <w:rFonts w:cs="Times New Roman"/>
+        </w:rPr>
+      </w:pPr>
+      <w:r>
+        <w:rPr>
+          <w:rFonts w:cs="Times New Roman"/>
+        </w:rPr>
+        <w:t>Juan Felipe Isaza Vásquez</w:t>
+      </w:r>
       <w:r>
         <w:rPr>
           <w:rFonts w:cs="Times New Roman"/>
         </w:rPr>
         <w:br/>
-        <w:t>Juan Felipe Isaza Vásquez</w:t>
+      </w:r>
+      <w:proofErr w:type="spellStart"/>
+      <w:r>
+        <w:rPr>
+          <w:rFonts w:cs="Times New Roman"/>
+        </w:rPr>
+        <w:t>Stiven</w:t>
+      </w:r>
+      <w:proofErr w:type="spellEnd"/>
+      <w:r>
+        <w:rPr>
+          <w:rFonts w:cs="Times New Roman"/>
+        </w:rPr>
+        <w:t xml:space="preserve"> Martínez Piedrahíta</w:t>
       </w:r>
       <w:r>
         <w:rPr>
           <w:rFonts w:cs="Times New Roman"/>
         </w:rPr>
         <w:br/>
-      </w:r>
-      <w:proofErr w:type="spellStart"/>
-      <w:r>
-        <w:rPr>
-          <w:rFonts w:cs="Times New Roman"/>
-        </w:rPr>
-        <w:t>Stiven</w:t>
-      </w:r>
-      <w:proofErr w:type="spellEnd"/>
-      <w:r>
-        <w:rPr>
-          <w:rFonts w:cs="Times New Roman"/>
-        </w:rPr>
-        <w:t xml:space="preserve"> Martínez Piedrahíta</w:t>
+        <w:t>Jorge Andrés Ávila Rodríguez</w:t>
       </w:r>
       <w:r>
         <w:rPr>
           <w:rFonts w:cs="Times New Roman"/>
         </w:rPr>
         <w:br/>
-      </w:r>
-      <w:r>
-        <w:rPr>
-          <w:rFonts w:cs="Times New Roman"/>
-        </w:rPr>
-        <w:t>Jorge Andrés Ávila Rodríguez</w:t>
+        <w:t>Brayner Stewart Flórez Palacios</w:t>
       </w:r>
       <w:r>
         <w:rPr>
           <w:rFonts w:cs="Times New Roman"/>
         </w:rPr>
         <w:br/>
-      </w:r>
-      <w:r>
-        <w:rPr>
-          <w:rFonts w:cs="Times New Roman"/>
-        </w:rPr>
-        <w:t>Brayner Stewart Flórez Palacios</w:t>
-      </w:r>
-      <w:r>
-        <w:rPr>
-          <w:rFonts w:cs="Times New Roman"/>
-        </w:rPr>
-        <w:br/>
-      </w:r>
-      <w:r>
-        <w:rPr>
-          <w:rFonts w:cs="Times New Roman"/>
-        </w:rPr>
         <w:t>Johann Felipe Hincapié Usuga</w:t>
       </w:r>
     </w:p>
     <w:p>
       <w:pPr>
-        <w:jc w:val="center"/>
-        <w:rPr>
-          <w:rFonts w:cs="Times New Roman"/>
-        </w:rPr>
-      </w:pPr>
-    </w:p>
-    <w:p>
-      <w:pPr>
-        <w:jc w:val="center"/>
-        <w:rPr>
-          <w:rFonts w:cs="Times New Roman"/>
-        </w:rPr>
-      </w:pPr>
-    </w:p>
-    <w:p>
-      <w:pPr>
-        <w:jc w:val="center"/>
-        <w:rPr>
-          <w:rFonts w:cs="Times New Roman"/>
-        </w:rPr>
-      </w:pPr>
-    </w:p>
-    <w:p>
-      <w:pPr>
+        <w:spacing w:after="160" w:line="278" w:lineRule="auto"/>
+        <w:ind w:firstLine="0"/>
+        <w:jc w:val="center"/>
+        <w:rPr>
+          <w:rFonts w:cs="Times New Roman"/>
+        </w:rPr>
+      </w:pPr>
+    </w:p>
+    <w:p>
+      <w:pPr>
+        <w:spacing w:after="160" w:line="278" w:lineRule="auto"/>
+        <w:ind w:firstLine="0"/>
+        <w:jc w:val="center"/>
+        <w:rPr>
+          <w:rFonts w:cs="Times New Roman"/>
+        </w:rPr>
+      </w:pPr>
+    </w:p>
+    <w:p>
+      <w:pPr>
+        <w:spacing w:after="160" w:line="278" w:lineRule="auto"/>
+        <w:ind w:firstLine="0"/>
+        <w:rPr>
+          <w:rFonts w:cs="Times New Roman"/>
+        </w:rPr>
+      </w:pPr>
+    </w:p>
+    <w:p>
+      <w:pPr>
+        <w:spacing w:after="160" w:line="278" w:lineRule="auto"/>
+        <w:ind w:firstLine="0"/>
+        <w:jc w:val="center"/>
+        <w:rPr>
+          <w:rFonts w:cs="Times New Roman"/>
+        </w:rPr>
+      </w:pPr>
+    </w:p>
+    <w:p>
+      <w:pPr>
+        <w:spacing w:after="160" w:line="278" w:lineRule="auto"/>
+        <w:ind w:firstLine="0"/>
         <w:jc w:val="center"/>
         <w:rPr>
           <w:rFonts w:cs="Times New Roman"/>
@@ -143,30 +163,47 @@
     </w:p>
     <w:p>
       <w:pPr>
-        <w:jc w:val="center"/>
-        <w:rPr>
-          <w:rFonts w:cs="Times New Roman"/>
-        </w:rPr>
-      </w:pPr>
-    </w:p>
-    <w:p>
-      <w:pPr>
-        <w:jc w:val="center"/>
-        <w:rPr>
-          <w:rFonts w:cs="Times New Roman"/>
-        </w:rPr>
-      </w:pPr>
-    </w:p>
-    <w:p>
-      <w:pPr>
-        <w:jc w:val="center"/>
-        <w:rPr>
-          <w:rFonts w:cs="Times New Roman"/>
-        </w:rPr>
-      </w:pPr>
-    </w:p>
-    <w:p>
-      <w:pPr>
+        <w:spacing w:after="160" w:line="278" w:lineRule="auto"/>
+        <w:ind w:firstLine="0"/>
+        <w:jc w:val="center"/>
+        <w:rPr>
+          <w:rFonts w:cs="Times New Roman"/>
+        </w:rPr>
+      </w:pPr>
+    </w:p>
+    <w:p>
+      <w:pPr>
+        <w:spacing w:after="160" w:line="278" w:lineRule="auto"/>
+        <w:ind w:firstLine="0"/>
+        <w:rPr>
+          <w:rFonts w:cs="Times New Roman"/>
+        </w:rPr>
+      </w:pPr>
+    </w:p>
+    <w:p>
+      <w:pPr>
+        <w:spacing w:after="160" w:line="278" w:lineRule="auto"/>
+        <w:ind w:firstLine="0"/>
+        <w:jc w:val="center"/>
+        <w:rPr>
+          <w:rFonts w:cs="Times New Roman"/>
+        </w:rPr>
+      </w:pPr>
+    </w:p>
+    <w:p>
+      <w:pPr>
+        <w:spacing w:after="160" w:line="278" w:lineRule="auto"/>
+        <w:ind w:firstLine="0"/>
+        <w:jc w:val="center"/>
+        <w:rPr>
+          <w:rFonts w:cs="Times New Roman"/>
+        </w:rPr>
+      </w:pPr>
+    </w:p>
+    <w:p>
+      <w:pPr>
+        <w:spacing w:after="160" w:line="278" w:lineRule="auto"/>
+        <w:ind w:firstLine="0"/>
         <w:jc w:val="center"/>
         <w:rPr>
           <w:rFonts w:cs="Times New Roman"/>
@@ -181,38 +218,76 @@
     </w:p>
     <w:p>
       <w:pPr>
-        <w:jc w:val="center"/>
-        <w:rPr>
-          <w:rFonts w:cs="Times New Roman"/>
-        </w:rPr>
-      </w:pPr>
-    </w:p>
-    <w:p>
-      <w:pPr>
-        <w:jc w:val="center"/>
-        <w:rPr>
-          <w:rFonts w:cs="Times New Roman"/>
-        </w:rPr>
-      </w:pPr>
-    </w:p>
-    <w:p>
-      <w:pPr>
-        <w:jc w:val="center"/>
-        <w:rPr>
-          <w:rFonts w:cs="Times New Roman"/>
-        </w:rPr>
-      </w:pPr>
-    </w:p>
-    <w:p>
-      <w:pPr>
-        <w:jc w:val="center"/>
-        <w:rPr>
-          <w:rFonts w:cs="Times New Roman"/>
-        </w:rPr>
-      </w:pPr>
-    </w:p>
-    <w:p>
-      <w:pPr>
+        <w:spacing w:after="160" w:line="278" w:lineRule="auto"/>
+        <w:ind w:firstLine="0"/>
+        <w:jc w:val="center"/>
+        <w:rPr>
+          <w:rFonts w:cs="Times New Roman"/>
+        </w:rPr>
+      </w:pPr>
+    </w:p>
+    <w:p>
+      <w:pPr>
+        <w:spacing w:after="160" w:line="278" w:lineRule="auto"/>
+        <w:ind w:firstLine="0"/>
+        <w:rPr>
+          <w:rFonts w:cs="Times New Roman"/>
+        </w:rPr>
+      </w:pPr>
+    </w:p>
+    <w:p>
+      <w:pPr>
+        <w:spacing w:after="160" w:line="278" w:lineRule="auto"/>
+        <w:ind w:firstLine="0"/>
+        <w:jc w:val="center"/>
+        <w:rPr>
+          <w:rFonts w:cs="Times New Roman"/>
+        </w:rPr>
+      </w:pPr>
+    </w:p>
+    <w:p>
+      <w:pPr>
+        <w:spacing w:after="160" w:line="278" w:lineRule="auto"/>
+        <w:ind w:firstLine="0"/>
+        <w:jc w:val="center"/>
+        <w:rPr>
+          <w:rFonts w:cs="Times New Roman"/>
+        </w:rPr>
+      </w:pPr>
+    </w:p>
+    <w:p>
+      <w:pPr>
+        <w:spacing w:after="160" w:line="278" w:lineRule="auto"/>
+        <w:ind w:firstLine="0"/>
+        <w:jc w:val="center"/>
+        <w:rPr>
+          <w:rFonts w:cs="Times New Roman"/>
+        </w:rPr>
+      </w:pPr>
+    </w:p>
+    <w:p>
+      <w:pPr>
+        <w:spacing w:after="160" w:line="278" w:lineRule="auto"/>
+        <w:ind w:firstLine="0"/>
+        <w:jc w:val="center"/>
+        <w:rPr>
+          <w:rFonts w:cs="Times New Roman"/>
+        </w:rPr>
+      </w:pPr>
+    </w:p>
+    <w:p>
+      <w:pPr>
+        <w:spacing w:after="160" w:line="278" w:lineRule="auto"/>
+        <w:ind w:firstLine="0"/>
+        <w:jc w:val="center"/>
+        <w:rPr>
+          <w:rFonts w:cs="Times New Roman"/>
+        </w:rPr>
+      </w:pPr>
+    </w:p>
+    <w:p>
+      <w:pPr>
+        <w:spacing w:after="160" w:line="278" w:lineRule="auto"/>
         <w:ind w:firstLine="0"/>
         <w:jc w:val="center"/>
         <w:rPr>
@@ -238,14 +313,9 @@
         <w:rPr>
           <w:rFonts w:cs="Times New Roman"/>
         </w:rPr>
-        <w:t xml:space="preserve">Antioquia, </w:t>
-      </w:r>
-      <w:r>
-        <w:rPr>
-          <w:rFonts w:cs="Times New Roman"/>
-        </w:rPr>
-        <w:t>Medellín</w:t>
-      </w:r>
+        <w:t>Antioquia, Medellín</w:t>
+      </w:r>
+      <w:bookmarkEnd w:id="0"/>
       <w:r>
         <w:rPr>
           <w:rFonts w:cs="Times New Roman"/>
@@ -358,7 +428,7 @@
             </w:rPr>
             <w:fldChar w:fldCharType="separate"/>
           </w:r>
-          <w:hyperlink w:anchor="_Toc242124618" w:history="1">
+          <w:hyperlink w:anchor="_Toc242137958" w:history="1">
             <w:r>
               <w:rPr>
                 <w:rStyle w:val="Hipervnculo"/>
@@ -387,7 +457,7 @@
                 <w:noProof/>
                 <w:webHidden/>
               </w:rPr>
-              <w:instrText xml:space="preserve"> PAGEREF _Toc242124618 \h </w:instrText>
+              <w:instrText xml:space="preserve"> PAGEREF _Toc242137958 \h </w:instrText>
             </w:r>
             <w:r>
               <w:rPr>
@@ -433,7 +503,7 @@
               <w:lang w:val="es-MX" w:eastAsia="es-MX"/>
             </w:rPr>
           </w:pPr>
-          <w:hyperlink w:anchor="_Toc242124619" w:history="1">
+          <w:hyperlink w:anchor="_Toc242137959" w:history="1">
             <w:r>
               <w:rPr>
                 <w:rStyle w:val="Hipervnculo"/>
@@ -461,7 +531,7 @@
                 <w:noProof/>
                 <w:webHidden/>
               </w:rPr>
-              <w:instrText xml:space="preserve"> PAGEREF _Toc242124619 \h </w:instrText>
+              <w:instrText xml:space="preserve"> PAGEREF _Toc242137959 \h </w:instrText>
             </w:r>
             <w:r>
               <w:rPr>
@@ -507,7 +577,7 @@
               <w:lang w:val="es-MX" w:eastAsia="es-MX"/>
             </w:rPr>
           </w:pPr>
-          <w:hyperlink w:anchor="_Toc242124620" w:history="1">
+          <w:hyperlink w:anchor="_Toc242137960" w:history="1">
             <w:r>
               <w:rPr>
                 <w:rStyle w:val="Hipervnculo"/>
@@ -535,7 +605,7 @@
                 <w:noProof/>
                 <w:webHidden/>
               </w:rPr>
-              <w:instrText xml:space="preserve"> PAGEREF _Toc242124620 \h </w:instrText>
+              <w:instrText xml:space="preserve"> PAGEREF _Toc242137960 \h </w:instrText>
             </w:r>
             <w:r>
               <w:rPr>
@@ -581,7 +651,7 @@
               <w:lang w:val="es-MX" w:eastAsia="es-MX"/>
             </w:rPr>
           </w:pPr>
-          <w:hyperlink w:anchor="_Toc242124621" w:history="1">
+          <w:hyperlink w:anchor="_Toc242137961" w:history="1">
             <w:r>
               <w:rPr>
                 <w:rStyle w:val="Hipervnculo"/>
@@ -608,7 +678,7 @@
                 <w:noProof/>
                 <w:webHidden/>
               </w:rPr>
-              <w:instrText xml:space="preserve"> PAGEREF _Toc242124621 \h </w:instrText>
+              <w:instrText xml:space="preserve"> PAGEREF _Toc242137961 \h </w:instrText>
             </w:r>
             <w:r>
               <w:rPr>
@@ -654,7 +724,7 @@
               <w:lang w:val="es-MX" w:eastAsia="es-MX"/>
             </w:rPr>
           </w:pPr>
-          <w:hyperlink w:anchor="_Toc242124622" w:history="1">
+          <w:hyperlink w:anchor="_Toc242137962" w:history="1">
             <w:r>
               <w:rPr>
                 <w:rStyle w:val="Hipervnculo"/>
@@ -681,7 +751,7 @@
                 <w:noProof/>
                 <w:webHidden/>
               </w:rPr>
-              <w:instrText xml:space="preserve"> PAGEREF _Toc242124622 \h </w:instrText>
+              <w:instrText xml:space="preserve"> PAGEREF _Toc242137962 \h </w:instrText>
             </w:r>
             <w:r>
               <w:rPr>
@@ -727,7 +797,7 @@
               <w:lang w:val="es-MX" w:eastAsia="es-MX"/>
             </w:rPr>
           </w:pPr>
-          <w:hyperlink w:anchor="_Toc242124623" w:history="1">
+          <w:hyperlink w:anchor="_Toc242137963" w:history="1">
             <w:r>
               <w:rPr>
                 <w:rStyle w:val="Hipervnculo"/>
@@ -754,7 +824,7 @@
                 <w:noProof/>
                 <w:webHidden/>
               </w:rPr>
-              <w:instrText xml:space="preserve"> PAGEREF _Toc242124623 \h </w:instrText>
+              <w:instrText xml:space="preserve"> PAGEREF _Toc242137963 \h </w:instrText>
             </w:r>
             <w:r>
               <w:rPr>
@@ -800,7 +870,7 @@
               <w:lang w:val="es-MX" w:eastAsia="es-MX"/>
             </w:rPr>
           </w:pPr>
-          <w:hyperlink w:anchor="_Toc242124624" w:history="1">
+          <w:hyperlink w:anchor="_Toc242137964" w:history="1">
             <w:r>
               <w:rPr>
                 <w:rStyle w:val="Hipervnculo"/>
@@ -828,7 +898,7 @@
                 <w:noProof/>
                 <w:webHidden/>
               </w:rPr>
-              <w:instrText xml:space="preserve"> PAGEREF _Toc242124624 \h </w:instrText>
+              <w:instrText xml:space="preserve"> PAGEREF _Toc242137964 \h </w:instrText>
             </w:r>
             <w:r>
               <w:rPr>
@@ -848,7 +918,7 @@
                 <w:noProof/>
                 <w:webHidden/>
               </w:rPr>
-              <w:t>9</w:t>
+              <w:t>10</w:t>
             </w:r>
             <w:r>
               <w:rPr>
@@ -874,7 +944,7 @@
               <w:lang w:val="es-MX" w:eastAsia="es-MX"/>
             </w:rPr>
           </w:pPr>
-          <w:hyperlink w:anchor="_Toc242124625" w:history="1">
+          <w:hyperlink w:anchor="_Toc242137965" w:history="1">
             <w:r>
               <w:rPr>
                 <w:rStyle w:val="Hipervnculo"/>
@@ -901,7 +971,7 @@
                 <w:noProof/>
                 <w:webHidden/>
               </w:rPr>
-              <w:instrText xml:space="preserve"> PAGEREF _Toc242124625 \h </w:instrText>
+              <w:instrText xml:space="preserve"> PAGEREF _Toc242137965 \h </w:instrText>
             </w:r>
             <w:r>
               <w:rPr>
@@ -921,7 +991,7 @@
                 <w:noProof/>
                 <w:webHidden/>
               </w:rPr>
-              <w:t>9</w:t>
+              <w:t>10</w:t>
             </w:r>
             <w:r>
               <w:rPr>
@@ -947,7 +1017,7 @@
               <w:lang w:val="es-MX" w:eastAsia="es-MX"/>
             </w:rPr>
           </w:pPr>
-          <w:hyperlink w:anchor="_Toc242124626" w:history="1">
+          <w:hyperlink w:anchor="_Toc242137966" w:history="1">
             <w:r>
               <w:rPr>
                 <w:rStyle w:val="Hipervnculo"/>
@@ -976,7 +1046,7 @@
                 <w:noProof/>
                 <w:webHidden/>
               </w:rPr>
-              <w:instrText xml:space="preserve"> PAGEREF _Toc242124626 \h </w:instrText>
+              <w:instrText xml:space="preserve"> PAGEREF _Toc242137966 \h </w:instrText>
             </w:r>
             <w:r>
               <w:rPr>
@@ -996,7 +1066,7 @@
                 <w:noProof/>
                 <w:webHidden/>
               </w:rPr>
-              <w:t>9</w:t>
+              <w:t>10</w:t>
             </w:r>
             <w:r>
               <w:rPr>
@@ -1022,7 +1092,7 @@
               <w:lang w:val="es-MX" w:eastAsia="es-MX"/>
             </w:rPr>
           </w:pPr>
-          <w:hyperlink w:anchor="_Toc242124627" w:history="1">
+          <w:hyperlink w:anchor="_Toc242137967" w:history="1">
             <w:r>
               <w:rPr>
                 <w:rStyle w:val="Hipervnculo"/>
@@ -1051,7 +1121,7 @@
                 <w:noProof/>
                 <w:webHidden/>
               </w:rPr>
-              <w:instrText xml:space="preserve"> PAGEREF _Toc242124627 \h </w:instrText>
+              <w:instrText xml:space="preserve"> PAGEREF _Toc242137967 \h </w:instrText>
             </w:r>
             <w:r>
               <w:rPr>
@@ -1071,7 +1141,7 @@
                 <w:noProof/>
                 <w:webHidden/>
               </w:rPr>
-              <w:t>9</w:t>
+              <w:t>10</w:t>
             </w:r>
             <w:r>
               <w:rPr>
@@ -1097,7 +1167,7 @@
               <w:lang w:val="es-MX" w:eastAsia="es-MX"/>
             </w:rPr>
           </w:pPr>
-          <w:hyperlink w:anchor="_Toc242124628" w:history="1">
+          <w:hyperlink w:anchor="_Toc242137968" w:history="1">
             <w:r>
               <w:rPr>
                 <w:rStyle w:val="Hipervnculo"/>
@@ -1125,7 +1195,7 @@
                 <w:noProof/>
                 <w:webHidden/>
               </w:rPr>
-              <w:instrText xml:space="preserve"> PAGEREF _Toc242124628 \h </w:instrText>
+              <w:instrText xml:space="preserve"> PAGEREF _Toc242137968 \h </w:instrText>
             </w:r>
             <w:r>
               <w:rPr>
@@ -1145,7 +1215,7 @@
                 <w:noProof/>
                 <w:webHidden/>
               </w:rPr>
-              <w:t>11</w:t>
+              <w:t>12</w:t>
             </w:r>
             <w:r>
               <w:rPr>
@@ -1171,7 +1241,7 @@
               <w:lang w:val="es-MX" w:eastAsia="es-MX"/>
             </w:rPr>
           </w:pPr>
-          <w:hyperlink w:anchor="_Toc242124629" w:history="1">
+          <w:hyperlink w:anchor="_Toc242137969" w:history="1">
             <w:r>
               <w:rPr>
                 <w:rStyle w:val="Hipervnculo"/>
@@ -1199,7 +1269,7 @@
                 <w:noProof/>
                 <w:webHidden/>
               </w:rPr>
-              <w:instrText xml:space="preserve"> PAGEREF _Toc242124629 \h </w:instrText>
+              <w:instrText xml:space="preserve"> PAGEREF _Toc242137969 \h </w:instrText>
             </w:r>
             <w:r>
               <w:rPr>
@@ -1219,7 +1289,7 @@
                 <w:noProof/>
                 <w:webHidden/>
               </w:rPr>
-              <w:t>13</w:t>
+              <w:t>14</w:t>
             </w:r>
             <w:r>
               <w:rPr>
@@ -1245,7 +1315,7 @@
               <w:lang w:val="es-MX" w:eastAsia="es-MX"/>
             </w:rPr>
           </w:pPr>
-          <w:hyperlink w:anchor="_Toc242124630" w:history="1">
+          <w:hyperlink w:anchor="_Toc242137970" w:history="1">
             <w:r>
               <w:rPr>
                 <w:rStyle w:val="Hipervnculo"/>
@@ -1273,7 +1343,7 @@
                 <w:noProof/>
                 <w:webHidden/>
               </w:rPr>
-              <w:instrText xml:space="preserve"> PAGEREF _Toc242124630 \h </w:instrText>
+              <w:instrText xml:space="preserve"> PAGEREF _Toc242137970 \h </w:instrText>
             </w:r>
             <w:r>
               <w:rPr>
@@ -1293,7 +1363,7 @@
                 <w:noProof/>
                 <w:webHidden/>
               </w:rPr>
-              <w:t>13</w:t>
+              <w:t>14</w:t>
             </w:r>
             <w:r>
               <w:rPr>
@@ -1319,7 +1389,7 @@
               <w:lang w:val="es-MX" w:eastAsia="es-MX"/>
             </w:rPr>
           </w:pPr>
-          <w:hyperlink w:anchor="_Toc242124631" w:history="1">
+          <w:hyperlink w:anchor="_Toc242137971" w:history="1">
             <w:r>
               <w:rPr>
                 <w:rStyle w:val="Hipervnculo"/>
@@ -1347,7 +1417,7 @@
                 <w:noProof/>
                 <w:webHidden/>
               </w:rPr>
-              <w:instrText xml:space="preserve"> PAGEREF _Toc242124631 \h </w:instrText>
+              <w:instrText xml:space="preserve"> PAGEREF _Toc242137971 \h </w:instrText>
             </w:r>
             <w:r>
               <w:rPr>
@@ -1367,7 +1437,372 @@
                 <w:noProof/>
                 <w:webHidden/>
               </w:rPr>
-              <w:t>13</w:t>
+              <w:t>14</w:t>
+            </w:r>
+            <w:r>
+              <w:rPr>
+                <w:noProof/>
+                <w:webHidden/>
+              </w:rPr>
+              <w:fldChar w:fldCharType="end"/>
+            </w:r>
+          </w:hyperlink>
+        </w:p>
+        <w:p>
+          <w:pPr>
+            <w:pStyle w:val="TDC1"/>
+            <w:tabs>
+              <w:tab w:val="right" w:leader="dot" w:pos="8828"/>
+            </w:tabs>
+            <w:rPr>
+              <w:rFonts w:asciiTheme="minorHAnsi" w:eastAsiaTheme="minorEastAsia" w:hAnsiTheme="minorHAnsi"/>
+              <w:noProof/>
+              <w:color w:val="auto"/>
+              <w:sz w:val="22"/>
+              <w:szCs w:val="22"/>
+              <w:lang w:val="es-MX" w:eastAsia="es-MX"/>
+            </w:rPr>
+          </w:pPr>
+          <w:hyperlink w:anchor="_Toc242137972" w:history="1">
+            <w:r>
+              <w:rPr>
+                <w:rStyle w:val="Hipervnculo"/>
+                <w:noProof/>
+              </w:rPr>
+              <w:t>Modelo Relacional</w:t>
+            </w:r>
+            <w:r>
+              <w:rPr>
+                <w:noProof/>
+                <w:webHidden/>
+              </w:rPr>
+              <w:tab/>
+            </w:r>
+            <w:r>
+              <w:rPr>
+                <w:noProof/>
+                <w:webHidden/>
+              </w:rPr>
+              <w:fldChar w:fldCharType="begin"/>
+            </w:r>
+            <w:r>
+              <w:rPr>
+                <w:noProof/>
+                <w:webHidden/>
+              </w:rPr>
+              <w:instrText xml:space="preserve"> PAGEREF _Toc242137972 \h </w:instrText>
+            </w:r>
+            <w:r>
+              <w:rPr>
+                <w:noProof/>
+                <w:webHidden/>
+              </w:rPr>
+            </w:r>
+            <w:r>
+              <w:rPr>
+                <w:noProof/>
+                <w:webHidden/>
+              </w:rPr>
+              <w:fldChar w:fldCharType="separate"/>
+            </w:r>
+            <w:r>
+              <w:rPr>
+                <w:noProof/>
+                <w:webHidden/>
+              </w:rPr>
+              <w:t>16</w:t>
+            </w:r>
+            <w:r>
+              <w:rPr>
+                <w:noProof/>
+                <w:webHidden/>
+              </w:rPr>
+              <w:fldChar w:fldCharType="end"/>
+            </w:r>
+          </w:hyperlink>
+        </w:p>
+        <w:p>
+          <w:pPr>
+            <w:pStyle w:val="TDC1"/>
+            <w:tabs>
+              <w:tab w:val="right" w:leader="dot" w:pos="8828"/>
+            </w:tabs>
+            <w:rPr>
+              <w:rFonts w:asciiTheme="minorHAnsi" w:eastAsiaTheme="minorEastAsia" w:hAnsiTheme="minorHAnsi"/>
+              <w:noProof/>
+              <w:color w:val="auto"/>
+              <w:sz w:val="22"/>
+              <w:szCs w:val="22"/>
+              <w:lang w:val="es-MX" w:eastAsia="es-MX"/>
+            </w:rPr>
+          </w:pPr>
+          <w:hyperlink w:anchor="_Toc242137973" w:history="1">
+            <w:r>
+              <w:rPr>
+                <w:rStyle w:val="Hipervnculo"/>
+                <w:noProof/>
+              </w:rPr>
+              <w:t>Conclusiones</w:t>
+            </w:r>
+            <w:r>
+              <w:rPr>
+                <w:noProof/>
+                <w:webHidden/>
+              </w:rPr>
+              <w:tab/>
+            </w:r>
+            <w:r>
+              <w:rPr>
+                <w:noProof/>
+                <w:webHidden/>
+              </w:rPr>
+              <w:fldChar w:fldCharType="begin"/>
+            </w:r>
+            <w:r>
+              <w:rPr>
+                <w:noProof/>
+                <w:webHidden/>
+              </w:rPr>
+              <w:instrText xml:space="preserve"> PAGEREF _Toc242137973 \h </w:instrText>
+            </w:r>
+            <w:r>
+              <w:rPr>
+                <w:noProof/>
+                <w:webHidden/>
+              </w:rPr>
+            </w:r>
+            <w:r>
+              <w:rPr>
+                <w:noProof/>
+                <w:webHidden/>
+              </w:rPr>
+              <w:fldChar w:fldCharType="separate"/>
+            </w:r>
+            <w:r>
+              <w:rPr>
+                <w:noProof/>
+                <w:webHidden/>
+              </w:rPr>
+              <w:t>17</w:t>
+            </w:r>
+            <w:r>
+              <w:rPr>
+                <w:noProof/>
+                <w:webHidden/>
+              </w:rPr>
+              <w:fldChar w:fldCharType="end"/>
+            </w:r>
+          </w:hyperlink>
+        </w:p>
+        <w:p>
+          <w:pPr>
+            <w:pStyle w:val="TDC1"/>
+            <w:tabs>
+              <w:tab w:val="right" w:leader="dot" w:pos="8828"/>
+            </w:tabs>
+            <w:rPr>
+              <w:rFonts w:asciiTheme="minorHAnsi" w:eastAsiaTheme="minorEastAsia" w:hAnsiTheme="minorHAnsi"/>
+              <w:noProof/>
+              <w:color w:val="auto"/>
+              <w:sz w:val="22"/>
+              <w:szCs w:val="22"/>
+              <w:lang w:val="es-MX" w:eastAsia="es-MX"/>
+            </w:rPr>
+          </w:pPr>
+          <w:hyperlink w:anchor="_Toc242137974" w:history="1">
+            <w:r>
+              <w:rPr>
+                <w:rStyle w:val="Hipervnculo"/>
+                <w:noProof/>
+              </w:rPr>
+              <w:t>Glosario</w:t>
+            </w:r>
+            <w:r>
+              <w:rPr>
+                <w:noProof/>
+                <w:webHidden/>
+              </w:rPr>
+              <w:tab/>
+            </w:r>
+            <w:r>
+              <w:rPr>
+                <w:noProof/>
+                <w:webHidden/>
+              </w:rPr>
+              <w:fldChar w:fldCharType="begin"/>
+            </w:r>
+            <w:r>
+              <w:rPr>
+                <w:noProof/>
+                <w:webHidden/>
+              </w:rPr>
+              <w:instrText xml:space="preserve"> PAGEREF _Toc242137974 \h </w:instrText>
+            </w:r>
+            <w:r>
+              <w:rPr>
+                <w:noProof/>
+                <w:webHidden/>
+              </w:rPr>
+            </w:r>
+            <w:r>
+              <w:rPr>
+                <w:noProof/>
+                <w:webHidden/>
+              </w:rPr>
+              <w:fldChar w:fldCharType="separate"/>
+            </w:r>
+            <w:r>
+              <w:rPr>
+                <w:noProof/>
+                <w:webHidden/>
+              </w:rPr>
+              <w:t>18</w:t>
+            </w:r>
+            <w:r>
+              <w:rPr>
+                <w:noProof/>
+                <w:webHidden/>
+              </w:rPr>
+              <w:fldChar w:fldCharType="end"/>
+            </w:r>
+          </w:hyperlink>
+        </w:p>
+        <w:p>
+          <w:pPr>
+            <w:pStyle w:val="TDC1"/>
+            <w:tabs>
+              <w:tab w:val="right" w:leader="dot" w:pos="8828"/>
+            </w:tabs>
+            <w:rPr>
+              <w:rFonts w:asciiTheme="minorHAnsi" w:eastAsiaTheme="minorEastAsia" w:hAnsiTheme="minorHAnsi"/>
+              <w:noProof/>
+              <w:color w:val="auto"/>
+              <w:sz w:val="22"/>
+              <w:szCs w:val="22"/>
+              <w:lang w:val="es-MX" w:eastAsia="es-MX"/>
+            </w:rPr>
+          </w:pPr>
+          <w:hyperlink w:anchor="_Toc242137975" w:history="1">
+            <w:r>
+              <w:rPr>
+                <w:rStyle w:val="Hipervnculo"/>
+                <w:noProof/>
+              </w:rPr>
+              <w:t>Referencias</w:t>
+            </w:r>
+            <w:r>
+              <w:rPr>
+                <w:noProof/>
+                <w:webHidden/>
+              </w:rPr>
+              <w:tab/>
+            </w:r>
+            <w:r>
+              <w:rPr>
+                <w:noProof/>
+                <w:webHidden/>
+              </w:rPr>
+              <w:fldChar w:fldCharType="begin"/>
+            </w:r>
+            <w:r>
+              <w:rPr>
+                <w:noProof/>
+                <w:webHidden/>
+              </w:rPr>
+              <w:instrText xml:space="preserve"> PAGEREF _Toc242137975 \h </w:instrText>
+            </w:r>
+            <w:r>
+              <w:rPr>
+                <w:noProof/>
+                <w:webHidden/>
+              </w:rPr>
+            </w:r>
+            <w:r>
+              <w:rPr>
+                <w:noProof/>
+                <w:webHidden/>
+              </w:rPr>
+              <w:fldChar w:fldCharType="separate"/>
+            </w:r>
+            <w:r>
+              <w:rPr>
+                <w:noProof/>
+                <w:webHidden/>
+              </w:rPr>
+              <w:t>19</w:t>
+            </w:r>
+            <w:r>
+              <w:rPr>
+                <w:noProof/>
+                <w:webHidden/>
+              </w:rPr>
+              <w:fldChar w:fldCharType="end"/>
+            </w:r>
+          </w:hyperlink>
+        </w:p>
+        <w:p>
+          <w:pPr>
+            <w:pStyle w:val="TDC1"/>
+            <w:tabs>
+              <w:tab w:val="right" w:leader="dot" w:pos="8828"/>
+            </w:tabs>
+            <w:rPr>
+              <w:rFonts w:asciiTheme="minorHAnsi" w:eastAsiaTheme="minorEastAsia" w:hAnsiTheme="minorHAnsi"/>
+              <w:noProof/>
+              <w:color w:val="auto"/>
+              <w:sz w:val="22"/>
+              <w:szCs w:val="22"/>
+              <w:lang w:val="es-MX" w:eastAsia="es-MX"/>
+            </w:rPr>
+          </w:pPr>
+          <w:hyperlink w:anchor="_Toc242137976" w:history="1">
+            <w:r>
+              <w:rPr>
+                <w:rStyle w:val="Hipervnculo"/>
+                <w:noProof/>
+              </w:rPr>
+              <w:t>Reglamentación y Condiciones Legales</w:t>
+            </w:r>
+            <w:r>
+              <w:rPr>
+                <w:noProof/>
+                <w:webHidden/>
+              </w:rPr>
+              <w:tab/>
+            </w:r>
+            <w:r>
+              <w:rPr>
+                <w:noProof/>
+                <w:webHidden/>
+              </w:rPr>
+              <w:fldChar w:fldCharType="begin"/>
+            </w:r>
+            <w:r>
+              <w:rPr>
+                <w:noProof/>
+                <w:webHidden/>
+              </w:rPr>
+              <w:instrText xml:space="preserve"> PAGEREF _Toc242137976 \h </w:instrText>
+            </w:r>
+            <w:r>
+              <w:rPr>
+                <w:noProof/>
+                <w:webHidden/>
+              </w:rPr>
+            </w:r>
+            <w:r>
+              <w:rPr>
+                <w:noProof/>
+                <w:webHidden/>
+              </w:rPr>
+              <w:fldChar w:fldCharType="separate"/>
+            </w:r>
+            <w:r>
+              <w:rPr>
+                <w:noProof/>
+                <w:webHidden/>
+              </w:rPr>
+              <w:t>20</w:t>
             </w:r>
             <w:r>
               <w:rPr>
@@ -1453,7 +1888,7 @@
           <w:lang w:val="en-US"/>
         </w:rPr>
       </w:pPr>
-      <w:bookmarkStart w:id="0" w:name="_Toc242124618"/>
+      <w:bookmarkStart w:id="1" w:name="_Toc242137958"/>
       <w:proofErr w:type="spellStart"/>
       <w:r>
         <w:rPr>
@@ -1482,7 +1917,7 @@
         </w:rPr>
         <w:t>tablas</w:t>
       </w:r>
-      <w:bookmarkEnd w:id="0"/>
+      <w:bookmarkEnd w:id="1"/>
       <w:proofErr w:type="spellEnd"/>
     </w:p>
     <w:p>
@@ -1857,7 +2292,7 @@
           <w:szCs w:val="24"/>
         </w:rPr>
       </w:pPr>
-      <w:bookmarkStart w:id="1" w:name="_Toc242124619"/>
+      <w:bookmarkStart w:id="2" w:name="_Toc242137959"/>
       <w:r>
         <w:rPr>
           <w:rFonts w:cs="Times New Roman"/>
@@ -1866,7 +2301,7 @@
         <w:lastRenderedPageBreak/>
         <w:t>Listado de ilustraciones</w:t>
       </w:r>
-      <w:bookmarkEnd w:id="1"/>
+      <w:bookmarkEnd w:id="2"/>
     </w:p>
     <w:p>
       <w:pPr>
@@ -2019,7 +2454,7 @@
           <w:szCs w:val="24"/>
         </w:rPr>
       </w:pPr>
-      <w:bookmarkStart w:id="2" w:name="_Toc242124620"/>
+      <w:bookmarkStart w:id="3" w:name="_Toc242137960"/>
       <w:r>
         <w:rPr>
           <w:rFonts w:cs="Times New Roman"/>
@@ -2027,7 +2462,7 @@
         </w:rPr>
         <w:t>Introducción</w:t>
       </w:r>
-      <w:bookmarkEnd w:id="2"/>
+      <w:bookmarkEnd w:id="3"/>
     </w:p>
     <w:p>
       <w:pPr>
@@ -2098,12 +2533,15 @@
         <w:lastRenderedPageBreak/>
         <w:t xml:space="preserve"> </w:t>
       </w:r>
-      <w:bookmarkStart w:id="3" w:name="_Toc242124621"/>
+      <w:bookmarkStart w:id="4" w:name="_Toc242137961"/>
       <w:r>
         <w:t>Objetivos</w:t>
       </w:r>
-      <w:bookmarkEnd w:id="3"/>
-    </w:p>
+      <w:bookmarkEnd w:id="4"/>
+    </w:p>
+    <w:p/>
+    <w:p/>
+    <w:p/>
     <w:p>
       <w:pPr>
         <w:pStyle w:val="Ttulo2"/>
@@ -2111,11 +2549,11 @@
       <w:r>
         <w:t xml:space="preserve"> </w:t>
       </w:r>
-      <w:bookmarkStart w:id="4" w:name="_Toc242124622"/>
+      <w:bookmarkStart w:id="5" w:name="_Toc242137962"/>
       <w:r>
         <w:t>Objetivo general</w:t>
       </w:r>
-      <w:bookmarkEnd w:id="4"/>
+      <w:bookmarkEnd w:id="5"/>
     </w:p>
     <w:p>
       <w:r>
@@ -2129,11 +2567,11 @@
       <w:r>
         <w:t xml:space="preserve"> </w:t>
       </w:r>
-      <w:bookmarkStart w:id="5" w:name="_Toc242124623"/>
+      <w:bookmarkStart w:id="6" w:name="_Toc242137963"/>
       <w:r>
         <w:t>Objetivos específicos</w:t>
       </w:r>
-      <w:bookmarkEnd w:id="5"/>
+      <w:bookmarkEnd w:id="6"/>
     </w:p>
     <w:p>
       <w:pPr>
@@ -2223,6 +2661,7 @@
         <w:rPr>
           <w:lang w:val="es-MX"/>
         </w:rPr>
+        <w:lastRenderedPageBreak/>
         <w:t>Gestionar los reportes realizados por los usuarios sobre contenido que pueda afectar la calidad o convivencia de la comunidad.</w:t>
       </w:r>
     </w:p>
@@ -2269,7 +2708,7 @@
           <w:szCs w:val="24"/>
         </w:rPr>
       </w:pPr>
-      <w:bookmarkStart w:id="6" w:name="_Toc242124624"/>
+      <w:bookmarkStart w:id="7" w:name="_Toc242137964"/>
       <w:r>
         <w:rPr>
           <w:rFonts w:cs="Times New Roman"/>
@@ -2277,7 +2716,7 @@
         </w:rPr>
         <w:t>Planteamiento del problema</w:t>
       </w:r>
-      <w:bookmarkEnd w:id="6"/>
+      <w:bookmarkEnd w:id="7"/>
     </w:p>
     <w:p>
       <w:pPr>
@@ -2307,11 +2746,11 @@
       <w:r>
         <w:t xml:space="preserve"> </w:t>
       </w:r>
-      <w:bookmarkStart w:id="7" w:name="_Toc242124625"/>
+      <w:bookmarkStart w:id="8" w:name="_Toc242137965"/>
       <w:r>
         <w:t>Necesidad</w:t>
       </w:r>
-      <w:bookmarkEnd w:id="7"/>
+      <w:bookmarkEnd w:id="8"/>
     </w:p>
     <w:p>
       <w:pPr>
@@ -2341,7 +2780,7 @@
         </w:rPr>
         <w:t xml:space="preserve"> </w:t>
       </w:r>
-      <w:bookmarkStart w:id="8" w:name="_Toc242124626"/>
+      <w:bookmarkStart w:id="9" w:name="_Toc242137966"/>
       <w:r>
         <w:rPr>
           <w:rFonts w:eastAsia="Times New Roman"/>
@@ -2349,7 +2788,7 @@
         </w:rPr>
         <w:t>Manejo Actual</w:t>
       </w:r>
-      <w:bookmarkEnd w:id="8"/>
+      <w:bookmarkEnd w:id="9"/>
     </w:p>
     <w:p>
       <w:pPr>
@@ -2386,7 +2825,7 @@
           <w:lang w:val="es-MX" w:eastAsia="es-MX"/>
         </w:rPr>
       </w:pPr>
-      <w:bookmarkStart w:id="9" w:name="_Toc242124627"/>
+      <w:bookmarkStart w:id="10" w:name="_Toc242137967"/>
       <w:r>
         <w:rPr>
           <w:rFonts w:eastAsia="Times New Roman"/>
@@ -2394,7 +2833,7 @@
         </w:rPr>
         <w:t>Solución Propuesta (Célula 6)</w:t>
       </w:r>
-      <w:bookmarkEnd w:id="9"/>
+      <w:bookmarkEnd w:id="10"/>
     </w:p>
     <w:p>
       <w:pPr>
@@ -2434,7 +2873,7 @@
           <w:szCs w:val="24"/>
         </w:rPr>
       </w:pPr>
-      <w:bookmarkStart w:id="10" w:name="_Toc241140091"/>
+      <w:bookmarkStart w:id="11" w:name="_Toc241140091"/>
       <w:r>
         <w:rPr>
           <w:rFonts w:cs="Times New Roman"/>
@@ -2492,7 +2931,7 @@
         </w:rPr>
         <w:t xml:space="preserve"> - Comparativa</w:t>
       </w:r>
-      <w:bookmarkEnd w:id="10"/>
+      <w:bookmarkEnd w:id="11"/>
     </w:p>
     <w:tbl>
       <w:tblPr>
@@ -2658,7 +3097,7 @@
           <w:szCs w:val="24"/>
         </w:rPr>
       </w:pPr>
-      <w:bookmarkStart w:id="11" w:name="_Toc242124628"/>
+      <w:bookmarkStart w:id="12" w:name="_Toc242137968"/>
       <w:r>
         <w:rPr>
           <w:rFonts w:cs="Times New Roman"/>
@@ -2667,34 +3106,7 @@
         <w:lastRenderedPageBreak/>
         <w:t>Stack tecnológico</w:t>
       </w:r>
-      <w:bookmarkEnd w:id="11"/>
-    </w:p>
-    <w:p>
-      <w:pPr>
-        <w:rPr>
-          <w:rFonts w:cs="Times New Roman"/>
-        </w:rPr>
-      </w:pPr>
-    </w:p>
-    <w:p>
-      <w:pPr>
-        <w:rPr>
-          <w:rFonts w:cs="Times New Roman"/>
-        </w:rPr>
-      </w:pPr>
-    </w:p>
-    <w:p>
-      <w:pPr>
-        <w:rPr>
-          <w:rFonts w:cs="Times New Roman"/>
-        </w:rPr>
-      </w:pPr>
-      <w:r>
-        <w:rPr>
-          <w:rFonts w:cs="Times New Roman"/>
-        </w:rPr>
-        <w:t>El desarrollo de la plataforma se estructurará dividiendo la interfaz visual y la lógica interna mediante un stack tecnológico claro. En el lado del cliente, se utilizará HTML para construir la estructura de las pantallas, CSS para darle un diseño visual moderno y JavaScript para programar la interactividad y dinamismo de la interfaz. Para agilizar la experiencia de navegación, se hará uso de localStorage, lo que permite una persistencia de datos temporal directamente en el dispositivo del usuario, ideal para mantener sesiones activas o guardar preferencias rápidas sin saturar el servidor. Por otro lado, el núcleo del sistema (backend) estará desarrollado en Java, encargado de procesar las reglas de negocio, gestionar la seguridad y coordinar las peticiones. Finalmente, para garantizar una persistencia de datos permanente, estructurada y segura a largo plazo —como la información de los clientes, las citas programadas y el historial de servicios—, todo el sistema estará respaldado por una base de datos relacional gestionada mediante SQL.</w:t>
-      </w:r>
+      <w:bookmarkEnd w:id="12"/>
     </w:p>
     <w:p>
       <w:pPr>
@@ -2777,7 +3189,7 @@
           <w:szCs w:val="24"/>
         </w:rPr>
       </w:pPr>
-      <w:bookmarkStart w:id="12" w:name="_Toc241140366"/>
+      <w:bookmarkStart w:id="13" w:name="_Toc241140366"/>
       <w:r>
         <w:rPr>
           <w:rFonts w:cs="Times New Roman"/>
@@ -2843,7 +3255,7 @@
         </w:rPr>
         <w:t>tecnológico</w:t>
       </w:r>
-      <w:bookmarkEnd w:id="12"/>
+      <w:bookmarkEnd w:id="13"/>
       <w:r>
         <w:rPr>
           <w:rFonts w:cs="Times New Roman"/>
@@ -2861,7 +3273,7 @@
           <w:szCs w:val="24"/>
         </w:rPr>
       </w:pPr>
-      <w:bookmarkStart w:id="13" w:name="_Toc242124629"/>
+      <w:bookmarkStart w:id="14" w:name="_Toc242137969"/>
       <w:r>
         <w:rPr>
           <w:rFonts w:cs="Times New Roman"/>
@@ -2870,7 +3282,7 @@
         <w:lastRenderedPageBreak/>
         <w:t>2. Alcance</w:t>
       </w:r>
-      <w:bookmarkEnd w:id="13"/>
+      <w:bookmarkEnd w:id="14"/>
     </w:p>
     <w:p>
       <w:pPr>
@@ -2893,7 +3305,7 @@
           <w:szCs w:val="24"/>
         </w:rPr>
       </w:pPr>
-      <w:bookmarkStart w:id="14" w:name="_Toc242124630"/>
+      <w:bookmarkStart w:id="15" w:name="_Toc242137970"/>
       <w:r>
         <w:rPr>
           <w:rFonts w:cs="Times New Roman"/>
@@ -2901,7 +3313,195 @@
         </w:rPr>
         <w:t>2.1 Inclusiones</w:t>
       </w:r>
-      <w:bookmarkEnd w:id="14"/>
+      <w:bookmarkEnd w:id="15"/>
+    </w:p>
+    <w:p>
+      <w:pPr>
+        <w:rPr>
+          <w:lang w:val="es-MX"/>
+        </w:rPr>
+      </w:pPr>
+      <w:r>
+        <w:rPr>
+          <w:lang w:val="es-MX"/>
+        </w:rPr>
+        <w:t>Registro y gestión de las calificaciones realizadas por los usuarios sobre las recetas.</w:t>
+      </w:r>
+    </w:p>
+    <w:p>
+      <w:pPr>
+        <w:rPr>
+          <w:lang w:val="es-MX"/>
+        </w:rPr>
+      </w:pPr>
+      <w:r>
+        <w:rPr>
+          <w:lang w:val="es-MX"/>
+        </w:rPr>
+        <w:t>Registro de comentarios asociados a las recetas.</w:t>
+      </w:r>
+    </w:p>
+    <w:p>
+      <w:pPr>
+        <w:rPr>
+          <w:lang w:val="es-MX"/>
+        </w:rPr>
+      </w:pPr>
+      <w:r>
+        <w:rPr>
+          <w:lang w:val="es-MX"/>
+        </w:rPr>
+        <w:t>Gestión de las recetas favoritas de cada usuario.</w:t>
+      </w:r>
+    </w:p>
+    <w:p>
+      <w:pPr>
+        <w:rPr>
+          <w:lang w:val="es-MX"/>
+        </w:rPr>
+      </w:pPr>
+      <w:r>
+        <w:rPr>
+          <w:lang w:val="es-MX"/>
+        </w:rPr>
+        <w:t>Creación y organización de colecciones de recetas.</w:t>
+      </w:r>
+    </w:p>
+    <w:p>
+      <w:pPr>
+        <w:rPr>
+          <w:lang w:val="es-MX"/>
+        </w:rPr>
+      </w:pPr>
+      <w:r>
+        <w:rPr>
+          <w:lang w:val="es-MX"/>
+        </w:rPr>
+        <w:t xml:space="preserve">Relación entre favoritos y colecciones mediante la entidad </w:t>
+      </w:r>
+      <w:proofErr w:type="spellStart"/>
+      <w:r>
+        <w:rPr>
+          <w:lang w:val="es-MX"/>
+        </w:rPr>
+        <w:t>Favoritos_colecciones</w:t>
+      </w:r>
+      <w:proofErr w:type="spellEnd"/>
+      <w:r>
+        <w:rPr>
+          <w:lang w:val="es-MX"/>
+        </w:rPr>
+        <w:t>.</w:t>
+      </w:r>
+    </w:p>
+    <w:p>
+      <w:pPr>
+        <w:rPr>
+          <w:lang w:val="es-MX"/>
+        </w:rPr>
+      </w:pPr>
+      <w:r>
+        <w:rPr>
+          <w:lang w:val="es-MX"/>
+        </w:rPr>
+        <w:t>Registro y gestión de reportes realizados por los usuarios.</w:t>
+      </w:r>
+    </w:p>
+    <w:p>
+      <w:pPr>
+        <w:rPr>
+          <w:lang w:val="es-MX"/>
+        </w:rPr>
+      </w:pPr>
+      <w:r>
+        <w:rPr>
+          <w:lang w:val="es-MX"/>
+        </w:rPr>
+        <w:t>Almacenamiento de la información necesaria para relacionar las acciones de los usuarios con las recetas.</w:t>
+      </w:r>
+    </w:p>
+    <w:p>
+      <w:pPr>
+        <w:rPr>
+          <w:lang w:val="es-MX"/>
+        </w:rPr>
+      </w:pPr>
+      <w:r>
+        <w:rPr>
+          <w:lang w:val="es-MX"/>
+        </w:rPr>
+        <w:t>Organización de la información mediante las entidades y relaciones definidas para el módulo de comunidad.</w:t>
+      </w:r>
+    </w:p>
+    <w:p>
+      <w:pPr>
+        <w:rPr>
+          <w:lang w:val="es-MX"/>
+        </w:rPr>
+      </w:pPr>
+      <w:r>
+        <w:rPr>
+          <w:lang w:val="es-MX"/>
+        </w:rPr>
+        <w:t>Consulta de la información generada por las diferentes acciones sociales realizadas dentro del sistema.</w:t>
+      </w:r>
+    </w:p>
+    <w:p>
+      <w:pPr>
+        <w:pStyle w:val="Ttulo2"/>
+        <w:rPr>
+          <w:rFonts w:cs="Times New Roman"/>
+          <w:szCs w:val="24"/>
+        </w:rPr>
+      </w:pPr>
+      <w:bookmarkStart w:id="16" w:name="_Toc242137971"/>
+      <w:r>
+        <w:rPr>
+          <w:rFonts w:cs="Times New Roman"/>
+          <w:szCs w:val="24"/>
+        </w:rPr>
+        <w:t>2.2 Exclusiones</w:t>
+      </w:r>
+      <w:bookmarkEnd w:id="16"/>
+    </w:p>
+    <w:p>
+      <w:pPr>
+        <w:rPr>
+          <w:lang w:val="es-MX"/>
+        </w:rPr>
+      </w:pPr>
+      <w:r>
+        <w:rPr>
+          <w:lang w:val="es-MX"/>
+        </w:rPr>
+        <w:t>Desarrollo de funcionalidades relacionadas con nutrición y perfiles alimentarios.</w:t>
+      </w:r>
+    </w:p>
+    <w:p>
+      <w:pPr>
+        <w:rPr>
+          <w:lang w:val="es-MX"/>
+        </w:rPr>
+      </w:pPr>
+      <w:r>
+        <w:rPr>
+          <w:lang w:val="es-MX"/>
+        </w:rPr>
+        <w:t>Desarrollo de funcionalidades relacionadas con transporte, pedidos o entrega de productos.</w:t>
+      </w:r>
+    </w:p>
+    <w:p>
+      <w:pPr>
+        <w:rPr>
+          <w:lang w:val="es-MX"/>
+        </w:rPr>
+      </w:pPr>
+      <w:r>
+        <w:rPr>
+          <w:lang w:val="es-MX"/>
+        </w:rPr>
+        <w:t>Gestión de información correspondiente a módulos diferentes al componente de comunidad.</w:t>
+      </w:r>
     </w:p>
     <w:p>
       <w:pPr>
@@ -2921,7 +3521,8 @@
           <w:szCs w:val="24"/>
           <w:lang w:val="es-MX"/>
         </w:rPr>
-        <w:t>Registro y gestión de las calificaciones realizadas por los usuarios sobre las recetas.</w:t>
+        <w:lastRenderedPageBreak/>
+        <w:t>Administración de contenidos que no estén relacionados con las interacciones sociales definidas para las recetas.</w:t>
       </w:r>
     </w:p>
     <w:p>
@@ -2942,299 +3543,259 @@
           <w:szCs w:val="24"/>
           <w:lang w:val="es-MX"/>
         </w:rPr>
-        <w:t>Registro de comentarios asociados a las recetas.</w:t>
-      </w:r>
-    </w:p>
-    <w:p>
-      <w:pPr>
-        <w:pStyle w:val="Listaconvietas"/>
-        <w:spacing w:line="480" w:lineRule="auto"/>
-        <w:rPr>
-          <w:rFonts w:ascii="Times New Roman" w:hAnsi="Times New Roman" w:cs="Times New Roman"/>
-          <w:sz w:val="24"/>
-          <w:szCs w:val="24"/>
-          <w:lang w:val="es-MX"/>
-        </w:rPr>
-      </w:pPr>
-      <w:r>
-        <w:rPr>
-          <w:rFonts w:ascii="Times New Roman" w:hAnsi="Times New Roman" w:cs="Times New Roman"/>
-          <w:sz w:val="24"/>
-          <w:szCs w:val="24"/>
-          <w:lang w:val="es-MX"/>
-        </w:rPr>
-        <w:t>Gestión de las recetas favoritas de cada usuario.</w:t>
-      </w:r>
-    </w:p>
-    <w:p>
-      <w:pPr>
-        <w:pStyle w:val="Listaconvietas"/>
-        <w:spacing w:line="480" w:lineRule="auto"/>
-        <w:rPr>
-          <w:rFonts w:ascii="Times New Roman" w:hAnsi="Times New Roman" w:cs="Times New Roman"/>
-          <w:sz w:val="24"/>
-          <w:szCs w:val="24"/>
-          <w:lang w:val="es-MX"/>
-        </w:rPr>
-      </w:pPr>
-      <w:r>
-        <w:rPr>
-          <w:rFonts w:ascii="Times New Roman" w:hAnsi="Times New Roman" w:cs="Times New Roman"/>
-          <w:sz w:val="24"/>
-          <w:szCs w:val="24"/>
-          <w:lang w:val="es-MX"/>
-        </w:rPr>
-        <w:t>Creación y organización de colecciones de recetas.</w:t>
-      </w:r>
-    </w:p>
-    <w:p>
-      <w:pPr>
-        <w:pStyle w:val="Listaconvietas"/>
-        <w:spacing w:line="480" w:lineRule="auto"/>
-        <w:rPr>
-          <w:rFonts w:ascii="Times New Roman" w:hAnsi="Times New Roman" w:cs="Times New Roman"/>
-          <w:sz w:val="24"/>
-          <w:szCs w:val="24"/>
-          <w:lang w:val="es-MX"/>
-        </w:rPr>
-      </w:pPr>
-      <w:r>
-        <w:rPr>
-          <w:rFonts w:ascii="Times New Roman" w:hAnsi="Times New Roman" w:cs="Times New Roman"/>
-          <w:sz w:val="24"/>
-          <w:szCs w:val="24"/>
-          <w:lang w:val="es-MX"/>
-        </w:rPr>
-        <w:t xml:space="preserve">Relación entre favoritos y colecciones mediante la entidad </w:t>
-      </w:r>
-      <w:proofErr w:type="spellStart"/>
-      <w:r>
-        <w:rPr>
-          <w:rFonts w:ascii="Times New Roman" w:hAnsi="Times New Roman" w:cs="Times New Roman"/>
-          <w:sz w:val="24"/>
-          <w:szCs w:val="24"/>
-          <w:lang w:val="es-MX"/>
-        </w:rPr>
-        <w:t>Favoritos_colecciones</w:t>
-      </w:r>
-      <w:proofErr w:type="spellEnd"/>
-      <w:r>
-        <w:rPr>
-          <w:rFonts w:ascii="Times New Roman" w:hAnsi="Times New Roman" w:cs="Times New Roman"/>
-          <w:sz w:val="24"/>
-          <w:szCs w:val="24"/>
-          <w:lang w:val="es-MX"/>
-        </w:rPr>
-        <w:t>.</w:t>
-      </w:r>
-    </w:p>
-    <w:p>
-      <w:pPr>
-        <w:pStyle w:val="Listaconvietas"/>
-        <w:spacing w:line="480" w:lineRule="auto"/>
-        <w:rPr>
-          <w:rFonts w:ascii="Times New Roman" w:hAnsi="Times New Roman" w:cs="Times New Roman"/>
-          <w:sz w:val="24"/>
-          <w:szCs w:val="24"/>
-          <w:lang w:val="es-MX"/>
-        </w:rPr>
-      </w:pPr>
-      <w:r>
-        <w:rPr>
-          <w:rFonts w:ascii="Times New Roman" w:hAnsi="Times New Roman" w:cs="Times New Roman"/>
-          <w:sz w:val="24"/>
-          <w:szCs w:val="24"/>
-          <w:lang w:val="es-MX"/>
-        </w:rPr>
-        <w:t>Registro y gestión de reportes realizados por los usuarios.</w:t>
-      </w:r>
-    </w:p>
-    <w:p>
-      <w:pPr>
-        <w:pStyle w:val="Listaconvietas"/>
-        <w:spacing w:line="480" w:lineRule="auto"/>
-        <w:rPr>
-          <w:rFonts w:ascii="Times New Roman" w:hAnsi="Times New Roman" w:cs="Times New Roman"/>
-          <w:sz w:val="24"/>
-          <w:szCs w:val="24"/>
-          <w:lang w:val="es-MX"/>
-        </w:rPr>
-      </w:pPr>
-      <w:r>
-        <w:rPr>
-          <w:rFonts w:ascii="Times New Roman" w:hAnsi="Times New Roman" w:cs="Times New Roman"/>
-          <w:sz w:val="24"/>
-          <w:szCs w:val="24"/>
-          <w:lang w:val="es-MX"/>
-        </w:rPr>
-        <w:t>Almacenamiento de la información necesaria para relacionar las acciones de los usuarios con las recetas.</w:t>
-      </w:r>
-    </w:p>
-    <w:p>
-      <w:pPr>
-        <w:pStyle w:val="Listaconvietas"/>
-        <w:spacing w:line="480" w:lineRule="auto"/>
-        <w:rPr>
-          <w:rFonts w:ascii="Times New Roman" w:hAnsi="Times New Roman" w:cs="Times New Roman"/>
-          <w:sz w:val="24"/>
-          <w:szCs w:val="24"/>
-          <w:lang w:val="es-MX"/>
-        </w:rPr>
-      </w:pPr>
-      <w:r>
-        <w:rPr>
-          <w:rFonts w:ascii="Times New Roman" w:hAnsi="Times New Roman" w:cs="Times New Roman"/>
-          <w:sz w:val="24"/>
-          <w:szCs w:val="24"/>
-          <w:lang w:val="es-MX"/>
-        </w:rPr>
-        <w:t>Organización de la información mediante las entidades y relaciones definidas para el módulo de comunidad.</w:t>
-      </w:r>
-    </w:p>
-    <w:p>
-      <w:pPr>
-        <w:pStyle w:val="Listaconvietas"/>
-        <w:spacing w:line="480" w:lineRule="auto"/>
-        <w:rPr>
-          <w:rFonts w:ascii="Times New Roman" w:hAnsi="Times New Roman" w:cs="Times New Roman"/>
-          <w:sz w:val="24"/>
-          <w:szCs w:val="24"/>
-          <w:lang w:val="es-MX"/>
-        </w:rPr>
-      </w:pPr>
-      <w:r>
-        <w:rPr>
-          <w:rFonts w:ascii="Times New Roman" w:hAnsi="Times New Roman" w:cs="Times New Roman"/>
-          <w:sz w:val="24"/>
-          <w:szCs w:val="24"/>
-          <w:lang w:val="es-MX"/>
-        </w:rPr>
-        <w:t>Consulta de la información generada por las diferentes acciones sociales realizadas dentro del sistema.</w:t>
-      </w:r>
-    </w:p>
-    <w:p>
-      <w:pPr>
-        <w:pStyle w:val="Ttulo2"/>
-        <w:rPr>
-          <w:rFonts w:cs="Times New Roman"/>
-          <w:szCs w:val="24"/>
-        </w:rPr>
-      </w:pPr>
-      <w:bookmarkStart w:id="15" w:name="_Toc242124631"/>
-      <w:r>
-        <w:rPr>
-          <w:rFonts w:cs="Times New Roman"/>
-          <w:szCs w:val="24"/>
-        </w:rPr>
-        <w:t>2.2 Exclusiones</w:t>
-      </w:r>
-      <w:bookmarkEnd w:id="15"/>
-    </w:p>
-    <w:p>
-      <w:pPr>
-        <w:pStyle w:val="Listaconvietas"/>
-        <w:spacing w:line="480" w:lineRule="auto"/>
-        <w:rPr>
-          <w:rFonts w:ascii="Times New Roman" w:hAnsi="Times New Roman" w:cs="Times New Roman"/>
-          <w:sz w:val="24"/>
-          <w:szCs w:val="24"/>
-          <w:lang w:val="es-MX"/>
-        </w:rPr>
-      </w:pPr>
-      <w:r>
-        <w:rPr>
-          <w:rFonts w:ascii="Times New Roman" w:hAnsi="Times New Roman" w:cs="Times New Roman"/>
-          <w:sz w:val="24"/>
-          <w:szCs w:val="24"/>
-          <w:lang w:val="es-MX"/>
-        </w:rPr>
-        <w:t>Desarrollo de funcionalidades relacionadas con nutrición y perfiles alimentarios.</w:t>
-      </w:r>
-    </w:p>
-    <w:p>
-      <w:pPr>
-        <w:pStyle w:val="Listaconvietas"/>
-        <w:spacing w:line="480" w:lineRule="auto"/>
-        <w:rPr>
-          <w:rFonts w:ascii="Times New Roman" w:hAnsi="Times New Roman" w:cs="Times New Roman"/>
-          <w:sz w:val="24"/>
-          <w:szCs w:val="24"/>
-          <w:lang w:val="es-MX"/>
-        </w:rPr>
-      </w:pPr>
-      <w:r>
-        <w:rPr>
-          <w:rFonts w:ascii="Times New Roman" w:hAnsi="Times New Roman" w:cs="Times New Roman"/>
-          <w:sz w:val="24"/>
-          <w:szCs w:val="24"/>
-          <w:lang w:val="es-MX"/>
-        </w:rPr>
-        <w:t>Desarrollo de funcionalidades relacionadas con transporte, pedidos o entrega de productos.</w:t>
-      </w:r>
-    </w:p>
-    <w:p>
-      <w:pPr>
-        <w:pStyle w:val="Listaconvietas"/>
-        <w:spacing w:line="480" w:lineRule="auto"/>
-        <w:rPr>
-          <w:rFonts w:ascii="Times New Roman" w:hAnsi="Times New Roman" w:cs="Times New Roman"/>
-          <w:sz w:val="24"/>
-          <w:szCs w:val="24"/>
-          <w:lang w:val="es-MX"/>
-        </w:rPr>
-      </w:pPr>
-      <w:r>
-        <w:rPr>
-          <w:rFonts w:ascii="Times New Roman" w:hAnsi="Times New Roman" w:cs="Times New Roman"/>
-          <w:sz w:val="24"/>
-          <w:szCs w:val="24"/>
-          <w:lang w:val="es-MX"/>
-        </w:rPr>
-        <w:t>Gestión de información correspondiente a módulos diferentes al componente de comunidad.</w:t>
-      </w:r>
-    </w:p>
-    <w:p>
-      <w:pPr>
-        <w:pStyle w:val="Listaconvietas"/>
-        <w:spacing w:line="480" w:lineRule="auto"/>
-        <w:rPr>
-          <w:rFonts w:ascii="Times New Roman" w:hAnsi="Times New Roman" w:cs="Times New Roman"/>
-          <w:sz w:val="24"/>
-          <w:szCs w:val="24"/>
-          <w:lang w:val="es-MX"/>
-        </w:rPr>
-      </w:pPr>
-      <w:r>
-        <w:rPr>
-          <w:rFonts w:ascii="Times New Roman" w:hAnsi="Times New Roman" w:cs="Times New Roman"/>
-          <w:sz w:val="24"/>
-          <w:szCs w:val="24"/>
-          <w:lang w:val="es-MX"/>
-        </w:rPr>
+        <w:t>Implementación de funcionalidades diferentes a las establecidas dentro de las entidades y relaciones correspondientes al módulo.</w:t>
+      </w:r>
+    </w:p>
+    <w:p>
+      <w:pPr>
+        <w:spacing w:after="160" w:line="278" w:lineRule="auto"/>
+        <w:ind w:firstLine="0"/>
+        <w:rPr>
+          <w:rFonts w:cs="Times New Roman"/>
+        </w:rPr>
+      </w:pPr>
+      <w:r>
+        <w:rPr>
+          <w:rFonts w:cs="Times New Roman"/>
+        </w:rPr>
+        <w:br w:type="page"/>
+      </w:r>
+    </w:p>
+    <w:p>
+      <w:pPr>
+        <w:pStyle w:val="Ttulo1"/>
+      </w:pPr>
+      <w:bookmarkStart w:id="17" w:name="_Toc242137972"/>
+      <w:r>
         <w:lastRenderedPageBreak/>
-        <w:t>Administración de contenidos que no estén relacionados con las interacciones sociales definidas para las recetas.</w:t>
-      </w:r>
-    </w:p>
-    <w:p>
-      <w:pPr>
-        <w:pStyle w:val="Listaconvietas"/>
-        <w:spacing w:line="480" w:lineRule="auto"/>
-        <w:rPr>
-          <w:rFonts w:ascii="Times New Roman" w:hAnsi="Times New Roman" w:cs="Times New Roman"/>
-          <w:sz w:val="24"/>
-          <w:szCs w:val="24"/>
-          <w:lang w:val="es-MX"/>
-        </w:rPr>
-      </w:pPr>
-      <w:r>
-        <w:rPr>
-          <w:rFonts w:ascii="Times New Roman" w:hAnsi="Times New Roman" w:cs="Times New Roman"/>
-          <w:sz w:val="24"/>
-          <w:szCs w:val="24"/>
-          <w:lang w:val="es-MX"/>
-        </w:rPr>
-        <w:t>Implementación de funcionalidades diferentes a las establecidas dentro de las entidades y relaciones correspondientes al módulo.</w:t>
-      </w:r>
+        <w:t>Modelo Relacional</w:t>
+      </w:r>
+      <w:bookmarkEnd w:id="17"/>
+    </w:p>
+    <w:p>
+      <w:pPr>
+        <w:spacing w:after="160" w:line="278" w:lineRule="auto"/>
+        <w:ind w:firstLine="0"/>
+        <w:rPr>
+          <w:rFonts w:cs="Times New Roman"/>
+        </w:rPr>
+      </w:pPr>
+    </w:p>
+    <w:p>
+      <w:pPr>
+        <w:spacing w:after="160" w:line="278" w:lineRule="auto"/>
+        <w:ind w:firstLine="0"/>
+        <w:rPr>
+          <w:rFonts w:cs="Times New Roman"/>
+        </w:rPr>
+      </w:pPr>
+    </w:p>
+    <w:p>
+      <w:pPr>
+        <w:spacing w:after="160" w:line="278" w:lineRule="auto"/>
+        <w:ind w:firstLine="0"/>
+        <w:rPr>
+          <w:rFonts w:cs="Times New Roman"/>
+        </w:rPr>
+      </w:pPr>
+    </w:p>
+    <w:p>
+      <w:pPr>
+        <w:spacing w:after="160" w:line="278" w:lineRule="auto"/>
+        <w:ind w:firstLine="0"/>
+        <w:rPr>
+          <w:rFonts w:cs="Times New Roman"/>
+        </w:rPr>
+      </w:pPr>
+    </w:p>
+    <w:p>
+      <w:pPr>
+        <w:spacing w:after="160" w:line="278" w:lineRule="auto"/>
+        <w:ind w:firstLine="0"/>
+        <w:rPr>
+          <w:rFonts w:cs="Times New Roman"/>
+        </w:rPr>
+      </w:pPr>
+    </w:p>
+    <w:p>
+      <w:pPr>
+        <w:spacing w:after="160" w:line="278" w:lineRule="auto"/>
+        <w:ind w:firstLine="0"/>
+        <w:rPr>
+          <w:rFonts w:cs="Times New Roman"/>
+        </w:rPr>
+      </w:pPr>
+    </w:p>
+    <w:p>
+      <w:pPr>
+        <w:spacing w:after="160" w:line="278" w:lineRule="auto"/>
+        <w:ind w:firstLine="0"/>
+        <w:rPr>
+          <w:rFonts w:cs="Times New Roman"/>
+        </w:rPr>
+      </w:pPr>
+    </w:p>
+    <w:p>
+      <w:pPr>
+        <w:spacing w:after="160" w:line="278" w:lineRule="auto"/>
+        <w:ind w:firstLine="0"/>
+        <w:rPr>
+          <w:rFonts w:cs="Times New Roman"/>
+        </w:rPr>
+      </w:pPr>
+    </w:p>
+    <w:p>
+      <w:pPr>
+        <w:spacing w:after="160" w:line="278" w:lineRule="auto"/>
+        <w:ind w:firstLine="0"/>
+        <w:rPr>
+          <w:rFonts w:cs="Times New Roman"/>
+        </w:rPr>
+      </w:pPr>
+    </w:p>
+    <w:p>
+      <w:pPr>
+        <w:spacing w:after="160" w:line="278" w:lineRule="auto"/>
+        <w:ind w:firstLine="0"/>
+        <w:rPr>
+          <w:rFonts w:cs="Times New Roman"/>
+        </w:rPr>
+      </w:pPr>
+    </w:p>
+    <w:p>
+      <w:pPr>
+        <w:spacing w:after="160" w:line="278" w:lineRule="auto"/>
+        <w:ind w:firstLine="0"/>
+        <w:rPr>
+          <w:rFonts w:cs="Times New Roman"/>
+        </w:rPr>
+      </w:pPr>
+    </w:p>
+    <w:p>
+      <w:pPr>
+        <w:spacing w:after="160" w:line="278" w:lineRule="auto"/>
+        <w:ind w:firstLine="0"/>
+        <w:rPr>
+          <w:rFonts w:cs="Times New Roman"/>
+        </w:rPr>
+      </w:pPr>
+    </w:p>
+    <w:p>
+      <w:pPr>
+        <w:spacing w:after="160" w:line="278" w:lineRule="auto"/>
+        <w:ind w:firstLine="0"/>
+        <w:rPr>
+          <w:rFonts w:cs="Times New Roman"/>
+        </w:rPr>
+      </w:pPr>
+    </w:p>
+    <w:p>
+      <w:pPr>
+        <w:spacing w:after="160" w:line="278" w:lineRule="auto"/>
+        <w:ind w:firstLine="0"/>
+        <w:rPr>
+          <w:rFonts w:cs="Times New Roman"/>
+        </w:rPr>
+      </w:pPr>
+    </w:p>
+    <w:p>
+      <w:pPr>
+        <w:spacing w:after="160" w:line="278" w:lineRule="auto"/>
+        <w:ind w:firstLine="0"/>
+        <w:rPr>
+          <w:rFonts w:cs="Times New Roman"/>
+        </w:rPr>
+      </w:pPr>
+    </w:p>
+    <w:p>
+      <w:pPr>
+        <w:spacing w:after="160" w:line="278" w:lineRule="auto"/>
+        <w:ind w:firstLine="0"/>
+        <w:rPr>
+          <w:rFonts w:cs="Times New Roman"/>
+        </w:rPr>
+      </w:pPr>
+    </w:p>
+    <w:p>
+      <w:pPr>
+        <w:spacing w:after="160" w:line="278" w:lineRule="auto"/>
+        <w:ind w:firstLine="0"/>
+        <w:rPr>
+          <w:rFonts w:cs="Times New Roman"/>
+        </w:rPr>
+      </w:pPr>
+    </w:p>
+    <w:p>
+      <w:pPr>
+        <w:spacing w:after="160" w:line="278" w:lineRule="auto"/>
+        <w:ind w:firstLine="0"/>
+        <w:rPr>
+          <w:rFonts w:cs="Times New Roman"/>
+        </w:rPr>
+      </w:pPr>
+    </w:p>
+    <w:p>
+      <w:pPr>
+        <w:spacing w:after="160" w:line="278" w:lineRule="auto"/>
+        <w:ind w:firstLine="0"/>
+        <w:rPr>
+          <w:rFonts w:cs="Times New Roman"/>
+        </w:rPr>
+      </w:pPr>
+    </w:p>
+    <w:p>
+      <w:pPr>
+        <w:spacing w:after="160" w:line="278" w:lineRule="auto"/>
+        <w:ind w:firstLine="0"/>
+        <w:rPr>
+          <w:rFonts w:cs="Times New Roman"/>
+        </w:rPr>
+      </w:pPr>
+    </w:p>
+    <w:p>
+      <w:pPr>
+        <w:spacing w:after="160" w:line="278" w:lineRule="auto"/>
+        <w:ind w:firstLine="0"/>
+        <w:rPr>
+          <w:rFonts w:cs="Times New Roman"/>
+        </w:rPr>
+      </w:pPr>
+    </w:p>
+    <w:p>
+      <w:pPr>
+        <w:spacing w:after="160" w:line="278" w:lineRule="auto"/>
+        <w:ind w:firstLine="0"/>
+        <w:rPr>
+          <w:rFonts w:cs="Times New Roman"/>
+        </w:rPr>
+      </w:pPr>
+    </w:p>
+    <w:p>
+      <w:pPr>
+        <w:spacing w:after="160" w:line="278" w:lineRule="auto"/>
+        <w:ind w:firstLine="0"/>
+        <w:rPr>
+          <w:rFonts w:cs="Times New Roman"/>
+        </w:rPr>
+      </w:pPr>
+    </w:p>
+    <w:p>
+      <w:pPr>
+        <w:spacing w:after="160" w:line="278" w:lineRule="auto"/>
+        <w:ind w:firstLine="0"/>
+        <w:rPr>
+          <w:rFonts w:cs="Times New Roman"/>
+        </w:rPr>
+      </w:pPr>
+    </w:p>
+    <w:p>
+      <w:pPr>
+        <w:spacing w:after="160" w:line="278" w:lineRule="auto"/>
+        <w:ind w:firstLine="0"/>
+        <w:rPr>
+          <w:rFonts w:cs="Times New Roman"/>
+        </w:rPr>
+      </w:pPr>
     </w:p>
     <w:p>
       <w:pPr>
@@ -3253,182 +3814,413 @@
     </w:p>
     <w:p>
       <w:pPr>
-        <w:jc w:val="center"/>
-        <w:rPr>
-          <w:rFonts w:cs="Times New Roman"/>
-        </w:rPr>
-      </w:pPr>
-      <w:r>
-        <w:rPr>
-          <w:rFonts w:cs="Times New Roman"/>
-        </w:rPr>
+        <w:pStyle w:val="Ttulo1"/>
+      </w:pPr>
+      <w:bookmarkStart w:id="18" w:name="_Toc242137973"/>
+      <w:r>
+        <w:lastRenderedPageBreak/>
+        <w:t>Conclusiones</w:t>
+      </w:r>
+      <w:bookmarkEnd w:id="18"/>
+    </w:p>
+    <w:p>
+      <w:pPr>
+        <w:spacing w:after="160" w:line="278" w:lineRule="auto"/>
+        <w:ind w:firstLine="0"/>
+        <w:rPr>
+          <w:rFonts w:cs="Times New Roman"/>
+        </w:rPr>
+      </w:pPr>
+    </w:p>
+    <w:p>
+      <w:pPr>
+        <w:spacing w:after="160" w:line="278" w:lineRule="auto"/>
+        <w:ind w:firstLine="0"/>
+        <w:rPr>
+          <w:rFonts w:cs="Times New Roman"/>
+        </w:rPr>
+      </w:pPr>
+    </w:p>
+    <w:p>
+      <w:pPr>
+        <w:spacing w:after="160" w:line="278" w:lineRule="auto"/>
+        <w:ind w:firstLine="0"/>
+        <w:rPr>
+          <w:rFonts w:cs="Times New Roman"/>
+        </w:rPr>
+      </w:pPr>
+    </w:p>
+    <w:p>
+      <w:pPr>
+        <w:spacing w:after="160" w:line="278" w:lineRule="auto"/>
+        <w:ind w:firstLine="0"/>
+        <w:rPr>
+          <w:rFonts w:cs="Times New Roman"/>
+        </w:rPr>
+      </w:pPr>
+    </w:p>
+    <w:p>
+      <w:pPr>
+        <w:spacing w:after="160" w:line="278" w:lineRule="auto"/>
+        <w:ind w:firstLine="0"/>
+        <w:rPr>
+          <w:rFonts w:cs="Times New Roman"/>
+        </w:rPr>
+      </w:pPr>
+    </w:p>
+    <w:p>
+      <w:pPr>
+        <w:spacing w:after="160" w:line="278" w:lineRule="auto"/>
+        <w:ind w:firstLine="0"/>
+        <w:rPr>
+          <w:rFonts w:cs="Times New Roman"/>
+        </w:rPr>
+      </w:pPr>
+    </w:p>
+    <w:p>
+      <w:pPr>
+        <w:spacing w:after="160" w:line="278" w:lineRule="auto"/>
+        <w:ind w:firstLine="0"/>
+        <w:rPr>
+          <w:rFonts w:cs="Times New Roman"/>
+        </w:rPr>
+      </w:pPr>
+    </w:p>
+    <w:p>
+      <w:pPr>
+        <w:spacing w:after="160" w:line="278" w:lineRule="auto"/>
+        <w:ind w:firstLine="0"/>
+        <w:rPr>
+          <w:rFonts w:cs="Times New Roman"/>
+        </w:rPr>
+      </w:pPr>
+    </w:p>
+    <w:p>
+      <w:pPr>
+        <w:spacing w:after="160" w:line="278" w:lineRule="auto"/>
+        <w:ind w:firstLine="0"/>
+        <w:rPr>
+          <w:rFonts w:cs="Times New Roman"/>
+        </w:rPr>
+      </w:pPr>
+    </w:p>
+    <w:p>
+      <w:pPr>
+        <w:spacing w:after="160" w:line="278" w:lineRule="auto"/>
+        <w:ind w:firstLine="0"/>
+        <w:rPr>
+          <w:rFonts w:cs="Times New Roman"/>
+        </w:rPr>
+      </w:pPr>
+    </w:p>
+    <w:p>
+      <w:pPr>
+        <w:spacing w:after="160" w:line="278" w:lineRule="auto"/>
+        <w:ind w:firstLine="0"/>
+        <w:rPr>
+          <w:rFonts w:cs="Times New Roman"/>
+        </w:rPr>
+      </w:pPr>
+    </w:p>
+    <w:p>
+      <w:pPr>
+        <w:spacing w:after="160" w:line="278" w:lineRule="auto"/>
+        <w:ind w:firstLine="0"/>
+        <w:rPr>
+          <w:rFonts w:cs="Times New Roman"/>
+        </w:rPr>
+      </w:pPr>
+    </w:p>
+    <w:p>
+      <w:pPr>
+        <w:spacing w:after="160" w:line="278" w:lineRule="auto"/>
+        <w:ind w:firstLine="0"/>
+        <w:rPr>
+          <w:rFonts w:cs="Times New Roman"/>
+        </w:rPr>
+      </w:pPr>
+    </w:p>
+    <w:p>
+      <w:pPr>
+        <w:spacing w:after="160" w:line="278" w:lineRule="auto"/>
+        <w:ind w:firstLine="0"/>
+        <w:rPr>
+          <w:rFonts w:cs="Times New Roman"/>
+        </w:rPr>
+      </w:pPr>
+    </w:p>
+    <w:p>
+      <w:pPr>
+        <w:spacing w:after="160" w:line="278" w:lineRule="auto"/>
+        <w:ind w:firstLine="0"/>
+        <w:rPr>
+          <w:rFonts w:cs="Times New Roman"/>
+        </w:rPr>
+      </w:pPr>
+    </w:p>
+    <w:p>
+      <w:pPr>
+        <w:spacing w:after="160" w:line="278" w:lineRule="auto"/>
+        <w:ind w:firstLine="0"/>
+        <w:rPr>
+          <w:rFonts w:cs="Times New Roman"/>
+        </w:rPr>
+      </w:pPr>
+    </w:p>
+    <w:p>
+      <w:pPr>
+        <w:spacing w:after="160" w:line="278" w:lineRule="auto"/>
+        <w:ind w:firstLine="0"/>
+        <w:rPr>
+          <w:rFonts w:cs="Times New Roman"/>
+        </w:rPr>
+      </w:pPr>
+    </w:p>
+    <w:p>
+      <w:pPr>
+        <w:spacing w:after="160" w:line="278" w:lineRule="auto"/>
+        <w:ind w:firstLine="0"/>
+        <w:rPr>
+          <w:rFonts w:cs="Times New Roman"/>
+        </w:rPr>
+      </w:pPr>
+    </w:p>
+    <w:p>
+      <w:pPr>
+        <w:spacing w:after="160" w:line="278" w:lineRule="auto"/>
+        <w:ind w:firstLine="0"/>
+        <w:rPr>
+          <w:rFonts w:cs="Times New Roman"/>
+        </w:rPr>
+      </w:pPr>
+    </w:p>
+    <w:p>
+      <w:pPr>
+        <w:spacing w:after="160" w:line="278" w:lineRule="auto"/>
+        <w:ind w:firstLine="0"/>
+        <w:rPr>
+          <w:rFonts w:cs="Times New Roman"/>
+        </w:rPr>
+      </w:pPr>
+    </w:p>
+    <w:p>
+      <w:pPr>
+        <w:spacing w:after="160" w:line="278" w:lineRule="auto"/>
+        <w:ind w:firstLine="0"/>
+        <w:rPr>
+          <w:rFonts w:cs="Times New Roman"/>
+        </w:rPr>
+      </w:pPr>
+    </w:p>
+    <w:p>
+      <w:pPr>
+        <w:spacing w:after="160" w:line="278" w:lineRule="auto"/>
+        <w:ind w:firstLine="0"/>
+        <w:rPr>
+          <w:rFonts w:cs="Times New Roman"/>
+        </w:rPr>
+      </w:pPr>
+    </w:p>
+    <w:p>
+      <w:pPr>
+        <w:spacing w:after="160" w:line="278" w:lineRule="auto"/>
+        <w:ind w:firstLine="0"/>
+        <w:rPr>
+          <w:rFonts w:cs="Times New Roman"/>
+        </w:rPr>
+      </w:pPr>
+    </w:p>
+    <w:p>
+      <w:pPr>
+        <w:spacing w:after="160" w:line="278" w:lineRule="auto"/>
+        <w:ind w:firstLine="0"/>
+        <w:rPr>
+          <w:rFonts w:cs="Times New Roman"/>
+        </w:rPr>
+      </w:pPr>
+    </w:p>
+    <w:p>
+      <w:pPr>
+        <w:spacing w:after="160" w:line="278" w:lineRule="auto"/>
+        <w:ind w:firstLine="0"/>
+        <w:rPr>
+          <w:rFonts w:cs="Times New Roman"/>
+        </w:rPr>
+      </w:pPr>
+    </w:p>
+    <w:p>
+      <w:pPr>
+        <w:spacing w:after="160" w:line="278" w:lineRule="auto"/>
+        <w:ind w:firstLine="0"/>
+        <w:rPr>
+          <w:rFonts w:cs="Times New Roman"/>
+        </w:rPr>
+      </w:pPr>
+      <w:r>
+        <w:rPr>
+          <w:rFonts w:cs="Times New Roman"/>
+        </w:rPr>
+        <w:br w:type="page"/>
+      </w:r>
+    </w:p>
+    <w:p>
+      <w:pPr>
+        <w:pStyle w:val="Ttulo1"/>
+      </w:pPr>
+      <w:bookmarkStart w:id="19" w:name="_Toc242137974"/>
+      <w:r>
         <w:lastRenderedPageBreak/>
         <w:t>Glosario</w:t>
       </w:r>
-    </w:p>
-    <w:p>
-      <w:pPr>
-        <w:jc w:val="center"/>
-        <w:rPr>
-          <w:rFonts w:cs="Times New Roman"/>
-        </w:rPr>
-      </w:pPr>
-    </w:p>
-    <w:p>
-      <w:pPr>
-        <w:jc w:val="center"/>
-        <w:rPr>
-          <w:rFonts w:cs="Times New Roman"/>
-        </w:rPr>
-      </w:pPr>
-    </w:p>
-    <w:p>
-      <w:pPr>
-        <w:jc w:val="center"/>
-        <w:rPr>
-          <w:rFonts w:cs="Times New Roman"/>
-        </w:rPr>
-      </w:pPr>
-    </w:p>
-    <w:p>
-      <w:pPr>
-        <w:jc w:val="center"/>
-        <w:rPr>
-          <w:rFonts w:cs="Times New Roman"/>
-        </w:rPr>
-      </w:pPr>
-    </w:p>
-    <w:p>
-      <w:pPr>
-        <w:jc w:val="center"/>
-        <w:rPr>
-          <w:rFonts w:cs="Times New Roman"/>
-        </w:rPr>
-      </w:pPr>
-    </w:p>
-    <w:p>
-      <w:pPr>
-        <w:jc w:val="center"/>
-        <w:rPr>
-          <w:rFonts w:cs="Times New Roman"/>
-        </w:rPr>
-      </w:pPr>
-    </w:p>
-    <w:p>
-      <w:pPr>
-        <w:jc w:val="center"/>
-        <w:rPr>
-          <w:rFonts w:cs="Times New Roman"/>
-        </w:rPr>
-      </w:pPr>
-    </w:p>
-    <w:p>
-      <w:pPr>
-        <w:jc w:val="center"/>
-        <w:rPr>
-          <w:rFonts w:cs="Times New Roman"/>
-        </w:rPr>
-      </w:pPr>
-    </w:p>
-    <w:p>
-      <w:pPr>
-        <w:jc w:val="center"/>
-        <w:rPr>
-          <w:rFonts w:cs="Times New Roman"/>
-        </w:rPr>
-      </w:pPr>
-    </w:p>
-    <w:p>
-      <w:pPr>
-        <w:jc w:val="center"/>
-        <w:rPr>
-          <w:rFonts w:cs="Times New Roman"/>
-        </w:rPr>
-      </w:pPr>
-    </w:p>
-    <w:p>
-      <w:pPr>
-        <w:jc w:val="center"/>
-        <w:rPr>
-          <w:rFonts w:cs="Times New Roman"/>
-        </w:rPr>
-      </w:pPr>
-    </w:p>
-    <w:p>
-      <w:pPr>
-        <w:jc w:val="center"/>
-        <w:rPr>
-          <w:rFonts w:cs="Times New Roman"/>
-        </w:rPr>
-      </w:pPr>
-    </w:p>
-    <w:p>
-      <w:pPr>
-        <w:jc w:val="center"/>
-        <w:rPr>
-          <w:rFonts w:cs="Times New Roman"/>
-        </w:rPr>
-      </w:pPr>
-    </w:p>
-    <w:p>
-      <w:pPr>
-        <w:jc w:val="center"/>
-        <w:rPr>
-          <w:rFonts w:cs="Times New Roman"/>
-        </w:rPr>
-      </w:pPr>
-    </w:p>
-    <w:p>
-      <w:pPr>
-        <w:jc w:val="center"/>
-        <w:rPr>
-          <w:rFonts w:cs="Times New Roman"/>
-        </w:rPr>
-      </w:pPr>
-    </w:p>
-    <w:p>
-      <w:pPr>
-        <w:jc w:val="center"/>
-        <w:rPr>
-          <w:rFonts w:cs="Times New Roman"/>
-        </w:rPr>
-      </w:pPr>
-    </w:p>
-    <w:p>
-      <w:pPr>
-        <w:jc w:val="center"/>
-        <w:rPr>
-          <w:rFonts w:cs="Times New Roman"/>
-        </w:rPr>
-      </w:pPr>
-    </w:p>
-    <w:p>
-      <w:pPr>
-        <w:jc w:val="center"/>
-        <w:rPr>
-          <w:rFonts w:cs="Times New Roman"/>
-        </w:rPr>
-      </w:pPr>
-    </w:p>
-    <w:p>
-      <w:pPr>
-        <w:jc w:val="center"/>
-        <w:rPr>
-          <w:rFonts w:cs="Times New Roman"/>
-        </w:rPr>
-      </w:pPr>
-    </w:p>
-    <w:p>
-      <w:pPr>
-        <w:jc w:val="center"/>
-        <w:rPr>
-          <w:rFonts w:cs="Times New Roman"/>
-        </w:rPr>
-      </w:pPr>
-    </w:p>
-    <w:p>
-      <w:pPr>
-        <w:jc w:val="center"/>
+      <w:bookmarkEnd w:id="19"/>
+    </w:p>
+    <w:p>
+      <w:pPr>
+        <w:jc w:val="center"/>
+        <w:rPr>
+          <w:rFonts w:cs="Times New Roman"/>
+        </w:rPr>
+      </w:pPr>
+    </w:p>
+    <w:p>
+      <w:pPr>
+        <w:jc w:val="center"/>
+        <w:rPr>
+          <w:rFonts w:cs="Times New Roman"/>
+        </w:rPr>
+      </w:pPr>
+    </w:p>
+    <w:p>
+      <w:pPr>
+        <w:jc w:val="center"/>
+        <w:rPr>
+          <w:rFonts w:cs="Times New Roman"/>
+        </w:rPr>
+      </w:pPr>
+    </w:p>
+    <w:p>
+      <w:pPr>
+        <w:jc w:val="center"/>
+        <w:rPr>
+          <w:rFonts w:cs="Times New Roman"/>
+        </w:rPr>
+      </w:pPr>
+    </w:p>
+    <w:p>
+      <w:pPr>
+        <w:jc w:val="center"/>
+        <w:rPr>
+          <w:rFonts w:cs="Times New Roman"/>
+        </w:rPr>
+      </w:pPr>
+    </w:p>
+    <w:p>
+      <w:pPr>
+        <w:jc w:val="center"/>
+        <w:rPr>
+          <w:rFonts w:cs="Times New Roman"/>
+        </w:rPr>
+      </w:pPr>
+    </w:p>
+    <w:p>
+      <w:pPr>
+        <w:jc w:val="center"/>
+        <w:rPr>
+          <w:rFonts w:cs="Times New Roman"/>
+        </w:rPr>
+      </w:pPr>
+    </w:p>
+    <w:p>
+      <w:pPr>
+        <w:jc w:val="center"/>
+        <w:rPr>
+          <w:rFonts w:cs="Times New Roman"/>
+        </w:rPr>
+      </w:pPr>
+    </w:p>
+    <w:p>
+      <w:pPr>
+        <w:jc w:val="center"/>
+        <w:rPr>
+          <w:rFonts w:cs="Times New Roman"/>
+        </w:rPr>
+      </w:pPr>
+    </w:p>
+    <w:p>
+      <w:pPr>
+        <w:jc w:val="center"/>
+        <w:rPr>
+          <w:rFonts w:cs="Times New Roman"/>
+        </w:rPr>
+      </w:pPr>
+    </w:p>
+    <w:p>
+      <w:pPr>
+        <w:jc w:val="center"/>
+        <w:rPr>
+          <w:rFonts w:cs="Times New Roman"/>
+        </w:rPr>
+      </w:pPr>
+    </w:p>
+    <w:p>
+      <w:pPr>
+        <w:jc w:val="center"/>
+        <w:rPr>
+          <w:rFonts w:cs="Times New Roman"/>
+        </w:rPr>
+      </w:pPr>
+    </w:p>
+    <w:p>
+      <w:pPr>
+        <w:jc w:val="center"/>
+        <w:rPr>
+          <w:rFonts w:cs="Times New Roman"/>
+        </w:rPr>
+      </w:pPr>
+    </w:p>
+    <w:p>
+      <w:pPr>
+        <w:jc w:val="center"/>
+        <w:rPr>
+          <w:rFonts w:cs="Times New Roman"/>
+        </w:rPr>
+      </w:pPr>
+    </w:p>
+    <w:p>
+      <w:pPr>
+        <w:jc w:val="center"/>
+        <w:rPr>
+          <w:rFonts w:cs="Times New Roman"/>
+        </w:rPr>
+      </w:pPr>
+    </w:p>
+    <w:p>
+      <w:pPr>
+        <w:jc w:val="center"/>
+        <w:rPr>
+          <w:rFonts w:cs="Times New Roman"/>
+        </w:rPr>
+      </w:pPr>
+    </w:p>
+    <w:p>
+      <w:pPr>
+        <w:jc w:val="center"/>
+        <w:rPr>
+          <w:rFonts w:cs="Times New Roman"/>
+        </w:rPr>
+      </w:pPr>
+    </w:p>
+    <w:p>
+      <w:pPr>
+        <w:jc w:val="center"/>
+        <w:rPr>
+          <w:rFonts w:cs="Times New Roman"/>
+        </w:rPr>
+      </w:pPr>
+    </w:p>
+    <w:p>
+      <w:pPr>
+        <w:ind w:firstLine="0"/>
         <w:rPr>
           <w:rFonts w:cs="Times New Roman"/>
         </w:rPr>
@@ -3458,397 +4250,380 @@
     </w:p>
     <w:p>
       <w:pPr>
-        <w:jc w:val="center"/>
-        <w:rPr>
-          <w:rFonts w:cs="Times New Roman"/>
-        </w:rPr>
-      </w:pPr>
-      <w:r>
-        <w:rPr>
-          <w:rFonts w:cs="Times New Roman"/>
-        </w:rPr>
+        <w:pStyle w:val="Ttulo1"/>
+      </w:pPr>
+      <w:bookmarkStart w:id="20" w:name="_Toc242137975"/>
+      <w:r>
         <w:lastRenderedPageBreak/>
         <w:t>Referencias</w:t>
       </w:r>
-    </w:p>
-    <w:p>
-      <w:pPr>
-        <w:jc w:val="center"/>
-        <w:rPr>
-          <w:rFonts w:cs="Times New Roman"/>
-        </w:rPr>
-      </w:pPr>
-    </w:p>
-    <w:p>
-      <w:pPr>
-        <w:jc w:val="center"/>
-        <w:rPr>
-          <w:rFonts w:cs="Times New Roman"/>
-        </w:rPr>
-      </w:pPr>
-    </w:p>
-    <w:p>
-      <w:pPr>
-        <w:jc w:val="center"/>
-        <w:rPr>
-          <w:rFonts w:cs="Times New Roman"/>
-        </w:rPr>
-      </w:pPr>
-    </w:p>
-    <w:p>
-      <w:pPr>
-        <w:jc w:val="center"/>
-        <w:rPr>
-          <w:rFonts w:cs="Times New Roman"/>
-        </w:rPr>
-      </w:pPr>
-    </w:p>
-    <w:p>
-      <w:pPr>
-        <w:jc w:val="center"/>
-        <w:rPr>
-          <w:rFonts w:cs="Times New Roman"/>
-        </w:rPr>
-      </w:pPr>
-    </w:p>
-    <w:p>
-      <w:pPr>
-        <w:jc w:val="center"/>
-        <w:rPr>
-          <w:rFonts w:cs="Times New Roman"/>
-        </w:rPr>
-      </w:pPr>
-    </w:p>
-    <w:p>
-      <w:pPr>
-        <w:jc w:val="center"/>
-        <w:rPr>
-          <w:rFonts w:cs="Times New Roman"/>
-        </w:rPr>
-      </w:pPr>
-    </w:p>
-    <w:p>
-      <w:pPr>
-        <w:jc w:val="center"/>
-        <w:rPr>
-          <w:rFonts w:cs="Times New Roman"/>
-        </w:rPr>
-      </w:pPr>
-    </w:p>
-    <w:p>
-      <w:pPr>
-        <w:jc w:val="center"/>
-        <w:rPr>
-          <w:rFonts w:cs="Times New Roman"/>
-        </w:rPr>
-      </w:pPr>
-    </w:p>
-    <w:p>
-      <w:pPr>
-        <w:jc w:val="center"/>
-        <w:rPr>
-          <w:rFonts w:cs="Times New Roman"/>
-        </w:rPr>
-      </w:pPr>
-    </w:p>
-    <w:p>
-      <w:pPr>
-        <w:jc w:val="center"/>
-        <w:rPr>
-          <w:rFonts w:cs="Times New Roman"/>
-        </w:rPr>
-      </w:pPr>
-    </w:p>
-    <w:p>
-      <w:pPr>
-        <w:jc w:val="center"/>
-        <w:rPr>
-          <w:rFonts w:cs="Times New Roman"/>
-        </w:rPr>
-      </w:pPr>
-    </w:p>
-    <w:p>
-      <w:pPr>
-        <w:jc w:val="center"/>
-        <w:rPr>
-          <w:rFonts w:cs="Times New Roman"/>
-        </w:rPr>
-      </w:pPr>
-    </w:p>
-    <w:p>
-      <w:pPr>
-        <w:jc w:val="center"/>
-        <w:rPr>
-          <w:rFonts w:cs="Times New Roman"/>
-        </w:rPr>
-      </w:pPr>
-    </w:p>
-    <w:p>
-      <w:pPr>
-        <w:jc w:val="center"/>
-        <w:rPr>
-          <w:rFonts w:cs="Times New Roman"/>
-        </w:rPr>
-      </w:pPr>
-    </w:p>
-    <w:p>
-      <w:pPr>
-        <w:jc w:val="center"/>
-        <w:rPr>
-          <w:rFonts w:cs="Times New Roman"/>
-        </w:rPr>
-      </w:pPr>
-    </w:p>
-    <w:p>
-      <w:pPr>
-        <w:jc w:val="center"/>
-        <w:rPr>
-          <w:rFonts w:cs="Times New Roman"/>
-        </w:rPr>
-      </w:pPr>
-    </w:p>
-    <w:p>
-      <w:pPr>
-        <w:jc w:val="center"/>
-        <w:rPr>
-          <w:rFonts w:cs="Times New Roman"/>
-        </w:rPr>
-      </w:pPr>
-    </w:p>
-    <w:p>
-      <w:pPr>
-        <w:jc w:val="center"/>
-        <w:rPr>
-          <w:rFonts w:cs="Times New Roman"/>
-        </w:rPr>
-      </w:pPr>
-    </w:p>
-    <w:p>
-      <w:pPr>
-        <w:jc w:val="center"/>
-        <w:rPr>
-          <w:rFonts w:cs="Times New Roman"/>
-        </w:rPr>
-      </w:pPr>
-    </w:p>
-    <w:p>
-      <w:pPr>
-        <w:jc w:val="center"/>
-        <w:rPr>
-          <w:rFonts w:cs="Times New Roman"/>
-        </w:rPr>
-      </w:pPr>
-    </w:p>
-    <w:p>
-      <w:pPr>
-        <w:jc w:val="center"/>
-        <w:rPr>
-          <w:rFonts w:cs="Times New Roman"/>
-        </w:rPr>
-      </w:pPr>
-    </w:p>
-    <w:p>
-      <w:pPr>
-        <w:jc w:val="center"/>
-        <w:rPr>
-          <w:rFonts w:cs="Times New Roman"/>
-        </w:rPr>
-      </w:pPr>
-    </w:p>
-    <w:p>
-      <w:pPr>
-        <w:jc w:val="center"/>
-        <w:rPr>
-          <w:rFonts w:cs="Times New Roman"/>
-        </w:rPr>
-      </w:pPr>
-      <w:r>
-        <w:rPr>
-          <w:rFonts w:cs="Times New Roman"/>
-        </w:rPr>
+      <w:bookmarkEnd w:id="20"/>
+    </w:p>
+    <w:p>
+      <w:pPr>
+        <w:jc w:val="center"/>
+        <w:rPr>
+          <w:rFonts w:cs="Times New Roman"/>
+        </w:rPr>
+      </w:pPr>
+    </w:p>
+    <w:p>
+      <w:pPr>
+        <w:jc w:val="center"/>
+        <w:rPr>
+          <w:rFonts w:cs="Times New Roman"/>
+        </w:rPr>
+      </w:pPr>
+    </w:p>
+    <w:p>
+      <w:pPr>
+        <w:jc w:val="center"/>
+        <w:rPr>
+          <w:rFonts w:cs="Times New Roman"/>
+        </w:rPr>
+      </w:pPr>
+    </w:p>
+    <w:p>
+      <w:pPr>
+        <w:jc w:val="center"/>
+        <w:rPr>
+          <w:rFonts w:cs="Times New Roman"/>
+        </w:rPr>
+      </w:pPr>
+    </w:p>
+    <w:p>
+      <w:pPr>
+        <w:jc w:val="center"/>
+        <w:rPr>
+          <w:rFonts w:cs="Times New Roman"/>
+        </w:rPr>
+      </w:pPr>
+    </w:p>
+    <w:p>
+      <w:pPr>
+        <w:jc w:val="center"/>
+        <w:rPr>
+          <w:rFonts w:cs="Times New Roman"/>
+        </w:rPr>
+      </w:pPr>
+    </w:p>
+    <w:p>
+      <w:pPr>
+        <w:jc w:val="center"/>
+        <w:rPr>
+          <w:rFonts w:cs="Times New Roman"/>
+        </w:rPr>
+      </w:pPr>
+    </w:p>
+    <w:p>
+      <w:pPr>
+        <w:jc w:val="center"/>
+        <w:rPr>
+          <w:rFonts w:cs="Times New Roman"/>
+        </w:rPr>
+      </w:pPr>
+    </w:p>
+    <w:p>
+      <w:pPr>
+        <w:jc w:val="center"/>
+        <w:rPr>
+          <w:rFonts w:cs="Times New Roman"/>
+        </w:rPr>
+      </w:pPr>
+    </w:p>
+    <w:p>
+      <w:pPr>
+        <w:jc w:val="center"/>
+        <w:rPr>
+          <w:rFonts w:cs="Times New Roman"/>
+        </w:rPr>
+      </w:pPr>
+    </w:p>
+    <w:p>
+      <w:pPr>
+        <w:jc w:val="center"/>
+        <w:rPr>
+          <w:rFonts w:cs="Times New Roman"/>
+        </w:rPr>
+      </w:pPr>
+    </w:p>
+    <w:p>
+      <w:pPr>
+        <w:jc w:val="center"/>
+        <w:rPr>
+          <w:rFonts w:cs="Times New Roman"/>
+        </w:rPr>
+      </w:pPr>
+    </w:p>
+    <w:p>
+      <w:pPr>
+        <w:jc w:val="center"/>
+        <w:rPr>
+          <w:rFonts w:cs="Times New Roman"/>
+        </w:rPr>
+      </w:pPr>
+    </w:p>
+    <w:p>
+      <w:pPr>
+        <w:jc w:val="center"/>
+        <w:rPr>
+          <w:rFonts w:cs="Times New Roman"/>
+        </w:rPr>
+      </w:pPr>
+    </w:p>
+    <w:p>
+      <w:pPr>
+        <w:jc w:val="center"/>
+        <w:rPr>
+          <w:rFonts w:cs="Times New Roman"/>
+        </w:rPr>
+      </w:pPr>
+    </w:p>
+    <w:p>
+      <w:pPr>
+        <w:jc w:val="center"/>
+        <w:rPr>
+          <w:rFonts w:cs="Times New Roman"/>
+        </w:rPr>
+      </w:pPr>
+    </w:p>
+    <w:p>
+      <w:pPr>
+        <w:jc w:val="center"/>
+        <w:rPr>
+          <w:rFonts w:cs="Times New Roman"/>
+        </w:rPr>
+      </w:pPr>
+    </w:p>
+    <w:p>
+      <w:pPr>
+        <w:jc w:val="center"/>
+        <w:rPr>
+          <w:rFonts w:cs="Times New Roman"/>
+        </w:rPr>
+      </w:pPr>
+    </w:p>
+    <w:p>
+      <w:pPr>
+        <w:jc w:val="center"/>
+        <w:rPr>
+          <w:rFonts w:cs="Times New Roman"/>
+        </w:rPr>
+      </w:pPr>
+    </w:p>
+    <w:p>
+      <w:pPr>
+        <w:jc w:val="center"/>
+        <w:rPr>
+          <w:rFonts w:cs="Times New Roman"/>
+        </w:rPr>
+      </w:pPr>
+    </w:p>
+    <w:p>
+      <w:pPr>
+        <w:ind w:firstLine="0"/>
+        <w:rPr>
+          <w:rFonts w:cs="Times New Roman"/>
+        </w:rPr>
+      </w:pPr>
+    </w:p>
+    <w:p>
+      <w:pPr>
+        <w:spacing w:after="160" w:line="278" w:lineRule="auto"/>
+        <w:ind w:firstLine="0"/>
+        <w:rPr>
+          <w:rFonts w:cs="Times New Roman"/>
+        </w:rPr>
+      </w:pPr>
+      <w:r>
+        <w:rPr>
+          <w:rFonts w:cs="Times New Roman"/>
+        </w:rPr>
+        <w:br w:type="page"/>
+      </w:r>
+    </w:p>
+    <w:p>
+      <w:pPr>
+        <w:pStyle w:val="Ttulo1"/>
+      </w:pPr>
+      <w:bookmarkStart w:id="21" w:name="_Toc242137976"/>
+      <w:r>
         <w:lastRenderedPageBreak/>
         <w:t>Reglamentación y Condiciones Legales</w:t>
       </w:r>
-    </w:p>
-    <w:p>
-      <w:pPr>
-        <w:jc w:val="center"/>
-        <w:rPr>
-          <w:rFonts w:cs="Times New Roman"/>
-        </w:rPr>
-      </w:pPr>
-    </w:p>
-    <w:p>
-      <w:pPr>
-        <w:jc w:val="center"/>
-        <w:rPr>
-          <w:rFonts w:cs="Times New Roman"/>
-        </w:rPr>
-      </w:pPr>
-    </w:p>
-    <w:p>
-      <w:pPr>
-        <w:jc w:val="center"/>
-        <w:rPr>
-          <w:rFonts w:cs="Times New Roman"/>
-        </w:rPr>
-      </w:pPr>
-    </w:p>
-    <w:p>
-      <w:pPr>
-        <w:jc w:val="center"/>
-        <w:rPr>
-          <w:rFonts w:cs="Times New Roman"/>
-        </w:rPr>
-      </w:pPr>
-    </w:p>
-    <w:p>
-      <w:pPr>
-        <w:jc w:val="center"/>
-        <w:rPr>
-          <w:rFonts w:cs="Times New Roman"/>
-        </w:rPr>
-      </w:pPr>
-    </w:p>
-    <w:p>
-      <w:pPr>
-        <w:jc w:val="center"/>
-        <w:rPr>
-          <w:rFonts w:cs="Times New Roman"/>
-        </w:rPr>
-      </w:pPr>
-    </w:p>
-    <w:p>
-      <w:pPr>
-        <w:jc w:val="center"/>
-        <w:rPr>
-          <w:rFonts w:cs="Times New Roman"/>
-        </w:rPr>
-      </w:pPr>
-    </w:p>
-    <w:p>
-      <w:pPr>
-        <w:jc w:val="center"/>
-        <w:rPr>
-          <w:rFonts w:cs="Times New Roman"/>
-        </w:rPr>
-      </w:pPr>
-    </w:p>
-    <w:p>
-      <w:pPr>
-        <w:jc w:val="center"/>
-        <w:rPr>
-          <w:rFonts w:cs="Times New Roman"/>
-        </w:rPr>
-      </w:pPr>
-    </w:p>
-    <w:p>
-      <w:pPr>
-        <w:jc w:val="center"/>
-        <w:rPr>
-          <w:rFonts w:cs="Times New Roman"/>
-        </w:rPr>
-      </w:pPr>
-    </w:p>
-    <w:p>
-      <w:pPr>
-        <w:jc w:val="center"/>
-        <w:rPr>
-          <w:rFonts w:cs="Times New Roman"/>
-        </w:rPr>
-      </w:pPr>
-    </w:p>
-    <w:p>
-      <w:pPr>
-        <w:jc w:val="center"/>
-        <w:rPr>
-          <w:rFonts w:cs="Times New Roman"/>
-        </w:rPr>
-      </w:pPr>
-    </w:p>
-    <w:p>
-      <w:pPr>
-        <w:jc w:val="center"/>
-        <w:rPr>
-          <w:rFonts w:cs="Times New Roman"/>
-        </w:rPr>
-      </w:pPr>
-    </w:p>
-    <w:p>
-      <w:pPr>
-        <w:jc w:val="center"/>
-        <w:rPr>
-          <w:rFonts w:cs="Times New Roman"/>
-        </w:rPr>
-      </w:pPr>
-    </w:p>
-    <w:p>
-      <w:pPr>
-        <w:jc w:val="center"/>
-        <w:rPr>
-          <w:rFonts w:cs="Times New Roman"/>
-        </w:rPr>
-      </w:pPr>
-    </w:p>
-    <w:p>
-      <w:pPr>
-        <w:jc w:val="center"/>
-        <w:rPr>
-          <w:rFonts w:cs="Times New Roman"/>
-        </w:rPr>
-      </w:pPr>
-    </w:p>
-    <w:p>
-      <w:pPr>
-        <w:jc w:val="center"/>
-        <w:rPr>
-          <w:rFonts w:cs="Times New Roman"/>
-        </w:rPr>
-      </w:pPr>
-    </w:p>
-    <w:p>
-      <w:pPr>
-        <w:jc w:val="center"/>
-        <w:rPr>
-          <w:rFonts w:cs="Times New Roman"/>
-        </w:rPr>
-      </w:pPr>
-    </w:p>
-    <w:p>
-      <w:pPr>
-        <w:jc w:val="center"/>
-        <w:rPr>
-          <w:rFonts w:cs="Times New Roman"/>
-        </w:rPr>
-      </w:pPr>
-    </w:p>
-    <w:p>
-      <w:pPr>
-        <w:jc w:val="center"/>
-        <w:rPr>
-          <w:rFonts w:cs="Times New Roman"/>
-        </w:rPr>
-      </w:pPr>
-    </w:p>
-    <w:p>
-      <w:pPr>
-        <w:jc w:val="center"/>
-        <w:rPr>
-          <w:rFonts w:cs="Times New Roman"/>
-        </w:rPr>
-      </w:pPr>
-    </w:p>
-    <w:p>
-      <w:pPr>
-        <w:jc w:val="center"/>
-        <w:rPr>
-          <w:rFonts w:cs="Times New Roman"/>
-        </w:rPr>
-      </w:pPr>
-    </w:p>
-    <w:p>
-      <w:pPr>
-        <w:jc w:val="center"/>
+      <w:bookmarkEnd w:id="21"/>
+    </w:p>
+    <w:p>
+      <w:pPr>
+        <w:jc w:val="center"/>
+        <w:rPr>
+          <w:rFonts w:cs="Times New Roman"/>
+        </w:rPr>
+      </w:pPr>
+    </w:p>
+    <w:p>
+      <w:pPr>
+        <w:jc w:val="center"/>
+        <w:rPr>
+          <w:rFonts w:cs="Times New Roman"/>
+        </w:rPr>
+      </w:pPr>
+    </w:p>
+    <w:p>
+      <w:pPr>
+        <w:jc w:val="center"/>
+        <w:rPr>
+          <w:rFonts w:cs="Times New Roman"/>
+        </w:rPr>
+      </w:pPr>
+    </w:p>
+    <w:p>
+      <w:pPr>
+        <w:jc w:val="center"/>
+        <w:rPr>
+          <w:rFonts w:cs="Times New Roman"/>
+        </w:rPr>
+      </w:pPr>
+    </w:p>
+    <w:p>
+      <w:pPr>
+        <w:jc w:val="center"/>
+        <w:rPr>
+          <w:rFonts w:cs="Times New Roman"/>
+        </w:rPr>
+      </w:pPr>
+    </w:p>
+    <w:p>
+      <w:pPr>
+        <w:jc w:val="center"/>
+        <w:rPr>
+          <w:rFonts w:cs="Times New Roman"/>
+        </w:rPr>
+      </w:pPr>
+    </w:p>
+    <w:p>
+      <w:pPr>
+        <w:jc w:val="center"/>
+        <w:rPr>
+          <w:rFonts w:cs="Times New Roman"/>
+        </w:rPr>
+      </w:pPr>
+    </w:p>
+    <w:p>
+      <w:pPr>
+        <w:jc w:val="center"/>
+        <w:rPr>
+          <w:rFonts w:cs="Times New Roman"/>
+        </w:rPr>
+      </w:pPr>
+    </w:p>
+    <w:p>
+      <w:pPr>
+        <w:jc w:val="center"/>
+        <w:rPr>
+          <w:rFonts w:cs="Times New Roman"/>
+        </w:rPr>
+      </w:pPr>
+    </w:p>
+    <w:p>
+      <w:pPr>
+        <w:jc w:val="center"/>
+        <w:rPr>
+          <w:rFonts w:cs="Times New Roman"/>
+        </w:rPr>
+      </w:pPr>
+    </w:p>
+    <w:p>
+      <w:pPr>
+        <w:jc w:val="center"/>
+        <w:rPr>
+          <w:rFonts w:cs="Times New Roman"/>
+        </w:rPr>
+      </w:pPr>
+    </w:p>
+    <w:p>
+      <w:pPr>
+        <w:jc w:val="center"/>
+        <w:rPr>
+          <w:rFonts w:cs="Times New Roman"/>
+        </w:rPr>
+      </w:pPr>
+    </w:p>
+    <w:p>
+      <w:pPr>
+        <w:jc w:val="center"/>
+        <w:rPr>
+          <w:rFonts w:cs="Times New Roman"/>
+        </w:rPr>
+      </w:pPr>
+    </w:p>
+    <w:p>
+      <w:pPr>
+        <w:jc w:val="center"/>
+        <w:rPr>
+          <w:rFonts w:cs="Times New Roman"/>
+        </w:rPr>
+      </w:pPr>
+    </w:p>
+    <w:p>
+      <w:pPr>
+        <w:jc w:val="center"/>
+        <w:rPr>
+          <w:rFonts w:cs="Times New Roman"/>
+        </w:rPr>
+      </w:pPr>
+    </w:p>
+    <w:p>
+      <w:pPr>
+        <w:jc w:val="center"/>
+        <w:rPr>
+          <w:rFonts w:cs="Times New Roman"/>
+        </w:rPr>
+      </w:pPr>
+    </w:p>
+    <w:p>
+      <w:pPr>
+        <w:jc w:val="center"/>
+        <w:rPr>
+          <w:rFonts w:cs="Times New Roman"/>
+        </w:rPr>
+      </w:pPr>
+    </w:p>
+    <w:p>
+      <w:pPr>
+        <w:jc w:val="center"/>
+        <w:rPr>
+          <w:rFonts w:cs="Times New Roman"/>
+        </w:rPr>
+      </w:pPr>
+    </w:p>
+    <w:p>
+      <w:pPr>
+        <w:jc w:val="center"/>
+        <w:rPr>
+          <w:rFonts w:cs="Times New Roman"/>
+        </w:rPr>
+      </w:pPr>
+    </w:p>
+    <w:p>
+      <w:pPr>
+        <w:spacing w:after="160" w:line="278" w:lineRule="auto"/>
+        <w:ind w:firstLine="0"/>
+        <w:rPr>
+          <w:rFonts w:cs="Times New Roman"/>
+        </w:rPr>
+      </w:pPr>
+      <w:r>
+        <w:rPr>
+          <w:rFonts w:cs="Times New Roman"/>
+        </w:rPr>
+        <w:br w:type="page"/>
+      </w:r>
+    </w:p>
+    <w:p>
+      <w:pPr>
+        <w:spacing w:after="160" w:line="278" w:lineRule="auto"/>
+        <w:ind w:firstLine="0"/>
         <w:rPr>
           <w:rFonts w:cs="Times New Roman"/>
         </w:rPr>

</xml_diff>

<commit_message>
docs: se realiza el stack tecnologico y se actualiza la lista de contenido
</commit_message>
<xml_diff>
--- a/informe de requisitos.docx
+++ b/informe de requisitos.docx
@@ -428,13 +428,13 @@
             </w:rPr>
             <w:fldChar w:fldCharType="separate"/>
           </w:r>
-          <w:hyperlink w:anchor="_Toc242137958" w:history="1">
+          <w:hyperlink w:anchor="_Toc242165038" w:history="1">
             <w:r>
               <w:rPr>
                 <w:rStyle w:val="Hipervnculo"/>
                 <w:rFonts w:cs="Times New Roman"/>
                 <w:noProof/>
-                <w:lang w:val="en-US"/>
+                <w:lang w:val="es-MX"/>
               </w:rPr>
               <w:t>Listado de tablas</w:t>
             </w:r>
@@ -457,7 +457,7 @@
                 <w:noProof/>
                 <w:webHidden/>
               </w:rPr>
-              <w:instrText xml:space="preserve"> PAGEREF _Toc242137958 \h </w:instrText>
+              <w:instrText xml:space="preserve"> PAGEREF _Toc242165038 \h </w:instrText>
             </w:r>
             <w:r>
               <w:rPr>
@@ -503,7 +503,7 @@
               <w:lang w:val="es-MX" w:eastAsia="es-MX"/>
             </w:rPr>
           </w:pPr>
-          <w:hyperlink w:anchor="_Toc242137959" w:history="1">
+          <w:hyperlink w:anchor="_Toc242165039" w:history="1">
             <w:r>
               <w:rPr>
                 <w:rStyle w:val="Hipervnculo"/>
@@ -531,7 +531,7 @@
                 <w:noProof/>
                 <w:webHidden/>
               </w:rPr>
-              <w:instrText xml:space="preserve"> PAGEREF _Toc242137959 \h </w:instrText>
+              <w:instrText xml:space="preserve"> PAGEREF _Toc242165039 \h </w:instrText>
             </w:r>
             <w:r>
               <w:rPr>
@@ -577,7 +577,7 @@
               <w:lang w:val="es-MX" w:eastAsia="es-MX"/>
             </w:rPr>
           </w:pPr>
-          <w:hyperlink w:anchor="_Toc242137960" w:history="1">
+          <w:hyperlink w:anchor="_Toc242165040" w:history="1">
             <w:r>
               <w:rPr>
                 <w:rStyle w:val="Hipervnculo"/>
@@ -605,7 +605,7 @@
                 <w:noProof/>
                 <w:webHidden/>
               </w:rPr>
-              <w:instrText xml:space="preserve"> PAGEREF _Toc242137960 \h </w:instrText>
+              <w:instrText xml:space="preserve"> PAGEREF _Toc242165040 \h </w:instrText>
             </w:r>
             <w:r>
               <w:rPr>
@@ -651,7 +651,7 @@
               <w:lang w:val="es-MX" w:eastAsia="es-MX"/>
             </w:rPr>
           </w:pPr>
-          <w:hyperlink w:anchor="_Toc242137961" w:history="1">
+          <w:hyperlink w:anchor="_Toc242165041" w:history="1">
             <w:r>
               <w:rPr>
                 <w:rStyle w:val="Hipervnculo"/>
@@ -678,7 +678,7 @@
                 <w:noProof/>
                 <w:webHidden/>
               </w:rPr>
-              <w:instrText xml:space="preserve"> PAGEREF _Toc242137961 \h </w:instrText>
+              <w:instrText xml:space="preserve"> PAGEREF _Toc242165041 \h </w:instrText>
             </w:r>
             <w:r>
               <w:rPr>
@@ -724,7 +724,7 @@
               <w:lang w:val="es-MX" w:eastAsia="es-MX"/>
             </w:rPr>
           </w:pPr>
-          <w:hyperlink w:anchor="_Toc242137962" w:history="1">
+          <w:hyperlink w:anchor="_Toc242165042" w:history="1">
             <w:r>
               <w:rPr>
                 <w:rStyle w:val="Hipervnculo"/>
@@ -751,7 +751,7 @@
                 <w:noProof/>
                 <w:webHidden/>
               </w:rPr>
-              <w:instrText xml:space="preserve"> PAGEREF _Toc242137962 \h </w:instrText>
+              <w:instrText xml:space="preserve"> PAGEREF _Toc242165042 \h </w:instrText>
             </w:r>
             <w:r>
               <w:rPr>
@@ -797,7 +797,7 @@
               <w:lang w:val="es-MX" w:eastAsia="es-MX"/>
             </w:rPr>
           </w:pPr>
-          <w:hyperlink w:anchor="_Toc242137963" w:history="1">
+          <w:hyperlink w:anchor="_Toc242165043" w:history="1">
             <w:r>
               <w:rPr>
                 <w:rStyle w:val="Hipervnculo"/>
@@ -824,7 +824,7 @@
                 <w:noProof/>
                 <w:webHidden/>
               </w:rPr>
-              <w:instrText xml:space="preserve"> PAGEREF _Toc242137963 \h </w:instrText>
+              <w:instrText xml:space="preserve"> PAGEREF _Toc242165043 \h </w:instrText>
             </w:r>
             <w:r>
               <w:rPr>
@@ -870,7 +870,7 @@
               <w:lang w:val="es-MX" w:eastAsia="es-MX"/>
             </w:rPr>
           </w:pPr>
-          <w:hyperlink w:anchor="_Toc242137964" w:history="1">
+          <w:hyperlink w:anchor="_Toc242165044" w:history="1">
             <w:r>
               <w:rPr>
                 <w:rStyle w:val="Hipervnculo"/>
@@ -898,7 +898,7 @@
                 <w:noProof/>
                 <w:webHidden/>
               </w:rPr>
-              <w:instrText xml:space="preserve"> PAGEREF _Toc242137964 \h </w:instrText>
+              <w:instrText xml:space="preserve"> PAGEREF _Toc242165044 \h </w:instrText>
             </w:r>
             <w:r>
               <w:rPr>
@@ -944,7 +944,7 @@
               <w:lang w:val="es-MX" w:eastAsia="es-MX"/>
             </w:rPr>
           </w:pPr>
-          <w:hyperlink w:anchor="_Toc242137965" w:history="1">
+          <w:hyperlink w:anchor="_Toc242165045" w:history="1">
             <w:r>
               <w:rPr>
                 <w:rStyle w:val="Hipervnculo"/>
@@ -971,7 +971,7 @@
                 <w:noProof/>
                 <w:webHidden/>
               </w:rPr>
-              <w:instrText xml:space="preserve"> PAGEREF _Toc242137965 \h </w:instrText>
+              <w:instrText xml:space="preserve"> PAGEREF _Toc242165045 \h </w:instrText>
             </w:r>
             <w:r>
               <w:rPr>
@@ -1017,7 +1017,7 @@
               <w:lang w:val="es-MX" w:eastAsia="es-MX"/>
             </w:rPr>
           </w:pPr>
-          <w:hyperlink w:anchor="_Toc242137966" w:history="1">
+          <w:hyperlink w:anchor="_Toc242165046" w:history="1">
             <w:r>
               <w:rPr>
                 <w:rStyle w:val="Hipervnculo"/>
@@ -1046,7 +1046,7 @@
                 <w:noProof/>
                 <w:webHidden/>
               </w:rPr>
-              <w:instrText xml:space="preserve"> PAGEREF _Toc242137966 \h </w:instrText>
+              <w:instrText xml:space="preserve"> PAGEREF _Toc242165046 \h </w:instrText>
             </w:r>
             <w:r>
               <w:rPr>
@@ -1092,7 +1092,7 @@
               <w:lang w:val="es-MX" w:eastAsia="es-MX"/>
             </w:rPr>
           </w:pPr>
-          <w:hyperlink w:anchor="_Toc242137967" w:history="1">
+          <w:hyperlink w:anchor="_Toc242165047" w:history="1">
             <w:r>
               <w:rPr>
                 <w:rStyle w:val="Hipervnculo"/>
@@ -1121,7 +1121,7 @@
                 <w:noProof/>
                 <w:webHidden/>
               </w:rPr>
-              <w:instrText xml:space="preserve"> PAGEREF _Toc242137967 \h </w:instrText>
+              <w:instrText xml:space="preserve"> PAGEREF _Toc242165047 \h </w:instrText>
             </w:r>
             <w:r>
               <w:rPr>
@@ -1142,6 +1142,79 @@
                 <w:webHidden/>
               </w:rPr>
               <w:t>10</w:t>
+            </w:r>
+            <w:r>
+              <w:rPr>
+                <w:noProof/>
+                <w:webHidden/>
+              </w:rPr>
+              <w:fldChar w:fldCharType="end"/>
+            </w:r>
+          </w:hyperlink>
+        </w:p>
+        <w:p>
+          <w:pPr>
+            <w:pStyle w:val="TDC2"/>
+            <w:tabs>
+              <w:tab w:val="right" w:leader="dot" w:pos="8828"/>
+            </w:tabs>
+            <w:rPr>
+              <w:rFonts w:asciiTheme="minorHAnsi" w:eastAsiaTheme="minorEastAsia" w:hAnsiTheme="minorHAnsi"/>
+              <w:noProof/>
+              <w:color w:val="auto"/>
+              <w:sz w:val="22"/>
+              <w:szCs w:val="22"/>
+              <w:lang w:val="es-MX" w:eastAsia="es-MX"/>
+            </w:rPr>
+          </w:pPr>
+          <w:hyperlink w:anchor="_Toc242165048" w:history="1">
+            <w:r>
+              <w:rPr>
+                <w:rStyle w:val="Hipervnculo"/>
+                <w:noProof/>
+              </w:rPr>
+              <w:t>Tabla 1</w:t>
+            </w:r>
+            <w:r>
+              <w:rPr>
+                <w:noProof/>
+                <w:webHidden/>
+              </w:rPr>
+              <w:tab/>
+            </w:r>
+            <w:r>
+              <w:rPr>
+                <w:noProof/>
+                <w:webHidden/>
+              </w:rPr>
+              <w:fldChar w:fldCharType="begin"/>
+            </w:r>
+            <w:r>
+              <w:rPr>
+                <w:noProof/>
+                <w:webHidden/>
+              </w:rPr>
+              <w:instrText xml:space="preserve"> PAGEREF _Toc242165048 \h </w:instrText>
+            </w:r>
+            <w:r>
+              <w:rPr>
+                <w:noProof/>
+                <w:webHidden/>
+              </w:rPr>
+            </w:r>
+            <w:r>
+              <w:rPr>
+                <w:noProof/>
+                <w:webHidden/>
+              </w:rPr>
+              <w:fldChar w:fldCharType="separate"/>
+            </w:r>
+            <w:r>
+              <w:rPr>
+                <w:noProof/>
+                <w:webHidden/>
+              </w:rPr>
+              <w:t>11</w:t>
             </w:r>
             <w:r>
               <w:rPr>
@@ -1167,7 +1240,7 @@
               <w:lang w:val="es-MX" w:eastAsia="es-MX"/>
             </w:rPr>
           </w:pPr>
-          <w:hyperlink w:anchor="_Toc242137968" w:history="1">
+          <w:hyperlink w:anchor="_Toc242165049" w:history="1">
             <w:r>
               <w:rPr>
                 <w:rStyle w:val="Hipervnculo"/>
@@ -1195,7 +1268,80 @@
                 <w:noProof/>
                 <w:webHidden/>
               </w:rPr>
-              <w:instrText xml:space="preserve"> PAGEREF _Toc242137968 \h </w:instrText>
+              <w:instrText xml:space="preserve"> PAGEREF _Toc242165049 \h </w:instrText>
+            </w:r>
+            <w:r>
+              <w:rPr>
+                <w:noProof/>
+                <w:webHidden/>
+              </w:rPr>
+            </w:r>
+            <w:r>
+              <w:rPr>
+                <w:noProof/>
+                <w:webHidden/>
+              </w:rPr>
+              <w:fldChar w:fldCharType="separate"/>
+            </w:r>
+            <w:r>
+              <w:rPr>
+                <w:noProof/>
+                <w:webHidden/>
+              </w:rPr>
+              <w:t>12</w:t>
+            </w:r>
+            <w:r>
+              <w:rPr>
+                <w:noProof/>
+                <w:webHidden/>
+              </w:rPr>
+              <w:fldChar w:fldCharType="end"/>
+            </w:r>
+          </w:hyperlink>
+        </w:p>
+        <w:p>
+          <w:pPr>
+            <w:pStyle w:val="TDC2"/>
+            <w:tabs>
+              <w:tab w:val="right" w:leader="dot" w:pos="8828"/>
+            </w:tabs>
+            <w:rPr>
+              <w:rFonts w:asciiTheme="minorHAnsi" w:eastAsiaTheme="minorEastAsia" w:hAnsiTheme="minorHAnsi"/>
+              <w:noProof/>
+              <w:color w:val="auto"/>
+              <w:sz w:val="22"/>
+              <w:szCs w:val="22"/>
+              <w:lang w:val="es-MX" w:eastAsia="es-MX"/>
+            </w:rPr>
+          </w:pPr>
+          <w:hyperlink w:anchor="_Toc242165050" w:history="1">
+            <w:r>
+              <w:rPr>
+                <w:rStyle w:val="Hipervnculo"/>
+                <w:noProof/>
+              </w:rPr>
+              <w:t>Tabla 2</w:t>
+            </w:r>
+            <w:r>
+              <w:rPr>
+                <w:noProof/>
+                <w:webHidden/>
+              </w:rPr>
+              <w:tab/>
+            </w:r>
+            <w:r>
+              <w:rPr>
+                <w:noProof/>
+                <w:webHidden/>
+              </w:rPr>
+              <w:fldChar w:fldCharType="begin"/>
+            </w:r>
+            <w:r>
+              <w:rPr>
+                <w:noProof/>
+                <w:webHidden/>
+              </w:rPr>
+              <w:instrText xml:space="preserve"> PAGEREF _Toc242165050 \h </w:instrText>
             </w:r>
             <w:r>
               <w:rPr>
@@ -1241,7 +1387,7 @@
               <w:lang w:val="es-MX" w:eastAsia="es-MX"/>
             </w:rPr>
           </w:pPr>
-          <w:hyperlink w:anchor="_Toc242137969" w:history="1">
+          <w:hyperlink w:anchor="_Toc242165051" w:history="1">
             <w:r>
               <w:rPr>
                 <w:rStyle w:val="Hipervnculo"/>
@@ -1269,7 +1415,7 @@
                 <w:noProof/>
                 <w:webHidden/>
               </w:rPr>
-              <w:instrText xml:space="preserve"> PAGEREF _Toc242137969 \h </w:instrText>
+              <w:instrText xml:space="preserve"> PAGEREF _Toc242165051 \h </w:instrText>
             </w:r>
             <w:r>
               <w:rPr>
@@ -1315,7 +1461,7 @@
               <w:lang w:val="es-MX" w:eastAsia="es-MX"/>
             </w:rPr>
           </w:pPr>
-          <w:hyperlink w:anchor="_Toc242137970" w:history="1">
+          <w:hyperlink w:anchor="_Toc242165052" w:history="1">
             <w:r>
               <w:rPr>
                 <w:rStyle w:val="Hipervnculo"/>
@@ -1343,7 +1489,7 @@
                 <w:noProof/>
                 <w:webHidden/>
               </w:rPr>
-              <w:instrText xml:space="preserve"> PAGEREF _Toc242137970 \h </w:instrText>
+              <w:instrText xml:space="preserve"> PAGEREF _Toc242165052 \h </w:instrText>
             </w:r>
             <w:r>
               <w:rPr>
@@ -1389,7 +1535,7 @@
               <w:lang w:val="es-MX" w:eastAsia="es-MX"/>
             </w:rPr>
           </w:pPr>
-          <w:hyperlink w:anchor="_Toc242137971" w:history="1">
+          <w:hyperlink w:anchor="_Toc242165053" w:history="1">
             <w:r>
               <w:rPr>
                 <w:rStyle w:val="Hipervnculo"/>
@@ -1417,7 +1563,7 @@
                 <w:noProof/>
                 <w:webHidden/>
               </w:rPr>
-              <w:instrText xml:space="preserve"> PAGEREF _Toc242137971 \h </w:instrText>
+              <w:instrText xml:space="preserve"> PAGEREF _Toc242165053 \h </w:instrText>
             </w:r>
             <w:r>
               <w:rPr>
@@ -1463,7 +1609,7 @@
               <w:lang w:val="es-MX" w:eastAsia="es-MX"/>
             </w:rPr>
           </w:pPr>
-          <w:hyperlink w:anchor="_Toc242137972" w:history="1">
+          <w:hyperlink w:anchor="_Toc242165054" w:history="1">
             <w:r>
               <w:rPr>
                 <w:rStyle w:val="Hipervnculo"/>
@@ -1490,7 +1636,7 @@
                 <w:noProof/>
                 <w:webHidden/>
               </w:rPr>
-              <w:instrText xml:space="preserve"> PAGEREF _Toc242137972 \h </w:instrText>
+              <w:instrText xml:space="preserve"> PAGEREF _Toc242165054 \h </w:instrText>
             </w:r>
             <w:r>
               <w:rPr>
@@ -1536,7 +1682,7 @@
               <w:lang w:val="es-MX" w:eastAsia="es-MX"/>
             </w:rPr>
           </w:pPr>
-          <w:hyperlink w:anchor="_Toc242137973" w:history="1">
+          <w:hyperlink w:anchor="_Toc242165055" w:history="1">
             <w:r>
               <w:rPr>
                 <w:rStyle w:val="Hipervnculo"/>
@@ -1563,7 +1709,7 @@
                 <w:noProof/>
                 <w:webHidden/>
               </w:rPr>
-              <w:instrText xml:space="preserve"> PAGEREF _Toc242137973 \h </w:instrText>
+              <w:instrText xml:space="preserve"> PAGEREF _Toc242165055 \h </w:instrText>
             </w:r>
             <w:r>
               <w:rPr>
@@ -1609,7 +1755,7 @@
               <w:lang w:val="es-MX" w:eastAsia="es-MX"/>
             </w:rPr>
           </w:pPr>
-          <w:hyperlink w:anchor="_Toc242137974" w:history="1">
+          <w:hyperlink w:anchor="_Toc242165056" w:history="1">
             <w:r>
               <w:rPr>
                 <w:rStyle w:val="Hipervnculo"/>
@@ -1636,7 +1782,7 @@
                 <w:noProof/>
                 <w:webHidden/>
               </w:rPr>
-              <w:instrText xml:space="preserve"> PAGEREF _Toc242137974 \h </w:instrText>
+              <w:instrText xml:space="preserve"> PAGEREF _Toc242165056 \h </w:instrText>
             </w:r>
             <w:r>
               <w:rPr>
@@ -1682,7 +1828,7 @@
               <w:lang w:val="es-MX" w:eastAsia="es-MX"/>
             </w:rPr>
           </w:pPr>
-          <w:hyperlink w:anchor="_Toc242137975" w:history="1">
+          <w:hyperlink w:anchor="_Toc242165057" w:history="1">
             <w:r>
               <w:rPr>
                 <w:rStyle w:val="Hipervnculo"/>
@@ -1709,7 +1855,7 @@
                 <w:noProof/>
                 <w:webHidden/>
               </w:rPr>
-              <w:instrText xml:space="preserve"> PAGEREF _Toc242137975 \h </w:instrText>
+              <w:instrText xml:space="preserve"> PAGEREF _Toc242165057 \h </w:instrText>
             </w:r>
             <w:r>
               <w:rPr>
@@ -1755,7 +1901,7 @@
               <w:lang w:val="es-MX" w:eastAsia="es-MX"/>
             </w:rPr>
           </w:pPr>
-          <w:hyperlink w:anchor="_Toc242137976" w:history="1">
+          <w:hyperlink w:anchor="_Toc242165058" w:history="1">
             <w:r>
               <w:rPr>
                 <w:rStyle w:val="Hipervnculo"/>
@@ -1782,7 +1928,7 @@
                 <w:noProof/>
                 <w:webHidden/>
               </w:rPr>
-              <w:instrText xml:space="preserve"> PAGEREF _Toc242137976 \h </w:instrText>
+              <w:instrText xml:space="preserve"> PAGEREF _Toc242165058 \h </w:instrText>
             </w:r>
             <w:r>
               <w:rPr>
@@ -1885,62 +2031,42 @@
         <w:rPr>
           <w:rFonts w:cs="Times New Roman"/>
           <w:szCs w:val="24"/>
-          <w:lang w:val="en-US"/>
-        </w:rPr>
-      </w:pPr>
-      <w:bookmarkStart w:id="1" w:name="_Toc242137958"/>
-      <w:proofErr w:type="spellStart"/>
+          <w:lang w:val="es-MX"/>
+        </w:rPr>
+      </w:pPr>
+      <w:bookmarkStart w:id="1" w:name="_Toc242165038"/>
       <w:r>
         <w:rPr>
           <w:rFonts w:cs="Times New Roman"/>
           <w:szCs w:val="24"/>
-          <w:lang w:val="en-US"/>
+          <w:lang w:val="es-MX"/>
         </w:rPr>
         <w:lastRenderedPageBreak/>
-        <w:t>Listado</w:t>
-      </w:r>
-      <w:proofErr w:type="spellEnd"/>
-      <w:r>
-        <w:rPr>
-          <w:rFonts w:cs="Times New Roman"/>
-          <w:szCs w:val="24"/>
-          <w:lang w:val="en-US"/>
-        </w:rPr>
-        <w:t xml:space="preserve"> de </w:t>
-      </w:r>
-      <w:proofErr w:type="spellStart"/>
-      <w:r>
-        <w:rPr>
-          <w:rFonts w:cs="Times New Roman"/>
-          <w:szCs w:val="24"/>
-          <w:lang w:val="en-US"/>
-        </w:rPr>
-        <w:t>tablas</w:t>
+        <w:t>Listado de tablas</w:t>
       </w:r>
       <w:bookmarkEnd w:id="1"/>
-      <w:proofErr w:type="spellEnd"/>
-    </w:p>
-    <w:p>
-      <w:pPr>
-        <w:rPr>
-          <w:rFonts w:cs="Times New Roman"/>
-          <w:lang w:val="en-US"/>
-        </w:rPr>
-      </w:pPr>
-    </w:p>
-    <w:p>
-      <w:pPr>
-        <w:rPr>
-          <w:rFonts w:cs="Times New Roman"/>
-          <w:lang w:val="en-US"/>
-        </w:rPr>
-      </w:pPr>
-    </w:p>
-    <w:p>
-      <w:pPr>
-        <w:rPr>
-          <w:rFonts w:cs="Times New Roman"/>
-          <w:lang w:val="en-US"/>
+    </w:p>
+    <w:p>
+      <w:pPr>
+        <w:rPr>
+          <w:rFonts w:cs="Times New Roman"/>
+          <w:lang w:val="es-MX"/>
+        </w:rPr>
+      </w:pPr>
+    </w:p>
+    <w:p>
+      <w:pPr>
+        <w:rPr>
+          <w:rFonts w:cs="Times New Roman"/>
+          <w:lang w:val="es-MX"/>
+        </w:rPr>
+      </w:pPr>
+    </w:p>
+    <w:p>
+      <w:pPr>
+        <w:rPr>
+          <w:rFonts w:cs="Times New Roman"/>
+          <w:lang w:val="es-MX"/>
         </w:rPr>
       </w:pPr>
     </w:p>
@@ -1984,7 +2110,23 @@
             <w:rFonts w:cs="Times New Roman"/>
             <w:noProof/>
           </w:rPr>
-          <w:t>Tabla 1 - Comparativa</w:t>
+          <w:t>Tabla 1 - Com</w:t>
+        </w:r>
+        <w:r>
+          <w:rPr>
+            <w:rStyle w:val="Hipervnculo"/>
+            <w:rFonts w:cs="Times New Roman"/>
+            <w:noProof/>
+          </w:rPr>
+          <w:t>p</w:t>
+        </w:r>
+        <w:r>
+          <w:rPr>
+            <w:rStyle w:val="Hipervnculo"/>
+            <w:rFonts w:cs="Times New Roman"/>
+            <w:noProof/>
+          </w:rPr>
+          <w:t>arativa</w:t>
         </w:r>
         <w:r>
           <w:rPr>
@@ -2048,215 +2190,19 @@
         <w:jc w:val="both"/>
         <w:rPr>
           <w:rFonts w:cs="Times New Roman"/>
+          <w:lang w:val="es-MX"/>
+        </w:rPr>
+      </w:pPr>
+      <w:r>
+        <w:rPr>
+          <w:rFonts w:cs="Times New Roman"/>
           <w:lang w:val="en-US"/>
         </w:rPr>
-      </w:pPr>
-      <w:r>
-        <w:rPr>
-          <w:rFonts w:cs="Times New Roman"/>
-          <w:lang w:val="en-US"/>
-        </w:rPr>
         <w:fldChar w:fldCharType="end"/>
       </w:r>
     </w:p>
     <w:p>
       <w:pPr>
-        <w:jc w:val="both"/>
-        <w:rPr>
-          <w:rFonts w:cs="Times New Roman"/>
-        </w:rPr>
-      </w:pPr>
-      <w:r>
-        <w:rPr>
-          <w:rFonts w:cs="Times New Roman"/>
-          <w:b/>
-          <w:bCs/>
-        </w:rPr>
-        <w:t>Tabla 1</w:t>
-      </w:r>
-      <w:r>
-        <w:rPr>
-          <w:rFonts w:cs="Times New Roman"/>
-        </w:rPr>
-        <w:t>.</w:t>
-      </w:r>
-    </w:p>
-    <w:p>
-      <w:pPr>
-        <w:ind w:left="708" w:firstLine="12"/>
-        <w:jc w:val="both"/>
-        <w:rPr>
-          <w:rFonts w:cs="Times New Roman"/>
-        </w:rPr>
-      </w:pPr>
-      <w:r>
-        <w:rPr>
-          <w:rFonts w:cs="Times New Roman"/>
-        </w:rPr>
-        <w:t xml:space="preserve">Colecciones Descripción: Permite almacenar las colecciones creadas por los </w:t>
-      </w:r>
-      <w:r>
-        <w:rPr>
-          <w:rFonts w:cs="Times New Roman"/>
-        </w:rPr>
-        <w:t>u</w:t>
-      </w:r>
-      <w:r>
-        <w:rPr>
-          <w:rFonts w:cs="Times New Roman"/>
-        </w:rPr>
-        <w:t xml:space="preserve">suarios. </w:t>
-      </w:r>
-    </w:p>
-    <w:p>
-      <w:pPr>
-        <w:jc w:val="both"/>
-        <w:rPr>
-          <w:rFonts w:cs="Times New Roman"/>
-          <w:b/>
-          <w:bCs/>
-        </w:rPr>
-      </w:pPr>
-      <w:r>
-        <w:rPr>
-          <w:rFonts w:cs="Times New Roman"/>
-          <w:b/>
-          <w:bCs/>
-        </w:rPr>
-        <w:t xml:space="preserve">Tabla 2. </w:t>
-      </w:r>
-    </w:p>
-    <w:p>
-      <w:pPr>
-        <w:jc w:val="both"/>
-        <w:rPr>
-          <w:rFonts w:cs="Times New Roman"/>
-        </w:rPr>
-      </w:pPr>
-      <w:r>
-        <w:rPr>
-          <w:rFonts w:cs="Times New Roman"/>
-        </w:rPr>
-        <w:t xml:space="preserve">Favoritos Descripción: Registra las recetas guardadas por cada usuario. </w:t>
-      </w:r>
-    </w:p>
-    <w:p>
-      <w:pPr>
-        <w:jc w:val="both"/>
-        <w:rPr>
-          <w:rFonts w:cs="Times New Roman"/>
-          <w:b/>
-          <w:bCs/>
-        </w:rPr>
-      </w:pPr>
-      <w:r>
-        <w:rPr>
-          <w:rFonts w:cs="Times New Roman"/>
-          <w:b/>
-          <w:bCs/>
-        </w:rPr>
-        <w:t>Tabla 3.</w:t>
-      </w:r>
-    </w:p>
-    <w:p>
-      <w:pPr>
-        <w:jc w:val="both"/>
-        <w:rPr>
-          <w:rFonts w:cs="Times New Roman"/>
-        </w:rPr>
-      </w:pPr>
-      <w:r>
-        <w:rPr>
-          <w:rFonts w:cs="Times New Roman"/>
-        </w:rPr>
-        <w:t xml:space="preserve">Comentarios Descripción: Almacena comentarios realizados sobre las recetas. </w:t>
-      </w:r>
-    </w:p>
-    <w:p>
-      <w:pPr>
-        <w:jc w:val="both"/>
-        <w:rPr>
-          <w:rFonts w:cs="Times New Roman"/>
-          <w:b/>
-          <w:bCs/>
-        </w:rPr>
-      </w:pPr>
-      <w:r>
-        <w:rPr>
-          <w:rFonts w:cs="Times New Roman"/>
-          <w:b/>
-          <w:bCs/>
-        </w:rPr>
-        <w:t>Tabla 4.</w:t>
-      </w:r>
-    </w:p>
-    <w:p>
-      <w:pPr>
-        <w:jc w:val="both"/>
-        <w:rPr>
-          <w:rFonts w:cs="Times New Roman"/>
-        </w:rPr>
-      </w:pPr>
-      <w:r>
-        <w:rPr>
-          <w:rFonts w:cs="Times New Roman"/>
-        </w:rPr>
-        <w:t xml:space="preserve">Reportes Descripción: Registra reportes de contenido realizados por los usuarios. </w:t>
-      </w:r>
-    </w:p>
-    <w:p>
-      <w:pPr>
-        <w:jc w:val="both"/>
-        <w:rPr>
-          <w:rFonts w:cs="Times New Roman"/>
-          <w:b/>
-          <w:bCs/>
-        </w:rPr>
-      </w:pPr>
-      <w:r>
-        <w:rPr>
-          <w:rFonts w:cs="Times New Roman"/>
-          <w:b/>
-          <w:bCs/>
-        </w:rPr>
-        <w:t>Tabla 5.</w:t>
-      </w:r>
-    </w:p>
-    <w:p>
-      <w:pPr>
-        <w:jc w:val="both"/>
-        <w:rPr>
-          <w:rFonts w:cs="Times New Roman"/>
-        </w:rPr>
-      </w:pPr>
-      <w:r>
-        <w:rPr>
-          <w:rFonts w:cs="Times New Roman"/>
-        </w:rPr>
-        <w:t xml:space="preserve">Calificaciones Descripción: Guarda las puntuaciones asignadas a las recetas. </w:t>
-      </w:r>
-    </w:p>
-    <w:p>
-      <w:pPr>
-        <w:jc w:val="both"/>
-        <w:rPr>
-          <w:rFonts w:cs="Times New Roman"/>
-          <w:b/>
-          <w:bCs/>
-        </w:rPr>
-      </w:pPr>
-      <w:r>
-        <w:rPr>
-          <w:rFonts w:cs="Times New Roman"/>
-          <w:b/>
-          <w:bCs/>
-        </w:rPr>
-        <w:t>Tabla 6.</w:t>
-      </w:r>
-    </w:p>
-    <w:p>
-      <w:pPr>
-        <w:jc w:val="both"/>
         <w:rPr>
           <w:rFonts w:cs="Times New Roman"/>
           <w:lang w:val="es-MX"/>
@@ -2265,22 +2211,8 @@
       <w:r>
         <w:rPr>
           <w:rFonts w:cs="Times New Roman"/>
-        </w:rPr>
-        <w:t>Favoritos colecciones Descripción: Relaciona recetas favoritas con colecciones.</w:t>
-      </w:r>
-    </w:p>
-    <w:p>
-      <w:pPr>
-        <w:rPr>
-          <w:rFonts w:cs="Times New Roman"/>
           <w:lang w:val="es-MX"/>
         </w:rPr>
-      </w:pPr>
-      <w:r>
-        <w:rPr>
-          <w:rFonts w:cs="Times New Roman"/>
-          <w:lang w:val="es-MX"/>
-        </w:rPr>
         <w:br w:type="page"/>
       </w:r>
     </w:p>
@@ -2292,7 +2224,7 @@
           <w:szCs w:val="24"/>
         </w:rPr>
       </w:pPr>
-      <w:bookmarkStart w:id="2" w:name="_Toc242137959"/>
+      <w:bookmarkStart w:id="2" w:name="_Toc242165039"/>
       <w:r>
         <w:rPr>
           <w:rFonts w:cs="Times New Roman"/>
@@ -2454,7 +2386,7 @@
           <w:szCs w:val="24"/>
         </w:rPr>
       </w:pPr>
-      <w:bookmarkStart w:id="3" w:name="_Toc242137960"/>
+      <w:bookmarkStart w:id="3" w:name="_Toc242165040"/>
       <w:r>
         <w:rPr>
           <w:rFonts w:cs="Times New Roman"/>
@@ -2533,7 +2465,7 @@
         <w:lastRenderedPageBreak/>
         <w:t xml:space="preserve"> </w:t>
       </w:r>
-      <w:bookmarkStart w:id="4" w:name="_Toc242137961"/>
+      <w:bookmarkStart w:id="4" w:name="_Toc242165041"/>
       <w:r>
         <w:t>Objetivos</w:t>
       </w:r>
@@ -2549,7 +2481,7 @@
       <w:r>
         <w:t xml:space="preserve"> </w:t>
       </w:r>
-      <w:bookmarkStart w:id="5" w:name="_Toc242137962"/>
+      <w:bookmarkStart w:id="5" w:name="_Toc242165042"/>
       <w:r>
         <w:t>Objetivo general</w:t>
       </w:r>
@@ -2567,7 +2499,7 @@
       <w:r>
         <w:t xml:space="preserve"> </w:t>
       </w:r>
-      <w:bookmarkStart w:id="6" w:name="_Toc242137963"/>
+      <w:bookmarkStart w:id="6" w:name="_Toc242165043"/>
       <w:r>
         <w:t>Objetivos específicos</w:t>
       </w:r>
@@ -2688,32 +2620,19 @@
     </w:p>
     <w:p>
       <w:pPr>
-        <w:pStyle w:val="Listaconvietas"/>
-        <w:numPr>
-          <w:ilvl w:val="0"/>
-          <w:numId w:val="0"/>
-        </w:numPr>
-        <w:spacing w:line="480" w:lineRule="auto"/>
-        <w:ind w:left="360"/>
-        <w:rPr>
-          <w:lang w:val="es-MX"/>
-        </w:rPr>
-      </w:pPr>
-    </w:p>
-    <w:p>
-      <w:pPr>
         <w:pStyle w:val="Ttulo1"/>
         <w:rPr>
           <w:rFonts w:cs="Times New Roman"/>
           <w:szCs w:val="24"/>
         </w:rPr>
       </w:pPr>
-      <w:bookmarkStart w:id="7" w:name="_Toc242137964"/>
+      <w:bookmarkStart w:id="7" w:name="_Toc242165044"/>
       <w:r>
         <w:rPr>
           <w:rFonts w:cs="Times New Roman"/>
           <w:szCs w:val="24"/>
         </w:rPr>
+        <w:lastRenderedPageBreak/>
         <w:t>Planteamiento del problema</w:t>
       </w:r>
       <w:bookmarkEnd w:id="7"/>
@@ -2746,7 +2665,7 @@
       <w:r>
         <w:t xml:space="preserve"> </w:t>
       </w:r>
-      <w:bookmarkStart w:id="8" w:name="_Toc242137965"/>
+      <w:bookmarkStart w:id="8" w:name="_Toc242165045"/>
       <w:r>
         <w:t>Necesidad</w:t>
       </w:r>
@@ -2780,7 +2699,7 @@
         </w:rPr>
         <w:t xml:space="preserve"> </w:t>
       </w:r>
-      <w:bookmarkStart w:id="9" w:name="_Toc242137966"/>
+      <w:bookmarkStart w:id="9" w:name="_Toc242165046"/>
       <w:r>
         <w:rPr>
           <w:rFonts w:eastAsia="Times New Roman"/>
@@ -2825,7 +2744,7 @@
           <w:lang w:val="es-MX" w:eastAsia="es-MX"/>
         </w:rPr>
       </w:pPr>
-      <w:bookmarkStart w:id="10" w:name="_Toc242137967"/>
+      <w:bookmarkStart w:id="10" w:name="_Toc242165047"/>
       <w:r>
         <w:rPr>
           <w:rFonts w:eastAsia="Times New Roman"/>
@@ -2845,14 +2764,7 @@
         <w:rPr>
           <w:lang w:val="es-MX" w:eastAsia="es-MX"/>
         </w:rPr>
-        <w:t xml:space="preserve">La Célula 6 implementará un Módulo de Comunidad y Valoraciones integrado de forma transparente en la plataforma. Esta solución permitirá a los usuarios registrados calificar las recetas mediante una escala de 1 a 5 estrellas, redactar reseñas con comentarios constructivos, responder a las opiniones de otros miembros y visualizar estadísticas </w:t>
-      </w:r>
-      <w:r>
-        <w:rPr>
-          <w:lang w:val="es-MX" w:eastAsia="es-MX"/>
-        </w:rPr>
-        <w:lastRenderedPageBreak/>
-        <w:t>agregadas (promedios de valoración y número de reseñas) en cada ficha de receta, fomentando un ecosistema culinario participativo.</w:t>
+        <w:t>La Célula 6 implementará un Módulo de Comunidad y Valoraciones integrado de forma transparente en la plataforma. Esta solución permitirá a los usuarios registrados calificar las recetas mediante una escala de 1 a 5 estrellas, redactar reseñas con comentarios constructivos, responder a las opiniones de otros miembros y visualizar estadísticas agregadas (promedios de valoración y número de reseñas) en cada ficha de receta, fomentando un ecosistema culinario participativo.</w:t>
       </w:r>
     </w:p>
     <w:p>
@@ -2865,84 +2777,81 @@
     </w:p>
     <w:p>
       <w:pPr>
-        <w:pStyle w:val="Descripcin"/>
-        <w:keepNext/>
-        <w:rPr>
-          <w:rFonts w:cs="Times New Roman"/>
-          <w:sz w:val="24"/>
-          <w:szCs w:val="24"/>
+        <w:pStyle w:val="Ttulo2"/>
+        <w:rPr>
+          <w:rStyle w:val="Ttulo2Car"/>
+          <w:b/>
         </w:rPr>
       </w:pPr>
       <w:bookmarkStart w:id="11" w:name="_Toc241140091"/>
-      <w:r>
-        <w:rPr>
-          <w:rFonts w:cs="Times New Roman"/>
-          <w:sz w:val="24"/>
-          <w:szCs w:val="24"/>
+      <w:bookmarkStart w:id="12" w:name="_Toc242165048"/>
+      <w:r>
+        <w:rPr>
+          <w:rStyle w:val="Ttulo2Car"/>
+          <w:b/>
         </w:rPr>
         <w:t xml:space="preserve">Tabla </w:t>
       </w:r>
       <w:r>
         <w:rPr>
-          <w:rFonts w:cs="Times New Roman"/>
-          <w:sz w:val="24"/>
-          <w:szCs w:val="24"/>
+          <w:rStyle w:val="Ttulo2Car"/>
+          <w:b/>
         </w:rPr>
         <w:fldChar w:fldCharType="begin"/>
       </w:r>
       <w:r>
         <w:rPr>
-          <w:rFonts w:cs="Times New Roman"/>
-          <w:sz w:val="24"/>
-          <w:szCs w:val="24"/>
+          <w:rStyle w:val="Ttulo2Car"/>
+          <w:b/>
         </w:rPr>
         <w:instrText xml:space="preserve"> SEQ Tabla \* ARABIC </w:instrText>
       </w:r>
       <w:r>
         <w:rPr>
-          <w:rFonts w:cs="Times New Roman"/>
-          <w:sz w:val="24"/>
-          <w:szCs w:val="24"/>
+          <w:rStyle w:val="Ttulo2Car"/>
+          <w:b/>
         </w:rPr>
         <w:fldChar w:fldCharType="separate"/>
       </w:r>
       <w:r>
         <w:rPr>
-          <w:rFonts w:cs="Times New Roman"/>
+          <w:rStyle w:val="Ttulo2Car"/>
+          <w:b/>
           <w:noProof/>
-          <w:sz w:val="24"/>
-          <w:szCs w:val="24"/>
         </w:rPr>
         <w:t>1</w:t>
       </w:r>
-      <w:r>
-        <w:rPr>
-          <w:rFonts w:cs="Times New Roman"/>
-          <w:sz w:val="24"/>
-          <w:szCs w:val="24"/>
+      <w:bookmarkEnd w:id="12"/>
+      <w:r>
+        <w:rPr>
+          <w:rStyle w:val="Ttulo2Car"/>
+          <w:b/>
         </w:rPr>
         <w:fldChar w:fldCharType="end"/>
       </w:r>
-      <w:r>
-        <w:rPr>
-          <w:rFonts w:cs="Times New Roman"/>
-          <w:sz w:val="24"/>
-          <w:szCs w:val="24"/>
-        </w:rPr>
-        <w:t xml:space="preserve"> - Comparativa</w:t>
-      </w:r>
-      <w:bookmarkEnd w:id="11"/>
+    </w:p>
+    <w:bookmarkEnd w:id="11"/>
+    <w:p>
+      <w:pPr>
+        <w:rPr>
+          <w:rFonts w:cs="Times New Roman"/>
+        </w:rPr>
+      </w:pPr>
+      <w:r>
+        <w:t>Matriz Comparativa del Planteamiento del Sistema (Célula 6: Comunidad y Valoraciones)</w:t>
+      </w:r>
     </w:p>
     <w:tbl>
       <w:tblPr>
-        <w:tblStyle w:val="Tablanormal2"/>
+        <w:tblStyle w:val="normasAPA"/>
         <w:tblW w:w="0" w:type="auto"/>
         <w:tblLook w:val="04A0" w:firstRow="1" w:lastRow="0" w:firstColumn="1" w:lastColumn="0" w:noHBand="0" w:noVBand="1"/>
       </w:tblPr>
       <w:tblGrid>
-        <w:gridCol w:w="2942"/>
-        <w:gridCol w:w="2943"/>
-        <w:gridCol w:w="2943"/>
+        <w:gridCol w:w="2344"/>
+        <w:gridCol w:w="2129"/>
+        <w:gridCol w:w="2171"/>
+        <w:gridCol w:w="2194"/>
       </w:tblGrid>
       <w:tr>
         <w:trPr>
@@ -2950,120 +2859,605 @@
         </w:trPr>
         <w:tc>
           <w:tcPr>
-            <w:cnfStyle w:val="001000000000" w:firstRow="0" w:lastRow="0" w:firstColumn="1" w:lastColumn="0" w:oddVBand="0" w:evenVBand="0" w:oddHBand="0" w:evenHBand="0" w:firstRowFirstColumn="0" w:firstRowLastColumn="0" w:lastRowFirstColumn="0" w:lastRowLastColumn="0"/>
-            <w:tcW w:w="2942" w:type="dxa"/>
+            <w:tcW w:w="0" w:type="auto"/>
+            <w:hideMark/>
           </w:tcPr>
           <w:p>
             <w:pPr>
-              <w:rPr>
-                <w:rFonts w:cs="Times New Roman"/>
+              <w:spacing w:line="240" w:lineRule="auto"/>
+              <w:ind w:firstLine="0"/>
+              <w:rPr>
+                <w:rFonts w:ascii="Arial" w:eastAsia="Times New Roman" w:hAnsi="Arial" w:cs="Arial"/>
+                <w:color w:val="auto"/>
+                <w:kern w:val="0"/>
+                <w:lang w:val="es-MX" w:eastAsia="es-MX"/>
+                <w14:ligatures w14:val="none"/>
               </w:rPr>
             </w:pPr>
             <w:r>
               <w:rPr>
-                <w:rFonts w:cs="Times New Roman"/>
-              </w:rPr>
-              <w:t>Problema Actual</w:t>
+                <w:rFonts w:ascii="Arial" w:eastAsia="Times New Roman" w:hAnsi="Arial" w:cs="Arial"/>
+                <w:b/>
+                <w:bCs/>
+                <w:color w:val="auto"/>
+                <w:kern w:val="0"/>
+                <w:lang w:val="es-MX" w:eastAsia="es-MX"/>
+                <w14:ligatures w14:val="none"/>
+              </w:rPr>
+              <w:t>Criterio de Análisis</w:t>
             </w:r>
           </w:p>
         </w:tc>
         <w:tc>
           <w:tcPr>
-            <w:tcW w:w="2943" w:type="dxa"/>
+            <w:tcW w:w="0" w:type="auto"/>
+            <w:hideMark/>
           </w:tcPr>
           <w:p>
             <w:pPr>
-              <w:cnfStyle w:val="100000000000" w:firstRow="1" w:lastRow="0" w:firstColumn="0" w:lastColumn="0" w:oddVBand="0" w:evenVBand="0" w:oddHBand="0" w:evenHBand="0" w:firstRowFirstColumn="0" w:firstRowLastColumn="0" w:lastRowFirstColumn="0" w:lastRowLastColumn="0"/>
-              <w:rPr>
-                <w:rFonts w:cs="Times New Roman"/>
+              <w:spacing w:line="240" w:lineRule="auto"/>
+              <w:ind w:firstLine="0"/>
+              <w:rPr>
+                <w:rFonts w:ascii="Arial" w:eastAsia="Times New Roman" w:hAnsi="Arial" w:cs="Arial"/>
+                <w:color w:val="auto"/>
+                <w:kern w:val="0"/>
+                <w:lang w:val="es-MX" w:eastAsia="es-MX"/>
+                <w14:ligatures w14:val="none"/>
               </w:rPr>
             </w:pPr>
             <w:r>
               <w:rPr>
-                <w:rFonts w:cs="Times New Roman"/>
-              </w:rPr>
-              <w:t>Consecuencia en la Operación</w:t>
+                <w:rFonts w:ascii="Arial" w:eastAsia="Times New Roman" w:hAnsi="Arial" w:cs="Arial"/>
+                <w:b/>
+                <w:bCs/>
+                <w:color w:val="auto"/>
+                <w:kern w:val="0"/>
+                <w:lang w:val="es-MX" w:eastAsia="es-MX"/>
+                <w14:ligatures w14:val="none"/>
+              </w:rPr>
+              <w:t>1. Necesidad Detectada</w:t>
             </w:r>
           </w:p>
         </w:tc>
         <w:tc>
           <w:tcPr>
-            <w:tcW w:w="2943" w:type="dxa"/>
+            <w:tcW w:w="0" w:type="auto"/>
+            <w:hideMark/>
           </w:tcPr>
           <w:p>
             <w:pPr>
-              <w:cnfStyle w:val="100000000000" w:firstRow="1" w:lastRow="0" w:firstColumn="0" w:lastColumn="0" w:oddVBand="0" w:evenVBand="0" w:oddHBand="0" w:evenHBand="0" w:firstRowFirstColumn="0" w:firstRowLastColumn="0" w:lastRowFirstColumn="0" w:lastRowLastColumn="0"/>
-              <w:rPr>
-                <w:rFonts w:cs="Times New Roman"/>
+              <w:spacing w:line="240" w:lineRule="auto"/>
+              <w:ind w:firstLine="0"/>
+              <w:rPr>
+                <w:rFonts w:ascii="Arial" w:eastAsia="Times New Roman" w:hAnsi="Arial" w:cs="Arial"/>
+                <w:color w:val="auto"/>
+                <w:kern w:val="0"/>
+                <w:lang w:val="es-MX" w:eastAsia="es-MX"/>
+                <w14:ligatures w14:val="none"/>
               </w:rPr>
             </w:pPr>
             <w:r>
               <w:rPr>
-                <w:rFonts w:cs="Times New Roman"/>
-              </w:rPr>
-              <w:t>Solución con la Aplicación</w:t>
+                <w:rFonts w:ascii="Arial" w:eastAsia="Times New Roman" w:hAnsi="Arial" w:cs="Arial"/>
+                <w:b/>
+                <w:bCs/>
+                <w:color w:val="auto"/>
+                <w:kern w:val="0"/>
+                <w:lang w:val="es-MX" w:eastAsia="es-MX"/>
+                <w14:ligatures w14:val="none"/>
+              </w:rPr>
+              <w:t>2. Manejo Actual (Sin Célula 6)</w:t>
+            </w:r>
+          </w:p>
+        </w:tc>
+        <w:tc>
+          <w:tcPr>
+            <w:tcW w:w="0" w:type="auto"/>
+            <w:hideMark/>
+          </w:tcPr>
+          <w:p>
+            <w:pPr>
+              <w:spacing w:line="240" w:lineRule="auto"/>
+              <w:ind w:firstLine="0"/>
+              <w:rPr>
+                <w:rFonts w:ascii="Arial" w:eastAsia="Times New Roman" w:hAnsi="Arial" w:cs="Arial"/>
+                <w:color w:val="auto"/>
+                <w:kern w:val="0"/>
+                <w:lang w:val="es-MX" w:eastAsia="es-MX"/>
+                <w14:ligatures w14:val="none"/>
+              </w:rPr>
+            </w:pPr>
+            <w:r>
+              <w:rPr>
+                <w:rFonts w:ascii="Arial" w:eastAsia="Times New Roman" w:hAnsi="Arial" w:cs="Arial"/>
+                <w:b/>
+                <w:bCs/>
+                <w:color w:val="auto"/>
+                <w:kern w:val="0"/>
+                <w:lang w:val="es-MX" w:eastAsia="es-MX"/>
+                <w14:ligatures w14:val="none"/>
+              </w:rPr>
+              <w:t>3. Solución Propuesta (Célula 6)</w:t>
             </w:r>
           </w:p>
         </w:tc>
       </w:tr>
       <w:tr>
-        <w:trPr>
-          <w:cnfStyle w:val="000000100000" w:firstRow="0" w:lastRow="0" w:firstColumn="0" w:lastColumn="0" w:oddVBand="0" w:evenVBand="0" w:oddHBand="1" w:evenHBand="0" w:firstRowFirstColumn="0" w:firstRowLastColumn="0" w:lastRowFirstColumn="0" w:lastRowLastColumn="0"/>
-        </w:trPr>
         <w:tc>
           <w:tcPr>
-            <w:cnfStyle w:val="001000000000" w:firstRow="0" w:lastRow="0" w:firstColumn="1" w:lastColumn="0" w:oddVBand="0" w:evenVBand="0" w:oddHBand="0" w:evenHBand="0" w:firstRowFirstColumn="0" w:firstRowLastColumn="0" w:lastRowFirstColumn="0" w:lastRowLastColumn="0"/>
-            <w:tcW w:w="2942" w:type="dxa"/>
+            <w:tcW w:w="0" w:type="auto"/>
+            <w:hideMark/>
           </w:tcPr>
           <w:p>
             <w:pPr>
-              <w:rPr>
-                <w:rFonts w:cs="Times New Roman"/>
+              <w:spacing w:line="240" w:lineRule="auto"/>
+              <w:ind w:firstLine="0"/>
+              <w:rPr>
+                <w:rFonts w:ascii="Arial" w:eastAsia="Times New Roman" w:hAnsi="Arial" w:cs="Arial"/>
+                <w:color w:val="auto"/>
+                <w:kern w:val="0"/>
+                <w:lang w:val="es-MX" w:eastAsia="es-MX"/>
+                <w14:ligatures w14:val="none"/>
               </w:rPr>
             </w:pPr>
             <w:r>
               <w:rPr>
-                <w:rFonts w:cs="Times New Roman"/>
-              </w:rPr>
-              <w:t>Agendamiento manual por WhatsApp y llamadas</w:t>
+                <w:rFonts w:ascii="Arial" w:eastAsia="Times New Roman" w:hAnsi="Arial" w:cs="Arial"/>
+                <w:b/>
+                <w:bCs/>
+                <w:color w:val="auto"/>
+                <w:kern w:val="0"/>
+                <w:lang w:val="es-MX" w:eastAsia="es-MX"/>
+                <w14:ligatures w14:val="none"/>
+              </w:rPr>
+              <w:t>Enfoque de Interacción</w:t>
             </w:r>
           </w:p>
         </w:tc>
         <w:tc>
           <w:tcPr>
-            <w:tcW w:w="2943" w:type="dxa"/>
+            <w:tcW w:w="0" w:type="auto"/>
+            <w:hideMark/>
           </w:tcPr>
           <w:p>
             <w:pPr>
-              <w:cnfStyle w:val="000000100000" w:firstRow="0" w:lastRow="0" w:firstColumn="0" w:lastColumn="0" w:oddVBand="0" w:evenVBand="0" w:oddHBand="1" w:evenHBand="0" w:firstRowFirstColumn="0" w:firstRowLastColumn="0" w:lastRowFirstColumn="0" w:lastRowLastColumn="0"/>
-              <w:rPr>
-                <w:rFonts w:cs="Times New Roman"/>
+              <w:spacing w:line="240" w:lineRule="auto"/>
+              <w:ind w:firstLine="0"/>
+              <w:rPr>
+                <w:rFonts w:ascii="Arial" w:eastAsia="Times New Roman" w:hAnsi="Arial" w:cs="Arial"/>
+                <w:color w:val="auto"/>
+                <w:kern w:val="0"/>
+                <w:lang w:val="es-MX" w:eastAsia="es-MX"/>
+                <w14:ligatures w14:val="none"/>
               </w:rPr>
             </w:pPr>
             <w:r>
               <w:rPr>
-                <w:rFonts w:cs="Times New Roman"/>
-              </w:rPr>
-              <w:t>Interrupciones constantes durante el servicio al cliente y errores humanos como cruces de horarios.</w:t>
+                <w:rFonts w:ascii="Arial" w:eastAsia="Times New Roman" w:hAnsi="Arial" w:cs="Arial"/>
+                <w:color w:val="auto"/>
+                <w:kern w:val="0"/>
+                <w:lang w:val="es-MX" w:eastAsia="es-MX"/>
+                <w14:ligatures w14:val="none"/>
+              </w:rPr>
+              <w:t>Falta de "prueba social" e intercambio de experiencias reales entre cocineros.</w:t>
             </w:r>
           </w:p>
         </w:tc>
         <w:tc>
           <w:tcPr>
-            <w:tcW w:w="2943" w:type="dxa"/>
+            <w:tcW w:w="0" w:type="auto"/>
+            <w:hideMark/>
           </w:tcPr>
           <w:p>
             <w:pPr>
-              <w:cnfStyle w:val="000000100000" w:firstRow="0" w:lastRow="0" w:firstColumn="0" w:lastColumn="0" w:oddVBand="0" w:evenVBand="0" w:oddHBand="1" w:evenHBand="0" w:firstRowFirstColumn="0" w:firstRowLastColumn="0" w:lastRowFirstColumn="0" w:lastRowLastColumn="0"/>
-              <w:rPr>
-                <w:rFonts w:cs="Times New Roman"/>
+              <w:spacing w:line="240" w:lineRule="auto"/>
+              <w:ind w:firstLine="0"/>
+              <w:rPr>
+                <w:rFonts w:ascii="Arial" w:eastAsia="Times New Roman" w:hAnsi="Arial" w:cs="Arial"/>
+                <w:color w:val="auto"/>
+                <w:kern w:val="0"/>
+                <w:lang w:val="es-MX" w:eastAsia="es-MX"/>
+                <w14:ligatures w14:val="none"/>
               </w:rPr>
             </w:pPr>
             <w:r>
               <w:rPr>
-                <w:rFonts w:cs="Times New Roman"/>
-              </w:rPr>
-              <w:t>Sistema de reservas en línea donde el cliente agenda de forma autónoma viendo la disponibilidad real.</w:t>
+                <w:rFonts w:ascii="Arial" w:eastAsia="Times New Roman" w:hAnsi="Arial" w:cs="Arial"/>
+                <w:color w:val="auto"/>
+                <w:kern w:val="0"/>
+                <w:lang w:val="es-MX" w:eastAsia="es-MX"/>
+                <w14:ligatures w14:val="none"/>
+              </w:rPr>
+              <w:t>Comunicación unidireccional (la plataforma publica, el usuario solo lee).</w:t>
+            </w:r>
+          </w:p>
+        </w:tc>
+        <w:tc>
+          <w:tcPr>
+            <w:tcW w:w="0" w:type="auto"/>
+            <w:hideMark/>
+          </w:tcPr>
+          <w:p>
+            <w:pPr>
+              <w:spacing w:line="240" w:lineRule="auto"/>
+              <w:ind w:firstLine="0"/>
+              <w:rPr>
+                <w:rFonts w:ascii="Arial" w:eastAsia="Times New Roman" w:hAnsi="Arial" w:cs="Arial"/>
+                <w:color w:val="auto"/>
+                <w:kern w:val="0"/>
+                <w:lang w:val="es-MX" w:eastAsia="es-MX"/>
+                <w14:ligatures w14:val="none"/>
+              </w:rPr>
+            </w:pPr>
+            <w:r>
+              <w:rPr>
+                <w:rFonts w:ascii="Arial" w:eastAsia="Times New Roman" w:hAnsi="Arial" w:cs="Arial"/>
+                <w:color w:val="auto"/>
+                <w:kern w:val="0"/>
+                <w:lang w:val="es-MX" w:eastAsia="es-MX"/>
+                <w14:ligatures w14:val="none"/>
+              </w:rPr>
+              <w:t>Ecosistema bidireccional y participativo basado en la comunidad.</w:t>
+            </w:r>
+          </w:p>
+        </w:tc>
+      </w:tr>
+      <w:tr>
+        <w:tc>
+          <w:tcPr>
+            <w:tcW w:w="0" w:type="auto"/>
+            <w:hideMark/>
+          </w:tcPr>
+          <w:p>
+            <w:pPr>
+              <w:spacing w:line="240" w:lineRule="auto"/>
+              <w:ind w:firstLine="0"/>
+              <w:rPr>
+                <w:rFonts w:ascii="Arial" w:eastAsia="Times New Roman" w:hAnsi="Arial" w:cs="Arial"/>
+                <w:color w:val="auto"/>
+                <w:kern w:val="0"/>
+                <w:lang w:val="es-MX" w:eastAsia="es-MX"/>
+                <w14:ligatures w14:val="none"/>
+              </w:rPr>
+            </w:pPr>
+            <w:r>
+              <w:rPr>
+                <w:rFonts w:ascii="Arial" w:eastAsia="Times New Roman" w:hAnsi="Arial" w:cs="Arial"/>
+                <w:b/>
+                <w:bCs/>
+                <w:color w:val="auto"/>
+                <w:kern w:val="0"/>
+                <w:lang w:val="es-MX" w:eastAsia="es-MX"/>
+                <w14:ligatures w14:val="none"/>
+              </w:rPr>
+              <w:t>Evaluación de Recetas</w:t>
+            </w:r>
+          </w:p>
+        </w:tc>
+        <w:tc>
+          <w:tcPr>
+            <w:tcW w:w="0" w:type="auto"/>
+            <w:hideMark/>
+          </w:tcPr>
+          <w:p>
+            <w:pPr>
+              <w:spacing w:line="240" w:lineRule="auto"/>
+              <w:ind w:firstLine="0"/>
+              <w:rPr>
+                <w:rFonts w:ascii="Arial" w:eastAsia="Times New Roman" w:hAnsi="Arial" w:cs="Arial"/>
+                <w:color w:val="auto"/>
+                <w:kern w:val="0"/>
+                <w:lang w:val="es-MX" w:eastAsia="es-MX"/>
+                <w14:ligatures w14:val="none"/>
+              </w:rPr>
+            </w:pPr>
+            <w:r>
+              <w:rPr>
+                <w:rFonts w:ascii="Arial" w:eastAsia="Times New Roman" w:hAnsi="Arial" w:cs="Arial"/>
+                <w:color w:val="auto"/>
+                <w:kern w:val="0"/>
+                <w:lang w:val="es-MX" w:eastAsia="es-MX"/>
+                <w14:ligatures w14:val="none"/>
+              </w:rPr>
+              <w:t>Incertidumbre sobre la precisión, tiempo real y dificultad de una receta.</w:t>
+            </w:r>
+          </w:p>
+        </w:tc>
+        <w:tc>
+          <w:tcPr>
+            <w:tcW w:w="0" w:type="auto"/>
+            <w:hideMark/>
+          </w:tcPr>
+          <w:p>
+            <w:pPr>
+              <w:spacing w:line="240" w:lineRule="auto"/>
+              <w:ind w:firstLine="0"/>
+              <w:rPr>
+                <w:rFonts w:ascii="Arial" w:eastAsia="Times New Roman" w:hAnsi="Arial" w:cs="Arial"/>
+                <w:color w:val="auto"/>
+                <w:kern w:val="0"/>
+                <w:lang w:val="es-MX" w:eastAsia="es-MX"/>
+                <w14:ligatures w14:val="none"/>
+              </w:rPr>
+            </w:pPr>
+            <w:r>
+              <w:rPr>
+                <w:rFonts w:ascii="Arial" w:eastAsia="Times New Roman" w:hAnsi="Arial" w:cs="Arial"/>
+                <w:color w:val="auto"/>
+                <w:kern w:val="0"/>
+                <w:lang w:val="es-MX" w:eastAsia="es-MX"/>
+                <w14:ligatures w14:val="none"/>
+              </w:rPr>
+              <w:t>Imposibilidad de calificar o cuantificar el éxito de una receta.</w:t>
+            </w:r>
+          </w:p>
+        </w:tc>
+        <w:tc>
+          <w:tcPr>
+            <w:tcW w:w="0" w:type="auto"/>
+            <w:hideMark/>
+          </w:tcPr>
+          <w:p>
+            <w:pPr>
+              <w:spacing w:line="240" w:lineRule="auto"/>
+              <w:ind w:firstLine="0"/>
+              <w:rPr>
+                <w:rFonts w:ascii="Arial" w:eastAsia="Times New Roman" w:hAnsi="Arial" w:cs="Arial"/>
+                <w:color w:val="auto"/>
+                <w:kern w:val="0"/>
+                <w:lang w:val="es-MX" w:eastAsia="es-MX"/>
+                <w14:ligatures w14:val="none"/>
+              </w:rPr>
+            </w:pPr>
+            <w:r>
+              <w:rPr>
+                <w:rFonts w:ascii="Arial" w:eastAsia="Times New Roman" w:hAnsi="Arial" w:cs="Arial"/>
+                <w:color w:val="auto"/>
+                <w:kern w:val="0"/>
+                <w:lang w:val="es-MX" w:eastAsia="es-MX"/>
+                <w14:ligatures w14:val="none"/>
+              </w:rPr>
+              <w:t>Sistema de valoración numérica e intuitiva mediante escala de 1 a 5 estrellas.</w:t>
+            </w:r>
+          </w:p>
+        </w:tc>
+      </w:tr>
+      <w:tr>
+        <w:tc>
+          <w:tcPr>
+            <w:tcW w:w="0" w:type="auto"/>
+            <w:hideMark/>
+          </w:tcPr>
+          <w:p>
+            <w:pPr>
+              <w:spacing w:line="240" w:lineRule="auto"/>
+              <w:ind w:firstLine="0"/>
+              <w:rPr>
+                <w:rFonts w:ascii="Arial" w:eastAsia="Times New Roman" w:hAnsi="Arial" w:cs="Arial"/>
+                <w:color w:val="auto"/>
+                <w:kern w:val="0"/>
+                <w:lang w:val="es-MX" w:eastAsia="es-MX"/>
+                <w14:ligatures w14:val="none"/>
+              </w:rPr>
+            </w:pPr>
+            <w:r>
+              <w:rPr>
+                <w:rFonts w:ascii="Arial" w:eastAsia="Times New Roman" w:hAnsi="Arial" w:cs="Arial"/>
+                <w:b/>
+                <w:bCs/>
+                <w:color w:val="auto"/>
+                <w:kern w:val="0"/>
+                <w:lang w:val="es-MX" w:eastAsia="es-MX"/>
+                <w14:ligatures w14:val="none"/>
+              </w:rPr>
+              <w:t>Retroalimentación</w:t>
+            </w:r>
+          </w:p>
+        </w:tc>
+        <w:tc>
+          <w:tcPr>
+            <w:tcW w:w="0" w:type="auto"/>
+            <w:hideMark/>
+          </w:tcPr>
+          <w:p>
+            <w:pPr>
+              <w:spacing w:line="240" w:lineRule="auto"/>
+              <w:ind w:firstLine="0"/>
+              <w:rPr>
+                <w:rFonts w:ascii="Arial" w:eastAsia="Times New Roman" w:hAnsi="Arial" w:cs="Arial"/>
+                <w:color w:val="auto"/>
+                <w:kern w:val="0"/>
+                <w:lang w:val="es-MX" w:eastAsia="es-MX"/>
+                <w14:ligatures w14:val="none"/>
+              </w:rPr>
+            </w:pPr>
+            <w:r>
+              <w:rPr>
+                <w:rFonts w:ascii="Arial" w:eastAsia="Times New Roman" w:hAnsi="Arial" w:cs="Arial"/>
+                <w:color w:val="auto"/>
+                <w:kern w:val="0"/>
+                <w:lang w:val="es-MX" w:eastAsia="es-MX"/>
+                <w14:ligatures w14:val="none"/>
+              </w:rPr>
+              <w:t>Ausencia de canal para compartir variaciones, trucos o sustitutos de ingredientes.</w:t>
+            </w:r>
+          </w:p>
+        </w:tc>
+        <w:tc>
+          <w:tcPr>
+            <w:tcW w:w="0" w:type="auto"/>
+            <w:hideMark/>
+          </w:tcPr>
+          <w:p>
+            <w:pPr>
+              <w:spacing w:line="240" w:lineRule="auto"/>
+              <w:ind w:firstLine="0"/>
+              <w:rPr>
+                <w:rFonts w:ascii="Arial" w:eastAsia="Times New Roman" w:hAnsi="Arial" w:cs="Arial"/>
+                <w:color w:val="auto"/>
+                <w:kern w:val="0"/>
+                <w:lang w:val="es-MX" w:eastAsia="es-MX"/>
+                <w14:ligatures w14:val="none"/>
+              </w:rPr>
+            </w:pPr>
+            <w:r>
+              <w:rPr>
+                <w:rFonts w:ascii="Arial" w:eastAsia="Times New Roman" w:hAnsi="Arial" w:cs="Arial"/>
+                <w:color w:val="auto"/>
+                <w:kern w:val="0"/>
+                <w:lang w:val="es-MX" w:eastAsia="es-MX"/>
+                <w14:ligatures w14:val="none"/>
+              </w:rPr>
+              <w:t>Sin mecanismos para publicar comentarios, opiniones o sugerencias.</w:t>
+            </w:r>
+          </w:p>
+        </w:tc>
+        <w:tc>
+          <w:tcPr>
+            <w:tcW w:w="0" w:type="auto"/>
+            <w:hideMark/>
+          </w:tcPr>
+          <w:p>
+            <w:pPr>
+              <w:spacing w:line="240" w:lineRule="auto"/>
+              <w:ind w:firstLine="0"/>
+              <w:rPr>
+                <w:rFonts w:ascii="Arial" w:eastAsia="Times New Roman" w:hAnsi="Arial" w:cs="Arial"/>
+                <w:color w:val="auto"/>
+                <w:kern w:val="0"/>
+                <w:lang w:val="es-MX" w:eastAsia="es-MX"/>
+                <w14:ligatures w14:val="none"/>
+              </w:rPr>
+            </w:pPr>
+            <w:r>
+              <w:rPr>
+                <w:rFonts w:ascii="Arial" w:eastAsia="Times New Roman" w:hAnsi="Arial" w:cs="Arial"/>
+                <w:color w:val="auto"/>
+                <w:kern w:val="0"/>
+                <w:lang w:val="es-MX" w:eastAsia="es-MX"/>
+                <w14:ligatures w14:val="none"/>
+              </w:rPr>
+              <w:t>Módulo de reseñas con comentarios redactados e hilos de respuesta entre usuarios.</w:t>
+            </w:r>
+          </w:p>
+        </w:tc>
+      </w:tr>
+      <w:tr>
+        <w:tc>
+          <w:tcPr>
+            <w:tcW w:w="0" w:type="auto"/>
+            <w:hideMark/>
+          </w:tcPr>
+          <w:p>
+            <w:pPr>
+              <w:spacing w:line="240" w:lineRule="auto"/>
+              <w:ind w:firstLine="0"/>
+              <w:rPr>
+                <w:rFonts w:ascii="Arial" w:eastAsia="Times New Roman" w:hAnsi="Arial" w:cs="Arial"/>
+                <w:color w:val="auto"/>
+                <w:kern w:val="0"/>
+                <w:lang w:val="es-MX" w:eastAsia="es-MX"/>
+                <w14:ligatures w14:val="none"/>
+              </w:rPr>
+            </w:pPr>
+            <w:r>
+              <w:rPr>
+                <w:rFonts w:ascii="Arial" w:eastAsia="Times New Roman" w:hAnsi="Arial" w:cs="Arial"/>
+                <w:b/>
+                <w:bCs/>
+                <w:color w:val="auto"/>
+                <w:kern w:val="0"/>
+                <w:lang w:val="es-MX" w:eastAsia="es-MX"/>
+                <w14:ligatures w14:val="none"/>
+              </w:rPr>
+              <w:t>Confianza del Usuario</w:t>
+            </w:r>
+          </w:p>
+        </w:tc>
+        <w:tc>
+          <w:tcPr>
+            <w:tcW w:w="0" w:type="auto"/>
+            <w:hideMark/>
+          </w:tcPr>
+          <w:p>
+            <w:pPr>
+              <w:spacing w:line="240" w:lineRule="auto"/>
+              <w:ind w:firstLine="0"/>
+              <w:rPr>
+                <w:rFonts w:ascii="Arial" w:eastAsia="Times New Roman" w:hAnsi="Arial" w:cs="Arial"/>
+                <w:color w:val="auto"/>
+                <w:kern w:val="0"/>
+                <w:lang w:val="es-MX" w:eastAsia="es-MX"/>
+                <w14:ligatures w14:val="none"/>
+              </w:rPr>
+            </w:pPr>
+            <w:r>
+              <w:rPr>
+                <w:rFonts w:ascii="Arial" w:eastAsia="Times New Roman" w:hAnsi="Arial" w:cs="Arial"/>
+                <w:color w:val="auto"/>
+                <w:kern w:val="0"/>
+                <w:lang w:val="es-MX" w:eastAsia="es-MX"/>
+                <w14:ligatures w14:val="none"/>
+              </w:rPr>
+              <w:t>Baja tasa de fidelización y vacilación al seleccionar un platillo para cocinar.</w:t>
+            </w:r>
+          </w:p>
+        </w:tc>
+        <w:tc>
+          <w:tcPr>
+            <w:tcW w:w="0" w:type="auto"/>
+            <w:hideMark/>
+          </w:tcPr>
+          <w:p>
+            <w:pPr>
+              <w:spacing w:line="240" w:lineRule="auto"/>
+              <w:ind w:firstLine="0"/>
+              <w:rPr>
+                <w:rFonts w:ascii="Arial" w:eastAsia="Times New Roman" w:hAnsi="Arial" w:cs="Arial"/>
+                <w:color w:val="auto"/>
+                <w:kern w:val="0"/>
+                <w:lang w:val="es-MX" w:eastAsia="es-MX"/>
+                <w14:ligatures w14:val="none"/>
+              </w:rPr>
+            </w:pPr>
+            <w:r>
+              <w:rPr>
+                <w:rFonts w:ascii="Arial" w:eastAsia="Times New Roman" w:hAnsi="Arial" w:cs="Arial"/>
+                <w:color w:val="auto"/>
+                <w:kern w:val="0"/>
+                <w:lang w:val="es-MX" w:eastAsia="es-MX"/>
+                <w14:ligatures w14:val="none"/>
+              </w:rPr>
+              <w:t>Dependencia exclusiva de la descripción estática proporcionada por la página.</w:t>
+            </w:r>
+          </w:p>
+        </w:tc>
+        <w:tc>
+          <w:tcPr>
+            <w:tcW w:w="0" w:type="auto"/>
+            <w:hideMark/>
+          </w:tcPr>
+          <w:p>
+            <w:pPr>
+              <w:spacing w:line="240" w:lineRule="auto"/>
+              <w:ind w:firstLine="0"/>
+              <w:rPr>
+                <w:rFonts w:ascii="Arial" w:eastAsia="Times New Roman" w:hAnsi="Arial" w:cs="Arial"/>
+                <w:color w:val="auto"/>
+                <w:kern w:val="0"/>
+                <w:lang w:val="es-MX" w:eastAsia="es-MX"/>
+                <w14:ligatures w14:val="none"/>
+              </w:rPr>
+            </w:pPr>
+            <w:r>
+              <w:rPr>
+                <w:rFonts w:ascii="Arial" w:eastAsia="Times New Roman" w:hAnsi="Arial" w:cs="Arial"/>
+                <w:color w:val="auto"/>
+                <w:kern w:val="0"/>
+                <w:lang w:val="es-MX" w:eastAsia="es-MX"/>
+                <w14:ligatures w14:val="none"/>
+              </w:rPr>
+              <w:t>Visualización en tiempo real de estadísticas agregadas (promedio de estrellas y número de reseñas).</w:t>
             </w:r>
           </w:p>
         </w:tc>
@@ -3073,6 +3467,7 @@
       <w:pPr>
         <w:rPr>
           <w:rFonts w:cs="Times New Roman"/>
+          <w:lang w:val="es-MX"/>
         </w:rPr>
       </w:pPr>
     </w:p>
@@ -3097,21 +3492,750 @@
           <w:szCs w:val="24"/>
         </w:rPr>
       </w:pPr>
-      <w:bookmarkStart w:id="12" w:name="_Toc242137968"/>
+      <w:bookmarkStart w:id="13" w:name="_Toc242165049"/>
+      <w:proofErr w:type="spellStart"/>
       <w:r>
         <w:rPr>
           <w:rFonts w:cs="Times New Roman"/>
           <w:szCs w:val="24"/>
         </w:rPr>
         <w:lastRenderedPageBreak/>
-        <w:t>Stack tecnológico</w:t>
-      </w:r>
-      <w:bookmarkEnd w:id="12"/>
-    </w:p>
-    <w:p>
-      <w:pPr>
-        <w:rPr>
-          <w:rFonts w:cs="Times New Roman"/>
+        <w:t>Stack</w:t>
+      </w:r>
+      <w:proofErr w:type="spellEnd"/>
+      <w:r>
+        <w:rPr>
+          <w:rFonts w:cs="Times New Roman"/>
+          <w:szCs w:val="24"/>
+        </w:rPr>
+        <w:t xml:space="preserve"> tecnológico</w:t>
+      </w:r>
+      <w:bookmarkEnd w:id="13"/>
+    </w:p>
+    <w:p>
+      <w:pPr>
+        <w:pStyle w:val="Ttulo2"/>
+      </w:pPr>
+      <w:bookmarkStart w:id="14" w:name="_Toc242165050"/>
+      <w:r>
+        <w:t xml:space="preserve">Tabla </w:t>
+      </w:r>
+      <w:fldSimple w:instr=" SEQ Tabla \* ARABIC ">
+        <w:r>
+          <w:rPr>
+            <w:noProof/>
+          </w:rPr>
+          <w:t>2</w:t>
+        </w:r>
+        <w:bookmarkEnd w:id="14"/>
+      </w:fldSimple>
+    </w:p>
+    <w:p>
+      <w:r>
+        <w:t xml:space="preserve">El desarrollo de la Célula 6 mantendrá compatibilidad directa con el </w:t>
+      </w:r>
+      <w:proofErr w:type="spellStart"/>
+      <w:r>
+        <w:t>stack</w:t>
+      </w:r>
+      <w:proofErr w:type="spellEnd"/>
+      <w:r>
+        <w:t xml:space="preserve"> central del proyecto Sazón</w:t>
+      </w:r>
+      <w:r>
+        <w:t>:</w:t>
+      </w:r>
+    </w:p>
+    <w:tbl>
+      <w:tblPr>
+        <w:tblStyle w:val="normasAPA"/>
+        <w:tblW w:w="0" w:type="auto"/>
+        <w:tblLook w:val="04A0" w:firstRow="1" w:lastRow="0" w:firstColumn="1" w:lastColumn="0" w:noHBand="0" w:noVBand="1"/>
+      </w:tblPr>
+      <w:tblGrid>
+        <w:gridCol w:w="2480"/>
+        <w:gridCol w:w="2335"/>
+        <w:gridCol w:w="4023"/>
+      </w:tblGrid>
+      <w:tr>
+        <w:trPr>
+          <w:cnfStyle w:val="100000000000" w:firstRow="1" w:lastRow="0" w:firstColumn="0" w:lastColumn="0" w:oddVBand="0" w:evenVBand="0" w:oddHBand="0" w:evenHBand="0" w:firstRowFirstColumn="0" w:firstRowLastColumn="0" w:lastRowFirstColumn="0" w:lastRowLastColumn="0"/>
+        </w:trPr>
+        <w:tc>
+          <w:tcPr>
+            <w:tcW w:w="0" w:type="auto"/>
+            <w:hideMark/>
+          </w:tcPr>
+          <w:p>
+            <w:pPr>
+              <w:spacing w:line="240" w:lineRule="auto"/>
+              <w:ind w:firstLine="0"/>
+              <w:rPr>
+                <w:rFonts w:ascii="Arial" w:eastAsia="Times New Roman" w:hAnsi="Arial" w:cs="Arial"/>
+                <w:color w:val="auto"/>
+                <w:kern w:val="0"/>
+                <w:lang w:val="es-MX" w:eastAsia="es-MX"/>
+                <w14:ligatures w14:val="none"/>
+              </w:rPr>
+            </w:pPr>
+            <w:r>
+              <w:rPr>
+                <w:rFonts w:ascii="Arial" w:eastAsia="Times New Roman" w:hAnsi="Arial" w:cs="Arial"/>
+                <w:b/>
+                <w:bCs/>
+                <w:color w:val="auto"/>
+                <w:kern w:val="0"/>
+                <w:lang w:val="es-MX" w:eastAsia="es-MX"/>
+                <w14:ligatures w14:val="none"/>
+              </w:rPr>
+              <w:t>Capa / Área</w:t>
+            </w:r>
+          </w:p>
+        </w:tc>
+        <w:tc>
+          <w:tcPr>
+            <w:tcW w:w="0" w:type="auto"/>
+            <w:hideMark/>
+          </w:tcPr>
+          <w:p>
+            <w:pPr>
+              <w:spacing w:line="240" w:lineRule="auto"/>
+              <w:ind w:firstLine="0"/>
+              <w:rPr>
+                <w:rFonts w:ascii="Arial" w:eastAsia="Times New Roman" w:hAnsi="Arial" w:cs="Arial"/>
+                <w:color w:val="auto"/>
+                <w:kern w:val="0"/>
+                <w:lang w:val="es-MX" w:eastAsia="es-MX"/>
+                <w14:ligatures w14:val="none"/>
+              </w:rPr>
+            </w:pPr>
+            <w:r>
+              <w:rPr>
+                <w:rFonts w:ascii="Arial" w:eastAsia="Times New Roman" w:hAnsi="Arial" w:cs="Arial"/>
+                <w:b/>
+                <w:bCs/>
+                <w:color w:val="auto"/>
+                <w:kern w:val="0"/>
+                <w:lang w:val="es-MX" w:eastAsia="es-MX"/>
+                <w14:ligatures w14:val="none"/>
+              </w:rPr>
+              <w:t>Tecnología / Herramienta</w:t>
+            </w:r>
+          </w:p>
+        </w:tc>
+        <w:tc>
+          <w:tcPr>
+            <w:tcW w:w="0" w:type="auto"/>
+            <w:hideMark/>
+          </w:tcPr>
+          <w:p>
+            <w:pPr>
+              <w:spacing w:line="240" w:lineRule="auto"/>
+              <w:ind w:firstLine="0"/>
+              <w:rPr>
+                <w:rFonts w:ascii="Arial" w:eastAsia="Times New Roman" w:hAnsi="Arial" w:cs="Arial"/>
+                <w:color w:val="auto"/>
+                <w:kern w:val="0"/>
+                <w:lang w:val="es-MX" w:eastAsia="es-MX"/>
+                <w14:ligatures w14:val="none"/>
+              </w:rPr>
+            </w:pPr>
+            <w:r>
+              <w:rPr>
+                <w:rFonts w:ascii="Arial" w:eastAsia="Times New Roman" w:hAnsi="Arial" w:cs="Arial"/>
+                <w:b/>
+                <w:bCs/>
+                <w:color w:val="auto"/>
+                <w:kern w:val="0"/>
+                <w:lang w:val="es-MX" w:eastAsia="es-MX"/>
+                <w14:ligatures w14:val="none"/>
+              </w:rPr>
+              <w:t>Justificación Técnica en la Célula 6</w:t>
+            </w:r>
+          </w:p>
+        </w:tc>
+      </w:tr>
+      <w:tr>
+        <w:tc>
+          <w:tcPr>
+            <w:tcW w:w="0" w:type="auto"/>
+            <w:hideMark/>
+          </w:tcPr>
+          <w:p>
+            <w:pPr>
+              <w:spacing w:line="240" w:lineRule="auto"/>
+              <w:ind w:firstLine="0"/>
+              <w:rPr>
+                <w:rFonts w:ascii="Arial" w:eastAsia="Times New Roman" w:hAnsi="Arial" w:cs="Arial"/>
+                <w:color w:val="auto"/>
+                <w:kern w:val="0"/>
+                <w:lang w:val="es-MX" w:eastAsia="es-MX"/>
+                <w14:ligatures w14:val="none"/>
+              </w:rPr>
+            </w:pPr>
+            <w:proofErr w:type="spellStart"/>
+            <w:r>
+              <w:rPr>
+                <w:rFonts w:ascii="Arial" w:eastAsia="Times New Roman" w:hAnsi="Arial" w:cs="Arial"/>
+                <w:b/>
+                <w:bCs/>
+                <w:color w:val="auto"/>
+                <w:kern w:val="0"/>
+                <w:lang w:val="es-MX" w:eastAsia="es-MX"/>
+                <w14:ligatures w14:val="none"/>
+              </w:rPr>
+              <w:t>Frontend</w:t>
+            </w:r>
+            <w:proofErr w:type="spellEnd"/>
+            <w:r>
+              <w:rPr>
+                <w:rFonts w:ascii="Arial" w:eastAsia="Times New Roman" w:hAnsi="Arial" w:cs="Arial"/>
+                <w:b/>
+                <w:bCs/>
+                <w:color w:val="auto"/>
+                <w:kern w:val="0"/>
+                <w:lang w:val="es-MX" w:eastAsia="es-MX"/>
+                <w14:ligatures w14:val="none"/>
+              </w:rPr>
+              <w:t xml:space="preserve"> Componentes</w:t>
+            </w:r>
+          </w:p>
+        </w:tc>
+        <w:tc>
+          <w:tcPr>
+            <w:tcW w:w="0" w:type="auto"/>
+            <w:hideMark/>
+          </w:tcPr>
+          <w:p>
+            <w:pPr>
+              <w:spacing w:line="240" w:lineRule="auto"/>
+              <w:ind w:firstLine="0"/>
+              <w:rPr>
+                <w:rFonts w:ascii="Arial" w:eastAsia="Times New Roman" w:hAnsi="Arial" w:cs="Arial"/>
+                <w:color w:val="auto"/>
+                <w:kern w:val="0"/>
+                <w:lang w:val="es-MX" w:eastAsia="es-MX"/>
+                <w14:ligatures w14:val="none"/>
+              </w:rPr>
+            </w:pPr>
+            <w:r>
+              <w:rPr>
+                <w:rFonts w:ascii="Arial" w:eastAsia="Times New Roman" w:hAnsi="Arial" w:cs="Arial"/>
+                <w:color w:val="auto"/>
+                <w:kern w:val="0"/>
+                <w:lang w:val="es-MX" w:eastAsia="es-MX"/>
+                <w14:ligatures w14:val="none"/>
+              </w:rPr>
+              <w:t>HTML5, JavaScript (ES6+), CSS</w:t>
+            </w:r>
+          </w:p>
+        </w:tc>
+        <w:tc>
+          <w:tcPr>
+            <w:tcW w:w="0" w:type="auto"/>
+            <w:hideMark/>
+          </w:tcPr>
+          <w:p>
+            <w:pPr>
+              <w:spacing w:line="240" w:lineRule="auto"/>
+              <w:ind w:firstLine="0"/>
+              <w:rPr>
+                <w:rFonts w:ascii="Arial" w:eastAsia="Times New Roman" w:hAnsi="Arial" w:cs="Arial"/>
+                <w:color w:val="auto"/>
+                <w:kern w:val="0"/>
+                <w:lang w:val="es-MX" w:eastAsia="es-MX"/>
+                <w14:ligatures w14:val="none"/>
+              </w:rPr>
+            </w:pPr>
+            <w:r>
+              <w:rPr>
+                <w:rFonts w:ascii="Arial" w:eastAsia="Times New Roman" w:hAnsi="Arial" w:cs="Arial"/>
+                <w:color w:val="auto"/>
+                <w:kern w:val="0"/>
+                <w:lang w:val="es-MX" w:eastAsia="es-MX"/>
+                <w14:ligatures w14:val="none"/>
+              </w:rPr>
+              <w:t>Creación de componentes dinámicos para la renderización de estrellas, formularios de comentarios e hilos de respuesta.</w:t>
+            </w:r>
+          </w:p>
+        </w:tc>
+      </w:tr>
+      <w:tr>
+        <w:tc>
+          <w:tcPr>
+            <w:tcW w:w="0" w:type="auto"/>
+            <w:hideMark/>
+          </w:tcPr>
+          <w:p>
+            <w:pPr>
+              <w:spacing w:line="240" w:lineRule="auto"/>
+              <w:ind w:firstLine="0"/>
+              <w:rPr>
+                <w:rFonts w:ascii="Arial" w:eastAsia="Times New Roman" w:hAnsi="Arial" w:cs="Arial"/>
+                <w:color w:val="auto"/>
+                <w:kern w:val="0"/>
+                <w:lang w:val="es-MX" w:eastAsia="es-MX"/>
+                <w14:ligatures w14:val="none"/>
+              </w:rPr>
+            </w:pPr>
+            <w:r>
+              <w:rPr>
+                <w:rFonts w:ascii="Arial" w:eastAsia="Times New Roman" w:hAnsi="Arial" w:cs="Arial"/>
+                <w:b/>
+                <w:bCs/>
+                <w:color w:val="auto"/>
+                <w:kern w:val="0"/>
+                <w:lang w:val="es-MX" w:eastAsia="es-MX"/>
+                <w14:ligatures w14:val="none"/>
+              </w:rPr>
+              <w:t>Almacenamiento Local / Estado</w:t>
+            </w:r>
+          </w:p>
+        </w:tc>
+        <w:tc>
+          <w:tcPr>
+            <w:tcW w:w="0" w:type="auto"/>
+            <w:hideMark/>
+          </w:tcPr>
+          <w:p>
+            <w:pPr>
+              <w:spacing w:line="240" w:lineRule="auto"/>
+              <w:ind w:firstLine="0"/>
+              <w:rPr>
+                <w:rFonts w:ascii="Arial" w:eastAsia="Times New Roman" w:hAnsi="Arial" w:cs="Arial"/>
+                <w:color w:val="auto"/>
+                <w:kern w:val="0"/>
+                <w:lang w:val="es-MX" w:eastAsia="es-MX"/>
+                <w14:ligatures w14:val="none"/>
+              </w:rPr>
+            </w:pPr>
+            <w:proofErr w:type="spellStart"/>
+            <w:r>
+              <w:rPr>
+                <w:rFonts w:ascii="Arial" w:eastAsia="Times New Roman" w:hAnsi="Arial" w:cs="Arial"/>
+                <w:color w:val="auto"/>
+                <w:kern w:val="0"/>
+                <w:lang w:val="es-MX" w:eastAsia="es-MX"/>
+                <w14:ligatures w14:val="none"/>
+              </w:rPr>
+              <w:t>LocalStorage</w:t>
+            </w:r>
+            <w:proofErr w:type="spellEnd"/>
+            <w:r>
+              <w:rPr>
+                <w:rFonts w:ascii="Arial" w:eastAsia="Times New Roman" w:hAnsi="Arial" w:cs="Arial"/>
+                <w:color w:val="auto"/>
+                <w:kern w:val="0"/>
+                <w:lang w:val="es-MX" w:eastAsia="es-MX"/>
+                <w14:ligatures w14:val="none"/>
+              </w:rPr>
+              <w:t xml:space="preserve"> / </w:t>
+            </w:r>
+            <w:proofErr w:type="spellStart"/>
+            <w:r>
+              <w:rPr>
+                <w:rFonts w:ascii="Arial" w:eastAsia="Times New Roman" w:hAnsi="Arial" w:cs="Arial"/>
+                <w:color w:val="auto"/>
+                <w:kern w:val="0"/>
+                <w:lang w:val="es-MX" w:eastAsia="es-MX"/>
+                <w14:ligatures w14:val="none"/>
+              </w:rPr>
+              <w:t>Fetch</w:t>
+            </w:r>
+            <w:proofErr w:type="spellEnd"/>
+            <w:r>
+              <w:rPr>
+                <w:rFonts w:ascii="Arial" w:eastAsia="Times New Roman" w:hAnsi="Arial" w:cs="Arial"/>
+                <w:color w:val="auto"/>
+                <w:kern w:val="0"/>
+                <w:lang w:val="es-MX" w:eastAsia="es-MX"/>
+                <w14:ligatures w14:val="none"/>
+              </w:rPr>
+              <w:t xml:space="preserve"> API</w:t>
+            </w:r>
+          </w:p>
+        </w:tc>
+        <w:tc>
+          <w:tcPr>
+            <w:tcW w:w="0" w:type="auto"/>
+            <w:hideMark/>
+          </w:tcPr>
+          <w:p>
+            <w:pPr>
+              <w:spacing w:line="240" w:lineRule="auto"/>
+              <w:ind w:firstLine="0"/>
+              <w:rPr>
+                <w:rFonts w:ascii="Arial" w:eastAsia="Times New Roman" w:hAnsi="Arial" w:cs="Arial"/>
+                <w:color w:val="auto"/>
+                <w:kern w:val="0"/>
+                <w:lang w:val="es-MX" w:eastAsia="es-MX"/>
+                <w14:ligatures w14:val="none"/>
+              </w:rPr>
+            </w:pPr>
+            <w:r>
+              <w:rPr>
+                <w:rFonts w:ascii="Arial" w:eastAsia="Times New Roman" w:hAnsi="Arial" w:cs="Arial"/>
+                <w:color w:val="auto"/>
+                <w:kern w:val="0"/>
+                <w:lang w:val="es-MX" w:eastAsia="es-MX"/>
+                <w14:ligatures w14:val="none"/>
+              </w:rPr>
+              <w:t>Manejo de persistencia temporal e integración con las fuentes de datos compartidas del proyecto.</w:t>
+            </w:r>
+          </w:p>
+        </w:tc>
+      </w:tr>
+      <w:tr>
+        <w:tc>
+          <w:tcPr>
+            <w:tcW w:w="0" w:type="auto"/>
+            <w:hideMark/>
+          </w:tcPr>
+          <w:p>
+            <w:pPr>
+              <w:spacing w:line="240" w:lineRule="auto"/>
+              <w:ind w:firstLine="0"/>
+              <w:rPr>
+                <w:rFonts w:ascii="Arial" w:eastAsia="Times New Roman" w:hAnsi="Arial" w:cs="Arial"/>
+                <w:color w:val="auto"/>
+                <w:kern w:val="0"/>
+                <w:lang w:val="es-MX" w:eastAsia="es-MX"/>
+                <w14:ligatures w14:val="none"/>
+              </w:rPr>
+            </w:pPr>
+            <w:r>
+              <w:rPr>
+                <w:rFonts w:ascii="Arial" w:eastAsia="Times New Roman" w:hAnsi="Arial" w:cs="Arial"/>
+                <w:b/>
+                <w:bCs/>
+                <w:color w:val="auto"/>
+                <w:kern w:val="0"/>
+                <w:lang w:val="es-MX" w:eastAsia="es-MX"/>
+                <w14:ligatures w14:val="none"/>
+              </w:rPr>
+              <w:t>Estilos &amp; UI Social</w:t>
+            </w:r>
+          </w:p>
+        </w:tc>
+        <w:tc>
+          <w:tcPr>
+            <w:tcW w:w="0" w:type="auto"/>
+            <w:hideMark/>
+          </w:tcPr>
+          <w:p>
+            <w:pPr>
+              <w:spacing w:line="240" w:lineRule="auto"/>
+              <w:ind w:firstLine="0"/>
+              <w:rPr>
+                <w:rFonts w:ascii="Arial" w:eastAsia="Times New Roman" w:hAnsi="Arial" w:cs="Arial"/>
+                <w:color w:val="auto"/>
+                <w:kern w:val="0"/>
+                <w:lang w:val="es-MX" w:eastAsia="es-MX"/>
+                <w14:ligatures w14:val="none"/>
+              </w:rPr>
+            </w:pPr>
+            <w:r>
+              <w:rPr>
+                <w:rFonts w:ascii="Arial" w:eastAsia="Times New Roman" w:hAnsi="Arial" w:cs="Arial"/>
+                <w:color w:val="auto"/>
+                <w:kern w:val="0"/>
+                <w:lang w:val="es-MX" w:eastAsia="es-MX"/>
+                <w14:ligatures w14:val="none"/>
+              </w:rPr>
+              <w:t xml:space="preserve">CSS </w:t>
+            </w:r>
+            <w:proofErr w:type="spellStart"/>
+            <w:r>
+              <w:rPr>
+                <w:rFonts w:ascii="Arial" w:eastAsia="Times New Roman" w:hAnsi="Arial" w:cs="Arial"/>
+                <w:color w:val="auto"/>
+                <w:kern w:val="0"/>
+                <w:lang w:val="es-MX" w:eastAsia="es-MX"/>
+                <w14:ligatures w14:val="none"/>
+              </w:rPr>
+              <w:t>Flexbox</w:t>
+            </w:r>
+            <w:proofErr w:type="spellEnd"/>
+            <w:r>
+              <w:rPr>
+                <w:rFonts w:ascii="Arial" w:eastAsia="Times New Roman" w:hAnsi="Arial" w:cs="Arial"/>
+                <w:color w:val="auto"/>
+                <w:kern w:val="0"/>
+                <w:lang w:val="es-MX" w:eastAsia="es-MX"/>
+                <w14:ligatures w14:val="none"/>
+              </w:rPr>
+              <w:t xml:space="preserve"> / </w:t>
+            </w:r>
+            <w:proofErr w:type="spellStart"/>
+            <w:r>
+              <w:rPr>
+                <w:rFonts w:ascii="Arial" w:eastAsia="Times New Roman" w:hAnsi="Arial" w:cs="Arial"/>
+                <w:color w:val="auto"/>
+                <w:kern w:val="0"/>
+                <w:lang w:val="es-MX" w:eastAsia="es-MX"/>
+                <w14:ligatures w14:val="none"/>
+              </w:rPr>
+              <w:t>Grid</w:t>
+            </w:r>
+            <w:proofErr w:type="spellEnd"/>
+          </w:p>
+        </w:tc>
+        <w:tc>
+          <w:tcPr>
+            <w:tcW w:w="0" w:type="auto"/>
+            <w:hideMark/>
+          </w:tcPr>
+          <w:p>
+            <w:pPr>
+              <w:spacing w:line="240" w:lineRule="auto"/>
+              <w:ind w:firstLine="0"/>
+              <w:rPr>
+                <w:rFonts w:ascii="Arial" w:eastAsia="Times New Roman" w:hAnsi="Arial" w:cs="Arial"/>
+                <w:color w:val="auto"/>
+                <w:kern w:val="0"/>
+                <w:lang w:val="es-MX" w:eastAsia="es-MX"/>
+                <w14:ligatures w14:val="none"/>
+              </w:rPr>
+            </w:pPr>
+            <w:r>
+              <w:rPr>
+                <w:rFonts w:ascii="Arial" w:eastAsia="Times New Roman" w:hAnsi="Arial" w:cs="Arial"/>
+                <w:color w:val="auto"/>
+                <w:kern w:val="0"/>
+                <w:lang w:val="es-MX" w:eastAsia="es-MX"/>
+                <w14:ligatures w14:val="none"/>
+              </w:rPr>
+              <w:t>Maquetación responsiva para la sección de comentarios en pantallas de dispositivos móviles.</w:t>
+            </w:r>
+          </w:p>
+        </w:tc>
+      </w:tr>
+      <w:tr>
+        <w:tc>
+          <w:tcPr>
+            <w:tcW w:w="0" w:type="auto"/>
+            <w:hideMark/>
+          </w:tcPr>
+          <w:p>
+            <w:pPr>
+              <w:spacing w:line="240" w:lineRule="auto"/>
+              <w:ind w:firstLine="0"/>
+              <w:rPr>
+                <w:rFonts w:ascii="Arial" w:eastAsia="Times New Roman" w:hAnsi="Arial" w:cs="Arial"/>
+                <w:color w:val="auto"/>
+                <w:kern w:val="0"/>
+                <w:lang w:val="es-MX" w:eastAsia="es-MX"/>
+                <w14:ligatures w14:val="none"/>
+              </w:rPr>
+            </w:pPr>
+            <w:r>
+              <w:rPr>
+                <w:rFonts w:ascii="Arial" w:eastAsia="Times New Roman" w:hAnsi="Arial" w:cs="Arial"/>
+                <w:b/>
+                <w:bCs/>
+                <w:color w:val="auto"/>
+                <w:kern w:val="0"/>
+                <w:lang w:val="es-MX" w:eastAsia="es-MX"/>
+                <w14:ligatures w14:val="none"/>
+              </w:rPr>
+              <w:t>Control de Versiones</w:t>
+            </w:r>
+          </w:p>
+        </w:tc>
+        <w:tc>
+          <w:tcPr>
+            <w:tcW w:w="0" w:type="auto"/>
+            <w:hideMark/>
+          </w:tcPr>
+          <w:p>
+            <w:pPr>
+              <w:spacing w:line="240" w:lineRule="auto"/>
+              <w:ind w:firstLine="0"/>
+              <w:rPr>
+                <w:rFonts w:ascii="Arial" w:eastAsia="Times New Roman" w:hAnsi="Arial" w:cs="Arial"/>
+                <w:color w:val="auto"/>
+                <w:kern w:val="0"/>
+                <w:lang w:val="es-MX" w:eastAsia="es-MX"/>
+                <w14:ligatures w14:val="none"/>
+              </w:rPr>
+            </w:pPr>
+            <w:r>
+              <w:rPr>
+                <w:rFonts w:ascii="Arial" w:eastAsia="Times New Roman" w:hAnsi="Arial" w:cs="Arial"/>
+                <w:color w:val="auto"/>
+                <w:kern w:val="0"/>
+                <w:lang w:val="es-MX" w:eastAsia="es-MX"/>
+                <w14:ligatures w14:val="none"/>
+              </w:rPr>
+              <w:t xml:space="preserve">Git &amp; GitHub (Branch: </w:t>
+            </w:r>
+            <w:proofErr w:type="spellStart"/>
+            <w:r>
+              <w:rPr>
+                <w:rFonts w:ascii="Arial" w:eastAsia="Times New Roman" w:hAnsi="Arial" w:cs="Arial"/>
+                <w:color w:val="auto"/>
+                <w:kern w:val="0"/>
+                <w:sz w:val="20"/>
+                <w:szCs w:val="20"/>
+                <w:lang w:val="es-MX" w:eastAsia="es-MX"/>
+                <w14:ligatures w14:val="none"/>
+              </w:rPr>
+              <w:t>feature</w:t>
+            </w:r>
+            <w:proofErr w:type="spellEnd"/>
+            <w:r>
+              <w:rPr>
+                <w:rFonts w:ascii="Arial" w:eastAsia="Times New Roman" w:hAnsi="Arial" w:cs="Arial"/>
+                <w:color w:val="auto"/>
+                <w:kern w:val="0"/>
+                <w:sz w:val="20"/>
+                <w:szCs w:val="20"/>
+                <w:lang w:val="es-MX" w:eastAsia="es-MX"/>
+                <w14:ligatures w14:val="none"/>
+              </w:rPr>
+              <w:t>/celula-6-comunidad</w:t>
+            </w:r>
+            <w:r>
+              <w:rPr>
+                <w:rFonts w:ascii="Arial" w:eastAsia="Times New Roman" w:hAnsi="Arial" w:cs="Arial"/>
+                <w:color w:val="auto"/>
+                <w:kern w:val="0"/>
+                <w:lang w:val="es-MX" w:eastAsia="es-MX"/>
+                <w14:ligatures w14:val="none"/>
+              </w:rPr>
+              <w:t>)</w:t>
+            </w:r>
+          </w:p>
+        </w:tc>
+        <w:tc>
+          <w:tcPr>
+            <w:tcW w:w="0" w:type="auto"/>
+            <w:hideMark/>
+          </w:tcPr>
+          <w:p>
+            <w:pPr>
+              <w:spacing w:line="240" w:lineRule="auto"/>
+              <w:ind w:firstLine="0"/>
+              <w:rPr>
+                <w:rFonts w:ascii="Arial" w:eastAsia="Times New Roman" w:hAnsi="Arial" w:cs="Arial"/>
+                <w:color w:val="auto"/>
+                <w:kern w:val="0"/>
+                <w:lang w:val="es-MX" w:eastAsia="es-MX"/>
+                <w14:ligatures w14:val="none"/>
+              </w:rPr>
+            </w:pPr>
+            <w:r>
+              <w:rPr>
+                <w:rFonts w:ascii="Arial" w:eastAsia="Times New Roman" w:hAnsi="Arial" w:cs="Arial"/>
+                <w:color w:val="auto"/>
+                <w:kern w:val="0"/>
+                <w:lang w:val="es-MX" w:eastAsia="es-MX"/>
+                <w14:ligatures w14:val="none"/>
+              </w:rPr>
+              <w:t>Trabajo colaborativo en rama independiente para posterior integración al repositorio principal.</w:t>
+            </w:r>
+          </w:p>
+        </w:tc>
+      </w:tr>
+      <w:tr>
+        <w:tc>
+          <w:tcPr>
+            <w:tcW w:w="0" w:type="auto"/>
+            <w:hideMark/>
+          </w:tcPr>
+          <w:p>
+            <w:pPr>
+              <w:spacing w:line="240" w:lineRule="auto"/>
+              <w:ind w:firstLine="0"/>
+              <w:rPr>
+                <w:rFonts w:ascii="Arial" w:eastAsia="Times New Roman" w:hAnsi="Arial" w:cs="Arial"/>
+                <w:color w:val="auto"/>
+                <w:kern w:val="0"/>
+                <w:lang w:val="es-MX" w:eastAsia="es-MX"/>
+                <w14:ligatures w14:val="none"/>
+              </w:rPr>
+            </w:pPr>
+            <w:r>
+              <w:rPr>
+                <w:rFonts w:ascii="Arial" w:eastAsia="Times New Roman" w:hAnsi="Arial" w:cs="Arial"/>
+                <w:b/>
+                <w:bCs/>
+                <w:color w:val="auto"/>
+                <w:kern w:val="0"/>
+                <w:lang w:val="es-MX" w:eastAsia="es-MX"/>
+                <w14:ligatures w14:val="none"/>
+              </w:rPr>
+              <w:t>Diseño UI / UX</w:t>
+            </w:r>
+          </w:p>
+        </w:tc>
+        <w:tc>
+          <w:tcPr>
+            <w:tcW w:w="0" w:type="auto"/>
+            <w:hideMark/>
+          </w:tcPr>
+          <w:p>
+            <w:pPr>
+              <w:spacing w:line="240" w:lineRule="auto"/>
+              <w:ind w:firstLine="0"/>
+              <w:rPr>
+                <w:rFonts w:ascii="Arial" w:eastAsia="Times New Roman" w:hAnsi="Arial" w:cs="Arial"/>
+                <w:color w:val="auto"/>
+                <w:kern w:val="0"/>
+                <w:lang w:val="es-MX" w:eastAsia="es-MX"/>
+                <w14:ligatures w14:val="none"/>
+              </w:rPr>
+            </w:pPr>
+            <w:proofErr w:type="spellStart"/>
+            <w:r>
+              <w:rPr>
+                <w:rFonts w:ascii="Arial" w:eastAsia="Times New Roman" w:hAnsi="Arial" w:cs="Arial"/>
+                <w:color w:val="auto"/>
+                <w:kern w:val="0"/>
+                <w:lang w:val="es-MX" w:eastAsia="es-MX"/>
+                <w14:ligatures w14:val="none"/>
+              </w:rPr>
+              <w:t>Figma</w:t>
+            </w:r>
+            <w:proofErr w:type="spellEnd"/>
+          </w:p>
+        </w:tc>
+        <w:tc>
+          <w:tcPr>
+            <w:tcW w:w="0" w:type="auto"/>
+            <w:hideMark/>
+          </w:tcPr>
+          <w:p>
+            <w:pPr>
+              <w:spacing w:line="240" w:lineRule="auto"/>
+              <w:ind w:firstLine="0"/>
+              <w:rPr>
+                <w:rFonts w:ascii="Arial" w:eastAsia="Times New Roman" w:hAnsi="Arial" w:cs="Arial"/>
+                <w:color w:val="auto"/>
+                <w:kern w:val="0"/>
+                <w:lang w:val="es-MX" w:eastAsia="es-MX"/>
+                <w14:ligatures w14:val="none"/>
+              </w:rPr>
+            </w:pPr>
+            <w:r>
+              <w:rPr>
+                <w:rFonts w:ascii="Arial" w:eastAsia="Times New Roman" w:hAnsi="Arial" w:cs="Arial"/>
+                <w:color w:val="auto"/>
+                <w:kern w:val="0"/>
+                <w:lang w:val="es-MX" w:eastAsia="es-MX"/>
+                <w14:ligatures w14:val="none"/>
+              </w:rPr>
+              <w:t>Prototipado de los widgets de valoración y la caja de comentarios interactiva.</w:t>
+            </w:r>
+          </w:p>
+        </w:tc>
+      </w:tr>
+    </w:tbl>
+    <w:p>
+      <w:pPr>
+        <w:rPr>
+          <w:rFonts w:cs="Times New Roman"/>
+          <w:lang w:val="es-MX"/>
         </w:rPr>
       </w:pPr>
     </w:p>
@@ -3189,7 +4313,7 @@
           <w:szCs w:val="24"/>
         </w:rPr>
       </w:pPr>
-      <w:bookmarkStart w:id="13" w:name="_Toc241140366"/>
+      <w:bookmarkStart w:id="15" w:name="_Toc241140366"/>
       <w:r>
         <w:rPr>
           <w:rFonts w:cs="Times New Roman"/>
@@ -3255,7 +4379,7 @@
         </w:rPr>
         <w:t>tecnológico</w:t>
       </w:r>
-      <w:bookmarkEnd w:id="13"/>
+      <w:bookmarkEnd w:id="15"/>
       <w:r>
         <w:rPr>
           <w:rFonts w:cs="Times New Roman"/>
@@ -3273,7 +4397,7 @@
           <w:szCs w:val="24"/>
         </w:rPr>
       </w:pPr>
-      <w:bookmarkStart w:id="14" w:name="_Toc242137969"/>
+      <w:bookmarkStart w:id="16" w:name="_Toc242165051"/>
       <w:r>
         <w:rPr>
           <w:rFonts w:cs="Times New Roman"/>
@@ -3282,7 +4406,7 @@
         <w:lastRenderedPageBreak/>
         <w:t>2. Alcance</w:t>
       </w:r>
-      <w:bookmarkEnd w:id="14"/>
+      <w:bookmarkEnd w:id="16"/>
     </w:p>
     <w:p>
       <w:pPr>
@@ -3305,7 +4429,7 @@
           <w:szCs w:val="24"/>
         </w:rPr>
       </w:pPr>
-      <w:bookmarkStart w:id="15" w:name="_Toc242137970"/>
+      <w:bookmarkStart w:id="17" w:name="_Toc242165052"/>
       <w:r>
         <w:rPr>
           <w:rFonts w:cs="Times New Roman"/>
@@ -3313,7 +4437,7 @@
         </w:rPr>
         <w:t>2.1 Inclusiones</w:t>
       </w:r>
-      <w:bookmarkEnd w:id="15"/>
+      <w:bookmarkEnd w:id="17"/>
     </w:p>
     <w:p>
       <w:pPr>
@@ -3454,7 +4578,7 @@
           <w:szCs w:val="24"/>
         </w:rPr>
       </w:pPr>
-      <w:bookmarkStart w:id="16" w:name="_Toc242137971"/>
+      <w:bookmarkStart w:id="18" w:name="_Toc242165053"/>
       <w:r>
         <w:rPr>
           <w:rFonts w:cs="Times New Roman"/>
@@ -3462,7 +4586,7 @@
         </w:rPr>
         <w:t>2.2 Exclusiones</w:t>
       </w:r>
-      <w:bookmarkEnd w:id="16"/>
+      <w:bookmarkEnd w:id="18"/>
     </w:p>
     <w:p>
       <w:pPr>
@@ -3565,12 +4689,12 @@
       <w:pPr>
         <w:pStyle w:val="Ttulo1"/>
       </w:pPr>
-      <w:bookmarkStart w:id="17" w:name="_Toc242137972"/>
+      <w:bookmarkStart w:id="19" w:name="_Toc242165054"/>
       <w:r>
         <w:lastRenderedPageBreak/>
         <w:t>Modelo Relacional</w:t>
       </w:r>
-      <w:bookmarkEnd w:id="17"/>
+      <w:bookmarkEnd w:id="19"/>
     </w:p>
     <w:p>
       <w:pPr>
@@ -3816,12 +4940,12 @@
       <w:pPr>
         <w:pStyle w:val="Ttulo1"/>
       </w:pPr>
-      <w:bookmarkStart w:id="18" w:name="_Toc242137973"/>
+      <w:bookmarkStart w:id="20" w:name="_Toc242165055"/>
       <w:r>
         <w:lastRenderedPageBreak/>
         <w:t>Conclusiones</w:t>
       </w:r>
-      <w:bookmarkEnd w:id="18"/>
+      <w:bookmarkEnd w:id="20"/>
     </w:p>
     <w:p>
       <w:pPr>
@@ -4067,12 +5191,12 @@
       <w:pPr>
         <w:pStyle w:val="Ttulo1"/>
       </w:pPr>
-      <w:bookmarkStart w:id="19" w:name="_Toc242137974"/>
+      <w:bookmarkStart w:id="21" w:name="_Toc242165056"/>
       <w:r>
         <w:lastRenderedPageBreak/>
         <w:t>Glosario</w:t>
       </w:r>
-      <w:bookmarkEnd w:id="19"/>
+      <w:bookmarkEnd w:id="21"/>
     </w:p>
     <w:p>
       <w:pPr>
@@ -4252,12 +5376,12 @@
       <w:pPr>
         <w:pStyle w:val="Ttulo1"/>
       </w:pPr>
-      <w:bookmarkStart w:id="20" w:name="_Toc242137975"/>
+      <w:bookmarkStart w:id="22" w:name="_Toc242165057"/>
       <w:r>
         <w:lastRenderedPageBreak/>
         <w:t>Referencias</w:t>
       </w:r>
-      <w:bookmarkEnd w:id="20"/>
+      <w:bookmarkEnd w:id="22"/>
     </w:p>
     <w:p>
       <w:pPr>
@@ -4446,12 +5570,12 @@
       <w:pPr>
         <w:pStyle w:val="Ttulo1"/>
       </w:pPr>
-      <w:bookmarkStart w:id="21" w:name="_Toc242137976"/>
+      <w:bookmarkStart w:id="23" w:name="_Toc242165058"/>
       <w:r>
         <w:lastRenderedPageBreak/>
         <w:t>Reglamentación y Condiciones Legales</w:t>
       </w:r>
-      <w:bookmarkEnd w:id="21"/>
+      <w:bookmarkEnd w:id="23"/>
     </w:p>
     <w:p>
       <w:pPr>
@@ -6167,7 +7291,6 @@
   <w:style w:type="character" w:default="1" w:styleId="Fuentedeprrafopredeter">
     <w:name w:val="Default Paragraph Font"/>
     <w:uiPriority w:val="1"/>
-    <w:semiHidden/>
     <w:unhideWhenUsed/>
   </w:style>
   <w:style w:type="table" w:default="1" w:styleId="Tablanormal">
@@ -6703,6 +7826,57 @@
       <w14:ligatures w14:val="none"/>
     </w:rPr>
   </w:style>
+  <w:style w:type="character" w:styleId="Textoennegrita">
+    <w:name w:val="Strong"/>
+    <w:basedOn w:val="Fuentedeprrafopredeter"/>
+    <w:uiPriority w:val="22"/>
+    <w:qFormat/>
+    <w:rsid w:val="00266F57"/>
+    <w:rPr>
+      <w:b/>
+      <w:bCs/>
+    </w:rPr>
+  </w:style>
+  <w:style w:type="table" w:customStyle="1" w:styleId="normasAPA">
+    <w:name w:val="normasAPA"/>
+    <w:basedOn w:val="Tablanormal"/>
+    <w:uiPriority w:val="99"/>
+    <w:rsid w:val="00266F57"/>
+    <w:pPr>
+      <w:spacing w:after="0" w:line="240" w:lineRule="auto"/>
+    </w:pPr>
+    <w:rPr>
+      <w:rFonts w:ascii="Times New Roman" w:hAnsi="Times New Roman"/>
+      <w:color w:val="000000" w:themeColor="text1"/>
+    </w:rPr>
+    <w:tblPr>
+      <w:tblBorders>
+        <w:top w:val="single" w:sz="4" w:space="0" w:color="auto"/>
+        <w:bottom w:val="single" w:sz="4" w:space="0" w:color="auto"/>
+      </w:tblBorders>
+    </w:tblPr>
+    <w:tblStylePr w:type="firstRow">
+      <w:tblPr/>
+      <w:tcPr>
+        <w:tcBorders>
+          <w:bottom w:val="single" w:sz="4" w:space="0" w:color="auto"/>
+        </w:tcBorders>
+      </w:tcPr>
+    </w:tblStylePr>
+  </w:style>
+  <w:style w:type="character" w:styleId="CdigoHTML">
+    <w:name w:val="HTML Code"/>
+    <w:basedOn w:val="Fuentedeprrafopredeter"/>
+    <w:uiPriority w:val="99"/>
+    <w:semiHidden/>
+    <w:unhideWhenUsed/>
+    <w:rsid w:val="003A1E4B"/>
+    <w:rPr>
+      <w:rFonts w:ascii="Courier New" w:eastAsia="Times New Roman" w:hAnsi="Courier New" w:cs="Courier New"/>
+      <w:sz w:val="20"/>
+      <w:szCs w:val="20"/>
+    </w:rPr>
+  </w:style>
 </w:styles>
 </file>
 

</xml_diff>

<commit_message>
feat glosario y referencias
</commit_message>
<xml_diff>
--- a/informe de requisitos.docx
+++ b/informe de requisitos.docx
@@ -1,6 +1,6 @@
 
 <file path=word/document.xml><?xml version="1.0" encoding="utf-8"?>
-<w:document xmlns:wpc="http://schemas.microsoft.com/office/word/2010/wordprocessingCanvas" xmlns:cx="http://schemas.microsoft.com/office/drawing/2014/chartex" xmlns:cx1="http://schemas.microsoft.com/office/drawing/2015/9/8/chartex" xmlns:cx2="http://schemas.microsoft.com/office/drawing/2015/10/21/chartex" xmlns:cx3="http://schemas.microsoft.com/office/drawing/2016/5/9/chartex" xmlns:cx4="http://schemas.microsoft.com/office/drawing/2016/5/10/chartex" xmlns:cx5="http://schemas.microsoft.com/office/drawing/2016/5/11/chartex" xmlns:cx6="http://schemas.microsoft.com/office/drawing/2016/5/12/chartex" xmlns:cx7="http://schemas.microsoft.com/office/drawing/2016/5/13/chartex" xmlns:cx8="http://schemas.microsoft.com/office/drawing/2016/5/14/chartex" xmlns:mc="http://schemas.openxmlformats.org/markup-compatibility/2006" xmlns:aink="http://schemas.microsoft.com/office/drawing/2016/ink" xmlns:am3d="http://schemas.microsoft.com/office/drawing/2017/model3d" xmlns:o="urn:schemas-microsoft-com:office:office" xmlns:oel="http://schemas.microsoft.com/office/2019/extlst" xmlns:r="http://schemas.openxmlformats.org/officeDocument/2006/relationships" xmlns:m="http://schemas.openxmlformats.org/officeDocument/2006/math" xmlns:v="urn:schemas-microsoft-com:vml" xmlns:wp14="http://schemas.microsoft.com/office/word/2010/wordprocessingDrawing" xmlns:wp="http://schemas.openxmlformats.org/drawingml/2006/wordprocessingDrawing" xmlns:w10="urn:schemas-microsoft-com:office:word" xmlns:w="http://schemas.openxmlformats.org/wordprocessingml/2006/main" xmlns:w14="http://schemas.microsoft.com/office/word/2010/wordml" xmlns:w15="http://schemas.microsoft.com/office/word/2012/wordml" xmlns:w16cex="http://schemas.microsoft.com/office/word/2018/wordml/cex" xmlns:w16cid="http://schemas.microsoft.com/office/word/2016/wordml/cid" xmlns:w16="http://schemas.microsoft.com/office/word/2018/wordml" xmlns:w16du="http://schemas.microsoft.com/office/word/2023/wordml/word16du" xmlns:w16sdtdh="http://schemas.microsoft.com/office/word/2020/wordml/sdtdatahash" xmlns:w16se="http://schemas.microsoft.com/office/word/2015/wordml/symex" xmlns:wpg="http://schemas.microsoft.com/office/word/2010/wordprocessingGroup" xmlns:wpi="http://schemas.microsoft.com/office/word/2010/wordprocessingInk" xmlns:wne="http://schemas.microsoft.com/office/word/2006/wordml" xmlns:wps="http://schemas.microsoft.com/office/word/2010/wordprocessingShape" mc:Ignorable="w14 w15 w16se w16cid w16 w16cex w16sdtdh w16du wp14">
+<w:document xmlns:wpc="http://schemas.microsoft.com/office/word/2010/wordprocessingCanvas" xmlns:cx="http://schemas.microsoft.com/office/drawing/2014/chartex" xmlns:mc="http://schemas.openxmlformats.org/markup-compatibility/2006" xmlns:o="urn:schemas-microsoft-com:office:office" xmlns:r="http://schemas.openxmlformats.org/officeDocument/2006/relationships" xmlns:m="http://schemas.openxmlformats.org/officeDocument/2006/math" xmlns:v="urn:schemas-microsoft-com:vml" xmlns:wp14="http://schemas.microsoft.com/office/word/2010/wordprocessingDrawing" xmlns:wp="http://schemas.openxmlformats.org/drawingml/2006/wordprocessingDrawing" xmlns:w10="urn:schemas-microsoft-com:office:word" xmlns:w="http://schemas.openxmlformats.org/wordprocessingml/2006/main" xmlns:w14="http://schemas.microsoft.com/office/word/2010/wordml" xmlns:w15="http://schemas.microsoft.com/office/word/2012/wordml" xmlns:w16se="http://schemas.microsoft.com/office/word/2015/wordml/symex" xmlns:wpg="http://schemas.microsoft.com/office/word/2010/wordprocessingGroup" xmlns:wpi="http://schemas.microsoft.com/office/word/2010/wordprocessingInk" xmlns:wne="http://schemas.microsoft.com/office/word/2006/wordml" xmlns:wps="http://schemas.microsoft.com/office/word/2010/wordprocessingShape" mc:Ignorable="w14 w15 w16se wp14">
   <w:body>
     <w:p>
       <w:pPr>
@@ -64,8 +64,16 @@
         <w:rPr>
           <w:rFonts w:cs="Times New Roman"/>
         </w:rPr>
-        <w:t xml:space="preserve"> Martínez Piedrahíta</w:t>
-      </w:r>
+        <w:t xml:space="preserve"> Martínez </w:t>
+      </w:r>
+      <w:proofErr w:type="spellStart"/>
+      <w:r>
+        <w:rPr>
+          <w:rFonts w:cs="Times New Roman"/>
+        </w:rPr>
+        <w:t>Piedrahíta</w:t>
+      </w:r>
+      <w:proofErr w:type="spellEnd"/>
       <w:r>
         <w:rPr>
           <w:rFonts w:cs="Times New Roman"/>
@@ -2710,61 +2718,6 @@
           <w:rFonts w:cs="Times New Roman"/>
         </w:rPr>
       </w:pPr>
-      <w:r>
-        <w:rPr>
-          <w:rFonts w:cs="Times New Roman"/>
-          <w:noProof/>
-        </w:rPr>
-        <w:lastRenderedPageBreak/>
-        <w:drawing>
-          <wp:inline distT="0" distB="0" distL="0" distR="0" wp14:anchorId="2EE34CBC" wp14:editId="04F9D64E">
-            <wp:extent cx="1972924" cy="7827899"/>
-            <wp:effectExtent l="0" t="0" r="8890" b="1905"/>
-            <wp:docPr id="392883808" name="Picture 2"/>
-            <wp:cNvGraphicFramePr>
-              <a:graphicFrameLocks xmlns:a="http://schemas.openxmlformats.org/drawingml/2006/main" noChangeAspect="1"/>
-            </wp:cNvGraphicFramePr>
-            <a:graphic xmlns:a="http://schemas.openxmlformats.org/drawingml/2006/main">
-              <a:graphicData uri="http://schemas.openxmlformats.org/drawingml/2006/picture">
-                <pic:pic xmlns:pic="http://schemas.openxmlformats.org/drawingml/2006/picture">
-                  <pic:nvPicPr>
-                    <pic:cNvPr id="0" name="Picture 3"/>
-                    <pic:cNvPicPr>
-                      <a:picLocks noChangeAspect="1" noChangeArrowheads="1"/>
-                    </pic:cNvPicPr>
-                  </pic:nvPicPr>
-                  <pic:blipFill>
-                    <a:blip r:embed="rId6" cstate="print">
-                      <a:extLst>
-                        <a:ext uri="{28A0092B-C50C-407E-A947-70E740481C1C}">
-                          <a14:useLocalDpi xmlns:a14="http://schemas.microsoft.com/office/drawing/2010/main" val="0"/>
-                        </a:ext>
-                      </a:extLst>
-                    </a:blip>
-                    <a:srcRect/>
-                    <a:stretch>
-                      <a:fillRect/>
-                    </a:stretch>
-                  </pic:blipFill>
-                  <pic:spPr bwMode="auto">
-                    <a:xfrm>
-                      <a:off x="0" y="0"/>
-                      <a:ext cx="1979969" cy="7855852"/>
-                    </a:xfrm>
-                    <a:prstGeom prst="rect">
-                      <a:avLst/>
-                    </a:prstGeom>
-                    <a:noFill/>
-                    <a:ln>
-                      <a:noFill/>
-                    </a:ln>
-                  </pic:spPr>
-                </pic:pic>
-              </a:graphicData>
-            </a:graphic>
-          </wp:inline>
-        </w:drawing>
-      </w:r>
     </w:p>
     <w:p>
       <w:pPr>
@@ -2833,7 +2786,25 @@
           <w:sz w:val="24"/>
           <w:szCs w:val="24"/>
         </w:rPr>
-        <w:t xml:space="preserve"> - Stack </w:t>
+        <w:t xml:space="preserve"> - </w:t>
+      </w:r>
+      <w:proofErr w:type="spellStart"/>
+      <w:r>
+        <w:rPr>
+          <w:rFonts w:cs="Times New Roman"/>
+          <w:sz w:val="24"/>
+          <w:szCs w:val="24"/>
+        </w:rPr>
+        <w:t>Stack</w:t>
+      </w:r>
+      <w:proofErr w:type="spellEnd"/>
+      <w:r>
+        <w:rPr>
+          <w:rFonts w:cs="Times New Roman"/>
+          <w:sz w:val="24"/>
+          <w:szCs w:val="24"/>
+        </w:rPr>
+        <w:t xml:space="preserve"> </w:t>
       </w:r>
       <w:r>
         <w:rPr>
@@ -3289,70 +3260,780 @@
           <w:rFonts w:cs="Times New Roman"/>
         </w:rPr>
       </w:pPr>
-    </w:p>
-    <w:p>
-      <w:pPr>
-        <w:jc w:val="center"/>
-        <w:rPr>
-          <w:rFonts w:cs="Times New Roman"/>
-        </w:rPr>
-      </w:pPr>
-    </w:p>
-    <w:p>
-      <w:pPr>
-        <w:jc w:val="center"/>
-        <w:rPr>
-          <w:rFonts w:cs="Times New Roman"/>
-        </w:rPr>
-      </w:pPr>
-    </w:p>
-    <w:p>
-      <w:pPr>
-        <w:jc w:val="center"/>
-        <w:rPr>
-          <w:rFonts w:cs="Times New Roman"/>
-        </w:rPr>
-      </w:pPr>
-    </w:p>
-    <w:p>
-      <w:pPr>
-        <w:jc w:val="center"/>
-        <w:rPr>
-          <w:rFonts w:cs="Times New Roman"/>
-        </w:rPr>
-      </w:pPr>
-    </w:p>
-    <w:p>
-      <w:pPr>
-        <w:jc w:val="center"/>
-        <w:rPr>
-          <w:rFonts w:cs="Times New Roman"/>
-        </w:rPr>
-      </w:pPr>
-    </w:p>
-    <w:p>
-      <w:pPr>
-        <w:jc w:val="center"/>
-        <w:rPr>
-          <w:rFonts w:cs="Times New Roman"/>
-        </w:rPr>
-      </w:pPr>
-    </w:p>
-    <w:p>
-      <w:pPr>
-        <w:jc w:val="center"/>
-        <w:rPr>
-          <w:rFonts w:cs="Times New Roman"/>
-        </w:rPr>
-      </w:pPr>
-    </w:p>
-    <w:p>
-      <w:pPr>
-        <w:jc w:val="center"/>
-        <w:rPr>
-          <w:rFonts w:cs="Times New Roman"/>
-        </w:rPr>
-      </w:pPr>
+      <w:r>
+        <w:rPr>
+          <w:rFonts w:cs="Times New Roman"/>
+        </w:rPr>
+        <w:t>-</w:t>
+      </w:r>
+      <w:proofErr w:type="spellStart"/>
+      <w:r>
+        <w:rPr>
+          <w:rFonts w:cs="Times New Roman"/>
+        </w:rPr>
+        <w:t>Backend</w:t>
+      </w:r>
+      <w:proofErr w:type="spellEnd"/>
+      <w:r>
+        <w:rPr>
+          <w:rFonts w:cs="Times New Roman"/>
+        </w:rPr>
+        <w:t>: Capa del lado del servidor desarrollada en Java que procesa las reglas de</w:t>
+      </w:r>
+    </w:p>
+    <w:p>
+      <w:pPr>
+        <w:jc w:val="center"/>
+        <w:rPr>
+          <w:rFonts w:cs="Times New Roman"/>
+        </w:rPr>
+      </w:pPr>
+      <w:r>
+        <w:rPr>
+          <w:rFonts w:cs="Times New Roman"/>
+        </w:rPr>
+        <w:t>negocio, valida la seguridad de las peticiones y c</w:t>
+      </w:r>
+      <w:r>
+        <w:rPr>
+          <w:rFonts w:cs="Times New Roman"/>
+        </w:rPr>
+        <w:t xml:space="preserve">oordina el intercambio de datos entre la interfaz </w:t>
+      </w:r>
+      <w:r>
+        <w:rPr>
+          <w:rFonts w:cs="Times New Roman"/>
+        </w:rPr>
+        <w:t>visual y la base de datos relacional de Sazón.</w:t>
+      </w:r>
+    </w:p>
+    <w:p>
+      <w:pPr>
+        <w:ind w:left="708" w:firstLine="12"/>
+        <w:rPr>
+          <w:rFonts w:cs="Times New Roman"/>
+        </w:rPr>
+      </w:pPr>
+      <w:r>
+        <w:rPr>
+          <w:rFonts w:cs="Times New Roman"/>
+        </w:rPr>
+        <w:t>-</w:t>
+      </w:r>
+      <w:r>
+        <w:rPr>
+          <w:rFonts w:cs="Times New Roman"/>
+        </w:rPr>
+        <w:t>Base de Datos Relacional (SQL): Sistema de almacenami</w:t>
+      </w:r>
+      <w:r>
+        <w:rPr>
+          <w:rFonts w:cs="Times New Roman"/>
+        </w:rPr>
+        <w:t xml:space="preserve">ento persistente y estructurado </w:t>
+      </w:r>
+      <w:r>
+        <w:rPr>
+          <w:rFonts w:cs="Times New Roman"/>
+        </w:rPr>
+        <w:t>que utiliza tablas y claves relacionales</w:t>
+      </w:r>
+      <w:r>
+        <w:rPr>
+          <w:rFonts w:cs="Times New Roman"/>
+        </w:rPr>
+        <w:t xml:space="preserve"> para guardar la información de </w:t>
+      </w:r>
+      <w:r>
+        <w:rPr>
+          <w:rFonts w:cs="Times New Roman"/>
+        </w:rPr>
+        <w:t>usuarios, calificaciones,</w:t>
+      </w:r>
+      <w:r>
+        <w:rPr>
+          <w:rFonts w:cs="Times New Roman"/>
+        </w:rPr>
+        <w:t xml:space="preserve"> </w:t>
+      </w:r>
+      <w:r>
+        <w:rPr>
+          <w:rFonts w:cs="Times New Roman"/>
+        </w:rPr>
+        <w:t>comentarios, recetas favoritas, colecciones y reportes de la comunidad.</w:t>
+      </w:r>
+    </w:p>
+    <w:p>
+      <w:pPr>
+        <w:rPr>
+          <w:rFonts w:cs="Times New Roman"/>
+        </w:rPr>
+      </w:pPr>
+      <w:r>
+        <w:rPr>
+          <w:rFonts w:cs="Times New Roman"/>
+        </w:rPr>
+        <w:t>-</w:t>
+      </w:r>
+      <w:r>
+        <w:rPr>
+          <w:rFonts w:cs="Times New Roman"/>
+        </w:rPr>
+        <w:t>CSS (</w:t>
+      </w:r>
+      <w:proofErr w:type="spellStart"/>
+      <w:r>
+        <w:rPr>
+          <w:rFonts w:cs="Times New Roman"/>
+        </w:rPr>
+        <w:t>Cascading</w:t>
+      </w:r>
+      <w:proofErr w:type="spellEnd"/>
+      <w:r>
+        <w:rPr>
+          <w:rFonts w:cs="Times New Roman"/>
+        </w:rPr>
+        <w:t xml:space="preserve"> Style </w:t>
+      </w:r>
+      <w:proofErr w:type="spellStart"/>
+      <w:r>
+        <w:rPr>
+          <w:rFonts w:cs="Times New Roman"/>
+        </w:rPr>
+        <w:t>Sheets</w:t>
+      </w:r>
+      <w:proofErr w:type="spellEnd"/>
+      <w:r>
+        <w:rPr>
+          <w:rFonts w:cs="Times New Roman"/>
+        </w:rPr>
+        <w:t>): Lenguaje de diseño visual utilizado para definir la</w:t>
+      </w:r>
+    </w:p>
+    <w:p>
+      <w:pPr>
+        <w:jc w:val="center"/>
+        <w:rPr>
+          <w:rFonts w:cs="Times New Roman"/>
+        </w:rPr>
+      </w:pPr>
+      <w:r>
+        <w:rPr>
+          <w:rFonts w:cs="Times New Roman"/>
+        </w:rPr>
+        <w:t>presentación gráfica, colores, diseños adaptativos y</w:t>
+      </w:r>
+      <w:r>
+        <w:rPr>
+          <w:rFonts w:cs="Times New Roman"/>
+        </w:rPr>
+        <w:t xml:space="preserve"> maquetación de la interfaz web del módulo </w:t>
+      </w:r>
+      <w:r>
+        <w:rPr>
+          <w:rFonts w:cs="Times New Roman"/>
+        </w:rPr>
+        <w:t>de comunidad.</w:t>
+      </w:r>
+    </w:p>
+    <w:p>
+      <w:pPr>
+        <w:jc w:val="center"/>
+        <w:rPr>
+          <w:rFonts w:cs="Times New Roman"/>
+        </w:rPr>
+      </w:pPr>
+      <w:r>
+        <w:rPr>
+          <w:rFonts w:cs="Times New Roman"/>
+        </w:rPr>
+        <w:t>HTML (</w:t>
+      </w:r>
+      <w:proofErr w:type="spellStart"/>
+      <w:r>
+        <w:rPr>
+          <w:rFonts w:cs="Times New Roman"/>
+        </w:rPr>
+        <w:t>HyperText</w:t>
+      </w:r>
+      <w:proofErr w:type="spellEnd"/>
+      <w:r>
+        <w:rPr>
+          <w:rFonts w:cs="Times New Roman"/>
+        </w:rPr>
+        <w:t xml:space="preserve"> </w:t>
+      </w:r>
+      <w:proofErr w:type="spellStart"/>
+      <w:r>
+        <w:rPr>
+          <w:rFonts w:cs="Times New Roman"/>
+        </w:rPr>
+        <w:t>Markup</w:t>
+      </w:r>
+      <w:proofErr w:type="spellEnd"/>
+      <w:r>
+        <w:rPr>
+          <w:rFonts w:cs="Times New Roman"/>
+        </w:rPr>
+        <w:t xml:space="preserve"> </w:t>
+      </w:r>
+      <w:proofErr w:type="spellStart"/>
+      <w:r>
+        <w:rPr>
+          <w:rFonts w:cs="Times New Roman"/>
+        </w:rPr>
+        <w:t>Language</w:t>
+      </w:r>
+      <w:proofErr w:type="spellEnd"/>
+      <w:r>
+        <w:rPr>
+          <w:rFonts w:cs="Times New Roman"/>
+        </w:rPr>
+        <w:t>): Lenguaje de marcado estándar con el que se</w:t>
+      </w:r>
+    </w:p>
+    <w:p>
+      <w:pPr>
+        <w:jc w:val="center"/>
+        <w:rPr>
+          <w:rFonts w:cs="Times New Roman"/>
+        </w:rPr>
+      </w:pPr>
+      <w:r>
+        <w:rPr>
+          <w:rFonts w:cs="Times New Roman"/>
+        </w:rPr>
+        <w:t>construye la estructura semántica y el esqueleto de las pantallas del sistema Sazón.</w:t>
+      </w:r>
+    </w:p>
+    <w:p>
+      <w:pPr>
+        <w:jc w:val="center"/>
+        <w:rPr>
+          <w:rFonts w:cs="Times New Roman"/>
+        </w:rPr>
+      </w:pPr>
+      <w:r>
+        <w:rPr>
+          <w:rFonts w:cs="Times New Roman"/>
+        </w:rPr>
+        <w:t>JavaScript: Lenguaje de programación interpretado del lado del cliente que brinda</w:t>
+      </w:r>
+    </w:p>
+    <w:p>
+      <w:pPr>
+        <w:jc w:val="center"/>
+        <w:rPr>
+          <w:rFonts w:cs="Times New Roman"/>
+        </w:rPr>
+      </w:pPr>
+      <w:r>
+        <w:rPr>
+          <w:rFonts w:cs="Times New Roman"/>
+        </w:rPr>
+        <w:t>dinamismo, interactividad en tiempo real y validaciones dentro de la experiencia de usuario.</w:t>
+      </w:r>
+    </w:p>
+    <w:p>
+      <w:pPr>
+        <w:jc w:val="center"/>
+        <w:rPr>
+          <w:rFonts w:cs="Times New Roman"/>
+        </w:rPr>
+      </w:pPr>
+      <w:proofErr w:type="spellStart"/>
+      <w:r>
+        <w:rPr>
+          <w:rFonts w:cs="Times New Roman"/>
+        </w:rPr>
+        <w:t>localStorage</w:t>
+      </w:r>
+      <w:proofErr w:type="spellEnd"/>
+      <w:r>
+        <w:rPr>
+          <w:rFonts w:cs="Times New Roman"/>
+        </w:rPr>
+        <w:t>: Mecanismo de almacenamiento web del navegador que permite la</w:t>
+      </w:r>
+    </w:p>
+    <w:p>
+      <w:pPr>
+        <w:ind w:left="708" w:firstLine="12"/>
+        <w:jc w:val="center"/>
+        <w:rPr>
+          <w:rFonts w:cs="Times New Roman"/>
+        </w:rPr>
+      </w:pPr>
+      <w:r>
+        <w:rPr>
+          <w:rFonts w:cs="Times New Roman"/>
+        </w:rPr>
+        <w:t xml:space="preserve">persistencia temporal de datos directamente en el dispositivo </w:t>
+      </w:r>
+      <w:r>
+        <w:rPr>
+          <w:rFonts w:cs="Times New Roman"/>
+        </w:rPr>
+        <w:t xml:space="preserve">del usuario, útil para mantener </w:t>
+      </w:r>
+      <w:r>
+        <w:rPr>
+          <w:rFonts w:cs="Times New Roman"/>
+        </w:rPr>
+        <w:t>sesiones activas o guardar preferencias rápidamente sin sobrecargar el servidor.</w:t>
+      </w:r>
+    </w:p>
+    <w:p>
+      <w:pPr>
+        <w:jc w:val="center"/>
+        <w:rPr>
+          <w:rFonts w:cs="Times New Roman"/>
+        </w:rPr>
+      </w:pPr>
+      <w:r>
+        <w:rPr>
+          <w:rFonts w:cs="Times New Roman"/>
+        </w:rPr>
+        <w:t>Modelo de Clientes / Entidad-Relación: Representación lógica y conceptual que define</w:t>
+      </w:r>
+    </w:p>
+    <w:p>
+      <w:pPr>
+        <w:jc w:val="center"/>
+        <w:rPr>
+          <w:rFonts w:cs="Times New Roman"/>
+        </w:rPr>
+      </w:pPr>
+      <w:r>
+        <w:rPr>
+          <w:rFonts w:cs="Times New Roman"/>
+        </w:rPr>
+        <w:lastRenderedPageBreak/>
+        <w:t>las tablas, atributos y relaciones entre las en</w:t>
+      </w:r>
+      <w:r>
+        <w:rPr>
+          <w:rFonts w:cs="Times New Roman"/>
+        </w:rPr>
+        <w:t xml:space="preserve">tidades del módulo de comunidad (como </w:t>
+      </w:r>
+      <w:r>
+        <w:rPr>
+          <w:rFonts w:cs="Times New Roman"/>
+        </w:rPr>
+        <w:t>calificaciones, comentarios, colecciones, favoritos y reportes).</w:t>
+      </w:r>
+    </w:p>
+    <w:p>
+      <w:pPr>
+        <w:ind w:left="708" w:firstLine="12"/>
+        <w:jc w:val="center"/>
+        <w:rPr>
+          <w:rFonts w:cs="Times New Roman"/>
+        </w:rPr>
+      </w:pPr>
+      <w:r>
+        <w:rPr>
+          <w:rFonts w:cs="Times New Roman"/>
+        </w:rPr>
+        <w:t>-</w:t>
+      </w:r>
+      <w:r>
+        <w:rPr>
+          <w:rFonts w:cs="Times New Roman"/>
+        </w:rPr>
+        <w:t xml:space="preserve">SRS (Software </w:t>
+      </w:r>
+      <w:proofErr w:type="spellStart"/>
+      <w:r>
+        <w:rPr>
+          <w:rFonts w:cs="Times New Roman"/>
+        </w:rPr>
+        <w:t>Requirements</w:t>
+      </w:r>
+      <w:proofErr w:type="spellEnd"/>
+      <w:r>
+        <w:rPr>
+          <w:rFonts w:cs="Times New Roman"/>
+        </w:rPr>
+        <w:t xml:space="preserve"> </w:t>
+      </w:r>
+      <w:proofErr w:type="spellStart"/>
+      <w:r>
+        <w:rPr>
+          <w:rFonts w:cs="Times New Roman"/>
+        </w:rPr>
+        <w:t>Specification</w:t>
+      </w:r>
+      <w:proofErr w:type="spellEnd"/>
+      <w:r>
+        <w:rPr>
+          <w:rFonts w:cs="Times New Roman"/>
+        </w:rPr>
+        <w:t>): Docume</w:t>
+      </w:r>
+      <w:r>
+        <w:rPr>
+          <w:rFonts w:cs="Times New Roman"/>
+        </w:rPr>
+        <w:t xml:space="preserve">nto formal de especificación de </w:t>
+      </w:r>
+      <w:r>
+        <w:rPr>
+          <w:rFonts w:cs="Times New Roman"/>
+        </w:rPr>
+        <w:t>requisitos de software que establece los requerimientos funcional</w:t>
+      </w:r>
+      <w:r>
+        <w:rPr>
+          <w:rFonts w:cs="Times New Roman"/>
+        </w:rPr>
+        <w:t xml:space="preserve">es, no funcionales, de alcance </w:t>
+      </w:r>
+      <w:r>
+        <w:rPr>
+          <w:rFonts w:cs="Times New Roman"/>
+        </w:rPr>
+        <w:t>de arquitectura para la Célula 6.</w:t>
+      </w:r>
+    </w:p>
+    <w:p>
+      <w:pPr>
+        <w:jc w:val="center"/>
+        <w:rPr>
+          <w:rFonts w:cs="Times New Roman"/>
+        </w:rPr>
+      </w:pPr>
+      <w:r>
+        <w:rPr>
+          <w:rFonts w:cs="Times New Roman"/>
+        </w:rPr>
+        <w:t>-</w:t>
+      </w:r>
+      <w:proofErr w:type="spellStart"/>
+      <w:r>
+        <w:rPr>
+          <w:rFonts w:cs="Times New Roman"/>
+        </w:rPr>
+        <w:t>Stack</w:t>
+      </w:r>
+      <w:proofErr w:type="spellEnd"/>
+      <w:r>
+        <w:rPr>
+          <w:rFonts w:cs="Times New Roman"/>
+        </w:rPr>
+        <w:t xml:space="preserve"> Tecnológico: Conjunto integrado de herramientas, lenguajes de programación</w:t>
+      </w:r>
+    </w:p>
+    <w:p>
+      <w:pPr>
+        <w:jc w:val="center"/>
+        <w:rPr>
+          <w:rFonts w:cs="Times New Roman"/>
+        </w:rPr>
+      </w:pPr>
+      <w:r>
+        <w:rPr>
+          <w:rFonts w:cs="Times New Roman"/>
+        </w:rPr>
+        <w:t>(HTML, CSS, JavaScript, Java, SQL) y tecnologías de al</w:t>
+      </w:r>
+      <w:r>
+        <w:rPr>
+          <w:rFonts w:cs="Times New Roman"/>
+        </w:rPr>
+        <w:t xml:space="preserve">macenamiento seleccionadas para </w:t>
+      </w:r>
+      <w:r>
+        <w:rPr>
+          <w:rFonts w:cs="Times New Roman"/>
+        </w:rPr>
+        <w:t>implementar el módulo de comunidad.</w:t>
+      </w:r>
+    </w:p>
+    <w:p>
+      <w:pPr>
+        <w:jc w:val="center"/>
+        <w:rPr>
+          <w:rFonts w:cs="Times New Roman"/>
+        </w:rPr>
+      </w:pPr>
+      <w:r>
+        <w:rPr>
+          <w:rFonts w:cs="Times New Roman"/>
+        </w:rPr>
+        <w:t>Términos No Técnicos</w:t>
+      </w:r>
+    </w:p>
+    <w:p>
+      <w:pPr>
+        <w:jc w:val="center"/>
+        <w:rPr>
+          <w:rFonts w:cs="Times New Roman"/>
+        </w:rPr>
+      </w:pPr>
+      <w:r>
+        <w:rPr>
+          <w:rFonts w:cs="Times New Roman"/>
+        </w:rPr>
+        <w:t>Célula de Desarrollo: Equipo interdisciplinario de trabajo asignado de forma</w:t>
+      </w:r>
+    </w:p>
+    <w:p>
+      <w:pPr>
+        <w:jc w:val="center"/>
+        <w:rPr>
+          <w:rFonts w:cs="Times New Roman"/>
+        </w:rPr>
+      </w:pPr>
+      <w:r>
+        <w:rPr>
+          <w:rFonts w:cs="Times New Roman"/>
+        </w:rPr>
+        <w:t>especializada a un componente específico dentro del proyecto macro Sazón, como la Célula 6</w:t>
+      </w:r>
+    </w:p>
+    <w:p>
+      <w:pPr>
+        <w:jc w:val="center"/>
+        <w:rPr>
+          <w:rFonts w:cs="Times New Roman"/>
+        </w:rPr>
+      </w:pPr>
+      <w:r>
+        <w:rPr>
+          <w:rFonts w:cs="Times New Roman"/>
+        </w:rPr>
+        <w:t>encargada del módulo de Comunidad y Valoraciones.</w:t>
+      </w:r>
+    </w:p>
+    <w:p>
+      <w:pPr>
+        <w:ind w:left="708" w:firstLine="12"/>
+        <w:jc w:val="center"/>
+        <w:rPr>
+          <w:rFonts w:cs="Times New Roman"/>
+        </w:rPr>
+      </w:pPr>
+      <w:r>
+        <w:rPr>
+          <w:rFonts w:cs="Times New Roman"/>
+        </w:rPr>
+        <w:t>Colección de Recetas: Agrupación personalizada o temática creada por un usuari</w:t>
+      </w:r>
+      <w:r>
+        <w:rPr>
+          <w:rFonts w:cs="Times New Roman"/>
+        </w:rPr>
+        <w:t xml:space="preserve">o para </w:t>
+      </w:r>
+      <w:r>
+        <w:rPr>
+          <w:rFonts w:cs="Times New Roman"/>
+        </w:rPr>
+        <w:t>organizar, almacenar y administrar sus recetas guardadas o preferidas dentro de la plataforma.</w:t>
+      </w:r>
+    </w:p>
+    <w:p>
+      <w:pPr>
+        <w:jc w:val="center"/>
+        <w:rPr>
+          <w:rFonts w:cs="Times New Roman"/>
+        </w:rPr>
+      </w:pPr>
+    </w:p>
+    <w:p>
+      <w:pPr>
+        <w:jc w:val="center"/>
+        <w:rPr>
+          <w:rFonts w:cs="Times New Roman"/>
+        </w:rPr>
+      </w:pPr>
+      <w:r>
+        <w:rPr>
+          <w:rFonts w:cs="Times New Roman"/>
+        </w:rPr>
+        <w:t>Comunidad y Valoraciones: Ecosistema interactivo dentro de la plataforma</w:t>
+      </w:r>
+    </w:p>
+    <w:p>
+      <w:pPr>
+        <w:jc w:val="center"/>
+        <w:rPr>
+          <w:rFonts w:cs="Times New Roman"/>
+        </w:rPr>
+      </w:pPr>
+      <w:r>
+        <w:rPr>
+          <w:rFonts w:cs="Times New Roman"/>
+        </w:rPr>
+        <w:t>gastronómica donde los usuarios registrados comparten sus o</w:t>
+      </w:r>
+      <w:r>
+        <w:rPr>
+          <w:rFonts w:cs="Times New Roman"/>
+        </w:rPr>
+        <w:t xml:space="preserve">piniones, asignan puntuaciones, </w:t>
+      </w:r>
+      <w:r>
+        <w:rPr>
+          <w:rFonts w:cs="Times New Roman"/>
+        </w:rPr>
+        <w:t>guardan recetas y crean hábitos de convivencia digital.</w:t>
+      </w:r>
+    </w:p>
+    <w:p>
+      <w:pPr>
+        <w:jc w:val="center"/>
+        <w:rPr>
+          <w:rFonts w:cs="Times New Roman"/>
+        </w:rPr>
+      </w:pPr>
+      <w:r>
+        <w:rPr>
+          <w:rFonts w:cs="Times New Roman"/>
+        </w:rPr>
+        <w:t>Fidelización de Usuarios: Estrategia para fomentar la retención y frecuencia de uso</w:t>
+      </w:r>
+    </w:p>
+    <w:p>
+      <w:pPr>
+        <w:jc w:val="center"/>
+        <w:rPr>
+          <w:rFonts w:cs="Times New Roman"/>
+        </w:rPr>
+      </w:pPr>
+      <w:r>
+        <w:rPr>
+          <w:rFonts w:cs="Times New Roman"/>
+        </w:rPr>
+        <w:t>mediante la creación de espacios interactivos, pertenencia y generación de valor continuo.</w:t>
+      </w:r>
+    </w:p>
+    <w:p>
+      <w:pPr>
+        <w:jc w:val="center"/>
+        <w:rPr>
+          <w:rFonts w:cs="Times New Roman"/>
+        </w:rPr>
+      </w:pPr>
+      <w:r>
+        <w:rPr>
+          <w:rFonts w:cs="Times New Roman"/>
+        </w:rPr>
+        <w:lastRenderedPageBreak/>
+        <w:t>Prueba Social: Fenómeno psicológico y social donde los usuarios validan la calidad y</w:t>
+      </w:r>
+    </w:p>
+    <w:p>
+      <w:pPr>
+        <w:jc w:val="center"/>
+        <w:rPr>
+          <w:rFonts w:cs="Times New Roman"/>
+        </w:rPr>
+      </w:pPr>
+      <w:r>
+        <w:rPr>
+          <w:rFonts w:cs="Times New Roman"/>
+        </w:rPr>
+        <w:t>confiabilidad de una receta basándose en las experiencias, res</w:t>
+      </w:r>
+      <w:r>
+        <w:rPr>
+          <w:rFonts w:cs="Times New Roman"/>
+        </w:rPr>
+        <w:t xml:space="preserve">eñas y calificaciones otorgadas </w:t>
+      </w:r>
+      <w:r>
+        <w:rPr>
+          <w:rFonts w:cs="Times New Roman"/>
+        </w:rPr>
+        <w:t>previamente por otros cocineros.</w:t>
+      </w:r>
+    </w:p>
+    <w:p>
+      <w:pPr>
+        <w:jc w:val="center"/>
+        <w:rPr>
+          <w:rFonts w:cs="Times New Roman"/>
+        </w:rPr>
+      </w:pPr>
+      <w:r>
+        <w:rPr>
+          <w:rFonts w:cs="Times New Roman"/>
+        </w:rPr>
+        <w:t>Reporte de Contenido: Mecanismo mediante el cual los miembros de la comunidad</w:t>
+      </w:r>
+    </w:p>
+    <w:p>
+      <w:pPr>
+        <w:jc w:val="center"/>
+        <w:rPr>
+          <w:rFonts w:cs="Times New Roman"/>
+        </w:rPr>
+      </w:pPr>
+      <w:r>
+        <w:rPr>
+          <w:rFonts w:cs="Times New Roman"/>
+        </w:rPr>
+        <w:t>notifican a la plataforma sobre comentarios o publicaciones que incumplen las normas de</w:t>
+      </w:r>
+    </w:p>
+    <w:p>
+      <w:pPr>
+        <w:jc w:val="center"/>
+        <w:rPr>
+          <w:rFonts w:cs="Times New Roman"/>
+        </w:rPr>
+      </w:pPr>
+      <w:r>
+        <w:rPr>
+          <w:rFonts w:cs="Times New Roman"/>
+        </w:rPr>
+        <w:t>convivencia o afectan la calidad del recetario.</w:t>
+      </w:r>
+    </w:p>
+    <w:p>
+      <w:pPr>
+        <w:jc w:val="center"/>
+        <w:rPr>
+          <w:rFonts w:cs="Times New Roman"/>
+        </w:rPr>
+      </w:pPr>
+      <w:r>
+        <w:rPr>
+          <w:rFonts w:cs="Times New Roman"/>
+        </w:rPr>
+        <w:t>Reseña / Comentario Constructivo: Retroalimentación en texto que aporta valor</w:t>
+      </w:r>
+    </w:p>
+    <w:p>
+      <w:pPr>
+        <w:jc w:val="center"/>
+        <w:rPr>
+          <w:rFonts w:cs="Times New Roman"/>
+        </w:rPr>
+      </w:pPr>
+      <w:r>
+        <w:rPr>
+          <w:rFonts w:cs="Times New Roman"/>
+        </w:rPr>
+        <w:t>adicional a una receta, sugiriendo posibles sustituciones de ingredientes, variaciones de tiempo o</w:t>
+      </w:r>
+    </w:p>
+    <w:p>
+      <w:pPr>
+        <w:jc w:val="center"/>
+        <w:rPr>
+          <w:rFonts w:cs="Times New Roman"/>
+        </w:rPr>
+      </w:pPr>
+      <w:r>
+        <w:rPr>
+          <w:rFonts w:cs="Times New Roman"/>
+        </w:rPr>
+        <w:t>niveles reales de dificultad.</w:t>
+      </w:r>
     </w:p>
     <w:p>
       <w:pPr>
@@ -3449,12 +4130,6 @@
           <w:rFonts w:cs="Times New Roman"/>
         </w:rPr>
       </w:pPr>
-      <w:r>
-        <w:rPr>
-          <w:rFonts w:cs="Times New Roman"/>
-        </w:rPr>
-        <w:br w:type="page"/>
-      </w:r>
     </w:p>
     <w:p>
       <w:pPr>
@@ -3489,184 +4164,792 @@
     </w:p>
     <w:p>
       <w:pPr>
-        <w:jc w:val="center"/>
-        <w:rPr>
-          <w:rFonts w:cs="Times New Roman"/>
-        </w:rPr>
-      </w:pPr>
-    </w:p>
-    <w:p>
-      <w:pPr>
-        <w:jc w:val="center"/>
-        <w:rPr>
-          <w:rFonts w:cs="Times New Roman"/>
-        </w:rPr>
-      </w:pPr>
-    </w:p>
-    <w:p>
-      <w:pPr>
-        <w:jc w:val="center"/>
-        <w:rPr>
-          <w:rFonts w:cs="Times New Roman"/>
-        </w:rPr>
-      </w:pPr>
-    </w:p>
-    <w:p>
-      <w:pPr>
-        <w:jc w:val="center"/>
-        <w:rPr>
-          <w:rFonts w:cs="Times New Roman"/>
-        </w:rPr>
-      </w:pPr>
-    </w:p>
-    <w:p>
-      <w:pPr>
-        <w:jc w:val="center"/>
-        <w:rPr>
-          <w:rFonts w:cs="Times New Roman"/>
-        </w:rPr>
-      </w:pPr>
-    </w:p>
-    <w:p>
-      <w:pPr>
-        <w:jc w:val="center"/>
-        <w:rPr>
-          <w:rFonts w:cs="Times New Roman"/>
-        </w:rPr>
-      </w:pPr>
-    </w:p>
-    <w:p>
-      <w:pPr>
-        <w:jc w:val="center"/>
-        <w:rPr>
-          <w:rFonts w:cs="Times New Roman"/>
-        </w:rPr>
-      </w:pPr>
-    </w:p>
-    <w:p>
-      <w:pPr>
-        <w:jc w:val="center"/>
-        <w:rPr>
-          <w:rFonts w:cs="Times New Roman"/>
-        </w:rPr>
-      </w:pPr>
-    </w:p>
-    <w:p>
-      <w:pPr>
-        <w:jc w:val="center"/>
-        <w:rPr>
-          <w:rFonts w:cs="Times New Roman"/>
-        </w:rPr>
-      </w:pPr>
-    </w:p>
-    <w:p>
-      <w:pPr>
-        <w:jc w:val="center"/>
-        <w:rPr>
-          <w:rFonts w:cs="Times New Roman"/>
-        </w:rPr>
-      </w:pPr>
-    </w:p>
-    <w:p>
-      <w:pPr>
-        <w:jc w:val="center"/>
-        <w:rPr>
-          <w:rFonts w:cs="Times New Roman"/>
-        </w:rPr>
-      </w:pPr>
-    </w:p>
-    <w:p>
-      <w:pPr>
-        <w:jc w:val="center"/>
-        <w:rPr>
-          <w:rFonts w:cs="Times New Roman"/>
-        </w:rPr>
-      </w:pPr>
-    </w:p>
-    <w:p>
-      <w:pPr>
-        <w:jc w:val="center"/>
-        <w:rPr>
-          <w:rFonts w:cs="Times New Roman"/>
-        </w:rPr>
-      </w:pPr>
-    </w:p>
-    <w:p>
-      <w:pPr>
-        <w:jc w:val="center"/>
-        <w:rPr>
-          <w:rFonts w:cs="Times New Roman"/>
-        </w:rPr>
-      </w:pPr>
-    </w:p>
-    <w:p>
-      <w:pPr>
-        <w:jc w:val="center"/>
-        <w:rPr>
-          <w:rFonts w:cs="Times New Roman"/>
-        </w:rPr>
-      </w:pPr>
-    </w:p>
-    <w:p>
-      <w:pPr>
-        <w:jc w:val="center"/>
-        <w:rPr>
-          <w:rFonts w:cs="Times New Roman"/>
-        </w:rPr>
-      </w:pPr>
-    </w:p>
-    <w:p>
-      <w:pPr>
-        <w:jc w:val="center"/>
-        <w:rPr>
-          <w:rFonts w:cs="Times New Roman"/>
-        </w:rPr>
-      </w:pPr>
-    </w:p>
-    <w:p>
-      <w:pPr>
-        <w:jc w:val="center"/>
-        <w:rPr>
-          <w:rFonts w:cs="Times New Roman"/>
-        </w:rPr>
-      </w:pPr>
-    </w:p>
-    <w:p>
-      <w:pPr>
-        <w:jc w:val="center"/>
-        <w:rPr>
-          <w:rFonts w:cs="Times New Roman"/>
-        </w:rPr>
-      </w:pPr>
-    </w:p>
-    <w:p>
-      <w:pPr>
-        <w:jc w:val="center"/>
-        <w:rPr>
-          <w:rFonts w:cs="Times New Roman"/>
-        </w:rPr>
-      </w:pPr>
-    </w:p>
-    <w:p>
-      <w:pPr>
-        <w:jc w:val="center"/>
-        <w:rPr>
-          <w:rFonts w:cs="Times New Roman"/>
-        </w:rPr>
-      </w:pPr>
-    </w:p>
-    <w:p>
-      <w:pPr>
-        <w:jc w:val="center"/>
-        <w:rPr>
-          <w:rFonts w:cs="Times New Roman"/>
-        </w:rPr>
-      </w:pPr>
-      <w:r>
-        <w:rPr>
-          <w:rFonts w:cs="Times New Roman"/>
+        <w:ind w:firstLine="0"/>
+        <w:rPr>
+          <w:rFonts w:cs="Times New Roman"/>
+        </w:rPr>
+      </w:pPr>
+      <w:r>
+        <w:rPr>
+          <w:rFonts w:cs="Times New Roman"/>
+          <w:lang w:val="en-US"/>
+        </w:rPr>
+        <w:t xml:space="preserve">Anderson, L. W., &amp; Krathwohl, D. R. (2001). </w:t>
+      </w:r>
+      <w:r>
+        <w:rPr>
+          <w:rFonts w:cs="Times New Roman"/>
+          <w:lang w:val="en-US"/>
+        </w:rPr>
+        <w:t xml:space="preserve">A Taxonomy for Learning, Teaching, and Assessing: A Revision of Bloom's Taxonomy of Educational Objectives. </w:t>
+      </w:r>
+      <w:proofErr w:type="spellStart"/>
+      <w:r>
+        <w:rPr>
+          <w:rFonts w:cs="Times New Roman"/>
+        </w:rPr>
+        <w:t>Longman</w:t>
+      </w:r>
+      <w:proofErr w:type="spellEnd"/>
+      <w:r>
+        <w:rPr>
+          <w:rFonts w:cs="Times New Roman"/>
+        </w:rPr>
+        <w:t>.</w:t>
+      </w:r>
+    </w:p>
+    <w:p>
+      <w:pPr>
+        <w:ind w:firstLine="0"/>
+        <w:rPr>
+          <w:rFonts w:cs="Times New Roman"/>
+        </w:rPr>
+      </w:pPr>
+    </w:p>
+    <w:p>
+      <w:pPr>
+        <w:ind w:firstLine="0"/>
+        <w:rPr>
+          <w:rFonts w:cs="Times New Roman"/>
+        </w:rPr>
+      </w:pPr>
+      <w:r>
+        <w:rPr>
+          <w:rFonts w:cs="Times New Roman"/>
+        </w:rPr>
+        <w:t>taxonomía de Bloom utilizada en los objetivos.</w:t>
+      </w:r>
+    </w:p>
+    <w:p>
+      <w:pPr>
+        <w:ind w:firstLine="0"/>
+        <w:rPr>
+          <w:rFonts w:cs="Times New Roman"/>
+          <w:lang w:val="en-US"/>
+        </w:rPr>
+      </w:pPr>
+      <w:r>
+        <w:rPr>
+          <w:rFonts w:cs="Times New Roman"/>
+        </w:rPr>
+        <w:t xml:space="preserve">International </w:t>
+      </w:r>
+      <w:proofErr w:type="spellStart"/>
+      <w:r>
+        <w:rPr>
+          <w:rFonts w:cs="Times New Roman"/>
+        </w:rPr>
+        <w:t>Organization</w:t>
+      </w:r>
+      <w:proofErr w:type="spellEnd"/>
+      <w:r>
+        <w:rPr>
+          <w:rFonts w:cs="Times New Roman"/>
+        </w:rPr>
+        <w:t xml:space="preserve"> </w:t>
+      </w:r>
+      <w:proofErr w:type="spellStart"/>
+      <w:r>
+        <w:rPr>
+          <w:rFonts w:cs="Times New Roman"/>
+        </w:rPr>
+        <w:t>for</w:t>
+      </w:r>
+      <w:proofErr w:type="spellEnd"/>
+      <w:r>
+        <w:rPr>
+          <w:rFonts w:cs="Times New Roman"/>
+        </w:rPr>
+        <w:t xml:space="preserve"> </w:t>
+      </w:r>
+      <w:proofErr w:type="spellStart"/>
+      <w:r>
+        <w:rPr>
+          <w:rFonts w:cs="Times New Roman"/>
+        </w:rPr>
+        <w:t>Standardization</w:t>
+      </w:r>
+      <w:proofErr w:type="spellEnd"/>
+      <w:r>
+        <w:rPr>
+          <w:rFonts w:cs="Times New Roman"/>
+        </w:rPr>
+        <w:t xml:space="preserve">. </w:t>
+      </w:r>
+      <w:r>
+        <w:rPr>
+          <w:rFonts w:cs="Times New Roman"/>
+          <w:lang w:val="en-US"/>
+        </w:rPr>
+        <w:t>(2018). ISO/IEC/IEEE 29148:2018: Systems and software engineering — Life cycle processes — Requirements engineering.</w:t>
+      </w:r>
+    </w:p>
+    <w:p>
+      <w:pPr>
+        <w:ind w:firstLine="0"/>
+        <w:rPr>
+          <w:rFonts w:cs="Times New Roman"/>
+          <w:lang w:val="en-US"/>
+        </w:rPr>
+      </w:pPr>
+    </w:p>
+    <w:p>
+      <w:pPr>
+        <w:ind w:firstLine="0"/>
+        <w:rPr>
+          <w:rFonts w:cs="Times New Roman"/>
+        </w:rPr>
+      </w:pPr>
+      <w:r>
+        <w:rPr>
+          <w:rFonts w:cs="Times New Roman"/>
+        </w:rPr>
+        <w:t>ingeniería de requisitos, incluyendo identificación, documentación y gestión de requisitos.</w:t>
+      </w:r>
+    </w:p>
+    <w:p>
+      <w:pPr>
+        <w:ind w:firstLine="0"/>
+        <w:rPr>
+          <w:rFonts w:cs="Times New Roman"/>
+          <w:lang w:val="en-US"/>
+        </w:rPr>
+      </w:pPr>
+      <w:r>
+        <w:rPr>
+          <w:rFonts w:cs="Times New Roman"/>
+          <w:lang w:val="en-US"/>
+        </w:rPr>
+        <w:t>Project Management Institute. (2021).</w:t>
+      </w:r>
+    </w:p>
+    <w:p>
+      <w:pPr>
+        <w:ind w:firstLine="0"/>
+        <w:rPr>
+          <w:rFonts w:cs="Times New Roman"/>
+        </w:rPr>
+      </w:pPr>
+      <w:r>
+        <w:rPr>
+          <w:rFonts w:cs="Times New Roman"/>
+          <w:lang w:val="en-US"/>
+        </w:rPr>
+        <w:t xml:space="preserve">A Guide to the Project Management Body of Knowledge (PMBOK® Guide) – Seventh Edition. </w:t>
+      </w:r>
+      <w:r>
+        <w:rPr>
+          <w:rFonts w:cs="Times New Roman"/>
+        </w:rPr>
+        <w:t xml:space="preserve">Project Management </w:t>
+      </w:r>
+      <w:proofErr w:type="spellStart"/>
+      <w:r>
+        <w:rPr>
+          <w:rFonts w:cs="Times New Roman"/>
+        </w:rPr>
+        <w:t>Institute</w:t>
+      </w:r>
+      <w:proofErr w:type="spellEnd"/>
+      <w:r>
+        <w:rPr>
+          <w:rFonts w:cs="Times New Roman"/>
+        </w:rPr>
+        <w:t>.</w:t>
+      </w:r>
+    </w:p>
+    <w:p>
+      <w:pPr>
+        <w:ind w:firstLine="0"/>
+        <w:rPr>
+          <w:rFonts w:cs="Times New Roman"/>
+        </w:rPr>
+      </w:pPr>
+    </w:p>
+    <w:p>
+      <w:pPr>
+        <w:ind w:firstLine="0"/>
+        <w:rPr>
+          <w:rFonts w:cs="Times New Roman"/>
+        </w:rPr>
+      </w:pPr>
+      <w:r>
+        <w:rPr>
+          <w:rFonts w:cs="Times New Roman"/>
+        </w:rPr>
+        <w:t>conceptos relacionados con alcance del proyecto.</w:t>
+      </w:r>
+    </w:p>
+    <w:p>
+      <w:pPr>
+        <w:ind w:firstLine="0"/>
+        <w:rPr>
+          <w:rFonts w:cs="Times New Roman"/>
+          <w:lang w:val="en-US"/>
+        </w:rPr>
+      </w:pPr>
+      <w:proofErr w:type="spellStart"/>
+      <w:r>
+        <w:rPr>
+          <w:rFonts w:cs="Times New Roman"/>
+        </w:rPr>
+        <w:t>Sommerville</w:t>
+      </w:r>
+      <w:proofErr w:type="spellEnd"/>
+      <w:r>
+        <w:rPr>
+          <w:rFonts w:cs="Times New Roman"/>
+        </w:rPr>
+        <w:t xml:space="preserve">, I. (2016). </w:t>
+      </w:r>
+      <w:r>
+        <w:rPr>
+          <w:rFonts w:cs="Times New Roman"/>
+          <w:lang w:val="en-US"/>
+        </w:rPr>
+        <w:t>Software Engineering (10th ed.). Pearson.</w:t>
+      </w:r>
+    </w:p>
+    <w:p>
+      <w:pPr>
+        <w:ind w:firstLine="0"/>
+        <w:rPr>
+          <w:rFonts w:cs="Times New Roman"/>
+          <w:lang w:val="en-US"/>
+        </w:rPr>
+      </w:pPr>
+    </w:p>
+    <w:p>
+      <w:pPr>
+        <w:ind w:firstLine="0"/>
+        <w:rPr>
+          <w:rFonts w:cs="Times New Roman"/>
+          <w:lang w:val="en-US"/>
+        </w:rPr>
+      </w:pPr>
+    </w:p>
+    <w:p>
+      <w:pPr>
+        <w:ind w:firstLine="0"/>
+        <w:rPr>
+          <w:rFonts w:cs="Times New Roman"/>
+          <w:lang w:val="en-US"/>
+        </w:rPr>
+      </w:pPr>
+      <w:r>
+        <w:rPr>
+          <w:rFonts w:cs="Times New Roman"/>
+          <w:lang w:val="en-US"/>
+        </w:rPr>
+        <w:t>Bloom's Taxonomy - Cornell University</w:t>
+      </w:r>
+    </w:p>
+    <w:p>
+      <w:pPr>
+        <w:ind w:firstLine="0"/>
+        <w:rPr>
+          <w:rFonts w:cs="Times New Roman"/>
+          <w:lang w:val="en-US"/>
+        </w:rPr>
+      </w:pPr>
+      <w:r>
+        <w:rPr>
+          <w:rFonts w:cs="Times New Roman"/>
+          <w:lang w:val="en-US"/>
+        </w:rPr>
+        <w:t>https://teaching.cornell.edu/resource/blooms-taxonomy?utm_source=chatgpt.com</w:t>
+      </w:r>
+    </w:p>
+    <w:p>
+      <w:pPr>
+        <w:ind w:firstLine="0"/>
+        <w:rPr>
+          <w:rFonts w:cs="Times New Roman"/>
+          <w:lang w:val="en-US"/>
+        </w:rPr>
+      </w:pPr>
+    </w:p>
+    <w:p>
+      <w:pPr>
+        <w:ind w:firstLine="0"/>
+        <w:rPr>
+          <w:rFonts w:cs="Times New Roman"/>
+          <w:lang w:val="en-US"/>
+        </w:rPr>
+      </w:pPr>
+    </w:p>
+    <w:p>
+      <w:pPr>
+        <w:ind w:firstLine="0"/>
+        <w:rPr>
+          <w:rFonts w:cs="Times New Roman"/>
+          <w:lang w:val="en-US"/>
+        </w:rPr>
+      </w:pPr>
+      <w:proofErr w:type="spellStart"/>
+      <w:r>
+        <w:rPr>
+          <w:rFonts w:cs="Times New Roman"/>
+          <w:lang w:val="en-US"/>
+        </w:rPr>
+        <w:t>Libro</w:t>
+      </w:r>
+      <w:proofErr w:type="spellEnd"/>
+      <w:r>
+        <w:rPr>
+          <w:rFonts w:cs="Times New Roman"/>
+          <w:lang w:val="en-US"/>
+        </w:rPr>
+        <w:t xml:space="preserve"> de Anderson y </w:t>
+      </w:r>
+      <w:proofErr w:type="spellStart"/>
+      <w:r>
+        <w:rPr>
+          <w:rFonts w:cs="Times New Roman"/>
+          <w:lang w:val="en-US"/>
+        </w:rPr>
+        <w:t>Krathwohl</w:t>
+      </w:r>
+      <w:proofErr w:type="spellEnd"/>
+      <w:r>
+        <w:rPr>
+          <w:rFonts w:cs="Times New Roman"/>
+          <w:lang w:val="en-US"/>
+        </w:rPr>
+        <w:t xml:space="preserve"> (2001) - Library of Congress</w:t>
+      </w:r>
+    </w:p>
+    <w:p>
+      <w:pPr>
+        <w:ind w:firstLine="0"/>
+        <w:rPr>
+          <w:rFonts w:cs="Times New Roman"/>
+          <w:lang w:val="en-US"/>
+        </w:rPr>
+      </w:pPr>
+      <w:r>
+        <w:rPr>
+          <w:rFonts w:cs="Times New Roman"/>
+          <w:lang w:val="en-US"/>
         </w:rPr>
         <w:lastRenderedPageBreak/>
+        <w:t>https://www.loc.gov/item/00063423/?utm_source=chatgpt.com</w:t>
+      </w:r>
+    </w:p>
+    <w:p>
+      <w:pPr>
+        <w:ind w:firstLine="0"/>
+        <w:rPr>
+          <w:rFonts w:cs="Times New Roman"/>
+          <w:lang w:val="en-US"/>
+        </w:rPr>
+      </w:pPr>
+    </w:p>
+    <w:p>
+      <w:pPr>
+        <w:ind w:firstLine="0"/>
+        <w:rPr>
+          <w:rFonts w:cs="Times New Roman"/>
+          <w:lang w:val="en-US"/>
+        </w:rPr>
+      </w:pPr>
+    </w:p>
+    <w:p>
+      <w:pPr>
+        <w:ind w:firstLine="0"/>
+        <w:rPr>
+          <w:rFonts w:cs="Times New Roman"/>
+        </w:rPr>
+      </w:pPr>
+      <w:r>
+        <w:rPr>
+          <w:rFonts w:cs="Times New Roman"/>
+        </w:rPr>
+        <w:t>2. Ingeniería de requisitos</w:t>
+      </w:r>
+    </w:p>
+    <w:p>
+      <w:pPr>
+        <w:ind w:firstLine="0"/>
+        <w:rPr>
+          <w:rFonts w:cs="Times New Roman"/>
+        </w:rPr>
+      </w:pPr>
+      <w:r>
+        <w:rPr>
+          <w:rFonts w:cs="Times New Roman"/>
+        </w:rPr>
+        <w:t>ISO/IEC/IEEE 29148:2018 - ISO oficial</w:t>
+      </w:r>
+    </w:p>
+    <w:p>
+      <w:pPr>
+        <w:ind w:firstLine="0"/>
+        <w:rPr>
+          <w:rFonts w:cs="Times New Roman"/>
+        </w:rPr>
+      </w:pPr>
+      <w:r>
+        <w:rPr>
+          <w:rFonts w:cs="Times New Roman"/>
+        </w:rPr>
+        <w:t>https://www.iso.org/standard/72089.html?utm_source=chatgpt.com</w:t>
+      </w:r>
+    </w:p>
+    <w:p>
+      <w:pPr>
+        <w:ind w:firstLine="0"/>
+        <w:rPr>
+          <w:rFonts w:cs="Times New Roman"/>
+        </w:rPr>
+      </w:pPr>
+    </w:p>
+    <w:p>
+      <w:pPr>
+        <w:ind w:firstLine="0"/>
+        <w:rPr>
+          <w:rFonts w:cs="Times New Roman"/>
+        </w:rPr>
+      </w:pPr>
+    </w:p>
+    <w:p>
+      <w:pPr>
+        <w:ind w:firstLine="0"/>
+        <w:rPr>
+          <w:rFonts w:cs="Times New Roman"/>
+        </w:rPr>
+      </w:pPr>
+      <w:r>
+        <w:rPr>
+          <w:rFonts w:cs="Times New Roman"/>
+        </w:rPr>
+        <w:t>Vista previa ISO 29148</w:t>
+      </w:r>
+    </w:p>
+    <w:p>
+      <w:pPr>
+        <w:ind w:firstLine="0"/>
+        <w:rPr>
+          <w:rFonts w:cs="Times New Roman"/>
+        </w:rPr>
+      </w:pPr>
+      <w:r>
+        <w:rPr>
+          <w:rFonts w:cs="Times New Roman"/>
+        </w:rPr>
+        <w:t>https://www.iso.org/obp/ui?_escaped_fragment_=iso:std:iso-iec-ieee:29148:ed-2:v1:en&amp;utm_source=chatgpt.com</w:t>
+      </w:r>
+    </w:p>
+    <w:p>
+      <w:pPr>
+        <w:ind w:firstLine="0"/>
+        <w:rPr>
+          <w:rFonts w:cs="Times New Roman"/>
+        </w:rPr>
+      </w:pPr>
+    </w:p>
+    <w:p>
+      <w:pPr>
+        <w:ind w:firstLine="0"/>
+        <w:rPr>
+          <w:rFonts w:cs="Times New Roman"/>
+          <w:lang w:val="en-US"/>
+        </w:rPr>
+      </w:pPr>
+      <w:r>
+        <w:rPr>
+          <w:rFonts w:cs="Times New Roman"/>
+          <w:lang w:val="en-US"/>
+        </w:rPr>
+        <w:t>IEEE 29148:2018</w:t>
+      </w:r>
+    </w:p>
+    <w:p>
+      <w:pPr>
+        <w:ind w:firstLine="0"/>
+        <w:rPr>
+          <w:rFonts w:cs="Times New Roman"/>
+          <w:lang w:val="en-US"/>
+        </w:rPr>
+      </w:pPr>
+      <w:r>
+        <w:rPr>
+          <w:rFonts w:cs="Times New Roman"/>
+          <w:lang w:val="en-US"/>
+        </w:rPr>
+        <w:t>https://ieeexplore.ieee.org/document/8559686/amendments?signout=success&amp;utm_source=chatgpt.com#amendments</w:t>
+      </w:r>
+    </w:p>
+    <w:p>
+      <w:pPr>
+        <w:ind w:firstLine="0"/>
+        <w:rPr>
+          <w:rFonts w:cs="Times New Roman"/>
+          <w:lang w:val="en-US"/>
+        </w:rPr>
+      </w:pPr>
+      <w:r>
+        <w:rPr>
+          <w:rFonts w:cs="Times New Roman"/>
+          <w:lang w:val="en-US"/>
+        </w:rPr>
+        <w:t>https://app.diagrams.net/</w:t>
+      </w:r>
+    </w:p>
+    <w:p>
+      <w:pPr>
+        <w:ind w:firstLine="0"/>
+        <w:rPr>
+          <w:rFonts w:cs="Times New Roman"/>
+          <w:lang w:val="en-US"/>
+        </w:rPr>
+      </w:pPr>
+    </w:p>
+    <w:p>
+      <w:pPr>
+        <w:ind w:firstLine="0"/>
+        <w:rPr>
+          <w:rFonts w:cs="Times New Roman"/>
+          <w:lang w:val="en-US"/>
+        </w:rPr>
+      </w:pPr>
+      <w:r>
+        <w:rPr>
+          <w:rFonts w:cs="Times New Roman"/>
+          <w:lang w:val="en-US"/>
+        </w:rPr>
+        <w:t>https://gemini.google.com/app/3a7c9b8c441955ac?hl=es</w:t>
+      </w:r>
+      <w:bookmarkStart w:id="16" w:name="_GoBack"/>
+      <w:bookmarkEnd w:id="16"/>
+    </w:p>
+    <w:p>
+      <w:pPr>
+        <w:jc w:val="center"/>
+        <w:rPr>
+          <w:rFonts w:cs="Times New Roman"/>
+          <w:lang w:val="en-US"/>
+        </w:rPr>
+      </w:pPr>
+    </w:p>
+    <w:p>
+      <w:pPr>
+        <w:jc w:val="center"/>
+        <w:rPr>
+          <w:rFonts w:cs="Times New Roman"/>
+          <w:lang w:val="en-US"/>
+        </w:rPr>
+      </w:pPr>
+    </w:p>
+    <w:p>
+      <w:pPr>
+        <w:jc w:val="center"/>
+        <w:rPr>
+          <w:rFonts w:cs="Times New Roman"/>
+          <w:lang w:val="en-US"/>
+        </w:rPr>
+      </w:pPr>
+    </w:p>
+    <w:p>
+      <w:pPr>
+        <w:jc w:val="center"/>
+        <w:rPr>
+          <w:rFonts w:cs="Times New Roman"/>
+          <w:lang w:val="en-US"/>
+        </w:rPr>
+      </w:pPr>
+    </w:p>
+    <w:p>
+      <w:pPr>
+        <w:jc w:val="center"/>
+        <w:rPr>
+          <w:rFonts w:cs="Times New Roman"/>
+          <w:lang w:val="en-US"/>
+        </w:rPr>
+      </w:pPr>
+    </w:p>
+    <w:p>
+      <w:pPr>
+        <w:jc w:val="center"/>
+        <w:rPr>
+          <w:rFonts w:cs="Times New Roman"/>
+          <w:lang w:val="en-US"/>
+        </w:rPr>
+      </w:pPr>
+    </w:p>
+    <w:p>
+      <w:pPr>
+        <w:jc w:val="center"/>
+        <w:rPr>
+          <w:rFonts w:cs="Times New Roman"/>
+          <w:lang w:val="en-US"/>
+        </w:rPr>
+      </w:pPr>
+    </w:p>
+    <w:p>
+      <w:pPr>
+        <w:jc w:val="center"/>
+        <w:rPr>
+          <w:rFonts w:cs="Times New Roman"/>
+          <w:lang w:val="en-US"/>
+        </w:rPr>
+      </w:pPr>
+    </w:p>
+    <w:p>
+      <w:pPr>
+        <w:jc w:val="center"/>
+        <w:rPr>
+          <w:rFonts w:cs="Times New Roman"/>
+          <w:lang w:val="en-US"/>
+        </w:rPr>
+      </w:pPr>
+    </w:p>
+    <w:p>
+      <w:pPr>
+        <w:jc w:val="center"/>
+        <w:rPr>
+          <w:rFonts w:cs="Times New Roman"/>
+          <w:lang w:val="en-US"/>
+        </w:rPr>
+      </w:pPr>
+    </w:p>
+    <w:p>
+      <w:pPr>
+        <w:jc w:val="center"/>
+        <w:rPr>
+          <w:rFonts w:cs="Times New Roman"/>
+          <w:lang w:val="en-US"/>
+        </w:rPr>
+      </w:pPr>
+    </w:p>
+    <w:p>
+      <w:pPr>
+        <w:jc w:val="center"/>
+        <w:rPr>
+          <w:rFonts w:cs="Times New Roman"/>
+          <w:lang w:val="en-US"/>
+        </w:rPr>
+      </w:pPr>
+    </w:p>
+    <w:p>
+      <w:pPr>
+        <w:jc w:val="center"/>
+        <w:rPr>
+          <w:rFonts w:cs="Times New Roman"/>
+          <w:lang w:val="en-US"/>
+        </w:rPr>
+      </w:pPr>
+    </w:p>
+    <w:p>
+      <w:pPr>
+        <w:jc w:val="center"/>
+        <w:rPr>
+          <w:rFonts w:cs="Times New Roman"/>
+          <w:lang w:val="en-US"/>
+        </w:rPr>
+      </w:pPr>
+    </w:p>
+    <w:p>
+      <w:pPr>
+        <w:jc w:val="center"/>
+        <w:rPr>
+          <w:rFonts w:cs="Times New Roman"/>
+          <w:lang w:val="en-US"/>
+        </w:rPr>
+      </w:pPr>
+    </w:p>
+    <w:p>
+      <w:pPr>
+        <w:jc w:val="center"/>
+        <w:rPr>
+          <w:rFonts w:cs="Times New Roman"/>
+          <w:lang w:val="en-US"/>
+        </w:rPr>
+      </w:pPr>
+    </w:p>
+    <w:p>
+      <w:pPr>
+        <w:jc w:val="center"/>
+        <w:rPr>
+          <w:rFonts w:cs="Times New Roman"/>
+          <w:lang w:val="en-US"/>
+        </w:rPr>
+      </w:pPr>
+    </w:p>
+    <w:p>
+      <w:pPr>
+        <w:jc w:val="center"/>
+        <w:rPr>
+          <w:rFonts w:cs="Times New Roman"/>
+          <w:lang w:val="en-US"/>
+        </w:rPr>
+      </w:pPr>
+    </w:p>
+    <w:p>
+      <w:pPr>
+        <w:jc w:val="center"/>
+        <w:rPr>
+          <w:rFonts w:cs="Times New Roman"/>
+          <w:lang w:val="en-US"/>
+        </w:rPr>
+      </w:pPr>
+    </w:p>
+    <w:p>
+      <w:pPr>
+        <w:jc w:val="center"/>
+        <w:rPr>
+          <w:rFonts w:cs="Times New Roman"/>
+          <w:lang w:val="en-US"/>
+        </w:rPr>
+      </w:pPr>
+    </w:p>
+    <w:p>
+      <w:pPr>
+        <w:jc w:val="center"/>
+        <w:rPr>
+          <w:rFonts w:cs="Times New Roman"/>
+          <w:lang w:val="en-US"/>
+        </w:rPr>
+      </w:pPr>
+    </w:p>
+    <w:p>
+      <w:pPr>
+        <w:jc w:val="center"/>
+        <w:rPr>
+          <w:rFonts w:cs="Times New Roman"/>
+          <w:lang w:val="en-US"/>
+        </w:rPr>
+      </w:pPr>
+    </w:p>
+    <w:p>
+      <w:pPr>
+        <w:jc w:val="center"/>
+        <w:rPr>
+          <w:rFonts w:cs="Times New Roman"/>
+          <w:lang w:val="en-US"/>
+        </w:rPr>
+      </w:pPr>
+    </w:p>
+    <w:p>
+      <w:pPr>
+        <w:jc w:val="center"/>
+        <w:rPr>
+          <w:rFonts w:cs="Times New Roman"/>
+          <w:lang w:val="en-US"/>
+        </w:rPr>
+      </w:pPr>
+    </w:p>
+    <w:p>
+      <w:pPr>
+        <w:jc w:val="center"/>
+        <w:rPr>
+          <w:rFonts w:cs="Times New Roman"/>
+        </w:rPr>
+      </w:pPr>
+      <w:r>
+        <w:rPr>
+          <w:rFonts w:cs="Times New Roman"/>
+        </w:rPr>
         <w:t>Reglamentación y Condiciones Legales</w:t>
       </w:r>
     </w:p>
@@ -3865,7 +5148,7 @@
 </file>
 
 <file path=word/numbering.xml><?xml version="1.0" encoding="utf-8"?>
-<w:numbering xmlns:wpc="http://schemas.microsoft.com/office/word/2010/wordprocessingCanvas" xmlns:cx="http://schemas.microsoft.com/office/drawing/2014/chartex" xmlns:cx1="http://schemas.microsoft.com/office/drawing/2015/9/8/chartex" xmlns:cx2="http://schemas.microsoft.com/office/drawing/2015/10/21/chartex" xmlns:cx3="http://schemas.microsoft.com/office/drawing/2016/5/9/chartex" xmlns:cx4="http://schemas.microsoft.com/office/drawing/2016/5/10/chartex" xmlns:cx5="http://schemas.microsoft.com/office/drawing/2016/5/11/chartex" xmlns:cx6="http://schemas.microsoft.com/office/drawing/2016/5/12/chartex" xmlns:cx7="http://schemas.microsoft.com/office/drawing/2016/5/13/chartex" xmlns:cx8="http://schemas.microsoft.com/office/drawing/2016/5/14/chartex" xmlns:mc="http://schemas.openxmlformats.org/markup-compatibility/2006" xmlns:aink="http://schemas.microsoft.com/office/drawing/2016/ink" xmlns:am3d="http://schemas.microsoft.com/office/drawing/2017/model3d" xmlns:o="urn:schemas-microsoft-com:office:office" xmlns:oel="http://schemas.microsoft.com/office/2019/extlst" xmlns:r="http://schemas.openxmlformats.org/officeDocument/2006/relationships" xmlns:m="http://schemas.openxmlformats.org/officeDocument/2006/math" xmlns:v="urn:schemas-microsoft-com:vml" xmlns:wp14="http://schemas.microsoft.com/office/word/2010/wordprocessingDrawing" xmlns:wp="http://schemas.openxmlformats.org/drawingml/2006/wordprocessingDrawing" xmlns:w10="urn:schemas-microsoft-com:office:word" xmlns:w="http://schemas.openxmlformats.org/wordprocessingml/2006/main" xmlns:w14="http://schemas.microsoft.com/office/word/2010/wordml" xmlns:w15="http://schemas.microsoft.com/office/word/2012/wordml" xmlns:w16cex="http://schemas.microsoft.com/office/word/2018/wordml/cex" xmlns:w16cid="http://schemas.microsoft.com/office/word/2016/wordml/cid" xmlns:w16="http://schemas.microsoft.com/office/word/2018/wordml" xmlns:w16du="http://schemas.microsoft.com/office/word/2023/wordml/word16du" xmlns:w16sdtdh="http://schemas.microsoft.com/office/word/2020/wordml/sdtdatahash" xmlns:w16se="http://schemas.microsoft.com/office/word/2015/wordml/symex" xmlns:wpg="http://schemas.microsoft.com/office/word/2010/wordprocessingGroup" xmlns:wpi="http://schemas.microsoft.com/office/word/2010/wordprocessingInk" xmlns:wne="http://schemas.microsoft.com/office/word/2006/wordml" xmlns:wps="http://schemas.microsoft.com/office/word/2010/wordprocessingShape" mc:Ignorable="w14 w15 w16se w16cid w16 w16cex w16sdtdh w16du wp14">
+<w:numbering xmlns:wpc="http://schemas.microsoft.com/office/word/2010/wordprocessingCanvas" xmlns:cx="http://schemas.microsoft.com/office/drawing/2014/chartex" xmlns:mc="http://schemas.openxmlformats.org/markup-compatibility/2006" xmlns:o="urn:schemas-microsoft-com:office:office" xmlns:r="http://schemas.openxmlformats.org/officeDocument/2006/relationships" xmlns:m="http://schemas.openxmlformats.org/officeDocument/2006/math" xmlns:v="urn:schemas-microsoft-com:vml" xmlns:wp14="http://schemas.microsoft.com/office/word/2010/wordprocessingDrawing" xmlns:wp="http://schemas.openxmlformats.org/drawingml/2006/wordprocessingDrawing" xmlns:w10="urn:schemas-microsoft-com:office:word" xmlns:w="http://schemas.openxmlformats.org/wordprocessingml/2006/main" xmlns:w14="http://schemas.microsoft.com/office/word/2010/wordml" xmlns:w15="http://schemas.microsoft.com/office/word/2012/wordml" xmlns:w16se="http://schemas.microsoft.com/office/word/2015/wordml/symex" xmlns:wpg="http://schemas.microsoft.com/office/word/2010/wordprocessingGroup" xmlns:wpi="http://schemas.microsoft.com/office/word/2010/wordprocessingInk" xmlns:wne="http://schemas.microsoft.com/office/word/2006/wordml" xmlns:wps="http://schemas.microsoft.com/office/word/2010/wordprocessingShape" mc:Ignorable="w14 w15 w16se wp14">
   <w:abstractNum w:abstractNumId="0" w15:restartNumberingAfterBreak="0">
     <w:nsid w:val="FFFFFF89"/>
     <w:multiLevelType w:val="singleLevel"/>
@@ -4757,35 +6040,35 @@
       </w:rPr>
     </w:lvl>
   </w:abstractNum>
-  <w:num w:numId="1" w16cid:durableId="128135283">
+  <w:num w:numId="1">
     <w:abstractNumId w:val="4"/>
   </w:num>
-  <w:num w:numId="2" w16cid:durableId="21170353">
+  <w:num w:numId="2">
     <w:abstractNumId w:val="2"/>
   </w:num>
-  <w:num w:numId="3" w16cid:durableId="189268394">
+  <w:num w:numId="3">
     <w:abstractNumId w:val="1"/>
   </w:num>
-  <w:num w:numId="4" w16cid:durableId="1103454377">
+  <w:num w:numId="4">
     <w:abstractNumId w:val="3"/>
   </w:num>
-  <w:num w:numId="5" w16cid:durableId="1032073507">
+  <w:num w:numId="5">
     <w:abstractNumId w:val="5"/>
   </w:num>
-  <w:num w:numId="6" w16cid:durableId="1192379375">
+  <w:num w:numId="6">
     <w:abstractNumId w:val="7"/>
   </w:num>
-  <w:num w:numId="7" w16cid:durableId="591742390">
+  <w:num w:numId="7">
     <w:abstractNumId w:val="6"/>
   </w:num>
-  <w:num w:numId="8" w16cid:durableId="1853302657">
+  <w:num w:numId="8">
     <w:abstractNumId w:val="0"/>
   </w:num>
 </w:numbering>
 </file>
 
 <file path=word/styles.xml><?xml version="1.0" encoding="utf-8"?>
-<w:styles xmlns:mc="http://schemas.openxmlformats.org/markup-compatibility/2006" xmlns:r="http://schemas.openxmlformats.org/officeDocument/2006/relationships" xmlns:w="http://schemas.openxmlformats.org/wordprocessingml/2006/main" xmlns:w14="http://schemas.microsoft.com/office/word/2010/wordml" xmlns:w15="http://schemas.microsoft.com/office/word/2012/wordml" xmlns:w16cex="http://schemas.microsoft.com/office/word/2018/wordml/cex" xmlns:w16cid="http://schemas.microsoft.com/office/word/2016/wordml/cid" xmlns:w16="http://schemas.microsoft.com/office/word/2018/wordml" xmlns:w16du="http://schemas.microsoft.com/office/word/2023/wordml/word16du" xmlns:w16sdtdh="http://schemas.microsoft.com/office/word/2020/wordml/sdtdatahash" xmlns:w16se="http://schemas.microsoft.com/office/word/2015/wordml/symex" mc:Ignorable="w14 w15 w16se w16cid w16 w16cex w16sdtdh w16du">
+<w:styles xmlns:mc="http://schemas.openxmlformats.org/markup-compatibility/2006" xmlns:r="http://schemas.openxmlformats.org/officeDocument/2006/relationships" xmlns:w="http://schemas.openxmlformats.org/wordprocessingml/2006/main" xmlns:w14="http://schemas.microsoft.com/office/word/2010/wordml" xmlns:w15="http://schemas.microsoft.com/office/word/2012/wordml" xmlns:w16se="http://schemas.microsoft.com/office/word/2015/wordml/symex" mc:Ignorable="w14 w15 w16se">
   <w:docDefaults>
     <w:rPrDefault>
       <w:rPr>
@@ -4803,7 +6086,7 @@
       </w:pPr>
     </w:pPrDefault>
   </w:docDefaults>
-  <w:latentStyles w:defLockedState="0" w:defUIPriority="99" w:defSemiHidden="0" w:defUnhideWhenUsed="0" w:defQFormat="0" w:count="376">
+  <w:latentStyles w:defLockedState="0" w:defUIPriority="99" w:defSemiHidden="0" w:defUnhideWhenUsed="0" w:defQFormat="0" w:count="371">
     <w:lsdException w:name="Normal" w:uiPriority="0" w:qFormat="1"/>
     <w:lsdException w:name="heading 1" w:uiPriority="9" w:qFormat="1"/>
     <w:lsdException w:name="heading 2" w:semiHidden="1" w:uiPriority="9" w:unhideWhenUsed="1" w:qFormat="1"/>
@@ -5175,11 +6458,6 @@
     <w:lsdException w:name="List Table 5 Dark Accent 6" w:uiPriority="50"/>
     <w:lsdException w:name="List Table 6 Colorful Accent 6" w:uiPriority="51"/>
     <w:lsdException w:name="List Table 7 Colorful Accent 6" w:uiPriority="52"/>
-    <w:lsdException w:name="Mention" w:semiHidden="1" w:unhideWhenUsed="1"/>
-    <w:lsdException w:name="Smart Hyperlink" w:semiHidden="1" w:unhideWhenUsed="1"/>
-    <w:lsdException w:name="Hashtag" w:semiHidden="1" w:unhideWhenUsed="1"/>
-    <w:lsdException w:name="Unresolved Mention" w:semiHidden="1" w:unhideWhenUsed="1"/>
-    <w:lsdException w:name="Smart Link" w:semiHidden="1" w:unhideWhenUsed="1"/>
   </w:latentStyles>
   <w:style w:type="paragraph" w:default="1" w:styleId="Normal">
     <w:name w:val="Normal"/>
@@ -6251,7 +7529,7 @@
 </file>
 
 <file path=customXml/itemProps1.xml><?xml version="1.0" encoding="utf-8"?>
-<ds:datastoreItem xmlns:ds="http://schemas.openxmlformats.org/officeDocument/2006/customXml" ds:itemID="{F1B1C252-14DE-40B8-9DE0-A04ADE2DA201}">
+<ds:datastoreItem xmlns:ds="http://schemas.openxmlformats.org/officeDocument/2006/customXml" ds:itemID="{1B334FBE-A0EE-4CD2-83C8-D89B2CBE04CB}">
   <ds:schemaRefs>
     <ds:schemaRef ds:uri="http://schemas.openxmlformats.org/officeDocument/2006/bibliography"/>
   </ds:schemaRefs>

</xml_diff>